<commit_message>
Añade tono académico (Aranzadi) y Anexo IV de modelos y formularios
- Aparato de notas al pie con doctrina real (Sánchez Calero, Veiga Copo,
  Bataller Grau et al., Tirado Suárez, RES), citada por autor/obra/editorial
  sin inventar paginación ni ediciones no verificables.
- Sumario y bloque Resumen/Abstract (ES/EN) al inicio del capítulo, al modo
  de un artículo de revista jurídica.
- Formato de cita jurisprudencial académico (Sala, fecha, ROJ, ECLI,
  ponente), corrigiendo referencias que mezclaban el número ROJ con el
  número de resolución oficial no verificado.
- Bibliografía citada al cierre del capítulo 1.
- Anexo IV completo: 6 modelos (burofax de reclamación previa, escrito
  SAC/Defensor del Asegurado, designación e impugnación pericial art. 38
  LCS, demanda de juicio verbal, fundamentación de intereses art. 20 LCS,
  reclamación DGSFP), con competencia y procedimiento verificados contra
  la LEC vigente (arts. 52.2, 249.2, 250.2, 399, 394).
</commit_message>
<xml_diff>
--- a/libro/Derecho_Seguros_Hogar.docx
+++ b/libro/Derecho_Seguros_Hogar.docx
@@ -1205,53 +1205,6 @@
         <w:t xml:space="preserve">El contrato de seguro de hogar: concepto, fuentes y principios</w:t>
       </w:r>
     </w:p>
-    <w:p>
-      <w:pPr>
-        <w:spacing w:after="180" w:line="300"/>
-        <w:jc w:val="both"/>
-      </w:pPr>
-      <w:r>
-        <w:rPr>
-          <w:rFonts w:ascii="Archivo" w:cs="Archivo" w:eastAsia="Archivo" w:hAnsi="Archivo"/>
-          <w:i/>
-          <w:iCs/>
-          <w:sz w:val="21"/>
-          <w:szCs w:val="21"/>
-        </w:rPr>
-        <w:t xml:space="preserve">El seguro de hogar es, con diferencia, el ramo de daños más contratado en España y, a la vez, uno de los que genera mayor litigiosidad cotidiana: daños por agua, robos, incendios y reclamaciones de responsabilidad civil entre vecinos llenan cada año los juzgados de primera instancia y las mesas de los defensores del asegurado. Este primer capítulo sienta las bases conceptuales y normativas que sostienen todo lo que sigue.</w:t>
-      </w:r>
-    </w:p>
-    <w:p>
-      <w:pPr>
-        <w:pStyle w:val="Heading2"/>
-        <w:spacing w:after="160" w:before="400"/>
-      </w:pPr>
-      <w:r>
-        <w:rPr>
-          <w:rFonts w:ascii="Fraunces" w:cs="Fraunces" w:eastAsia="Fraunces" w:hAnsi="Fraunces"/>
-          <w:b/>
-          <w:bCs/>
-          <w:color w:val="0A2540"/>
-          <w:sz w:val="24"/>
-          <w:szCs w:val="24"/>
-        </w:rPr>
-        <w:t xml:space="preserve">1.1. Concepto legal del contrato de seguro</w:t>
-      </w:r>
-    </w:p>
-    <w:p>
-      <w:pPr>
-        <w:spacing w:after="180" w:line="300"/>
-        <w:jc w:val="both"/>
-      </w:pPr>
-      <w:r>
-        <w:rPr>
-          <w:rFonts w:ascii="Archivo" w:cs="Archivo" w:eastAsia="Archivo" w:hAnsi="Archivo"/>
-          <w:sz w:val="21"/>
-          <w:szCs w:val="21"/>
-        </w:rPr>
-        <w:t xml:space="preserve">El punto de partida obligado es el artículo 1 de la Ley 50/1980, de 8 de octubre, de Contrato de Seguro (en adelante, LCS), que define la institución en términos que siguen plenamente vigentes:</w:t>
-      </w:r>
-    </w:p>
     <w:tbl>
       <w:tblPr>
         <w:tblW w:type="pct" w:w="100%"/>
@@ -1292,24 +1245,137 @@
                 <w:sz w:val="18"/>
                 <w:szCs w:val="18"/>
               </w:rPr>
-              <w:t xml:space="preserve">Texto legal · Art. 1 LCS</w:t>
-            </w:r>
-          </w:p>
-          <w:p>
-            <w:pPr>
-              <w:spacing w:after="0" w:line="280"/>
-              <w:jc w:val="both"/>
-            </w:pPr>
-            <w:r>
-              <w:rPr>
-                <w:rFonts w:ascii="IBM Plex Mono" w:cs="IBM Plex Mono" w:eastAsia="IBM Plex Mono" w:hAnsi="IBM Plex Mono"/>
-                <w:i/>
-                <w:iCs/>
-                <w:color w:val="0A2540"/>
+              <w:t xml:space="preserve">Sumario</w:t>
+            </w:r>
+          </w:p>
+          <w:p>
+            <w:pPr>
+              <w:spacing w:after="40" w:line="260"/>
+            </w:pPr>
+            <w:r>
+              <w:rPr>
+                <w:rFonts w:ascii="Archivo" w:cs="Archivo" w:eastAsia="Archivo" w:hAnsi="Archivo"/>
                 <w:sz w:val="18"/>
                 <w:szCs w:val="18"/>
               </w:rPr>
-              <w:t xml:space="preserve">El contrato de seguro es aquel por el que el asegurador se obliga, mediante el cobro de una prima y para el caso de que se produzca el evento cuyo riesgo es objeto de cobertura, a indemnizar, dentro de los límites pactados, el daño producido al asegurado o a satisfacer un capital, una renta u otras prestaciones convenidas.</w:t>
+              <w:t xml:space="preserve">1.1. Concepto legal del contrato de seguro</w:t>
+            </w:r>
+          </w:p>
+          <w:p>
+            <w:pPr>
+              <w:spacing w:after="40" w:line="260"/>
+            </w:pPr>
+            <w:r>
+              <w:rPr>
+                <w:rFonts w:ascii="Archivo" w:cs="Archivo" w:eastAsia="Archivo" w:hAnsi="Archivo"/>
+                <w:sz w:val="18"/>
+                <w:szCs w:val="18"/>
+              </w:rPr>
+              <w:t xml:space="preserve">1.2. Fuentes del régimen jurídico aplicable</w:t>
+            </w:r>
+          </w:p>
+          <w:p>
+            <w:pPr>
+              <w:spacing w:after="40" w:line="260"/>
+            </w:pPr>
+            <w:r>
+              <w:rPr>
+                <w:rFonts w:ascii="Archivo" w:cs="Archivo" w:eastAsia="Archivo" w:hAnsi="Archivo"/>
+                <w:sz w:val="18"/>
+                <w:szCs w:val="18"/>
+              </w:rPr>
+              <w:t xml:space="preserve">1.3. Caracteres jurídicos del contrato de seguro de hogar</w:t>
+            </w:r>
+          </w:p>
+          <w:p>
+            <w:pPr>
+              <w:spacing w:after="40" w:line="260"/>
+            </w:pPr>
+            <w:r>
+              <w:rPr>
+                <w:rFonts w:ascii="Archivo" w:cs="Archivo" w:eastAsia="Archivo" w:hAnsi="Archivo"/>
+                <w:sz w:val="18"/>
+                <w:szCs w:val="18"/>
+              </w:rPr>
+              <w:t xml:space="preserve">1.4. El seguro multirriesgo del hogar: continente y contenido</w:t>
+            </w:r>
+          </w:p>
+          <w:p>
+            <w:pPr>
+              <w:spacing w:after="40" w:line="260"/>
+            </w:pPr>
+            <w:r>
+              <w:rPr>
+                <w:rFonts w:ascii="Archivo" w:cs="Archivo" w:eastAsia="Archivo" w:hAnsi="Archivo"/>
+                <w:sz w:val="18"/>
+                <w:szCs w:val="18"/>
+              </w:rPr>
+              <w:t xml:space="preserve">1.5. Condiciones generales, particulares y especiales: cláusulas delimitadoras y limitativas</w:t>
+            </w:r>
+          </w:p>
+          <w:p>
+            <w:pPr>
+              <w:spacing w:after="40" w:line="260"/>
+            </w:pPr>
+            <w:r>
+              <w:rPr>
+                <w:rFonts w:ascii="Archivo" w:cs="Archivo" w:eastAsia="Archivo" w:hAnsi="Archivo"/>
+                <w:sz w:val="18"/>
+                <w:szCs w:val="18"/>
+              </w:rPr>
+              <w:t xml:space="preserve">1.5.1. El principio de transparencia como fundamento común</w:t>
+            </w:r>
+          </w:p>
+          <w:p>
+            <w:pPr>
+              <w:spacing w:after="40" w:line="260"/>
+            </w:pPr>
+            <w:r>
+              <w:rPr>
+                <w:rFonts w:ascii="Archivo" w:cs="Archivo" w:eastAsia="Archivo" w:hAnsi="Archivo"/>
+                <w:sz w:val="18"/>
+                <w:szCs w:val="18"/>
+              </w:rPr>
+              <w:t xml:space="preserve">1.6. Las cláusulas lesivas: la frontera de la nulidad</w:t>
+            </w:r>
+          </w:p>
+          <w:p>
+            <w:pPr>
+              <w:spacing w:after="40" w:line="260"/>
+            </w:pPr>
+            <w:r>
+              <w:rPr>
+                <w:rFonts w:ascii="Archivo" w:cs="Archivo" w:eastAsia="Archivo" w:hAnsi="Archivo"/>
+                <w:sz w:val="18"/>
+                <w:szCs w:val="18"/>
+              </w:rPr>
+              <w:t xml:space="preserve">1.7. Ficha para el profesional</w:t>
+            </w:r>
+          </w:p>
+          <w:p>
+            <w:pPr>
+              <w:spacing w:after="40" w:line="260"/>
+            </w:pPr>
+            <w:r>
+              <w:rPr>
+                <w:rFonts w:ascii="Archivo" w:cs="Archivo" w:eastAsia="Archivo" w:hAnsi="Archivo"/>
+                <w:sz w:val="18"/>
+                <w:szCs w:val="18"/>
+              </w:rPr>
+              <w:t xml:space="preserve">1.8. Ficha para el asegurado</w:t>
+            </w:r>
+          </w:p>
+          <w:p>
+            <w:pPr>
+              <w:spacing w:after="40" w:line="260"/>
+            </w:pPr>
+            <w:r>
+              <w:rPr>
+                <w:rFonts w:ascii="Archivo" w:cs="Archivo" w:eastAsia="Archivo" w:hAnsi="Archivo"/>
+                <w:sz w:val="18"/>
+                <w:szCs w:val="18"/>
+              </w:rPr>
+              <w:t xml:space="preserve">1.9. Checklist: cómo leer una póliza de hogar en diez puntos</w:t>
             </w:r>
           </w:p>
         </w:tc>
@@ -1317,16 +1383,136 @@
     </w:tbl>
     <w:p>
       <w:pPr>
+        <w:spacing w:after="160"/>
+      </w:pPr>
+    </w:p>
+    <w:tbl>
+      <w:tblPr>
+        <w:tblW w:type="pct" w:w="100%"/>
+        <w:tblBorders>
+          <w:top w:val="single" w:color="CBD5E1" w:sz="4"/>
+          <w:left w:val="single" w:color="6B7A8F" w:sz="24"/>
+          <w:bottom w:val="single" w:color="CBD5E1" w:sz="4"/>
+          <w:right w:val="single" w:color="CBD5E1" w:sz="4"/>
+          <w:insideH w:val="single" w:color="auto" w:sz="4"/>
+          <w:insideV w:val="single" w:color="auto" w:sz="4"/>
+        </w:tblBorders>
+      </w:tblPr>
+      <w:tblGrid>
+        <w:gridCol w:w="100"/>
+      </w:tblGrid>
+      <w:tr>
+        <w:tc>
+          <w:tcPr>
+            <w:shd w:fill="F4F6F9" w:val="clear"/>
+            <w:tcMar>
+              <w:top w:type="dxa" w:w="160"/>
+              <w:left w:type="dxa" w:w="220"/>
+              <w:bottom w:type="dxa" w:w="160"/>
+              <w:right w:type="dxa" w:w="220"/>
+            </w:tcMar>
+          </w:tcPr>
+          <w:p>
+            <w:pPr>
+              <w:spacing w:after="100"/>
+            </w:pPr>
+            <w:r>
+              <w:rPr>
+                <w:rFonts w:ascii="Archivo" w:cs="Archivo" w:eastAsia="Archivo" w:hAnsi="Archivo"/>
+                <w:b/>
+                <w:bCs/>
+                <w:caps/>
+                <w:color w:val="6B7A8F"/>
+                <w:sz w:val="18"/>
+                <w:szCs w:val="18"/>
+              </w:rPr>
+              <w:t xml:space="preserve">Resumen · Abstract</w:t>
+            </w:r>
+          </w:p>
+          <w:p>
+            <w:pPr>
+              <w:spacing w:after="100"/>
+              <w:jc w:val="both"/>
+            </w:pPr>
+            <w:r>
+              <w:rPr>
+                <w:rFonts w:ascii="Archivo" w:cs="Archivo" w:eastAsia="Archivo" w:hAnsi="Archivo"/>
+                <w:i/>
+                <w:iCs/>
+                <w:sz w:val="18"/>
+                <w:szCs w:val="18"/>
+              </w:rPr>
+              <w:t xml:space="preserve">El presente capítulo analiza el encaje dogmático del seguro multirriesgo del hogar en el sistema de la Ley 50/1980, de Contrato de Seguro, con particular atención a la summa divisio entre condiciones delimitadoras del riesgo y cláusulas limitativas de los derechos del asegurado del art. 3 LCS, cuya correcta calificación —según reiterada jurisprudencia de la Sala Primera del Tribunal Supremo— determina el régimen de oponibilidad de la cláusula controvertida frente al asegurado.</w:t>
+            </w:r>
+          </w:p>
+          <w:p>
+            <w:pPr>
+              <w:spacing w:after="160"/>
+            </w:pPr>
+            <w:r>
+              <w:rPr>
+                <w:rFonts w:ascii="Archivo" w:cs="Archivo" w:eastAsia="Archivo" w:hAnsi="Archivo"/>
+                <w:b/>
+                <w:bCs/>
+                <w:sz w:val="17"/>
+                <w:szCs w:val="17"/>
+              </w:rPr>
+              <w:t xml:space="preserve">Palabras clave: seguro de hogar, contrato de seguro, cláusulas delimitadoras, cláusulas limitativas, art. 3 LCS, transparencia, buena fe contractual.</w:t>
+            </w:r>
+          </w:p>
+          <w:p>
+            <w:pPr>
+              <w:spacing w:after="100"/>
+              <w:jc w:val="both"/>
+            </w:pPr>
+            <w:r>
+              <w:rPr>
+                <w:rFonts w:ascii="Archivo" w:cs="Archivo" w:eastAsia="Archivo" w:hAnsi="Archivo"/>
+                <w:i/>
+                <w:iCs/>
+                <w:sz w:val="18"/>
+                <w:szCs w:val="18"/>
+              </w:rPr>
+              <w:t xml:space="preserve">This chapter examines the dogmatic construction of the Spanish homeowners' multi-risk insurance contract within Act 50/1980 on Insurance Contracts, focusing on the distinction between risk-delimiting clauses and clauses limiting the policyholder's rights under Article 3, whose correct qualification —pursuant to the consolidated case law of the Civil Chamber of the Supreme Court— determines whether the clause is enforceable against the insured.</w:t>
+            </w:r>
+          </w:p>
+          <w:p>
+            <w:pPr>
+              <w:spacing w:after="0"/>
+            </w:pPr>
+            <w:r>
+              <w:rPr>
+                <w:rFonts w:ascii="Archivo" w:cs="Archivo" w:eastAsia="Archivo" w:hAnsi="Archivo"/>
+                <w:b/>
+                <w:bCs/>
+                <w:sz w:val="17"/>
+                <w:szCs w:val="17"/>
+              </w:rPr>
+              <w:t xml:space="preserve">Keywords: homeowners insurance, insurance contract, risk-delimiting clauses, limiting clauses, transparency, good faith.</w:t>
+            </w:r>
+          </w:p>
+        </w:tc>
+      </w:tr>
+    </w:tbl>
+    <w:p>
+      <w:pPr>
+        <w:spacing w:after="200"/>
+      </w:pPr>
+    </w:p>
+    <w:p>
+      <w:pPr>
         <w:spacing w:after="180" w:line="300"/>
         <w:jc w:val="both"/>
       </w:pPr>
       <w:r>
         <w:rPr>
           <w:rFonts w:ascii="Archivo" w:cs="Archivo" w:eastAsia="Archivo" w:hAnsi="Archivo"/>
-          <w:sz w:val="21"/>
-          <w:szCs w:val="21"/>
-        </w:rPr>
-        <w:t xml:space="preserve">El seguro de hogar —también llamado seguro multirriesgo del hogar— es un seguro contra daños en sentido técnico: protege un interés patrimonial lícito (la integridad de la vivienda y sus enseres) frente a la realización de riesgos tipificados (incendio, agua, robo, fenómenos atmosféricos, etc.) y, además, incorpora de forma prácticamente universal una cobertura de responsabilidad civil de cabeza de familia, que muta su naturaleza parcial hacia el seguro de responsabilidad civil regulado en los artículos 73 y siguientes de la LCS. Esta doble naturaleza —seguro de daños propios y seguro de responsabilidad civil frente a terceros conviviendo en una misma póliza— es la primera clave de lectura que debe manejar cualquier profesional: cada siniestro debe reconducirse primero a su cobertura antes de analizar su régimen jurídico, porque las reglas de uno y otro bloque no son idénticas.</w:t>
+          <w:i/>
+          <w:iCs/>
+          <w:sz w:val="21"/>
+          <w:szCs w:val="21"/>
+        </w:rPr>
+        <w:t xml:space="preserve">El seguro de hogar es, con diferencia, el ramo de daños más contratado en España y, a la vez, uno de los que genera mayor litigiosidad cotidiana: daños por agua, robos, incendios y reclamaciones de responsabilidad civil entre vecinos llenan cada año los juzgados de primera instancia y las mesas de los defensores del asegurado. Este primer capítulo sienta las bases dogmáticas y normativas sobre las que se construye el resto de la obra.</w:t>
       </w:r>
     </w:p>
     <w:p>
@@ -1343,7 +1529,7 @@
           <w:sz w:val="24"/>
           <w:szCs w:val="24"/>
         </w:rPr>
-        <w:t xml:space="preserve">1.2. Fuentes del régimen jurídico aplicable</w:t>
+        <w:t xml:space="preserve">1.1. Concepto legal del contrato de seguro</w:t>
       </w:r>
     </w:p>
     <w:p>
@@ -1357,478 +1543,21 @@
           <w:sz w:val="21"/>
           <w:szCs w:val="21"/>
         </w:rPr>
-        <w:t xml:space="preserve">El seguro de hogar no se rige por una ley única. El profesional debe manejar, en la práctica, un entramado de fuentes que se articulan del siguiente modo:</w:t>
-      </w:r>
-    </w:p>
-    <w:p>
-      <w:pPr>
-        <w:pStyle w:val="ListParagraph"/>
-        <w:numPr>
-          <w:ilvl w:val="0"/>
-          <w:numId w:val="2"/>
-        </w:numPr>
-        <w:spacing w:after="100" w:line="290"/>
-      </w:pPr>
-      <w:r>
-        <w:rPr>
-          <w:rFonts w:ascii="Archivo" w:cs="Archivo" w:eastAsia="Archivo" w:hAnsi="Archivo"/>
-          <w:b/>
-          <w:bCs/>
-          <w:sz w:val="21"/>
-          <w:szCs w:val="21"/>
-        </w:rPr>
-        <w:t xml:space="preserve">Ley 50/1980, de Contrato de Seguro (LCS). </w:t>
-      </w:r>
-      <w:r>
-        <w:rPr>
-          <w:rFonts w:ascii="Archivo" w:cs="Archivo" w:eastAsia="Archivo" w:hAnsi="Archivo"/>
-          <w:sz w:val="21"/>
-          <w:szCs w:val="21"/>
-        </w:rPr>
-        <w:t xml:space="preserve">Es la norma nuclear. Conforme a su artículo 2, sus preceptos tienen carácter imperativo salvo que la propia ley disponga otra cosa, si bien se admiten siempre las cláusulas contractuales más beneficiosas para el asegurado. Este carácter imperativo relativo —imperatividad a favor del asegurado— es una idea que reaparece constantemente en el resto del libro, por ejemplo al analizar la mora del asegurador (art. 20 LCS, capítulo 16) o el deber de declaración del riesgo (art. 10 LCS, capítulo 3).</w:t>
-      </w:r>
-    </w:p>
-    <w:p>
-      <w:pPr>
-        <w:pStyle w:val="ListParagraph"/>
-        <w:numPr>
-          <w:ilvl w:val="0"/>
-          <w:numId w:val="2"/>
-        </w:numPr>
-        <w:spacing w:after="100" w:line="290"/>
-      </w:pPr>
-      <w:r>
-        <w:rPr>
-          <w:rFonts w:ascii="Archivo" w:cs="Archivo" w:eastAsia="Archivo" w:hAnsi="Archivo"/>
-          <w:b/>
-          <w:bCs/>
-          <w:sz w:val="21"/>
-          <w:szCs w:val="21"/>
-        </w:rPr>
-        <w:t xml:space="preserve">Código Civil. </w:t>
-      </w:r>
-      <w:r>
-        <w:rPr>
-          <w:rFonts w:ascii="Archivo" w:cs="Archivo" w:eastAsia="Archivo" w:hAnsi="Archivo"/>
-          <w:sz w:val="21"/>
-          <w:szCs w:val="21"/>
-        </w:rPr>
-        <w:t xml:space="preserve">Rige con carácter supletorio las cuestiones generales de obligaciones y contratos (interpretación, nulidad, prescripción de acciones no específicamente reguladas, responsabilidad extracontractual del art. 1902 CC en su conexión con la cobertura de responsabilidad civil del hogar).</w:t>
-      </w:r>
-    </w:p>
-    <w:p>
-      <w:pPr>
-        <w:pStyle w:val="ListParagraph"/>
-        <w:numPr>
-          <w:ilvl w:val="0"/>
-          <w:numId w:val="2"/>
-        </w:numPr>
-        <w:spacing w:after="100" w:line="290"/>
-      </w:pPr>
-      <w:r>
-        <w:rPr>
-          <w:rFonts w:ascii="Archivo" w:cs="Archivo" w:eastAsia="Archivo" w:hAnsi="Archivo"/>
-          <w:b/>
-          <w:bCs/>
-          <w:sz w:val="21"/>
-          <w:szCs w:val="21"/>
-        </w:rPr>
-        <w:t xml:space="preserve">Texto Refundido de la Ley General para la Defensa de los Consumidores y Usuarios (Real Decreto Legislativo 1/2007, TRLGDCU) y Ley 7/1998, de Condiciones Generales de la Contratación (LCGC). </w:t>
-      </w:r>
-      <w:r>
-        <w:rPr>
-          <w:rFonts w:ascii="Archivo" w:cs="Archivo" w:eastAsia="Archivo" w:hAnsi="Archivo"/>
-          <w:sz w:val="21"/>
-          <w:szCs w:val="21"/>
-        </w:rPr>
-        <w:t xml:space="preserve">Aplicables porque el tomador de un seguro de hogar es, en la inmensa mayoría de los casos, un consumidor. Su régimen de cláusulas abusivas y control de incorporación se estudia en el capítulo 21, en diálogo permanente con el artículo 3 LCS que se aborda más adelante en este mismo capítulo.</w:t>
-      </w:r>
-    </w:p>
-    <w:p>
-      <w:pPr>
-        <w:pStyle w:val="ListParagraph"/>
-        <w:numPr>
-          <w:ilvl w:val="0"/>
-          <w:numId w:val="2"/>
-        </w:numPr>
-        <w:spacing w:after="100" w:line="290"/>
-      </w:pPr>
-      <w:r>
-        <w:rPr>
-          <w:rFonts w:ascii="Archivo" w:cs="Archivo" w:eastAsia="Archivo" w:hAnsi="Archivo"/>
-          <w:b/>
-          <w:bCs/>
-          <w:sz w:val="21"/>
-          <w:szCs w:val="21"/>
-        </w:rPr>
-        <w:t xml:space="preserve">Real Decreto Legislativo 6/2004, de Ordenación y Supervisión de los Seguros Privados y su normativa de desarrollo, y el Texto Refundido de la Ley de Ordenación, Supervisión y Solvencia de las Entidades Aseguradoras y Reaseguradoras (Ley 20/2015, LOSSEAR). </w:t>
-      </w:r>
-      <w:r>
-        <w:rPr>
-          <w:rFonts w:ascii="Archivo" w:cs="Archivo" w:eastAsia="Archivo" w:hAnsi="Archivo"/>
-          <w:sz w:val="21"/>
-          <w:szCs w:val="21"/>
-        </w:rPr>
-        <w:t xml:space="preserve">Regulan la solvencia y supervisión administrativa de las aseguradoras por la Dirección General de Seguros y Fondos de Pensiones (DGSFP), relevante para la vía de reclamación extrajudicial (capítulo 19).</w:t>
-      </w:r>
-    </w:p>
-    <w:p>
-      <w:pPr>
-        <w:pStyle w:val="ListParagraph"/>
-        <w:numPr>
-          <w:ilvl w:val="0"/>
-          <w:numId w:val="2"/>
-        </w:numPr>
-        <w:spacing w:after="100" w:line="290"/>
-      </w:pPr>
-      <w:r>
-        <w:rPr>
-          <w:rFonts w:ascii="Archivo" w:cs="Archivo" w:eastAsia="Archivo" w:hAnsi="Archivo"/>
-          <w:b/>
-          <w:bCs/>
-          <w:sz w:val="21"/>
-          <w:szCs w:val="21"/>
-        </w:rPr>
-        <w:t xml:space="preserve">Real Decreto 300/2004, por el que se aprueba el Reglamento del Consorcio de Compensación de Seguros, y su normativa reguladora. </w:t>
-      </w:r>
-      <w:r>
-        <w:rPr>
-          <w:rFonts w:ascii="Archivo" w:cs="Archivo" w:eastAsia="Archivo" w:hAnsi="Archivo"/>
-          <w:sz w:val="21"/>
-          <w:szCs w:val="21"/>
-        </w:rPr>
-        <w:t xml:space="preserve">Determinante en la cobertura de riesgos extraordinarios (inundaciones, terremotos, tempestad ciclónica atípica) que en la práctica excluyen las condiciones generales de las pólizas privadas y que asume el Consorcio con su propio baremo (capítulo 8).</w:t>
-      </w:r>
-    </w:p>
-    <w:p>
-      <w:pPr>
-        <w:pStyle w:val="ListParagraph"/>
-        <w:numPr>
-          <w:ilvl w:val="0"/>
-          <w:numId w:val="2"/>
-        </w:numPr>
-        <w:spacing w:after="100" w:line="290"/>
-      </w:pPr>
-      <w:r>
-        <w:rPr>
-          <w:rFonts w:ascii="Archivo" w:cs="Archivo" w:eastAsia="Archivo" w:hAnsi="Archivo"/>
-          <w:b/>
-          <w:bCs/>
-          <w:sz w:val="21"/>
-          <w:szCs w:val="21"/>
-        </w:rPr>
-        <w:t xml:space="preserve">Ley 5/2019 y normativa hipotecaria conexa, Ley de Propiedad Horizontal (Ley 49/1960) y Código Técnico de la Edificación. </w:t>
-      </w:r>
-      <w:r>
-        <w:rPr>
-          <w:rFonts w:ascii="Archivo" w:cs="Archivo" w:eastAsia="Archivo" w:hAnsi="Archivo"/>
-          <w:sz w:val="21"/>
-          <w:szCs w:val="21"/>
-        </w:rPr>
-        <w:t xml:space="preserve">Inciden, respectivamente, en el seguro de hogar vinculado a préstamo hipotecario, en la interacción entre el seguro individual del piso y el seguro de comunidad, y en los estándares constructivos relevantes para la causa de determinados siniestros de agua o de estructura.</w:t>
-      </w:r>
-    </w:p>
-    <w:p>
-      <w:pPr>
-        <w:pStyle w:val="Heading2"/>
-        <w:spacing w:after="160" w:before="400"/>
-      </w:pPr>
-      <w:r>
-        <w:rPr>
-          <w:rFonts w:ascii="Fraunces" w:cs="Fraunces" w:eastAsia="Fraunces" w:hAnsi="Fraunces"/>
-          <w:b/>
-          <w:bCs/>
-          <w:color w:val="0A2540"/>
-          <w:sz w:val="24"/>
-          <w:szCs w:val="24"/>
-        </w:rPr>
-        <w:t xml:space="preserve">1.3. Caracteres jurídicos del contrato de seguro de hogar</w:t>
-      </w:r>
-    </w:p>
-    <w:p>
-      <w:pPr>
-        <w:spacing w:after="180" w:line="300"/>
-        <w:jc w:val="both"/>
-      </w:pPr>
-      <w:r>
-        <w:rPr>
-          <w:rFonts w:ascii="Archivo" w:cs="Archivo" w:eastAsia="Archivo" w:hAnsi="Archivo"/>
-          <w:sz w:val="21"/>
-          <w:szCs w:val="21"/>
-        </w:rPr>
-        <w:t xml:space="preserve">De la definición legal y de la práctica aseguradora se extraen los caracteres que, en cada capítulo, condicionan la solución de los casos:</w:t>
-      </w:r>
-    </w:p>
-    <w:p>
-      <w:pPr>
-        <w:pStyle w:val="ListParagraph"/>
-        <w:numPr>
-          <w:ilvl w:val="0"/>
-          <w:numId w:val="2"/>
-        </w:numPr>
-        <w:spacing w:after="100" w:line="290"/>
-      </w:pPr>
-      <w:r>
-        <w:rPr>
-          <w:rFonts w:ascii="Archivo" w:cs="Archivo" w:eastAsia="Archivo" w:hAnsi="Archivo"/>
-          <w:b/>
-          <w:bCs/>
-          <w:sz w:val="21"/>
-          <w:szCs w:val="21"/>
-        </w:rPr>
-        <w:t xml:space="preserve">Bilateral y sinalagmático: </w:t>
-      </w:r>
-      <w:r>
-        <w:rPr>
-          <w:rFonts w:ascii="Archivo" w:cs="Archivo" w:eastAsia="Archivo" w:hAnsi="Archivo"/>
-          <w:sz w:val="21"/>
-          <w:szCs w:val="21"/>
-        </w:rPr>
-        <w:t xml:space="preserve">genera obligaciones recíprocas (pago de la prima frente a cobertura del riesgo).</w:t>
-      </w:r>
-    </w:p>
-    <w:p>
-      <w:pPr>
-        <w:pStyle w:val="ListParagraph"/>
-        <w:numPr>
-          <w:ilvl w:val="0"/>
-          <w:numId w:val="2"/>
-        </w:numPr>
-        <w:spacing w:after="100" w:line="290"/>
-      </w:pPr>
-      <w:r>
-        <w:rPr>
-          <w:rFonts w:ascii="Archivo" w:cs="Archivo" w:eastAsia="Archivo" w:hAnsi="Archivo"/>
-          <w:b/>
-          <w:bCs/>
-          <w:sz w:val="21"/>
-          <w:szCs w:val="21"/>
-        </w:rPr>
-        <w:t xml:space="preserve">Oneroso y aleatorio: </w:t>
-      </w:r>
-      <w:r>
-        <w:rPr>
-          <w:rFonts w:ascii="Archivo" w:cs="Archivo" w:eastAsia="Archivo" w:hAnsi="Archivo"/>
-          <w:sz w:val="21"/>
-          <w:szCs w:val="21"/>
-        </w:rPr>
-        <w:t xml:space="preserve">la prestación del asegurador depende de un evento incierto (el siniestro), lo que justifica el rigor con el que la ley trata el deber de declaración del riesgo (art. 10 LCS) y las causas de exoneración por dolo o culpa grave (arts. 19 y 48 LCS).</w:t>
-      </w:r>
-    </w:p>
-    <w:p>
-      <w:pPr>
-        <w:pStyle w:val="ListParagraph"/>
-        <w:numPr>
-          <w:ilvl w:val="0"/>
-          <w:numId w:val="2"/>
-        </w:numPr>
-        <w:spacing w:after="100" w:line="290"/>
-      </w:pPr>
-      <w:r>
-        <w:rPr>
-          <w:rFonts w:ascii="Archivo" w:cs="Archivo" w:eastAsia="Archivo" w:hAnsi="Archivo"/>
-          <w:b/>
-          <w:bCs/>
-          <w:sz w:val="21"/>
-          <w:szCs w:val="21"/>
-        </w:rPr>
-        <w:t xml:space="preserve">De buena fe reforzada (uberrimae fidei): </w:t>
-      </w:r>
-      <w:r>
-        <w:rPr>
-          <w:rFonts w:ascii="Archivo" w:cs="Archivo" w:eastAsia="Archivo" w:hAnsi="Archivo"/>
-          <w:sz w:val="21"/>
-          <w:szCs w:val="21"/>
-        </w:rPr>
-        <w:t xml:space="preserve">la asimetría de información entre tomador y asegurador exige un estándar de lealtad recíproca superior al de los contratos comunes; de ahí derivan tanto los deberes del tomador (declaración del riesgo, comunicación del siniestro) como los del asegurador (transparencia, claridad de las condiciones ex art. 3 LCS).</w:t>
-      </w:r>
-    </w:p>
-    <w:p>
-      <w:pPr>
-        <w:pStyle w:val="ListParagraph"/>
-        <w:numPr>
-          <w:ilvl w:val="0"/>
-          <w:numId w:val="2"/>
-        </w:numPr>
-        <w:spacing w:after="100" w:line="290"/>
-      </w:pPr>
-      <w:r>
-        <w:rPr>
-          <w:rFonts w:ascii="Archivo" w:cs="Archivo" w:eastAsia="Archivo" w:hAnsi="Archivo"/>
-          <w:b/>
-          <w:bCs/>
-          <w:sz w:val="21"/>
-          <w:szCs w:val="21"/>
-        </w:rPr>
-        <w:t xml:space="preserve">De adhesión: </w:t>
-      </w:r>
-      <w:r>
-        <w:rPr>
-          <w:rFonts w:ascii="Archivo" w:cs="Archivo" w:eastAsia="Archivo" w:hAnsi="Archivo"/>
-          <w:sz w:val="21"/>
-          <w:szCs w:val="21"/>
-        </w:rPr>
-        <w:t xml:space="preserve">las condiciones generales las redacta unilateralmente el asegurador; el tomador se limita a aceptarlas. Este carácter es el que activa los controles de incorporación y transparencia que se explican en el epígrafe 1.5.</w:t>
-      </w:r>
-    </w:p>
-    <w:p>
-      <w:pPr>
-        <w:pStyle w:val="ListParagraph"/>
-        <w:numPr>
-          <w:ilvl w:val="0"/>
-          <w:numId w:val="2"/>
-        </w:numPr>
-        <w:spacing w:after="100" w:line="290"/>
-      </w:pPr>
-      <w:r>
-        <w:rPr>
-          <w:rFonts w:ascii="Archivo" w:cs="Archivo" w:eastAsia="Archivo" w:hAnsi="Archivo"/>
-          <w:b/>
-          <w:bCs/>
-          <w:sz w:val="21"/>
-          <w:szCs w:val="21"/>
-        </w:rPr>
-        <w:t xml:space="preserve">Indemnizatorio: </w:t>
-      </w:r>
-      <w:r>
-        <w:rPr>
-          <w:rFonts w:ascii="Archivo" w:cs="Archivo" w:eastAsia="Archivo" w:hAnsi="Archivo"/>
-          <w:sz w:val="21"/>
-          <w:szCs w:val="21"/>
-        </w:rPr>
-        <w:t xml:space="preserve">en el seguro de daños rige el llamado principio indemnizatorio, que impide que el asegurado obtenga, a través del seguro, un enriquecimiento superior al daño realmente sufrido; de él derivan tanto la regla proporcional del infraseguro (art. 30 LCS, capítulo 15) como el derecho de subrogación del asegurador frente a terceros responsables (art. 43 LCS).</w:t>
-      </w:r>
-    </w:p>
-    <w:p>
-      <w:pPr>
-        <w:pStyle w:val="Heading2"/>
-        <w:spacing w:after="160" w:before="400"/>
-      </w:pPr>
-      <w:r>
-        <w:rPr>
-          <w:rFonts w:ascii="Fraunces" w:cs="Fraunces" w:eastAsia="Fraunces" w:hAnsi="Fraunces"/>
-          <w:b/>
-          <w:bCs/>
-          <w:color w:val="0A2540"/>
-          <w:sz w:val="24"/>
-          <w:szCs w:val="24"/>
-        </w:rPr>
-        <w:t xml:space="preserve">1.4. El seguro multirriesgo del hogar: continente y contenido</w:t>
-      </w:r>
-    </w:p>
-    <w:p>
-      <w:pPr>
-        <w:spacing w:after="180" w:line="300"/>
-        <w:jc w:val="both"/>
-      </w:pPr>
-      <w:r>
-        <w:rPr>
-          <w:rFonts w:ascii="Archivo" w:cs="Archivo" w:eastAsia="Archivo" w:hAnsi="Archivo"/>
-          <w:sz w:val="21"/>
-          <w:szCs w:val="21"/>
-        </w:rPr>
-        <w:t xml:space="preserve">Aunque la LCS no emplea estos términos, la práctica aseguradora española distingue de forma constante entre:</w:t>
-      </w:r>
-    </w:p>
-    <w:p>
-      <w:pPr>
-        <w:pStyle w:val="ListParagraph"/>
-        <w:numPr>
-          <w:ilvl w:val="0"/>
-          <w:numId w:val="2"/>
-        </w:numPr>
-        <w:spacing w:after="100" w:line="290"/>
-      </w:pPr>
-      <w:r>
-        <w:rPr>
-          <w:rFonts w:ascii="Archivo" w:cs="Archivo" w:eastAsia="Archivo" w:hAnsi="Archivo"/>
-          <w:b/>
-          <w:bCs/>
-          <w:sz w:val="21"/>
-          <w:szCs w:val="21"/>
-        </w:rPr>
-        <w:t xml:space="preserve">El continente: </w:t>
-      </w:r>
-      <w:r>
-        <w:rPr>
-          <w:rFonts w:ascii="Archivo" w:cs="Archivo" w:eastAsia="Archivo" w:hAnsi="Archivo"/>
-          <w:sz w:val="21"/>
-          <w:szCs w:val="21"/>
-        </w:rPr>
-        <w:t xml:space="preserve">la construcción en sí —muros, techos, suelos, instalaciones fijas, elementos empotrados, e incluso, según póliza, anejos como garaje o trastero— y, en su caso, los elementos comunes en la proporción de la cuota de participación cuando el asegurado es propietario y la comunidad carece de seguro propio o el suyo es insuficiente.</w:t>
-      </w:r>
-    </w:p>
-    <w:p>
-      <w:pPr>
-        <w:pStyle w:val="ListParagraph"/>
-        <w:numPr>
-          <w:ilvl w:val="0"/>
-          <w:numId w:val="2"/>
-        </w:numPr>
-        <w:spacing w:after="100" w:line="290"/>
-      </w:pPr>
-      <w:r>
-        <w:rPr>
-          <w:rFonts w:ascii="Archivo" w:cs="Archivo" w:eastAsia="Archivo" w:hAnsi="Archivo"/>
-          <w:b/>
-          <w:bCs/>
-          <w:sz w:val="21"/>
-          <w:szCs w:val="21"/>
-        </w:rPr>
-        <w:t xml:space="preserve">El contenido: </w:t>
-      </w:r>
-      <w:r>
-        <w:rPr>
-          <w:rFonts w:ascii="Archivo" w:cs="Archivo" w:eastAsia="Archivo" w:hAnsi="Archivo"/>
-          <w:sz w:val="21"/>
-          <w:szCs w:val="21"/>
-        </w:rPr>
-        <w:t xml:space="preserve">los bienes muebles del hogar: mobiliario, electrodomésticos, ropa, y, con límites cuantitativos específicos que conviene revisar en cada póliza, joyas, dinero en efectivo, obras de arte y objetos de especial valor.</w:t>
-      </w:r>
-    </w:p>
-    <w:p>
-      <w:pPr>
-        <w:spacing w:after="180" w:line="300"/>
-        <w:jc w:val="both"/>
-      </w:pPr>
-      <w:r>
-        <w:rPr>
-          <w:rFonts w:ascii="Archivo" w:cs="Archivo" w:eastAsia="Archivo" w:hAnsi="Archivo"/>
-          <w:sz w:val="21"/>
-          <w:szCs w:val="21"/>
-        </w:rPr>
-        <w:t xml:space="preserve">Esta distinción no es meramente descriptiva: determina el interés asegurable de cada sujeto (el propietario no ocupante suele asegurar solo el continente; el inquilino, solo el contenido y su responsabilidad civil) y condiciona la correcta fijación de la suma asegurada a efectos de la regla proporcional del artículo 30 LCS, como se desarrolla en el capítulo 15.</w:t>
-      </w:r>
-    </w:p>
-    <w:p>
-      <w:pPr>
-        <w:pStyle w:val="Heading2"/>
-        <w:spacing w:after="160" w:before="400"/>
-      </w:pPr>
-      <w:r>
-        <w:rPr>
-          <w:rFonts w:ascii="Fraunces" w:cs="Fraunces" w:eastAsia="Fraunces" w:hAnsi="Fraunces"/>
-          <w:b/>
-          <w:bCs/>
-          <w:color w:val="0A2540"/>
-          <w:sz w:val="24"/>
-          <w:szCs w:val="24"/>
-        </w:rPr>
-        <w:t xml:space="preserve">1.5. Condiciones generales, particulares y especiales: la distinción entre cláusulas delimitadoras y limitativas</w:t>
-      </w:r>
-    </w:p>
-    <w:p>
-      <w:pPr>
-        <w:spacing w:after="180" w:line="300"/>
-        <w:jc w:val="both"/>
-      </w:pPr>
-      <w:r>
-        <w:rPr>
-          <w:rFonts w:ascii="Archivo" w:cs="Archivo" w:eastAsia="Archivo" w:hAnsi="Archivo"/>
-          <w:sz w:val="21"/>
-          <w:szCs w:val="21"/>
-        </w:rPr>
-        <w:t xml:space="preserve">El artículo 3 LCS es, junto con el artículo 20, el precepto más invocado en la litigación sobre seguros de hogar. Su tenor es el siguiente:</w:t>
+        <w:t xml:space="preserve">El punto de partida dogmático es el artículo 1 de la Ley 50/1980, de 8 de octubre, de Contrato de Seguro (en adelante, LCS), que define la institución en términos que siguen plenamente vigentes</w:t>
+      </w:r>
+      <w:r>
+        <w:rPr>
+          <w:rStyle w:val="FootnoteReference"/>
+        </w:rPr>
+        <w:footnoteReference w:id="1"/>
+      </w:r>
+      <w:r>
+        <w:rPr>
+          <w:rFonts w:ascii="Archivo" w:cs="Archivo" w:eastAsia="Archivo" w:hAnsi="Archivo"/>
+          <w:sz w:val="21"/>
+          <w:szCs w:val="21"/>
+        </w:rPr>
+        <w:t xml:space="preserve">:</w:t>
       </w:r>
     </w:p>
     <w:tbl>
@@ -1871,7 +1600,7 @@
                 <w:sz w:val="18"/>
                 <w:szCs w:val="18"/>
               </w:rPr>
-              <w:t xml:space="preserve">Texto legal · Art. 3 LCS</w:t>
+              <w:t xml:space="preserve">Texto legal · Art. 1 LCS</w:t>
             </w:r>
           </w:p>
           <w:p>
@@ -1888,7 +1617,7 @@
                 <w:sz w:val="18"/>
                 <w:szCs w:val="18"/>
               </w:rPr>
-              <w:t xml:space="preserve">Las condiciones generales, que en ningún caso podrán tener carácter lesivo para los asegurados, habrán de incluirse por el asegurador en la proposición de seguro si la hubiere y necesariamente en la póliza de contrato o en un documento complementario, que se suscribirá por el asegurado y al que se entregará copia del mismo. Las condiciones generales y particulares se redactarán de forma clara y precisa. Se destacarán de modo especial las cláusulas limitativas de los derechos de los asegurados, que deberán ser específicamente aceptadas por escrito. [...] Declarada por el Tribunal Supremo la nulidad de alguna de las cláusulas de las condiciones generales de un contrato, la Administración Pública competente obligará a los aseguradores a modificar las cláusulas idénticas contenidas en sus pólizas.</w:t>
+              <w:t xml:space="preserve">El contrato de seguro es aquel por el que el asegurador se obliga, mediante el cobro de una prima y para el caso de que se produzca el evento cuyo riesgo es objeto de cobertura, a indemnizar, dentro de los límites pactados, el daño producido al asegurado o a satisfacer un capital, una renta u otras prestaciones convenidas.</w:t>
             </w:r>
           </w:p>
         </w:tc>
@@ -1905,7 +1634,52 @@
           <w:sz w:val="21"/>
           <w:szCs w:val="21"/>
         </w:rPr>
-        <w:t xml:space="preserve">De este precepto derivan dos regímenes jurídicos distintos que el profesional debe aprender a diferenciar en cada cláusula controvertida:</w:t>
+        <w:t xml:space="preserve">El seguro de hogar —también llamado seguro multirriesgo del hogar, categoría de creación técnico-aseguradora sin tipificación legal autónoma</w:t>
+      </w:r>
+      <w:r>
+        <w:rPr>
+          <w:rStyle w:val="FootnoteReference"/>
+        </w:rPr>
+        <w:footnoteReference w:id="2"/>
+      </w:r>
+      <w:r>
+        <w:rPr>
+          <w:rFonts w:ascii="Archivo" w:cs="Archivo" w:eastAsia="Archivo" w:hAnsi="Archivo"/>
+          <w:sz w:val="21"/>
+          <w:szCs w:val="21"/>
+        </w:rPr>
+        <w:t xml:space="preserve">— es un seguro contra daños en sentido técnico: protege un interés patrimonial lícito (la integridad de la vivienda y sus enseres) frente a la realización de riesgos tipificados (incendio, agua, robo, fenómenos atmosféricos, etc.) y, además, incorpora de forma prácticamente universal una cobertura de responsabilidad civil de cabeza de familia, que muta su naturaleza parcial hacia el seguro de responsabilidad civil regulado en los artículos 73 y siguientes de la LCS. Esta doble naturaleza —seguro de daños propios y seguro de responsabilidad civil frente a terceros conviviendo en una misma póliza— es la primera clave de lectura que debe manejar cualquier profesional: cada siniestro debe reconducirse primero a su cobertura antes de analizar su régimen jurídico, porque las reglas de uno y otro bloque no son idénticas.</w:t>
+      </w:r>
+    </w:p>
+    <w:p>
+      <w:pPr>
+        <w:pStyle w:val="Heading2"/>
+        <w:spacing w:after="160" w:before="400"/>
+      </w:pPr>
+      <w:r>
+        <w:rPr>
+          <w:rFonts w:ascii="Fraunces" w:cs="Fraunces" w:eastAsia="Fraunces" w:hAnsi="Fraunces"/>
+          <w:b/>
+          <w:bCs/>
+          <w:color w:val="0A2540"/>
+          <w:sz w:val="24"/>
+          <w:szCs w:val="24"/>
+        </w:rPr>
+        <w:t xml:space="preserve">1.2. Fuentes del régimen jurídico aplicable</w:t>
+      </w:r>
+    </w:p>
+    <w:p>
+      <w:pPr>
+        <w:spacing w:after="180" w:line="300"/>
+        <w:jc w:val="both"/>
+      </w:pPr>
+      <w:r>
+        <w:rPr>
+          <w:rFonts w:ascii="Archivo" w:cs="Archivo" w:eastAsia="Archivo" w:hAnsi="Archivo"/>
+          <w:sz w:val="21"/>
+          <w:szCs w:val="21"/>
+        </w:rPr>
+        <w:t xml:space="preserve">El seguro de hogar no se rige por una ley única. El profesional debe manejar, en la práctica, un entramado de fuentes que se articulan del siguiente modo:</w:t>
       </w:r>
     </w:p>
     <w:p>
@@ -1925,15 +1699,15 @@
           <w:sz w:val="21"/>
           <w:szCs w:val="21"/>
         </w:rPr>
-        <w:t xml:space="preserve">Cláusulas delimitadoras del riesgo: </w:t>
-      </w:r>
-      <w:r>
-        <w:rPr>
-          <w:rFonts w:ascii="Archivo" w:cs="Archivo" w:eastAsia="Archivo" w:hAnsi="Archivo"/>
-          <w:sz w:val="21"/>
-          <w:szCs w:val="21"/>
-        </w:rPr>
-        <w:t xml:space="preserve">concretan el objeto del contrato, fijando qué riesgos, en caso de producirse, hacen surgir el derecho a la prestación. Basta su inclusión en condiciones generales aceptadas de forma genérica al perfeccionarse el contrato, sin necesidad de firma o aceptación específica adicional.</w:t>
+        <w:t xml:space="preserve">Ley 50/1980, de Contrato de Seguro (LCS). </w:t>
+      </w:r>
+      <w:r>
+        <w:rPr>
+          <w:rFonts w:ascii="Archivo" w:cs="Archivo" w:eastAsia="Archivo" w:hAnsi="Archivo"/>
+          <w:sz w:val="21"/>
+          <w:szCs w:val="21"/>
+        </w:rPr>
+        <w:t xml:space="preserve">Es la norma nuclear. Conforme a su artículo 2, sus preceptos tienen carácter imperativo salvo que la propia ley disponga otra cosa, si bien se admiten siempre las cláusulas contractuales más beneficiosas para el asegurado. Este carácter imperativo relativo —imperatividad a favor del asegurado— es una idea que reaparece constantemente en el resto del libro, por ejemplo al analizar la mora del asegurador (art. 20 LCS, capítulo 16) o el deber de declaración del riesgo (art. 10 LCS, capítulo 3).</w:t>
       </w:r>
     </w:p>
     <w:p>
@@ -1953,15 +1727,144 @@
           <w:sz w:val="21"/>
           <w:szCs w:val="21"/>
         </w:rPr>
-        <w:t xml:space="preserve">Cláusulas limitativas de los derechos del asegurado: </w:t>
-      </w:r>
-      <w:r>
-        <w:rPr>
-          <w:rFonts w:ascii="Archivo" w:cs="Archivo" w:eastAsia="Archivo" w:hAnsi="Archivo"/>
-          <w:sz w:val="21"/>
-          <w:szCs w:val="21"/>
-        </w:rPr>
-        <w:t xml:space="preserve">una vez nacido el derecho a la prestación, lo restringen, condicionan o modifican. Exigen, bajo pena de inoponibilidad al asegurado, que estén destacadas de modo especial y que sean específicamente aceptadas por escrito (doble requisito: destacado formal + firma o aceptación expresa distinta de la firma general de la póliza).</w:t>
+        <w:t xml:space="preserve">Código Civil. </w:t>
+      </w:r>
+      <w:r>
+        <w:rPr>
+          <w:rFonts w:ascii="Archivo" w:cs="Archivo" w:eastAsia="Archivo" w:hAnsi="Archivo"/>
+          <w:sz w:val="21"/>
+          <w:szCs w:val="21"/>
+        </w:rPr>
+        <w:t xml:space="preserve">Rige con carácter supletorio las cuestiones generales de obligaciones y contratos (interpretación, nulidad, prescripción de acciones no específicamente reguladas, responsabilidad extracontractual del art. 1902 CC en su conexión con la cobertura de responsabilidad civil del hogar).</w:t>
+      </w:r>
+    </w:p>
+    <w:p>
+      <w:pPr>
+        <w:pStyle w:val="ListParagraph"/>
+        <w:numPr>
+          <w:ilvl w:val="0"/>
+          <w:numId w:val="2"/>
+        </w:numPr>
+        <w:spacing w:after="100" w:line="290"/>
+      </w:pPr>
+      <w:r>
+        <w:rPr>
+          <w:rFonts w:ascii="Archivo" w:cs="Archivo" w:eastAsia="Archivo" w:hAnsi="Archivo"/>
+          <w:b/>
+          <w:bCs/>
+          <w:sz w:val="21"/>
+          <w:szCs w:val="21"/>
+        </w:rPr>
+        <w:t xml:space="preserve">Texto Refundido de la Ley General para la Defensa de los Consumidores y Usuarios (Real Decreto Legislativo 1/2007, TRLGDCU) y Ley 7/1998, de Condiciones Generales de la Contratación (LCGC). </w:t>
+      </w:r>
+      <w:r>
+        <w:rPr>
+          <w:rFonts w:ascii="Archivo" w:cs="Archivo" w:eastAsia="Archivo" w:hAnsi="Archivo"/>
+          <w:sz w:val="21"/>
+          <w:szCs w:val="21"/>
+        </w:rPr>
+        <w:t xml:space="preserve">Aplicables porque el tomador de un seguro de hogar es, en la inmensa mayoría de los casos, un consumidor. Su régimen de cláusulas abusivas y control de incorporación se estudia en el capítulo 21, en diálogo permanente con el artículo 3 LCS que se aborda más adelante en este mismo capítulo.</w:t>
+      </w:r>
+    </w:p>
+    <w:p>
+      <w:pPr>
+        <w:pStyle w:val="ListParagraph"/>
+        <w:numPr>
+          <w:ilvl w:val="0"/>
+          <w:numId w:val="2"/>
+        </w:numPr>
+        <w:spacing w:after="100" w:line="290"/>
+      </w:pPr>
+      <w:r>
+        <w:rPr>
+          <w:rFonts w:ascii="Archivo" w:cs="Archivo" w:eastAsia="Archivo" w:hAnsi="Archivo"/>
+          <w:b/>
+          <w:bCs/>
+          <w:sz w:val="21"/>
+          <w:szCs w:val="21"/>
+        </w:rPr>
+        <w:t xml:space="preserve">Real Decreto Legislativo 6/2004, de Ordenación y Supervisión de los Seguros Privados y su normativa de desarrollo, y el Texto Refundido de la Ley de Ordenación, Supervisión y Solvencia de las Entidades Aseguradoras y Reaseguradoras (Ley 20/2015, LOSSEAR). </w:t>
+      </w:r>
+      <w:r>
+        <w:rPr>
+          <w:rFonts w:ascii="Archivo" w:cs="Archivo" w:eastAsia="Archivo" w:hAnsi="Archivo"/>
+          <w:sz w:val="21"/>
+          <w:szCs w:val="21"/>
+        </w:rPr>
+        <w:t xml:space="preserve">Regulan la solvencia y supervisión administrativa de las aseguradoras por la Dirección General de Seguros y Fondos de Pensiones (DGSFP), relevante para la vía de reclamación extrajudicial (capítulo 19).</w:t>
+      </w:r>
+    </w:p>
+    <w:p>
+      <w:pPr>
+        <w:pStyle w:val="ListParagraph"/>
+        <w:numPr>
+          <w:ilvl w:val="0"/>
+          <w:numId w:val="2"/>
+        </w:numPr>
+        <w:spacing w:after="100" w:line="290"/>
+      </w:pPr>
+      <w:r>
+        <w:rPr>
+          <w:rFonts w:ascii="Archivo" w:cs="Archivo" w:eastAsia="Archivo" w:hAnsi="Archivo"/>
+          <w:b/>
+          <w:bCs/>
+          <w:sz w:val="21"/>
+          <w:szCs w:val="21"/>
+        </w:rPr>
+        <w:t xml:space="preserve">Real Decreto 300/2004, por el que se aprueba el Reglamento del Consorcio de Compensación de Seguros, y su normativa reguladora. </w:t>
+      </w:r>
+      <w:r>
+        <w:rPr>
+          <w:rFonts w:ascii="Archivo" w:cs="Archivo" w:eastAsia="Archivo" w:hAnsi="Archivo"/>
+          <w:sz w:val="21"/>
+          <w:szCs w:val="21"/>
+        </w:rPr>
+        <w:t xml:space="preserve">Determinante en la cobertura de riesgos extraordinarios (inundaciones, terremotos, tempestad ciclónica atípica) que en la práctica excluyen las condiciones generales de las pólizas privadas y que asume el Consorcio con su propio baremo (capítulo 8).</w:t>
+      </w:r>
+    </w:p>
+    <w:p>
+      <w:pPr>
+        <w:pStyle w:val="ListParagraph"/>
+        <w:numPr>
+          <w:ilvl w:val="0"/>
+          <w:numId w:val="2"/>
+        </w:numPr>
+        <w:spacing w:after="100" w:line="290"/>
+      </w:pPr>
+      <w:r>
+        <w:rPr>
+          <w:rFonts w:ascii="Archivo" w:cs="Archivo" w:eastAsia="Archivo" w:hAnsi="Archivo"/>
+          <w:b/>
+          <w:bCs/>
+          <w:sz w:val="21"/>
+          <w:szCs w:val="21"/>
+        </w:rPr>
+        <w:t xml:space="preserve">Ley 5/2019 y normativa hipotecaria conexa, Ley de Propiedad Horizontal (Ley 49/1960) y Código Técnico de la Edificación. </w:t>
+      </w:r>
+      <w:r>
+        <w:rPr>
+          <w:rFonts w:ascii="Archivo" w:cs="Archivo" w:eastAsia="Archivo" w:hAnsi="Archivo"/>
+          <w:sz w:val="21"/>
+          <w:szCs w:val="21"/>
+        </w:rPr>
+        <w:t xml:space="preserve">Inciden, respectivamente, en el seguro de hogar vinculado a préstamo hipotecario, en la interacción entre el seguro individual del piso y el seguro de comunidad, y en los estándares constructivos relevantes para la causa de determinados siniestros de agua o de estructura.</w:t>
+      </w:r>
+    </w:p>
+    <w:p>
+      <w:pPr>
+        <w:pStyle w:val="Heading2"/>
+        <w:spacing w:after="160" w:before="400"/>
+      </w:pPr>
+      <w:r>
+        <w:rPr>
+          <w:rFonts w:ascii="Fraunces" w:cs="Fraunces" w:eastAsia="Fraunces" w:hAnsi="Fraunces"/>
+          <w:b/>
+          <w:bCs/>
+          <w:color w:val="0A2540"/>
+          <w:sz w:val="24"/>
+          <w:szCs w:val="24"/>
+        </w:rPr>
+        <w:t xml:space="preserve">1.3. Caracteres jurídicos del contrato de seguro de hogar</w:t>
       </w:r>
     </w:p>
     <w:p>
@@ -1975,7 +1878,468 @@
           <w:sz w:val="21"/>
           <w:szCs w:val="21"/>
         </w:rPr>
-        <w:t xml:space="preserve">La distinción, aparentemente sencilla en la teoría, resulta enormemente controvertida en la práctica, y ha generado una jurisprudencia extensa y matizada. La sentencia de referencia —citada de forma constante por la Sala Primera hasta la actualidad— es la STS (Pleno) 853/2006, de 11 de septiembre, cuya doctrina resume con fidelidad la reciente STS 3996/2023, de 3 de octubre (ECLI:ES:TS:2023:3996, ponente Seoane Spiegelberg):</w:t>
+        <w:t xml:space="preserve">De la definición legal y de la práctica aseguradora se extraen los caracteres que, en cada capítulo, condicionan la solución de los casos:</w:t>
+      </w:r>
+    </w:p>
+    <w:p>
+      <w:pPr>
+        <w:pStyle w:val="ListParagraph"/>
+        <w:numPr>
+          <w:ilvl w:val="0"/>
+          <w:numId w:val="2"/>
+        </w:numPr>
+        <w:spacing w:after="100" w:line="290"/>
+      </w:pPr>
+      <w:r>
+        <w:rPr>
+          <w:rFonts w:ascii="Archivo" w:cs="Archivo" w:eastAsia="Archivo" w:hAnsi="Archivo"/>
+          <w:b/>
+          <w:bCs/>
+          <w:sz w:val="21"/>
+          <w:szCs w:val="21"/>
+        </w:rPr>
+        <w:t xml:space="preserve">Bilateral y sinalagmático: </w:t>
+      </w:r>
+      <w:r>
+        <w:rPr>
+          <w:rFonts w:ascii="Archivo" w:cs="Archivo" w:eastAsia="Archivo" w:hAnsi="Archivo"/>
+          <w:sz w:val="21"/>
+          <w:szCs w:val="21"/>
+        </w:rPr>
+        <w:t xml:space="preserve">genera obligaciones recíprocas (pago de la prima frente a cobertura del riesgo).</w:t>
+      </w:r>
+    </w:p>
+    <w:p>
+      <w:pPr>
+        <w:pStyle w:val="ListParagraph"/>
+        <w:numPr>
+          <w:ilvl w:val="0"/>
+          <w:numId w:val="2"/>
+        </w:numPr>
+        <w:spacing w:after="100" w:line="290"/>
+      </w:pPr>
+      <w:r>
+        <w:rPr>
+          <w:rFonts w:ascii="Archivo" w:cs="Archivo" w:eastAsia="Archivo" w:hAnsi="Archivo"/>
+          <w:b/>
+          <w:bCs/>
+          <w:sz w:val="21"/>
+          <w:szCs w:val="21"/>
+        </w:rPr>
+        <w:t xml:space="preserve">Oneroso y aleatorio: </w:t>
+      </w:r>
+      <w:r>
+        <w:rPr>
+          <w:rFonts w:ascii="Archivo" w:cs="Archivo" w:eastAsia="Archivo" w:hAnsi="Archivo"/>
+          <w:sz w:val="21"/>
+          <w:szCs w:val="21"/>
+        </w:rPr>
+        <w:t xml:space="preserve">la prestación del asegurador depende de un evento incierto (el siniestro), lo que justifica el rigor con el que la ley trata el deber de declaración del riesgo (art. 10 LCS) y las causas de exoneración por dolo o culpa grave (arts. 19 y 48 LCS).</w:t>
+      </w:r>
+    </w:p>
+    <w:p>
+      <w:pPr>
+        <w:pStyle w:val="ListParagraph"/>
+        <w:numPr>
+          <w:ilvl w:val="0"/>
+          <w:numId w:val="2"/>
+        </w:numPr>
+        <w:spacing w:after="100" w:line="290"/>
+      </w:pPr>
+      <w:r>
+        <w:rPr>
+          <w:rFonts w:ascii="Archivo" w:cs="Archivo" w:eastAsia="Archivo" w:hAnsi="Archivo"/>
+          <w:b/>
+          <w:bCs/>
+          <w:sz w:val="21"/>
+          <w:szCs w:val="21"/>
+        </w:rPr>
+        <w:t xml:space="preserve">De buena fe reforzada (uberrimae fidei): </w:t>
+      </w:r>
+      <w:r>
+        <w:rPr>
+          <w:rFonts w:ascii="Archivo" w:cs="Archivo" w:eastAsia="Archivo" w:hAnsi="Archivo"/>
+          <w:sz w:val="21"/>
+          <w:szCs w:val="21"/>
+        </w:rPr>
+        <w:t xml:space="preserve">la asimetría de información entre tomador y asegurador exige un estándar de lealtad recíproca superior al de los contratos comunes</w:t>
+      </w:r>
+      <w:r>
+        <w:rPr>
+          <w:rStyle w:val="FootnoteReference"/>
+        </w:rPr>
+        <w:footnoteReference w:id="3"/>
+      </w:r>
+      <w:r>
+        <w:rPr>
+          <w:rFonts w:ascii="Archivo" w:cs="Archivo" w:eastAsia="Archivo" w:hAnsi="Archivo"/>
+          <w:sz w:val="21"/>
+          <w:szCs w:val="21"/>
+        </w:rPr>
+        <w:t xml:space="preserve">; de ahí derivan tanto los deberes del tomador (declaración del riesgo, comunicación del siniestro) como los del asegurador (transparencia, claridad de las condiciones ex art. 3 LCS).</w:t>
+      </w:r>
+    </w:p>
+    <w:p>
+      <w:pPr>
+        <w:pStyle w:val="ListParagraph"/>
+        <w:numPr>
+          <w:ilvl w:val="0"/>
+          <w:numId w:val="2"/>
+        </w:numPr>
+        <w:spacing w:after="100" w:line="290"/>
+      </w:pPr>
+      <w:r>
+        <w:rPr>
+          <w:rFonts w:ascii="Archivo" w:cs="Archivo" w:eastAsia="Archivo" w:hAnsi="Archivo"/>
+          <w:b/>
+          <w:bCs/>
+          <w:sz w:val="21"/>
+          <w:szCs w:val="21"/>
+        </w:rPr>
+        <w:t xml:space="preserve">De adhesión: </w:t>
+      </w:r>
+      <w:r>
+        <w:rPr>
+          <w:rFonts w:ascii="Archivo" w:cs="Archivo" w:eastAsia="Archivo" w:hAnsi="Archivo"/>
+          <w:sz w:val="21"/>
+          <w:szCs w:val="21"/>
+        </w:rPr>
+        <w:t xml:space="preserve">las condiciones generales las redacta unilateralmente el asegurador; el tomador se limita a aceptarlas. Este carácter es el que activa los controles de incorporación y transparencia que se explican en el epígrafe 1.5.</w:t>
+      </w:r>
+    </w:p>
+    <w:p>
+      <w:pPr>
+        <w:pStyle w:val="ListParagraph"/>
+        <w:numPr>
+          <w:ilvl w:val="0"/>
+          <w:numId w:val="2"/>
+        </w:numPr>
+        <w:spacing w:after="100" w:line="290"/>
+      </w:pPr>
+      <w:r>
+        <w:rPr>
+          <w:rFonts w:ascii="Archivo" w:cs="Archivo" w:eastAsia="Archivo" w:hAnsi="Archivo"/>
+          <w:b/>
+          <w:bCs/>
+          <w:sz w:val="21"/>
+          <w:szCs w:val="21"/>
+        </w:rPr>
+        <w:t xml:space="preserve">Indemnizatorio: </w:t>
+      </w:r>
+      <w:r>
+        <w:rPr>
+          <w:rFonts w:ascii="Archivo" w:cs="Archivo" w:eastAsia="Archivo" w:hAnsi="Archivo"/>
+          <w:sz w:val="21"/>
+          <w:szCs w:val="21"/>
+        </w:rPr>
+        <w:t xml:space="preserve">en el seguro de daños rige el llamado principio indemnizatorio, que impide que el asegurado obtenga, a través del seguro, un enriquecimiento superior al daño realmente sufrido; de él derivan tanto la regla proporcional del infraseguro (art. 30 LCS, capítulo 15) como el derecho de subrogación del asegurador frente a terceros responsables (art. 43 LCS).</w:t>
+      </w:r>
+    </w:p>
+    <w:p>
+      <w:pPr>
+        <w:pStyle w:val="Heading2"/>
+        <w:spacing w:after="160" w:before="400"/>
+      </w:pPr>
+      <w:r>
+        <w:rPr>
+          <w:rFonts w:ascii="Fraunces" w:cs="Fraunces" w:eastAsia="Fraunces" w:hAnsi="Fraunces"/>
+          <w:b/>
+          <w:bCs/>
+          <w:color w:val="0A2540"/>
+          <w:sz w:val="24"/>
+          <w:szCs w:val="24"/>
+        </w:rPr>
+        <w:t xml:space="preserve">1.4. El seguro multirriesgo del hogar: continente y contenido</w:t>
+      </w:r>
+    </w:p>
+    <w:p>
+      <w:pPr>
+        <w:spacing w:after="180" w:line="300"/>
+        <w:jc w:val="both"/>
+      </w:pPr>
+      <w:r>
+        <w:rPr>
+          <w:rFonts w:ascii="Archivo" w:cs="Archivo" w:eastAsia="Archivo" w:hAnsi="Archivo"/>
+          <w:sz w:val="21"/>
+          <w:szCs w:val="21"/>
+        </w:rPr>
+        <w:t xml:space="preserve">Aunque la LCS no emplea estos términos, la práctica aseguradora española distingue de forma constante entre:</w:t>
+      </w:r>
+    </w:p>
+    <w:p>
+      <w:pPr>
+        <w:pStyle w:val="ListParagraph"/>
+        <w:numPr>
+          <w:ilvl w:val="0"/>
+          <w:numId w:val="2"/>
+        </w:numPr>
+        <w:spacing w:after="100" w:line="290"/>
+      </w:pPr>
+      <w:r>
+        <w:rPr>
+          <w:rFonts w:ascii="Archivo" w:cs="Archivo" w:eastAsia="Archivo" w:hAnsi="Archivo"/>
+          <w:b/>
+          <w:bCs/>
+          <w:sz w:val="21"/>
+          <w:szCs w:val="21"/>
+        </w:rPr>
+        <w:t xml:space="preserve">El continente: </w:t>
+      </w:r>
+      <w:r>
+        <w:rPr>
+          <w:rFonts w:ascii="Archivo" w:cs="Archivo" w:eastAsia="Archivo" w:hAnsi="Archivo"/>
+          <w:sz w:val="21"/>
+          <w:szCs w:val="21"/>
+        </w:rPr>
+        <w:t xml:space="preserve">la construcción en sí —muros, techos, suelos, instalaciones fijas, elementos empotrados, e incluso, según póliza, anejos como garaje o trastero— y, en su caso, los elementos comunes en la proporción de la cuota de participación cuando el asegurado es propietario y la comunidad carece de seguro propio o el suyo es insuficiente.</w:t>
+      </w:r>
+    </w:p>
+    <w:p>
+      <w:pPr>
+        <w:pStyle w:val="ListParagraph"/>
+        <w:numPr>
+          <w:ilvl w:val="0"/>
+          <w:numId w:val="2"/>
+        </w:numPr>
+        <w:spacing w:after="100" w:line="290"/>
+      </w:pPr>
+      <w:r>
+        <w:rPr>
+          <w:rFonts w:ascii="Archivo" w:cs="Archivo" w:eastAsia="Archivo" w:hAnsi="Archivo"/>
+          <w:b/>
+          <w:bCs/>
+          <w:sz w:val="21"/>
+          <w:szCs w:val="21"/>
+        </w:rPr>
+        <w:t xml:space="preserve">El contenido: </w:t>
+      </w:r>
+      <w:r>
+        <w:rPr>
+          <w:rFonts w:ascii="Archivo" w:cs="Archivo" w:eastAsia="Archivo" w:hAnsi="Archivo"/>
+          <w:sz w:val="21"/>
+          <w:szCs w:val="21"/>
+        </w:rPr>
+        <w:t xml:space="preserve">los bienes muebles del hogar: mobiliario, electrodomésticos, ropa, y, con límites cuantitativos específicos que conviene revisar en cada póliza, joyas, dinero en efectivo, obras de arte y objetos de especial valor.</w:t>
+      </w:r>
+    </w:p>
+    <w:p>
+      <w:pPr>
+        <w:spacing w:after="180" w:line="300"/>
+        <w:jc w:val="both"/>
+      </w:pPr>
+      <w:r>
+        <w:rPr>
+          <w:rFonts w:ascii="Archivo" w:cs="Archivo" w:eastAsia="Archivo" w:hAnsi="Archivo"/>
+          <w:sz w:val="21"/>
+          <w:szCs w:val="21"/>
+        </w:rPr>
+        <w:t xml:space="preserve">Esta distinción no es meramente descriptiva: determina el interés asegurable de cada sujeto (el propietario no ocupante suele asegurar solo el continente; el inquilino, solo el contenido y su responsabilidad civil) y condiciona la correcta fijación de la suma asegurada a efectos de la regla proporcional del artículo 30 LCS, como se desarrolla en el capítulo 15.</w:t>
+      </w:r>
+    </w:p>
+    <w:p>
+      <w:pPr>
+        <w:pStyle w:val="Heading2"/>
+        <w:spacing w:after="160" w:before="400"/>
+      </w:pPr>
+      <w:r>
+        <w:rPr>
+          <w:rFonts w:ascii="Fraunces" w:cs="Fraunces" w:eastAsia="Fraunces" w:hAnsi="Fraunces"/>
+          <w:b/>
+          <w:bCs/>
+          <w:color w:val="0A2540"/>
+          <w:sz w:val="24"/>
+          <w:szCs w:val="24"/>
+        </w:rPr>
+        <w:t xml:space="preserve">1.5. Condiciones generales, particulares y especiales: la distinción entre cláusulas delimitadoras y limitativas</w:t>
+      </w:r>
+    </w:p>
+    <w:p>
+      <w:pPr>
+        <w:spacing w:after="180" w:line="300"/>
+        <w:jc w:val="both"/>
+      </w:pPr>
+      <w:r>
+        <w:rPr>
+          <w:rFonts w:ascii="Archivo" w:cs="Archivo" w:eastAsia="Archivo" w:hAnsi="Archivo"/>
+          <w:sz w:val="21"/>
+          <w:szCs w:val="21"/>
+        </w:rPr>
+        <w:t xml:space="preserve">El artículo 3 LCS es, junto con el artículo 20, el precepto más invocado en la litigación sobre seguros de hogar. Su tenor es el siguiente:</w:t>
+      </w:r>
+    </w:p>
+    <w:tbl>
+      <w:tblPr>
+        <w:tblW w:type="pct" w:w="100%"/>
+        <w:tblBorders>
+          <w:top w:val="single" w:color="CBD5E1" w:sz="4"/>
+          <w:left w:val="single" w:color="1B6DF0" w:sz="24"/>
+          <w:bottom w:val="single" w:color="CBD5E1" w:sz="4"/>
+          <w:right w:val="single" w:color="CBD5E1" w:sz="4"/>
+          <w:insideH w:val="single" w:color="auto" w:sz="4"/>
+          <w:insideV w:val="single" w:color="auto" w:sz="4"/>
+        </w:tblBorders>
+      </w:tblPr>
+      <w:tblGrid>
+        <w:gridCol w:w="100"/>
+      </w:tblGrid>
+      <w:tr>
+        <w:tc>
+          <w:tcPr>
+            <w:shd w:fill="F4F6F9" w:val="clear"/>
+            <w:tcMar>
+              <w:top w:type="dxa" w:w="160"/>
+              <w:left w:type="dxa" w:w="220"/>
+              <w:bottom w:type="dxa" w:w="160"/>
+              <w:right w:type="dxa" w:w="220"/>
+            </w:tcMar>
+          </w:tcPr>
+          <w:p>
+            <w:pPr>
+              <w:spacing w:after="100"/>
+            </w:pPr>
+            <w:r>
+              <w:rPr>
+                <w:rFonts w:ascii="Archivo" w:cs="Archivo" w:eastAsia="Archivo" w:hAnsi="Archivo"/>
+                <w:b/>
+                <w:bCs/>
+                <w:caps/>
+                <w:color w:val="1B6DF0"/>
+                <w:sz w:val="18"/>
+                <w:szCs w:val="18"/>
+              </w:rPr>
+              <w:t xml:space="preserve">Texto legal · Art. 3 LCS</w:t>
+            </w:r>
+          </w:p>
+          <w:p>
+            <w:pPr>
+              <w:spacing w:after="0" w:line="280"/>
+              <w:jc w:val="both"/>
+            </w:pPr>
+            <w:r>
+              <w:rPr>
+                <w:rFonts w:ascii="IBM Plex Mono" w:cs="IBM Plex Mono" w:eastAsia="IBM Plex Mono" w:hAnsi="IBM Plex Mono"/>
+                <w:i/>
+                <w:iCs/>
+                <w:color w:val="0A2540"/>
+                <w:sz w:val="18"/>
+                <w:szCs w:val="18"/>
+              </w:rPr>
+              <w:t xml:space="preserve">Las condiciones generales, que en ningún caso podrán tener carácter lesivo para los asegurados, habrán de incluirse por el asegurador en la proposición de seguro si la hubiere y necesariamente en la póliza de contrato o en un documento complementario, que se suscribirá por el asegurado y al que se entregará copia del mismo. Las condiciones generales y particulares se redactarán de forma clara y precisa. Se destacarán de modo especial las cláusulas limitativas de los derechos de los asegurados, que deberán ser específicamente aceptadas por escrito. [...] Declarada por el Tribunal Supremo la nulidad de alguna de las cláusulas de las condiciones generales de un contrato, la Administración Pública competente obligará a los aseguradores a modificar las cláusulas idénticas contenidas en sus pólizas.</w:t>
+            </w:r>
+          </w:p>
+        </w:tc>
+      </w:tr>
+    </w:tbl>
+    <w:p>
+      <w:pPr>
+        <w:spacing w:after="180" w:line="300"/>
+        <w:jc w:val="both"/>
+      </w:pPr>
+      <w:r>
+        <w:rPr>
+          <w:rFonts w:ascii="Archivo" w:cs="Archivo" w:eastAsia="Archivo" w:hAnsi="Archivo"/>
+          <w:sz w:val="21"/>
+          <w:szCs w:val="21"/>
+        </w:rPr>
+        <w:t xml:space="preserve">De este precepto derivan dos regímenes jurídicos distintos que el intérprete debe aprender a diferenciar ante cada cláusula controvertida</w:t>
+      </w:r>
+      <w:r>
+        <w:rPr>
+          <w:rStyle w:val="FootnoteReference"/>
+        </w:rPr>
+        <w:footnoteReference w:id="4"/>
+      </w:r>
+      <w:r>
+        <w:rPr>
+          <w:rFonts w:ascii="Archivo" w:cs="Archivo" w:eastAsia="Archivo" w:hAnsi="Archivo"/>
+          <w:sz w:val="21"/>
+          <w:szCs w:val="21"/>
+        </w:rPr>
+        <w:t xml:space="preserve">:</w:t>
+      </w:r>
+    </w:p>
+    <w:p>
+      <w:pPr>
+        <w:pStyle w:val="ListParagraph"/>
+        <w:numPr>
+          <w:ilvl w:val="0"/>
+          <w:numId w:val="2"/>
+        </w:numPr>
+        <w:spacing w:after="100" w:line="290"/>
+      </w:pPr>
+      <w:r>
+        <w:rPr>
+          <w:rFonts w:ascii="Archivo" w:cs="Archivo" w:eastAsia="Archivo" w:hAnsi="Archivo"/>
+          <w:b/>
+          <w:bCs/>
+          <w:sz w:val="21"/>
+          <w:szCs w:val="21"/>
+        </w:rPr>
+        <w:t xml:space="preserve">Cláusulas delimitadoras del riesgo: </w:t>
+      </w:r>
+      <w:r>
+        <w:rPr>
+          <w:rFonts w:ascii="Archivo" w:cs="Archivo" w:eastAsia="Archivo" w:hAnsi="Archivo"/>
+          <w:sz w:val="21"/>
+          <w:szCs w:val="21"/>
+        </w:rPr>
+        <w:t xml:space="preserve">concretan el objeto del contrato, fijando qué riesgos, en caso de producirse, hacen surgir el derecho a la prestación. Basta su inclusión en condiciones generales aceptadas de forma genérica al perfeccionarse el contrato, sin necesidad de firma o aceptación específica adicional.</w:t>
+      </w:r>
+    </w:p>
+    <w:p>
+      <w:pPr>
+        <w:pStyle w:val="ListParagraph"/>
+        <w:numPr>
+          <w:ilvl w:val="0"/>
+          <w:numId w:val="2"/>
+        </w:numPr>
+        <w:spacing w:after="100" w:line="290"/>
+      </w:pPr>
+      <w:r>
+        <w:rPr>
+          <w:rFonts w:ascii="Archivo" w:cs="Archivo" w:eastAsia="Archivo" w:hAnsi="Archivo"/>
+          <w:b/>
+          <w:bCs/>
+          <w:sz w:val="21"/>
+          <w:szCs w:val="21"/>
+        </w:rPr>
+        <w:t xml:space="preserve">Cláusulas limitativas de los derechos del asegurado: </w:t>
+      </w:r>
+      <w:r>
+        <w:rPr>
+          <w:rFonts w:ascii="Archivo" w:cs="Archivo" w:eastAsia="Archivo" w:hAnsi="Archivo"/>
+          <w:sz w:val="21"/>
+          <w:szCs w:val="21"/>
+        </w:rPr>
+        <w:t xml:space="preserve">una vez nacido el derecho a la prestación, lo restringen, condicionan o modifican. Exigen, bajo pena de inoponibilidad al asegurado, que estén destacadas de modo especial y que sean específicamente aceptadas por escrito (doble requisito: destacado formal + firma o aceptación expresa distinta de la firma general de la póliza).</w:t>
+      </w:r>
+    </w:p>
+    <w:p>
+      <w:pPr>
+        <w:spacing w:after="180" w:line="300"/>
+        <w:jc w:val="both"/>
+      </w:pPr>
+      <w:r>
+        <w:rPr>
+          <w:rFonts w:ascii="Archivo" w:cs="Archivo" w:eastAsia="Archivo" w:hAnsi="Archivo"/>
+          <w:sz w:val="21"/>
+          <w:szCs w:val="21"/>
+        </w:rPr>
+        <w:t xml:space="preserve">La distinción, aparentemente sencilla en el plano teórico, resulta enormemente controvertida en su aplicación práctica y ha generado una jurisprudencia extensa y matizada</w:t>
+      </w:r>
+      <w:r>
+        <w:rPr>
+          <w:rStyle w:val="FootnoteReference"/>
+        </w:rPr>
+        <w:footnoteReference w:id="5"/>
+      </w:r>
+      <w:r>
+        <w:rPr>
+          <w:rFonts w:ascii="Archivo" w:cs="Archivo" w:eastAsia="Archivo" w:hAnsi="Archivo"/>
+          <w:sz w:val="21"/>
+          <w:szCs w:val="21"/>
+        </w:rPr>
+        <w:t xml:space="preserve">. La sentencia de contraste —invocada de forma constante por la Sala Primera hasta la actualidad— es la STS (Pleno), Sala de lo Civil, núm. 853/2006, de 11 de septiembre, cuya doctrina resume con fidelidad la más reciente STS, Sala de lo Civil, de 3 de octubre de 2023 (ROJ: STS 3996/2023; ECLI:ES:TS:2023:3996; ponente: Excmo. Sr. D. José Luis Seoane Spiegelberg):</w:t>
       </w:r>
     </w:p>
     <w:tbl>
@@ -2018,7 +2382,7 @@
                 <w:sz w:val="18"/>
                 <w:szCs w:val="18"/>
               </w:rPr>
-              <w:t xml:space="preserve">Jurisprudencia · STS 3996/2023, de 3 de octubre (ECLI:ES:TS:2023:3996)</w:t>
+              <w:t xml:space="preserve">Jurisprudencia · STS, Sala de lo Civil, de 3 de octubre de 2023 (ROJ: STS 3996/2023; ECLI:ES:TS:2023:3996; MP: Seoane Spiegelberg)</w:t>
             </w:r>
           </w:p>
           <w:p>
@@ -2050,7 +2414,7 @@
           <w:sz w:val="21"/>
           <w:szCs w:val="21"/>
         </w:rPr>
-        <w:t xml:space="preserve">La misma doctrina se reitera, aplicada a un seguro multirriesgo de comercio pero plenamente extrapolable al de hogar, en la STS 1751/2025, de 21 de abril (ECLI:ES:TS:2025:1751), que insiste en el criterio de la «cláusula sorpresiva» como indicio decisivo: una condición general que, aunque formalmente delimite el riesgo, se aparta del contenido natural o usual de la modalidad contratada y frustra las expectativas razonables del asegurado, recibe en la práctica el tratamiento —y las garantías formales— propio de las cláusulas limitativas.</w:t>
+        <w:t xml:space="preserve">La misma doctrina se reitera, aplicada a un seguro multirriesgo de comercio pero plenamente extrapolable al de hogar por identidad de razón, en la sentencia núm. 602/2025, de 21 de abril, reproducida literalmente por la STS de la misma fecha (ROJ: STS 1751/2025; ECLI:ES:TS:2025:1751; MP: García Martínez), que insiste en el criterio de la «cláusula sorpresiva» como indicio decisivo: una condición general que, aunque formalmente delimite el riesgo, se aparta del contenido natural o usual de la modalidad contratada y frustra las expectativas razonables del asegurado, recibe en la práctica el tratamiento —y las garantías formales— propio de las cláusulas limitativas.</w:t>
       </w:r>
     </w:p>
     <w:p>
@@ -2064,7 +2428,7 @@
           <w:sz w:val="21"/>
           <w:szCs w:val="21"/>
         </w:rPr>
-        <w:t xml:space="preserve">La aplicación práctica de esta doctrina al seguro de hogar puede ilustrarse con la STS 2233/2020, de 6 de julio (ECLI:ES:TS:2020:2233, ponente Seoane Spiegelberg), referida precisamente a una póliza multirriesgo del hogar:</w:t>
+        <w:t xml:space="preserve">La proyección de esta doctrina sobre el seguro de hogar en sentido estricto puede ilustrarse con la STS, Sala de lo Civil, de 6 de julio de 2020 (ROJ: STS 2233/2020; ECLI:ES:TS:2020:2233; MP: Seoane Spiegelberg), referida precisamente a una póliza multirriesgo del hogar:</w:t>
       </w:r>
     </w:p>
     <w:tbl>
@@ -2107,7 +2471,7 @@
                 <w:sz w:val="18"/>
                 <w:szCs w:val="18"/>
               </w:rPr>
-              <w:t xml:space="preserve">Jurisprudencia · STS 2233/2020, de 6 de julio (ECLI:ES:TS:2020:2233)</w:t>
+              <w:t xml:space="preserve">Jurisprudencia · STS, Sala de lo Civil, de 6 de julio de 2020 (ROJ: STS 2233/2020; ECLI:ES:TS:2020:2233; MP: Seoane Spiegelberg)</w:t>
             </w:r>
           </w:p>
           <w:p>
@@ -2139,7 +2503,21 @@
           <w:sz w:val="21"/>
           <w:szCs w:val="21"/>
         </w:rPr>
-        <w:t xml:space="preserve">De esta línea jurisprudencial se extrae una regla práctica de gran utilidad: cuando una cláusula, aunque formalmente incluida en el capítulo de «definiciones» o de «cobertura», tiene el efecto real de reducir lo que el asegurado razonablemente esperaba obtener contratando ese tipo de seguro (por ejemplo, valorar el contenido por su valor real y no de reposición, limitar cuantitativamente una cobertura de defensa jurídica anunciada como «ilimitada», o excluir de facto un riesgo típico del ramo), los tribunales tienden a reconducirla al régimen de las limitativas, con independencia de su ubicación formal en la póliza.</w:t>
+        <w:t xml:space="preserve">De esta línea jurisprudencial se extrae una regla práctica de general aplicación: cuando una cláusula, aunque formalmente incluida en el capítulo de «definiciones» o de «cobertura», tiene el efecto real de reducir lo que el asegurado razonablemente esperaba obtener contratando ese tipo de seguro (por ejemplo, valorar el contenido por su valor real y no de reposición, limitar cuantitativamente una cobertura de defensa jurídica anunciada como «ilimitada», o excluir de facto un riesgo típico del ramo), los tribunales tienden a reconducirla al régimen de las limitativas, con independencia de su ubicación formal en la póliza</w:t>
+      </w:r>
+      <w:r>
+        <w:rPr>
+          <w:rStyle w:val="FootnoteReference"/>
+        </w:rPr>
+        <w:footnoteReference w:id="6"/>
+      </w:r>
+      <w:r>
+        <w:rPr>
+          <w:rFonts w:ascii="Archivo" w:cs="Archivo" w:eastAsia="Archivo" w:hAnsi="Archivo"/>
+          <w:sz w:val="21"/>
+          <w:szCs w:val="21"/>
+        </w:rPr>
+        <w:t xml:space="preserve">.</w:t>
       </w:r>
     </w:p>
     <w:p>
@@ -2170,7 +2548,39 @@
           <w:sz w:val="21"/>
           <w:szCs w:val="21"/>
         </w:rPr>
-        <w:t xml:space="preserve">La STS 732/2017, de 2 de marzo (ECLI:ES:TS:2017:732, ponente Orduña Moreno), añade una capa adicional de análisis especialmente útil para el profesional que revisa una póliza controvertida: el «principio de transparencia», que subyace a todo el artículo 3 LCS y que «opera con especial intensidad respecto de las cláusulas introductorias o particulares». Cuando una cláusula general introduce, so capa de definición, un «insólito plus» restrictivo no anunciado en las condiciones particulares ni en la información precontractual, la sala aprecia su carácter sorpresivo y, por ello, limitativo, con independencia de la etiqueta que le haya dado el redactor de la póliza.</w:t>
+        <w:t xml:space="preserve">La STS, Sala de lo Civil, de 2 de marzo de 2017 (ROJ: STS 732/2017; ECLI:ES:TS:2017:732; MP: Orduña Moreno), añade una capa adicional de análisis especialmente útil para el intérprete que revisa una póliza controvertida: el «principio de transparencia», que subyace a todo el artículo 3 LCS y que</w:t>
+      </w:r>
+      <w:r>
+        <w:rPr>
+          <w:rFonts w:ascii="Archivo" w:cs="Archivo" w:eastAsia="Archivo" w:hAnsi="Archivo"/>
+          <w:i/>
+          <w:iCs/>
+          <w:sz w:val="21"/>
+          <w:szCs w:val="21"/>
+        </w:rPr>
+        <w:t xml:space="preserve"> «opera con especial intensidad respecto de las cláusulas introductorias o particulares»</w:t>
+      </w:r>
+      <w:r>
+        <w:rPr>
+          <w:rFonts w:ascii="Archivo" w:cs="Archivo" w:eastAsia="Archivo" w:hAnsi="Archivo"/>
+          <w:sz w:val="21"/>
+          <w:szCs w:val="21"/>
+        </w:rPr>
+        <w:t xml:space="preserve">. Cuando una cláusula general introduce, so capa de definición, un «insólito plus» restrictivo no anunciado en las condiciones particulares ni en la información precontractual, la Sala aprecia su carácter sorpresivo y, por ello, limitativo, con independencia de la etiqueta que le haya dado el redactor de la póliza</w:t>
+      </w:r>
+      <w:r>
+        <w:rPr>
+          <w:rStyle w:val="FootnoteReference"/>
+        </w:rPr>
+        <w:footnoteReference w:id="7"/>
+      </w:r>
+      <w:r>
+        <w:rPr>
+          <w:rFonts w:ascii="Archivo" w:cs="Archivo" w:eastAsia="Archivo" w:hAnsi="Archivo"/>
+          <w:sz w:val="21"/>
+          <w:szCs w:val="21"/>
+        </w:rPr>
+        <w:t xml:space="preserve">.</w:t>
       </w:r>
     </w:p>
     <w:p>
@@ -2689,6 +3099,1991 @@
         <w:t xml:space="preserve">10. Fecha de efecto, forma de pago de la prima y consecuencias del impago (art. 15 LCS).</w:t>
       </w:r>
     </w:p>
+    <w:p>
+      <w:pPr>
+        <w:pStyle w:val="Heading2"/>
+        <w:spacing w:after="160" w:before="400"/>
+      </w:pPr>
+      <w:r>
+        <w:rPr>
+          <w:rFonts w:ascii="Fraunces" w:cs="Fraunces" w:eastAsia="Fraunces" w:hAnsi="Fraunces"/>
+          <w:b/>
+          <w:bCs/>
+          <w:color w:val="0A2540"/>
+          <w:sz w:val="24"/>
+          <w:szCs w:val="24"/>
+        </w:rPr>
+        <w:t xml:space="preserve">Bibliografía citada</w:t>
+      </w:r>
+    </w:p>
+    <w:p>
+      <w:pPr>
+        <w:spacing w:after="180" w:line="300"/>
+        <w:jc w:val="both"/>
+      </w:pPr>
+      <w:r>
+        <w:rPr>
+          <w:rFonts w:ascii="Archivo" w:cs="Archivo" w:eastAsia="Archivo" w:hAnsi="Archivo"/>
+          <w:sz w:val="21"/>
+          <w:szCs w:val="21"/>
+        </w:rPr>
+        <w:t xml:space="preserve">BATALLER GRAU, J.; BOQUERA MATARREDONA, J.; OLAVARRÍA IGLESIA, J. (coords.), Comentarios a la Ley de Contrato de Seguro, Tirant lo Blanch, Valencia.</w:t>
+      </w:r>
+    </w:p>
+    <w:p>
+      <w:pPr>
+        <w:spacing w:after="180" w:line="300"/>
+        <w:jc w:val="both"/>
+      </w:pPr>
+      <w:r>
+        <w:rPr>
+          <w:rFonts w:ascii="Archivo" w:cs="Archivo" w:eastAsia="Archivo" w:hAnsi="Archivo"/>
+          <w:sz w:val="21"/>
+          <w:szCs w:val="21"/>
+        </w:rPr>
+        <w:t xml:space="preserve">SÁNCHEZ CALERO, F. (dir.), Ley de Contrato de Seguro. Comentarios a la Ley 50/1980, de 8 de octubre, y a sus modificaciones, Aranzadi-Thomson Reuters, Cizur Menor.</w:t>
+      </w:r>
+    </w:p>
+    <w:p>
+      <w:pPr>
+        <w:spacing w:after="180" w:line="300"/>
+        <w:jc w:val="both"/>
+      </w:pPr>
+      <w:r>
+        <w:rPr>
+          <w:rFonts w:ascii="Archivo" w:cs="Archivo" w:eastAsia="Archivo" w:hAnsi="Archivo"/>
+          <w:sz w:val="21"/>
+          <w:szCs w:val="21"/>
+        </w:rPr>
+        <w:t xml:space="preserve">TIRADO SUÁREZ, F. J., en URÍA, R.; MENÉNDEZ, A.; OLIVENCIA, M. (dirs.), Comentarios al Código de Comercio y legislación mercantil especial, tomo XXIV, vol. 1.º, Edersa/Civitas, Madrid.</w:t>
+      </w:r>
+    </w:p>
+    <w:p>
+      <w:pPr>
+        <w:spacing w:after="180" w:line="300"/>
+        <w:jc w:val="both"/>
+      </w:pPr>
+      <w:r>
+        <w:rPr>
+          <w:rFonts w:ascii="Archivo" w:cs="Archivo" w:eastAsia="Archivo" w:hAnsi="Archivo"/>
+          <w:sz w:val="21"/>
+          <w:szCs w:val="21"/>
+        </w:rPr>
+        <w:t xml:space="preserve">VEIGA COPO, A. B., Tratado del Contrato de Seguro, Civitas-Thomson Reuters, Cizur Menor.</w:t>
+      </w:r>
+    </w:p>
+    <w:p>
+      <w:pPr>
+        <w:spacing w:after="180" w:line="300"/>
+        <w:jc w:val="both"/>
+      </w:pPr>
+      <w:r>
+        <w:rPr>
+          <w:rFonts w:ascii="Archivo" w:cs="Archivo" w:eastAsia="Archivo" w:hAnsi="Archivo"/>
+          <w:sz w:val="21"/>
+          <w:szCs w:val="21"/>
+        </w:rPr>
+        <w:t xml:space="preserve">VEIGA COPO, A. B., Condiciones generales y particulares en el contrato de seguro, Civitas-Thomson Reuters, Cizur Menor.</w:t>
+      </w:r>
+    </w:p>
+    <w:p>
+      <w:pPr>
+        <w:spacing w:after="180" w:line="300"/>
+        <w:jc w:val="both"/>
+      </w:pPr>
+      <w:r>
+        <w:rPr>
+          <w:rFonts w:ascii="Archivo" w:cs="Archivo" w:eastAsia="Archivo" w:hAnsi="Archivo"/>
+          <w:sz w:val="21"/>
+          <w:szCs w:val="21"/>
+        </w:rPr>
+        <w:t xml:space="preserve">Revista Española de Seguros (RES), Sección Española de la Asociación Internacional de Derecho de Seguros (SEAIDA), Madrid.</w:t>
+      </w:r>
+    </w:p>
+    <w:p>
+      <w:pPr>
+        <w:pageBreakBefore/>
+        <w:spacing w:after="200" w:before="2000"/>
+      </w:pPr>
+      <w:r>
+        <w:rPr>
+          <w:rFonts w:ascii="Archivo" w:cs="Archivo" w:eastAsia="Archivo" w:hAnsi="Archivo"/>
+          <w:b/>
+          <w:bCs/>
+          <w:color w:val="1B6DF0"/>
+          <w:sz w:val="28"/>
+          <w:szCs w:val="28"/>
+        </w:rPr>
+        <w:t xml:space="preserve">PARTE V</w:t>
+      </w:r>
+    </w:p>
+    <w:p>
+      <w:pPr>
+        <w:pBdr>
+          <w:bottom w:val="single" w:color="CBD5E1" w:sz="6" w:space="12"/>
+        </w:pBdr>
+        <w:spacing w:after="600"/>
+      </w:pPr>
+      <w:r>
+        <w:rPr>
+          <w:rFonts w:ascii="Fraunces" w:cs="Fraunces" w:eastAsia="Fraunces" w:hAnsi="Fraunces"/>
+          <w:b/>
+          <w:bCs/>
+          <w:color w:val="0A2540"/>
+          <w:sz w:val="44"/>
+          <w:szCs w:val="44"/>
+        </w:rPr>
+        <w:t xml:space="preserve">Anexos prácticos</w:t>
+      </w:r>
+    </w:p>
+    <w:p>
+      <w:pPr>
+        <w:pStyle w:val="Heading1"/>
+        <w:pageBreakBefore/>
+        <w:spacing w:after="300"/>
+      </w:pPr>
+      <w:r>
+        <w:rPr>
+          <w:rFonts w:ascii="Fraunces" w:cs="Fraunces" w:eastAsia="Fraunces" w:hAnsi="Fraunces"/>
+          <w:b/>
+          <w:bCs/>
+          <w:color w:val="0A2540"/>
+          <w:sz w:val="30"/>
+          <w:szCs w:val="30"/>
+        </w:rPr>
+        <w:t xml:space="preserve">Anexo IV. Modelos y formularios</w:t>
+      </w:r>
+    </w:p>
+    <w:p>
+      <w:pPr>
+        <w:spacing w:after="180" w:line="300"/>
+        <w:jc w:val="both"/>
+      </w:pPr>
+      <w:r>
+        <w:rPr>
+          <w:rFonts w:ascii="Archivo" w:cs="Archivo" w:eastAsia="Archivo" w:hAnsi="Archivo"/>
+          <w:sz w:val="21"/>
+          <w:szCs w:val="21"/>
+        </w:rPr>
+        <w:t xml:space="preserve">Se recogen a continuación seis modelos de escritos de uso frecuente en la práctica del seguro de hogar, ordenados según la secuencia habitual de una reclamación: de la vía extrajudicial (burofax de reclamación previa, escrito ante el Servicio de Atención al Cliente, escrito de designación e impugnación pericial) a la vía judicial (demandas de juicio verbal y de reclamación de intereses del art. 20 LCS) y a la vía administrativa de supervisión (queja ante la DGSFP).</w:t>
+      </w:r>
+    </w:p>
+    <w:p>
+      <w:pPr>
+        <w:spacing w:after="180" w:line="300"/>
+        <w:jc w:val="both"/>
+      </w:pPr>
+      <w:r>
+        <w:rPr>
+          <w:rFonts w:ascii="Archivo" w:cs="Archivo" w:eastAsia="Archivo" w:hAnsi="Archivo"/>
+          <w:sz w:val="21"/>
+          <w:szCs w:val="21"/>
+        </w:rPr>
+        <w:t xml:space="preserve">Los modelos se ofrecen como plantilla de trabajo y no como escrito cerrado: los datos entre corchetes deben sustituirse por los del caso concreto, y los fundamentos jurídicos deben completarse y adaptarse a las circunstancias fácticas y a la póliza efectivamente contratada. Los preceptos legales citados en cada modelo se corresponden con el texto consolidado vigente en la fecha de cierre de este anexo.</w:t>
+      </w:r>
+    </w:p>
+    <w:p>
+      <w:pPr>
+        <w:spacing w:after="200"/>
+      </w:pPr>
+    </w:p>
+    <w:p>
+      <w:pPr>
+        <w:pStyle w:val="Heading2"/>
+        <w:spacing w:after="160" w:before="400"/>
+      </w:pPr>
+      <w:r>
+        <w:rPr>
+          <w:rFonts w:ascii="Fraunces" w:cs="Fraunces" w:eastAsia="Fraunces" w:hAnsi="Fraunces"/>
+          <w:b/>
+          <w:bCs/>
+          <w:color w:val="0A2540"/>
+          <w:sz w:val="24"/>
+          <w:szCs w:val="24"/>
+        </w:rPr>
+        <w:t xml:space="preserve">Modelo 1. Burofax de reclamación previa a la aseguradora</w:t>
+      </w:r>
+    </w:p>
+    <w:p>
+      <w:pPr>
+        <w:spacing w:after="180" w:line="300"/>
+        <w:jc w:val="both"/>
+      </w:pPr>
+      <w:r>
+        <w:rPr>
+          <w:rFonts w:ascii="Archivo" w:cs="Archivo" w:eastAsia="Archivo" w:hAnsi="Archivo"/>
+          <w:i/>
+          <w:iCs/>
+          <w:sz w:val="21"/>
+          <w:szCs w:val="21"/>
+        </w:rPr>
+        <w:t xml:space="preserve">Escrito extrajudicial dirigido a la aseguradora para reclamar el pago de la indemnización, dejar constancia fehaciente de la reclamación e interrumpir el plazo de prescripción de dos años del art. 23 LCS, conforme al art. 1973 CC. Es, además, presupuesto habitual —y en muchos casos exigencia contractual o de buena práctica procesal— antes de acudir a la vía judicial.</w:t>
+      </w:r>
+    </w:p>
+    <w:p>
+      <w:pPr>
+        <w:spacing w:after="120"/>
+      </w:pPr>
+    </w:p>
+    <w:tbl>
+      <w:tblPr>
+        <w:tblW w:type="pct" w:w="100%"/>
+        <w:tblBorders>
+          <w:top w:val="single" w:color="CBD5E1" w:sz="4"/>
+          <w:left w:val="single" w:color="CBD5E1" w:sz="4"/>
+          <w:bottom w:val="single" w:color="CBD5E1" w:sz="4"/>
+          <w:right w:val="single" w:color="CBD5E1" w:sz="4"/>
+          <w:insideH w:val="single" w:color="auto" w:sz="4"/>
+          <w:insideV w:val="single" w:color="auto" w:sz="4"/>
+        </w:tblBorders>
+      </w:tblPr>
+      <w:tblGrid>
+        <w:gridCol w:w="100"/>
+      </w:tblGrid>
+      <w:tr>
+        <w:tc>
+          <w:tcPr>
+            <w:tcMar>
+              <w:top w:type="dxa" w:w="260"/>
+              <w:left w:type="dxa" w:w="320"/>
+              <w:bottom w:type="dxa" w:w="260"/>
+              <w:right w:type="dxa" w:w="320"/>
+            </w:tcMar>
+          </w:tcPr>
+          <w:p>
+            <w:pPr>
+              <w:spacing w:after="160"/>
+              <w:jc w:val="center"/>
+            </w:pPr>
+            <w:r>
+              <w:rPr>
+                <w:rFonts w:ascii="Archivo" w:cs="Archivo" w:eastAsia="Archivo" w:hAnsi="Archivo"/>
+                <w:b/>
+                <w:bCs/>
+                <w:caps w:val="false"/>
+                <w:sz w:val="21"/>
+                <w:szCs w:val="21"/>
+              </w:rPr>
+              <w:t xml:space="preserve">RECLAMACIÓN PREVIA DE INDEMNIZACIÓN DERIVADA DE CONTRATO DE SEGURO</w:t>
+            </w:r>
+          </w:p>
+          <w:p>
+            <w:pPr>
+              <w:spacing w:after="120"/>
+            </w:pPr>
+            <w:r>
+              <w:rPr>
+                <w:rFonts w:ascii="Archivo" w:cs="Archivo" w:eastAsia="Archivo" w:hAnsi="Archivo"/>
+                <w:b/>
+                <w:bCs/>
+                <w:sz w:val="20"/>
+                <w:szCs w:val="20"/>
+              </w:rPr>
+              <w:t xml:space="preserve">Remite: </w:t>
+            </w:r>
+            <w:r>
+              <w:rPr>
+                <w:rFonts w:ascii="Archivo" w:cs="Archivo" w:eastAsia="Archivo" w:hAnsi="Archivo"/>
+                <w:color w:val="6B7A8F"/>
+                <w:sz w:val="20"/>
+                <w:szCs w:val="20"/>
+              </w:rPr>
+              <w:t xml:space="preserve">……………………………………………………………………………</w:t>
+            </w:r>
+          </w:p>
+          <w:p>
+            <w:pPr>
+              <w:spacing w:after="120"/>
+            </w:pPr>
+            <w:r>
+              <w:rPr>
+                <w:rFonts w:ascii="Archivo" w:cs="Archivo" w:eastAsia="Archivo" w:hAnsi="Archivo"/>
+                <w:b/>
+                <w:bCs/>
+                <w:sz w:val="20"/>
+                <w:szCs w:val="20"/>
+              </w:rPr>
+              <w:t xml:space="preserve">Destinatario (aseguradora): </w:t>
+            </w:r>
+            <w:r>
+              <w:rPr>
+                <w:rFonts w:ascii="Archivo" w:cs="Archivo" w:eastAsia="Archivo" w:hAnsi="Archivo"/>
+                <w:color w:val="6B7A8F"/>
+                <w:sz w:val="20"/>
+                <w:szCs w:val="20"/>
+              </w:rPr>
+              <w:t xml:space="preserve">……………………………………………………………………………</w:t>
+            </w:r>
+          </w:p>
+          <w:p>
+            <w:pPr>
+              <w:spacing w:after="120"/>
+            </w:pPr>
+            <w:r>
+              <w:rPr>
+                <w:rFonts w:ascii="Archivo" w:cs="Archivo" w:eastAsia="Archivo" w:hAnsi="Archivo"/>
+                <w:b/>
+                <w:bCs/>
+                <w:sz w:val="20"/>
+                <w:szCs w:val="20"/>
+              </w:rPr>
+              <w:t xml:space="preserve">Referencia de póliza n.º: </w:t>
+            </w:r>
+            <w:r>
+              <w:rPr>
+                <w:rFonts w:ascii="Archivo" w:cs="Archivo" w:eastAsia="Archivo" w:hAnsi="Archivo"/>
+                <w:color w:val="6B7A8F"/>
+                <w:sz w:val="20"/>
+                <w:szCs w:val="20"/>
+              </w:rPr>
+              <w:t xml:space="preserve">……………………………………………………………………………</w:t>
+            </w:r>
+          </w:p>
+          <w:p>
+            <w:pPr>
+              <w:spacing w:after="120"/>
+            </w:pPr>
+            <w:r>
+              <w:rPr>
+                <w:rFonts w:ascii="Archivo" w:cs="Archivo" w:eastAsia="Archivo" w:hAnsi="Archivo"/>
+                <w:b/>
+                <w:bCs/>
+                <w:sz w:val="20"/>
+                <w:szCs w:val="20"/>
+              </w:rPr>
+              <w:t xml:space="preserve">Referencia de siniestro / expediente n.º: </w:t>
+            </w:r>
+            <w:r>
+              <w:rPr>
+                <w:rFonts w:ascii="Archivo" w:cs="Archivo" w:eastAsia="Archivo" w:hAnsi="Archivo"/>
+                <w:color w:val="6B7A8F"/>
+                <w:sz w:val="20"/>
+                <w:szCs w:val="20"/>
+              </w:rPr>
+              <w:t xml:space="preserve">……………………………………………………………………………</w:t>
+            </w:r>
+          </w:p>
+          <w:p>
+            <w:pPr>
+              <w:spacing w:after="120"/>
+            </w:pPr>
+          </w:p>
+          <w:p>
+            <w:pPr>
+              <w:spacing w:after="160" w:line="300"/>
+              <w:jc w:val="both"/>
+            </w:pPr>
+            <w:r>
+              <w:rPr>
+                <w:rFonts w:ascii="Archivo" w:cs="Archivo" w:eastAsia="Archivo" w:hAnsi="Archivo"/>
+                <w:sz w:val="20"/>
+                <w:szCs w:val="20"/>
+              </w:rPr>
+              <w:t xml:space="preserve">Muy Sres. míos:</w:t>
+            </w:r>
+          </w:p>
+          <w:p>
+            <w:pPr>
+              <w:spacing w:after="160" w:line="300"/>
+              <w:ind w:firstLine="400"/>
+              <w:jc w:val="both"/>
+            </w:pPr>
+            <w:r>
+              <w:rPr>
+                <w:rFonts w:ascii="Archivo" w:cs="Archivo" w:eastAsia="Archivo" w:hAnsi="Archivo"/>
+                <w:sz w:val="20"/>
+                <w:szCs w:val="20"/>
+              </w:rPr>
+              <w:t xml:space="preserve">Por medio de la presente, en mi condición de </w:t>
+            </w:r>
+            <w:r>
+              <w:rPr>
+                <w:rFonts w:ascii="Archivo" w:cs="Archivo" w:eastAsia="Archivo" w:hAnsi="Archivo"/>
+                <w:b/>
+                <w:bCs/>
+                <w:sz w:val="21"/>
+                <w:szCs w:val="21"/>
+              </w:rPr>
+              <w:t xml:space="preserve">[tomador / asegurado]</w:t>
+            </w:r>
+            <w:r>
+              <w:rPr>
+                <w:rFonts w:ascii="Archivo" w:cs="Archivo" w:eastAsia="Archivo" w:hAnsi="Archivo"/>
+                <w:sz w:val="20"/>
+                <w:szCs w:val="20"/>
+              </w:rPr>
+              <w:t xml:space="preserve"> de la póliza de seguro multirriesgo de hogar arriba referenciada, suscrita con esa aseguradora con efectos desde el [fecha], me dirijo a Vds. para formular reclamación previa en relación con el siniestro ocurrido el día [fecha del siniestro], consistente en [breve descripción del siniestro: daños por agua / incendio / robo / responsabilidad civil], y que fue comunicado a esa compañía el día [fecha de comunicación] mediante [parte de siniestro / llamada telefónica / correo electrónico], quedando registrado con el número de expediente arriba indicado.</w:t>
+            </w:r>
+          </w:p>
+          <w:p>
+            <w:pPr>
+              <w:spacing w:after="160" w:line="300"/>
+              <w:ind w:firstLine="400"/>
+              <w:jc w:val="both"/>
+            </w:pPr>
+            <w:r>
+              <w:rPr>
+                <w:rFonts w:ascii="Archivo" w:cs="Archivo" w:eastAsia="Archivo" w:hAnsi="Archivo"/>
+                <w:sz w:val="20"/>
+                <w:szCs w:val="20"/>
+              </w:rPr>
+              <w:t xml:space="preserve">PRIMERO.- Que, pese al tiempo transcurrido desde la comunicación del siniestro, esa aseguradora [no ha emitido pronunciamiento alguno sobre la cobertura / ha denegado la cobertura mediante comunicación de fecha (...) por el motivo de (...) / ha ofrecido una indemnización que se considera insuficiente por importe de (...) euros, frente a los daños reales tasados en (...) euros].</w:t>
+            </w:r>
+          </w:p>
+          <w:p>
+            <w:pPr>
+              <w:spacing w:after="160" w:line="300"/>
+              <w:ind w:firstLine="400"/>
+              <w:jc w:val="both"/>
+            </w:pPr>
+            <w:r>
+              <w:rPr>
+                <w:rFonts w:ascii="Archivo" w:cs="Archivo" w:eastAsia="Archivo" w:hAnsi="Archivo"/>
+                <w:sz w:val="20"/>
+                <w:szCs w:val="20"/>
+              </w:rPr>
+              <w:t xml:space="preserve">SEGUNDO.- Que, de conformidad con el art. 1 de la Ley 50/1980, de Contrato de Seguro, la aseguradora se obliga, mediante el cobro de la prima, a indemnizar el daño producido al asegurado dentro de los límites pactados en la póliza, sin que conste causa de exclusión de cobertura aplicable al presente siniestro conforme a las condiciones generales y particulares suscritas.</w:t>
+            </w:r>
+          </w:p>
+          <w:p>
+            <w:pPr>
+              <w:spacing w:after="160" w:line="300"/>
+              <w:ind w:firstLine="400"/>
+              <w:jc w:val="both"/>
+            </w:pPr>
+            <w:r>
+              <w:rPr>
+                <w:rFonts w:ascii="Archivo" w:cs="Archivo" w:eastAsia="Archivo" w:hAnsi="Archivo"/>
+                <w:sz w:val="20"/>
+                <w:szCs w:val="20"/>
+              </w:rPr>
+              <w:t xml:space="preserve">TERCERO.- Que, conforme al art. 20 LCS, la aseguradora incurre en mora si no satisface la indemnización, o el importe mínimo de lo que pueda deber, en los plazos legalmente establecidos, lo que determina el devengo de los intereses moratorios previstos en dicho precepto desde la fecha del siniestro.</w:t>
+            </w:r>
+          </w:p>
+          <w:p>
+            <w:pPr>
+              <w:spacing w:after="160" w:line="300"/>
+              <w:ind w:firstLine="400"/>
+              <w:jc w:val="both"/>
+            </w:pPr>
+            <w:r>
+              <w:rPr>
+                <w:rFonts w:ascii="Archivo" w:cs="Archivo" w:eastAsia="Archivo" w:hAnsi="Archivo"/>
+                <w:sz w:val="20"/>
+                <w:szCs w:val="20"/>
+              </w:rPr>
+              <w:t xml:space="preserve">Por todo lo expuesto, formalmente:</w:t>
+            </w:r>
+          </w:p>
+          <w:p>
+            <w:pPr>
+              <w:spacing w:after="160" w:line="300"/>
+              <w:ind w:firstLine="400"/>
+              <w:jc w:val="both"/>
+            </w:pPr>
+            <w:r>
+              <w:rPr>
+                <w:rFonts w:ascii="Archivo" w:cs="Archivo" w:eastAsia="Archivo" w:hAnsi="Archivo"/>
+                <w:sz w:val="20"/>
+                <w:szCs w:val="20"/>
+              </w:rPr>
+              <w:t xml:space="preserve">REQUIERO a esa aseguradora para que, en el plazo de DIEZ (10) DÍAS naturales desde la recepción de la presente, proceda al abono de la indemnización que corresponda por el siniestro referenciado, por importe de [cantidad] euros, más los intereses del art. 20 LCS que resulten de aplicación, con la advertencia de que, transcurrido dicho plazo sin haber obtenido respuesta satisfactoria, me veré obligado a ejercitar las acciones legales que en Derecho me asisten, con expresa reserva de acciones y sin perjuicio de cuantos daños y perjuicios adicionales se deriven de la demora.</w:t>
+            </w:r>
+          </w:p>
+          <w:p>
+            <w:pPr>
+              <w:spacing w:after="160" w:line="300"/>
+              <w:ind w:firstLine="400"/>
+              <w:jc w:val="both"/>
+            </w:pPr>
+            <w:r>
+              <w:rPr>
+                <w:rFonts w:ascii="Archivo" w:cs="Archivo" w:eastAsia="Archivo" w:hAnsi="Archivo"/>
+                <w:sz w:val="20"/>
+                <w:szCs w:val="20"/>
+              </w:rPr>
+              <w:t xml:space="preserve">Esta comunicación se realiza, además, a los efectos previstos en el art. 1973 del Código Civil, en orden a la interrupción del plazo de prescripción de la acción derivada del contrato de seguro (art. 23 LCS).</w:t>
+            </w:r>
+          </w:p>
+          <w:p>
+            <w:pPr>
+              <w:spacing w:after="200"/>
+            </w:pPr>
+          </w:p>
+          <w:p>
+            <w:pPr>
+              <w:spacing w:after="160" w:line="300"/>
+              <w:jc w:val="both"/>
+            </w:pPr>
+            <w:r>
+              <w:rPr>
+                <w:rFonts w:ascii="Archivo" w:cs="Archivo" w:eastAsia="Archivo" w:hAnsi="Archivo"/>
+                <w:sz w:val="20"/>
+                <w:szCs w:val="20"/>
+              </w:rPr>
+              <w:t xml:space="preserve">En [lugar], a [fecha].</w:t>
+            </w:r>
+          </w:p>
+          <w:p>
+            <w:pPr>
+              <w:spacing w:after="400"/>
+            </w:pPr>
+          </w:p>
+          <w:p>
+            <w:pPr>
+              <w:spacing w:after="0"/>
+              <w:jc w:val="center"/>
+            </w:pPr>
+            <w:r>
+              <w:rPr>
+                <w:rFonts w:ascii="Archivo" w:cs="Archivo" w:eastAsia="Archivo" w:hAnsi="Archivo"/>
+                <w:b w:val="false"/>
+                <w:bCs w:val="false"/>
+                <w:caps w:val="false"/>
+                <w:sz w:val="21"/>
+                <w:szCs w:val="21"/>
+              </w:rPr>
+              <w:t xml:space="preserve">Fdo.: [nombre y apellidos / DNI]</w:t>
+            </w:r>
+          </w:p>
+        </w:tc>
+      </w:tr>
+    </w:tbl>
+    <w:p>
+      <w:pPr>
+        <w:pStyle w:val="Heading2"/>
+        <w:spacing w:after="160" w:before="400"/>
+      </w:pPr>
+      <w:r>
+        <w:rPr>
+          <w:rFonts w:ascii="Fraunces" w:cs="Fraunces" w:eastAsia="Fraunces" w:hAnsi="Fraunces"/>
+          <w:b/>
+          <w:bCs/>
+          <w:color w:val="0A2540"/>
+          <w:sz w:val="24"/>
+          <w:szCs w:val="24"/>
+        </w:rPr>
+        <w:t xml:space="preserve">Modelo 2. Reclamación ante el Servicio de Atención al Cliente y el Defensor del Asegurado</w:t>
+      </w:r>
+    </w:p>
+    <w:p>
+      <w:pPr>
+        <w:spacing w:after="180" w:line="300"/>
+        <w:jc w:val="both"/>
+      </w:pPr>
+      <w:r>
+        <w:rPr>
+          <w:rFonts w:ascii="Archivo" w:cs="Archivo" w:eastAsia="Archivo" w:hAnsi="Archivo"/>
+          <w:i/>
+          <w:iCs/>
+          <w:sz w:val="21"/>
+          <w:szCs w:val="21"/>
+        </w:rPr>
+        <w:t xml:space="preserve">Escrito con el que se agota la vía interna de reclamación de la aseguradora (art. 30 LOSSEAR y normativa de protección del cliente financiero), requisito habitual antes de acceder a la vía de reclamación ante la DGSFP (Anexo IV, Modelo 6) y elemento de prueba de la diligencia del reclamante.</w:t>
+      </w:r>
+    </w:p>
+    <w:p>
+      <w:pPr>
+        <w:spacing w:after="120"/>
+      </w:pPr>
+    </w:p>
+    <w:tbl>
+      <w:tblPr>
+        <w:tblW w:type="pct" w:w="100%"/>
+        <w:tblBorders>
+          <w:top w:val="single" w:color="CBD5E1" w:sz="4"/>
+          <w:left w:val="single" w:color="CBD5E1" w:sz="4"/>
+          <w:bottom w:val="single" w:color="CBD5E1" w:sz="4"/>
+          <w:right w:val="single" w:color="CBD5E1" w:sz="4"/>
+          <w:insideH w:val="single" w:color="auto" w:sz="4"/>
+          <w:insideV w:val="single" w:color="auto" w:sz="4"/>
+        </w:tblBorders>
+      </w:tblPr>
+      <w:tblGrid>
+        <w:gridCol w:w="100"/>
+      </w:tblGrid>
+      <w:tr>
+        <w:tc>
+          <w:tcPr>
+            <w:tcMar>
+              <w:top w:type="dxa" w:w="260"/>
+              <w:left w:type="dxa" w:w="320"/>
+              <w:bottom w:type="dxa" w:w="260"/>
+              <w:right w:type="dxa" w:w="320"/>
+            </w:tcMar>
+          </w:tcPr>
+          <w:p>
+            <w:pPr>
+              <w:spacing w:after="160"/>
+              <w:jc w:val="center"/>
+            </w:pPr>
+            <w:r>
+              <w:rPr>
+                <w:rFonts w:ascii="Archivo" w:cs="Archivo" w:eastAsia="Archivo" w:hAnsi="Archivo"/>
+                <w:b/>
+                <w:bCs/>
+                <w:caps w:val="false"/>
+                <w:sz w:val="21"/>
+                <w:szCs w:val="21"/>
+              </w:rPr>
+              <w:t xml:space="preserve">RECLAMACIÓN ANTE EL SERVICIO DE ATENCIÓN AL CLIENTE / DEFENSOR DEL ASEGURADO</w:t>
+            </w:r>
+          </w:p>
+          <w:p>
+            <w:pPr>
+              <w:spacing w:after="120"/>
+            </w:pPr>
+            <w:r>
+              <w:rPr>
+                <w:rFonts w:ascii="Archivo" w:cs="Archivo" w:eastAsia="Archivo" w:hAnsi="Archivo"/>
+                <w:b/>
+                <w:bCs/>
+                <w:sz w:val="20"/>
+                <w:szCs w:val="20"/>
+              </w:rPr>
+              <w:t xml:space="preserve">Reclamante: </w:t>
+            </w:r>
+            <w:r>
+              <w:rPr>
+                <w:rFonts w:ascii="Archivo" w:cs="Archivo" w:eastAsia="Archivo" w:hAnsi="Archivo"/>
+                <w:color w:val="6B7A8F"/>
+                <w:sz w:val="20"/>
+                <w:szCs w:val="20"/>
+              </w:rPr>
+              <w:t xml:space="preserve">……………………………………………………………………………</w:t>
+            </w:r>
+          </w:p>
+          <w:p>
+            <w:pPr>
+              <w:spacing w:after="120"/>
+            </w:pPr>
+            <w:r>
+              <w:rPr>
+                <w:rFonts w:ascii="Archivo" w:cs="Archivo" w:eastAsia="Archivo" w:hAnsi="Archivo"/>
+                <w:b/>
+                <w:bCs/>
+                <w:sz w:val="20"/>
+                <w:szCs w:val="20"/>
+              </w:rPr>
+              <w:t xml:space="preserve">Entidad aseguradora: </w:t>
+            </w:r>
+            <w:r>
+              <w:rPr>
+                <w:rFonts w:ascii="Archivo" w:cs="Archivo" w:eastAsia="Archivo" w:hAnsi="Archivo"/>
+                <w:color w:val="6B7A8F"/>
+                <w:sz w:val="20"/>
+                <w:szCs w:val="20"/>
+              </w:rPr>
+              <w:t xml:space="preserve">……………………………………………………………………………</w:t>
+            </w:r>
+          </w:p>
+          <w:p>
+            <w:pPr>
+              <w:spacing w:after="120"/>
+            </w:pPr>
+            <w:r>
+              <w:rPr>
+                <w:rFonts w:ascii="Archivo" w:cs="Archivo" w:eastAsia="Archivo" w:hAnsi="Archivo"/>
+                <w:b/>
+                <w:bCs/>
+                <w:sz w:val="20"/>
+                <w:szCs w:val="20"/>
+              </w:rPr>
+              <w:t xml:space="preserve">Póliza n.º / Siniestro n.º: </w:t>
+            </w:r>
+            <w:r>
+              <w:rPr>
+                <w:rFonts w:ascii="Archivo" w:cs="Archivo" w:eastAsia="Archivo" w:hAnsi="Archivo"/>
+                <w:color w:val="6B7A8F"/>
+                <w:sz w:val="20"/>
+                <w:szCs w:val="20"/>
+              </w:rPr>
+              <w:t xml:space="preserve">……………………………………………………………………………</w:t>
+            </w:r>
+          </w:p>
+          <w:p>
+            <w:pPr>
+              <w:spacing w:after="120"/>
+            </w:pPr>
+          </w:p>
+          <w:p>
+            <w:pPr>
+              <w:spacing w:after="160" w:line="300"/>
+              <w:jc w:val="both"/>
+            </w:pPr>
+            <w:r>
+              <w:rPr>
+                <w:rFonts w:ascii="Archivo" w:cs="Archivo" w:eastAsia="Archivo" w:hAnsi="Archivo"/>
+                <w:sz w:val="20"/>
+                <w:szCs w:val="20"/>
+              </w:rPr>
+              <w:t xml:space="preserve">EXPONE:</w:t>
+            </w:r>
+          </w:p>
+          <w:p>
+            <w:pPr>
+              <w:spacing w:after="160" w:line="300"/>
+              <w:ind w:firstLine="400"/>
+              <w:jc w:val="both"/>
+            </w:pPr>
+            <w:r>
+              <w:rPr>
+                <w:rFonts w:ascii="Archivo" w:cs="Archivo" w:eastAsia="Archivo" w:hAnsi="Archivo"/>
+                <w:sz w:val="20"/>
+                <w:szCs w:val="20"/>
+              </w:rPr>
+              <w:t xml:space="preserve">PRIMERO.- Que es tomador/asegurado de la póliza arriba referenciada y que con fecha [fecha] sufrió el siniestro consistente en [descripción], comunicado a la compañía el [fecha].</w:t>
+            </w:r>
+          </w:p>
+          <w:p>
+            <w:pPr>
+              <w:spacing w:after="160" w:line="300"/>
+              <w:ind w:firstLine="400"/>
+              <w:jc w:val="both"/>
+            </w:pPr>
+            <w:r>
+              <w:rPr>
+                <w:rFonts w:ascii="Archivo" w:cs="Archivo" w:eastAsia="Archivo" w:hAnsi="Archivo"/>
+                <w:sz w:val="20"/>
+                <w:szCs w:val="20"/>
+              </w:rPr>
+              <w:t xml:space="preserve">SEGUNDO.- Que no está conforme con [la denegación de cobertura / la valoración pericial practicada / el importe ofrecido / la demora en la resolución del expediente], por los motivos que se exponen a continuación: [desarrollo de los motivos de disconformidad, con referencia a las condiciones de la póliza y, en su caso, a la normativa aplicable].</w:t>
+            </w:r>
+          </w:p>
+          <w:p>
+            <w:pPr>
+              <w:spacing w:after="160" w:line="300"/>
+              <w:ind w:firstLine="400"/>
+              <w:jc w:val="both"/>
+            </w:pPr>
+            <w:r>
+              <w:rPr>
+                <w:rFonts w:ascii="Archivo" w:cs="Archivo" w:eastAsia="Archivo" w:hAnsi="Archivo"/>
+                <w:sz w:val="20"/>
+                <w:szCs w:val="20"/>
+              </w:rPr>
+              <w:t xml:space="preserve">TERCERO.- Que se acompañan como documentos justificativos de la presente reclamación: (i) copia de la póliza y condiciones generales y particulares; (ii) parte de comunicación del siniestro; (iii) informe pericial de parte, en su caso; (iv) reclamación previa remitida a la aseguradora y, en su caso, respuesta recibida; (v) [otros documentos relevantes].</w:t>
+            </w:r>
+          </w:p>
+          <w:p>
+            <w:pPr>
+              <w:spacing w:after="160" w:line="300"/>
+              <w:ind w:firstLine="400"/>
+              <w:jc w:val="both"/>
+            </w:pPr>
+            <w:r>
+              <w:rPr>
+                <w:rFonts w:ascii="Archivo" w:cs="Archivo" w:eastAsia="Archivo" w:hAnsi="Archivo"/>
+                <w:sz w:val="20"/>
+                <w:szCs w:val="20"/>
+              </w:rPr>
+              <w:t xml:space="preserve">SOLICITA que, teniendo por presentado este escrito, se admita a trámite la presente reclamación, se dicte resolución motivada en el plazo máximo legalmente establecido y se acuerde [el reconocimiento de la cobertura / el abono de la indemnización solicitada por importe de (...) euros / la revisión del dictamen pericial], con expresa mención de que, de no obtener respuesta o de resultar esta desestimatoria, se acudirá a la Dirección General de Seguros y Fondos de Pensiones y, en su caso, a la vía judicial.</w:t>
+            </w:r>
+          </w:p>
+          <w:p>
+            <w:pPr>
+              <w:spacing w:after="200"/>
+            </w:pPr>
+          </w:p>
+          <w:p>
+            <w:pPr>
+              <w:spacing w:after="160" w:line="300"/>
+              <w:jc w:val="both"/>
+            </w:pPr>
+            <w:r>
+              <w:rPr>
+                <w:rFonts w:ascii="Archivo" w:cs="Archivo" w:eastAsia="Archivo" w:hAnsi="Archivo"/>
+                <w:sz w:val="20"/>
+                <w:szCs w:val="20"/>
+              </w:rPr>
+              <w:t xml:space="preserve">En [lugar], a [fecha].</w:t>
+            </w:r>
+          </w:p>
+          <w:p>
+            <w:pPr>
+              <w:spacing w:after="400"/>
+            </w:pPr>
+          </w:p>
+          <w:p>
+            <w:pPr>
+              <w:spacing w:after="0"/>
+              <w:jc w:val="center"/>
+            </w:pPr>
+            <w:r>
+              <w:rPr>
+                <w:rFonts w:ascii="Archivo" w:cs="Archivo" w:eastAsia="Archivo" w:hAnsi="Archivo"/>
+                <w:b w:val="false"/>
+                <w:bCs w:val="false"/>
+                <w:caps w:val="false"/>
+                <w:sz w:val="21"/>
+                <w:szCs w:val="21"/>
+              </w:rPr>
+              <w:t xml:space="preserve">Fdo.: [nombre y apellidos / DNI]</w:t>
+            </w:r>
+          </w:p>
+        </w:tc>
+      </w:tr>
+    </w:tbl>
+    <w:p>
+      <w:pPr>
+        <w:pStyle w:val="Heading2"/>
+        <w:spacing w:after="160" w:before="400"/>
+      </w:pPr>
+      <w:r>
+        <w:rPr>
+          <w:rFonts w:ascii="Fraunces" w:cs="Fraunces" w:eastAsia="Fraunces" w:hAnsi="Fraunces"/>
+          <w:b/>
+          <w:bCs/>
+          <w:color w:val="0A2540"/>
+          <w:sz w:val="24"/>
+          <w:szCs w:val="24"/>
+        </w:rPr>
+        <w:t xml:space="preserve">Modelo 3. Designación de perito de parte e impugnación del dictamen pericial (art. 38 LCS)</w:t>
+      </w:r>
+    </w:p>
+    <w:p>
+      <w:pPr>
+        <w:spacing w:after="180" w:line="300"/>
+        <w:jc w:val="both"/>
+      </w:pPr>
+      <w:r>
+        <w:rPr>
+          <w:rFonts w:ascii="Archivo" w:cs="Archivo" w:eastAsia="Archivo" w:hAnsi="Archivo"/>
+          <w:i/>
+          <w:iCs/>
+          <w:sz w:val="21"/>
+          <w:szCs w:val="21"/>
+        </w:rPr>
+        <w:t xml:space="preserve">Escrito dirigido a la aseguradora para (a) designar perito de parte al inicio del procedimiento de peritación del art. 38 LCS, o (b) impugnar judicialmente el dictamen pericial contradictorio dentro de los plazos del propio art. 38 LCS (treinta días para el asegurador, ciento ochenta para el asegurado, desde la notificación del dictamen).</w:t>
+      </w:r>
+    </w:p>
+    <w:p>
+      <w:pPr>
+        <w:spacing w:after="120"/>
+      </w:pPr>
+    </w:p>
+    <w:tbl>
+      <w:tblPr>
+        <w:tblW w:type="pct" w:w="100%"/>
+        <w:tblBorders>
+          <w:top w:val="single" w:color="CBD5E1" w:sz="4"/>
+          <w:left w:val="single" w:color="CBD5E1" w:sz="4"/>
+          <w:bottom w:val="single" w:color="CBD5E1" w:sz="4"/>
+          <w:right w:val="single" w:color="CBD5E1" w:sz="4"/>
+          <w:insideH w:val="single" w:color="auto" w:sz="4"/>
+          <w:insideV w:val="single" w:color="auto" w:sz="4"/>
+        </w:tblBorders>
+      </w:tblPr>
+      <w:tblGrid>
+        <w:gridCol w:w="100"/>
+      </w:tblGrid>
+      <w:tr>
+        <w:tc>
+          <w:tcPr>
+            <w:tcMar>
+              <w:top w:type="dxa" w:w="260"/>
+              <w:left w:type="dxa" w:w="320"/>
+              <w:bottom w:type="dxa" w:w="260"/>
+              <w:right w:type="dxa" w:w="320"/>
+            </w:tcMar>
+          </w:tcPr>
+          <w:p>
+            <w:pPr>
+              <w:spacing w:after="160"/>
+              <w:jc w:val="center"/>
+            </w:pPr>
+            <w:r>
+              <w:rPr>
+                <w:rFonts w:ascii="Archivo" w:cs="Archivo" w:eastAsia="Archivo" w:hAnsi="Archivo"/>
+                <w:b/>
+                <w:bCs/>
+                <w:caps w:val="false"/>
+                <w:sz w:val="21"/>
+                <w:szCs w:val="21"/>
+              </w:rPr>
+              <w:t xml:space="preserve">DESIGNACIÓN DE PERITO DE PARTE / IMPUGNACIÓN DEL DICTAMEN PERICIAL</w:t>
+            </w:r>
+          </w:p>
+          <w:p>
+            <w:pPr>
+              <w:spacing w:after="120"/>
+            </w:pPr>
+            <w:r>
+              <w:rPr>
+                <w:rFonts w:ascii="Archivo" w:cs="Archivo" w:eastAsia="Archivo" w:hAnsi="Archivo"/>
+                <w:b/>
+                <w:bCs/>
+                <w:sz w:val="20"/>
+                <w:szCs w:val="20"/>
+              </w:rPr>
+              <w:t xml:space="preserve">Remite: </w:t>
+            </w:r>
+            <w:r>
+              <w:rPr>
+                <w:rFonts w:ascii="Archivo" w:cs="Archivo" w:eastAsia="Archivo" w:hAnsi="Archivo"/>
+                <w:color w:val="6B7A8F"/>
+                <w:sz w:val="20"/>
+                <w:szCs w:val="20"/>
+              </w:rPr>
+              <w:t xml:space="preserve">……………………………………………………………………………</w:t>
+            </w:r>
+          </w:p>
+          <w:p>
+            <w:pPr>
+              <w:spacing w:after="120"/>
+            </w:pPr>
+            <w:r>
+              <w:rPr>
+                <w:rFonts w:ascii="Archivo" w:cs="Archivo" w:eastAsia="Archivo" w:hAnsi="Archivo"/>
+                <w:b/>
+                <w:bCs/>
+                <w:sz w:val="20"/>
+                <w:szCs w:val="20"/>
+              </w:rPr>
+              <w:t xml:space="preserve">Destinatario (aseguradora): </w:t>
+            </w:r>
+            <w:r>
+              <w:rPr>
+                <w:rFonts w:ascii="Archivo" w:cs="Archivo" w:eastAsia="Archivo" w:hAnsi="Archivo"/>
+                <w:color w:val="6B7A8F"/>
+                <w:sz w:val="20"/>
+                <w:szCs w:val="20"/>
+              </w:rPr>
+              <w:t xml:space="preserve">……………………………………………………………………………</w:t>
+            </w:r>
+          </w:p>
+          <w:p>
+            <w:pPr>
+              <w:spacing w:after="120"/>
+            </w:pPr>
+            <w:r>
+              <w:rPr>
+                <w:rFonts w:ascii="Archivo" w:cs="Archivo" w:eastAsia="Archivo" w:hAnsi="Archivo"/>
+                <w:b/>
+                <w:bCs/>
+                <w:sz w:val="20"/>
+                <w:szCs w:val="20"/>
+              </w:rPr>
+              <w:t xml:space="preserve">Póliza n.º / Siniestro n.º: </w:t>
+            </w:r>
+            <w:r>
+              <w:rPr>
+                <w:rFonts w:ascii="Archivo" w:cs="Archivo" w:eastAsia="Archivo" w:hAnsi="Archivo"/>
+                <w:color w:val="6B7A8F"/>
+                <w:sz w:val="20"/>
+                <w:szCs w:val="20"/>
+              </w:rPr>
+              <w:t xml:space="preserve">……………………………………………………………………………</w:t>
+            </w:r>
+          </w:p>
+          <w:p>
+            <w:pPr>
+              <w:spacing w:after="120"/>
+            </w:pPr>
+          </w:p>
+          <w:p>
+            <w:pPr>
+              <w:spacing w:after="160" w:line="300"/>
+              <w:jc w:val="both"/>
+            </w:pPr>
+            <w:r>
+              <w:rPr>
+                <w:rFonts w:ascii="Archivo" w:cs="Archivo" w:eastAsia="Archivo" w:hAnsi="Archivo"/>
+                <w:sz w:val="20"/>
+                <w:szCs w:val="20"/>
+              </w:rPr>
+              <w:t xml:space="preserve">A) Designación de perito de parte</w:t>
+            </w:r>
+          </w:p>
+          <w:p>
+            <w:pPr>
+              <w:spacing w:after="160" w:line="300"/>
+              <w:ind w:firstLine="400"/>
+              <w:jc w:val="both"/>
+            </w:pPr>
+            <w:r>
+              <w:rPr>
+                <w:rFonts w:ascii="Archivo" w:cs="Archivo" w:eastAsia="Archivo" w:hAnsi="Archivo"/>
+                <w:sz w:val="20"/>
+                <w:szCs w:val="20"/>
+              </w:rPr>
+              <w:t xml:space="preserve">De conformidad con el art. 38 LCS, y no habiéndose alcanzado acuerdo sobre el importe y la forma de la indemnización correspondiente al siniestro referenciado, comunico a esa aseguradora la designación como perito de parte de D./D.ª [nombre, titulación y colegiación del perito], con domicilio profesional en [dirección] y datos de contacto [teléfono / correo electrónico], a los efectos de la práctica de la peritación contradictoria prevista en dicho precepto, requiriendo a esa compañía para que, en el plazo de ocho días desde la recepción de este escrito, comunique la identidad de su propio perito, con la advertencia legal de que, de no hacerlo, se entenderá que acepta el dictamen que emita el perito designado por esta parte, quedando vinculada por el mismo.</w:t>
+            </w:r>
+          </w:p>
+          <w:p>
+            <w:pPr>
+              <w:spacing w:after="160"/>
+            </w:pPr>
+          </w:p>
+          <w:p>
+            <w:pPr>
+              <w:spacing w:after="160" w:line="300"/>
+              <w:jc w:val="both"/>
+            </w:pPr>
+            <w:r>
+              <w:rPr>
+                <w:rFonts w:ascii="Archivo" w:cs="Archivo" w:eastAsia="Archivo" w:hAnsi="Archivo"/>
+                <w:sz w:val="20"/>
+                <w:szCs w:val="20"/>
+              </w:rPr>
+              <w:t xml:space="preserve">B) Impugnación del dictamen pericial</w:t>
+            </w:r>
+          </w:p>
+          <w:p>
+            <w:pPr>
+              <w:spacing w:after="160" w:line="300"/>
+              <w:ind w:firstLine="400"/>
+              <w:jc w:val="both"/>
+            </w:pPr>
+            <w:r>
+              <w:rPr>
+                <w:rFonts w:ascii="Archivo" w:cs="Archivo" w:eastAsia="Archivo" w:hAnsi="Archivo"/>
+                <w:sz w:val="20"/>
+                <w:szCs w:val="20"/>
+              </w:rPr>
+              <w:t xml:space="preserve">Habiéndose notificado con fecha [fecha] el dictamen pericial emitido con [unanimidad / mayoría / por el tercer perito] en el expediente de referencia, y no estando conforme esta parte con su contenido por los motivos que se exponen [error en la valoración de los daños, causa del siniestro incorrectamente atribuida, aplicación indebida de la regla proporcional del art. 30 LCS, etc.], se comunica la impugnación del citado dictamen dentro del plazo legal establecido en el art. 38 LCS, quedando anunciado el ejercicio de las acciones judiciales correspondientes si no se alcanza acuerdo en el plazo de [plazo], sin perjuicio de la obligación de la aseguradora de abonar, entre tanto, el importe mínimo debido conforme al art. 18 LCS.</w:t>
+            </w:r>
+          </w:p>
+          <w:p>
+            <w:pPr>
+              <w:spacing w:after="200"/>
+            </w:pPr>
+          </w:p>
+          <w:p>
+            <w:pPr>
+              <w:spacing w:after="160" w:line="300"/>
+              <w:jc w:val="both"/>
+            </w:pPr>
+            <w:r>
+              <w:rPr>
+                <w:rFonts w:ascii="Archivo" w:cs="Archivo" w:eastAsia="Archivo" w:hAnsi="Archivo"/>
+                <w:sz w:val="20"/>
+                <w:szCs w:val="20"/>
+              </w:rPr>
+              <w:t xml:space="preserve">En [lugar], a [fecha].</w:t>
+            </w:r>
+          </w:p>
+          <w:p>
+            <w:pPr>
+              <w:spacing w:after="400"/>
+            </w:pPr>
+          </w:p>
+          <w:p>
+            <w:pPr>
+              <w:spacing w:after="0"/>
+              <w:jc w:val="center"/>
+            </w:pPr>
+            <w:r>
+              <w:rPr>
+                <w:rFonts w:ascii="Archivo" w:cs="Archivo" w:eastAsia="Archivo" w:hAnsi="Archivo"/>
+                <w:b w:val="false"/>
+                <w:bCs w:val="false"/>
+                <w:caps w:val="false"/>
+                <w:sz w:val="21"/>
+                <w:szCs w:val="21"/>
+              </w:rPr>
+              <w:t xml:space="preserve">Fdo.: [nombre y apellidos / DNI]</w:t>
+            </w:r>
+          </w:p>
+        </w:tc>
+      </w:tr>
+    </w:tbl>
+    <w:p>
+      <w:pPr>
+        <w:pStyle w:val="Heading2"/>
+        <w:spacing w:after="160" w:before="400"/>
+      </w:pPr>
+      <w:r>
+        <w:rPr>
+          <w:rFonts w:ascii="Fraunces" w:cs="Fraunces" w:eastAsia="Fraunces" w:hAnsi="Fraunces"/>
+          <w:b/>
+          <w:bCs/>
+          <w:color w:val="0A2540"/>
+          <w:sz w:val="24"/>
+          <w:szCs w:val="24"/>
+        </w:rPr>
+        <w:t xml:space="preserve">Modelo 4. Demanda de juicio verbal reclamando indemnización derivada de contrato de seguro de hogar</w:t>
+      </w:r>
+    </w:p>
+    <w:p>
+      <w:pPr>
+        <w:spacing w:after="180" w:line="300"/>
+        <w:jc w:val="both"/>
+      </w:pPr>
+      <w:r>
+        <w:rPr>
+          <w:rFonts w:ascii="Archivo" w:cs="Archivo" w:eastAsia="Archivo" w:hAnsi="Archivo"/>
+          <w:i/>
+          <w:iCs/>
+          <w:sz w:val="21"/>
+          <w:szCs w:val="21"/>
+        </w:rPr>
+        <w:t xml:space="preserve">Modelo de demanda por reclamación de cantidad frente a la aseguradora por incumplimiento del contrato de seguro (denegación de cobertura o indemnización insuficiente) por daños por agua, para cuantías que no excedan de 15.000 euros, tramitable por los cauces del juicio verbal (art. 250.2 LEC). Para cuantías superiores, el mismo esquema es trasladable al juicio ordinario (art. 249.2 LEC), sustituyendo las referencias de trámite.</w:t>
+      </w:r>
+    </w:p>
+    <w:p>
+      <w:pPr>
+        <w:spacing w:after="120"/>
+      </w:pPr>
+    </w:p>
+    <w:tbl>
+      <w:tblPr>
+        <w:tblW w:type="pct" w:w="100%"/>
+        <w:tblBorders>
+          <w:top w:val="single" w:color="CBD5E1" w:sz="4"/>
+          <w:left w:val="single" w:color="CBD5E1" w:sz="4"/>
+          <w:bottom w:val="single" w:color="CBD5E1" w:sz="4"/>
+          <w:right w:val="single" w:color="CBD5E1" w:sz="4"/>
+          <w:insideH w:val="single" w:color="auto" w:sz="4"/>
+          <w:insideV w:val="single" w:color="auto" w:sz="4"/>
+        </w:tblBorders>
+      </w:tblPr>
+      <w:tblGrid>
+        <w:gridCol w:w="100"/>
+      </w:tblGrid>
+      <w:tr>
+        <w:tc>
+          <w:tcPr>
+            <w:tcMar>
+              <w:top w:type="dxa" w:w="260"/>
+              <w:left w:type="dxa" w:w="320"/>
+              <w:bottom w:type="dxa" w:w="260"/>
+              <w:right w:type="dxa" w:w="320"/>
+            </w:tcMar>
+          </w:tcPr>
+          <w:p>
+            <w:pPr>
+              <w:spacing w:after="160"/>
+              <w:jc w:val="center"/>
+            </w:pPr>
+            <w:r>
+              <w:rPr>
+                <w:rFonts w:ascii="Archivo" w:cs="Archivo" w:eastAsia="Archivo" w:hAnsi="Archivo"/>
+                <w:b/>
+                <w:bCs/>
+                <w:caps w:val="false"/>
+                <w:sz w:val="21"/>
+                <w:szCs w:val="21"/>
+              </w:rPr>
+              <w:t xml:space="preserve">AL JUZGADO DE PRIMERA INSTANCIA DE [PARTIDO JUDICIAL] QUE POR TURNO CORRESPONDA</w:t>
+            </w:r>
+          </w:p>
+          <w:p>
+            <w:pPr>
+              <w:spacing w:after="160"/>
+            </w:pPr>
+          </w:p>
+          <w:p>
+            <w:pPr>
+              <w:spacing w:after="160" w:line="300"/>
+              <w:ind w:firstLine="400"/>
+              <w:jc w:val="both"/>
+            </w:pPr>
+            <w:r>
+              <w:rPr>
+                <w:rFonts w:ascii="Archivo" w:cs="Archivo" w:eastAsia="Archivo" w:hAnsi="Archivo"/>
+                <w:sz w:val="20"/>
+                <w:szCs w:val="20"/>
+              </w:rPr>
+              <w:t xml:space="preserve">D./D.ª [Procurador/a], Procurador/a de los Tribunales, en nombre y representación de D./D.ª [demandante], mayor de edad, con DNI n.º [ ] y domicilio a efectos de notificaciones en [dirección], representación que acredito mediante escritura de poder que acompaño como Documento n.º 1, y bajo la dirección letrada de D./D.ª [abogado/a], Colegiado/a n.º [ ] del Ilustre Colegio de la Abogacía de [ ], ante el Juzgado comparezco y, como mejor proceda en Derecho, DIGO:</w:t>
+            </w:r>
+          </w:p>
+          <w:p>
+            <w:pPr>
+              <w:spacing w:after="160" w:line="300"/>
+              <w:ind w:firstLine="400"/>
+              <w:jc w:val="both"/>
+            </w:pPr>
+            <w:r>
+              <w:rPr>
+                <w:rFonts w:ascii="Archivo" w:cs="Archivo" w:eastAsia="Archivo" w:hAnsi="Archivo"/>
+                <w:sz w:val="20"/>
+                <w:szCs w:val="20"/>
+              </w:rPr>
+              <w:t xml:space="preserve">Que, por medio del presente escrito, formulo DEMANDA DE JUICIO VERBAL por reclamación de cantidad contra </w:t>
+            </w:r>
+            <w:r>
+              <w:rPr>
+                <w:rFonts w:ascii="Archivo" w:cs="Archivo" w:eastAsia="Archivo" w:hAnsi="Archivo"/>
+                <w:b/>
+                <w:bCs/>
+                <w:sz w:val="21"/>
+                <w:szCs w:val="21"/>
+              </w:rPr>
+              <w:t xml:space="preserve">[razón social de la aseguradora], </w:t>
+            </w:r>
+            <w:r>
+              <w:rPr>
+                <w:rFonts w:ascii="Archivo" w:cs="Archivo" w:eastAsia="Archivo" w:hAnsi="Archivo"/>
+                <w:sz w:val="20"/>
+                <w:szCs w:val="20"/>
+              </w:rPr>
+              <w:t xml:space="preserve">con NIF [ ] y domicilio social en [dirección], en su condición de aseguradora del contrato de seguro multirriesgo de hogar póliza n.º [ ], con base en los siguientes</w:t>
+            </w:r>
+          </w:p>
+          <w:p>
+            <w:pPr>
+              <w:spacing w:after="160"/>
+              <w:jc w:val="center"/>
+            </w:pPr>
+            <w:r>
+              <w:rPr>
+                <w:rFonts w:ascii="Archivo" w:cs="Archivo" w:eastAsia="Archivo" w:hAnsi="Archivo"/>
+                <w:b/>
+                <w:bCs/>
+                <w:caps w:val="false"/>
+                <w:sz w:val="21"/>
+                <w:szCs w:val="21"/>
+              </w:rPr>
+              <w:t xml:space="preserve">HECHOS</w:t>
+            </w:r>
+          </w:p>
+          <w:p>
+            <w:pPr>
+              <w:spacing w:after="160" w:line="300"/>
+              <w:ind w:firstLine="400"/>
+              <w:jc w:val="both"/>
+            </w:pPr>
+            <w:r>
+              <w:rPr>
+                <w:rFonts w:ascii="Archivo" w:cs="Archivo" w:eastAsia="Archivo" w:hAnsi="Archivo"/>
+                <w:sz w:val="20"/>
+                <w:szCs w:val="20"/>
+              </w:rPr>
+              <w:t xml:space="preserve">PRIMERO.- Contrato de seguro. Mi mandante es tomador y asegurado de la póliza de seguro multirriesgo de hogar n.º [ ], suscrita con la demandada con efectos desde el [fecha], que cubre, entre otros riesgos, los daños por agua en la vivienda sita en [dirección], con una suma asegurada de continente de [ ] euros y de contenido de [ ] euros (Documento n.º 2: póliza, condiciones generales y particulares).</w:t>
+            </w:r>
+          </w:p>
+          <w:p>
+            <w:pPr>
+              <w:spacing w:after="160" w:line="300"/>
+              <w:ind w:firstLine="400"/>
+              <w:jc w:val="both"/>
+            </w:pPr>
+            <w:r>
+              <w:rPr>
+                <w:rFonts w:ascii="Archivo" w:cs="Archivo" w:eastAsia="Archivo" w:hAnsi="Archivo"/>
+                <w:sz w:val="20"/>
+                <w:szCs w:val="20"/>
+              </w:rPr>
+              <w:t xml:space="preserve">SEGUNDO.- Siniestro. El día [fecha] se produjo en la vivienda asegurada un siniestro consistente en [descripción: rotura de la tubería de suministro de agua bajo el pavimento de la cocina, con filtración a la vivienda inferior y daños en solado, tabiquería y mobiliario], que fue comunicado a la demandada el día [fecha] (Documento n.º 3: parte de siniestro).</w:t>
+            </w:r>
+          </w:p>
+          <w:p>
+            <w:pPr>
+              <w:spacing w:after="160" w:line="300"/>
+              <w:ind w:firstLine="400"/>
+              <w:jc w:val="both"/>
+            </w:pPr>
+            <w:r>
+              <w:rPr>
+                <w:rFonts w:ascii="Archivo" w:cs="Archivo" w:eastAsia="Archivo" w:hAnsi="Archivo"/>
+                <w:sz w:val="20"/>
+                <w:szCs w:val="20"/>
+              </w:rPr>
+              <w:t xml:space="preserve">TERCERO.- Peritación y valoración de los daños. Personado el perito designado por la demandada el día [fecha], se emitió informe pericial que cuantificó los daños en [ ] euros (Documento n.º 4). [En su caso: mi mandante encargó a su vez informe pericial de parte, que cuantifica los daños en (...) euros, Documento n.º 5].</w:t>
+            </w:r>
+          </w:p>
+          <w:p>
+            <w:pPr>
+              <w:spacing w:after="160" w:line="300"/>
+              <w:ind w:firstLine="400"/>
+              <w:jc w:val="both"/>
+            </w:pPr>
+            <w:r>
+              <w:rPr>
+                <w:rFonts w:ascii="Archivo" w:cs="Archivo" w:eastAsia="Archivo" w:hAnsi="Archivo"/>
+                <w:sz w:val="20"/>
+                <w:szCs w:val="20"/>
+              </w:rPr>
+              <w:t xml:space="preserve">CUARTO.- Postura de la aseguradora. Con fecha [fecha], la demandada comunicó [la denegación de cobertura por (motivo) / el ofrecimiento de una indemnización de (...) euros, inferior a la debida], sin que hasta la fecha se haya abonado cantidad alguna [o: habiéndose abonado únicamente (...) euros] (Documento n.º 6).</w:t>
+            </w:r>
+          </w:p>
+          <w:p>
+            <w:pPr>
+              <w:spacing w:after="160" w:line="300"/>
+              <w:ind w:firstLine="400"/>
+              <w:jc w:val="both"/>
+            </w:pPr>
+            <w:r>
+              <w:rPr>
+                <w:rFonts w:ascii="Archivo" w:cs="Archivo" w:eastAsia="Archivo" w:hAnsi="Archivo"/>
+                <w:sz w:val="20"/>
+                <w:szCs w:val="20"/>
+              </w:rPr>
+              <w:t xml:space="preserve">QUINTO.- Reclamación previa. Con fecha [fecha] se remitió a la demandada burofax de reclamación previa, sin que se haya obtenido respuesta satisfactoria (Documento n.º 7).</w:t>
+            </w:r>
+          </w:p>
+          <w:p>
+            <w:pPr>
+              <w:spacing w:after="160"/>
+              <w:jc w:val="center"/>
+            </w:pPr>
+            <w:r>
+              <w:rPr>
+                <w:rFonts w:ascii="Archivo" w:cs="Archivo" w:eastAsia="Archivo" w:hAnsi="Archivo"/>
+                <w:b/>
+                <w:bCs/>
+                <w:caps w:val="false"/>
+                <w:sz w:val="21"/>
+                <w:szCs w:val="21"/>
+              </w:rPr>
+              <w:t xml:space="preserve">FUNDAMENTOS DE DERECHO</w:t>
+            </w:r>
+          </w:p>
+          <w:p>
+            <w:pPr>
+              <w:spacing w:after="160" w:line="300"/>
+              <w:ind w:firstLine="400"/>
+              <w:jc w:val="both"/>
+            </w:pPr>
+            <w:r>
+              <w:rPr>
+                <w:rFonts w:ascii="Archivo" w:cs="Archivo" w:eastAsia="Archivo" w:hAnsi="Archivo"/>
+                <w:sz w:val="20"/>
+                <w:szCs w:val="20"/>
+              </w:rPr>
+              <w:t xml:space="preserve">I. Jurisdicción y competencia. Corresponde el conocimiento del presente asunto a los Juzgados de Primera Instancia del orden civil (arts. 9.2 y 45 LEC), siendo competente territorialmente el Juzgado de [domicilio del asegurado], por aplicación del fuero especial en materia de seguros del art. 52.2 LEC, que atribuye la competencia, a elección del demandante, al tribunal del domicilio del asegurado.</w:t>
+            </w:r>
+          </w:p>
+          <w:p>
+            <w:pPr>
+              <w:spacing w:after="160" w:line="300"/>
+              <w:ind w:firstLine="400"/>
+              <w:jc w:val="both"/>
+            </w:pPr>
+            <w:r>
+              <w:rPr>
+                <w:rFonts w:ascii="Archivo" w:cs="Archivo" w:eastAsia="Archivo" w:hAnsi="Archivo"/>
+                <w:sz w:val="20"/>
+                <w:szCs w:val="20"/>
+              </w:rPr>
+              <w:t xml:space="preserve">II. Procedimiento. Al no exceder la cuantía litigiosa de 15.000 euros, procede la tramitación por los cauces del juicio verbal, conforme al art. 250.2 LEC.</w:t>
+            </w:r>
+          </w:p>
+          <w:p>
+            <w:pPr>
+              <w:spacing w:after="160" w:line="300"/>
+              <w:ind w:firstLine="400"/>
+              <w:jc w:val="both"/>
+            </w:pPr>
+            <w:r>
+              <w:rPr>
+                <w:rFonts w:ascii="Archivo" w:cs="Archivo" w:eastAsia="Archivo" w:hAnsi="Archivo"/>
+                <w:sz w:val="20"/>
+                <w:szCs w:val="20"/>
+              </w:rPr>
+              <w:t xml:space="preserve">III. Legitimación. La activa corresponde a mi mandante en su condición de tomador y asegurado (art. 7 LCS); la pasiva, a la demandada en su condición de aseguradora (art. 1 LCS).</w:t>
+            </w:r>
+          </w:p>
+          <w:p>
+            <w:pPr>
+              <w:spacing w:after="160" w:line="300"/>
+              <w:ind w:firstLine="400"/>
+              <w:jc w:val="both"/>
+            </w:pPr>
+            <w:r>
+              <w:rPr>
+                <w:rFonts w:ascii="Archivo" w:cs="Archivo" w:eastAsia="Archivo" w:hAnsi="Archivo"/>
+                <w:sz w:val="20"/>
+                <w:szCs w:val="20"/>
+              </w:rPr>
+              <w:t xml:space="preserve">IV. Fondo del asunto. El art. 1 LCS obliga a la aseguradora a indemnizar el daño producido al asegurado, dentro de los límites pactados, cuando se produce el riesgo objeto de cobertura. No constando causa de exclusión aplicable al siniestro [ni cláusula limitativa válidamente incorporada conforme al art. 3 LCS, a cuyo respecto se invoca la doctrina fijada por la STS (Pleno) núm. 853/2006, de 11 de septiembre, y reiterada, entre otras, por la STS de 3 de octubre de 2023 (ROJ: STS 3996/2023)], procede la condena de la demandada al pago de la indemnización reclamada.</w:t>
+            </w:r>
+          </w:p>
+          <w:p>
+            <w:pPr>
+              <w:spacing w:after="160" w:line="300"/>
+              <w:ind w:firstLine="400"/>
+              <w:jc w:val="both"/>
+            </w:pPr>
+            <w:r>
+              <w:rPr>
+                <w:rFonts w:ascii="Archivo" w:cs="Archivo" w:eastAsia="Archivo" w:hAnsi="Archivo"/>
+                <w:sz w:val="20"/>
+                <w:szCs w:val="20"/>
+              </w:rPr>
+              <w:t xml:space="preserve">V. Intereses. Procede la condena al pago de los intereses del art. 20 LCS desde la fecha del siniestro, al no concurrir causa justificada que exonere a la aseguradora de la mora en que ha incurrido.</w:t>
+            </w:r>
+          </w:p>
+          <w:p>
+            <w:pPr>
+              <w:spacing w:after="160" w:line="300"/>
+              <w:ind w:firstLine="400"/>
+              <w:jc w:val="both"/>
+            </w:pPr>
+            <w:r>
+              <w:rPr>
+                <w:rFonts w:ascii="Archivo" w:cs="Archivo" w:eastAsia="Archivo" w:hAnsi="Archivo"/>
+                <w:sz w:val="20"/>
+                <w:szCs w:val="20"/>
+              </w:rPr>
+              <w:t xml:space="preserve">VI. Costas. Procede la condena en costas a la demandada conforme al principio del vencimiento objetivo del art. 394 LEC.</w:t>
+            </w:r>
+          </w:p>
+          <w:p>
+            <w:pPr>
+              <w:spacing w:after="160"/>
+              <w:jc w:val="center"/>
+            </w:pPr>
+            <w:r>
+              <w:rPr>
+                <w:rFonts w:ascii="Archivo" w:cs="Archivo" w:eastAsia="Archivo" w:hAnsi="Archivo"/>
+                <w:b/>
+                <w:bCs/>
+                <w:caps w:val="false"/>
+                <w:sz w:val="21"/>
+                <w:szCs w:val="21"/>
+              </w:rPr>
+              <w:t xml:space="preserve">SUPLICO AL JUZGADO</w:t>
+            </w:r>
+          </w:p>
+          <w:p>
+            <w:pPr>
+              <w:spacing w:after="160" w:line="300"/>
+              <w:ind w:firstLine="400"/>
+              <w:jc w:val="both"/>
+            </w:pPr>
+            <w:r>
+              <w:rPr>
+                <w:rFonts w:ascii="Archivo" w:cs="Archivo" w:eastAsia="Archivo" w:hAnsi="Archivo"/>
+                <w:sz w:val="20"/>
+                <w:szCs w:val="20"/>
+              </w:rPr>
+              <w:t xml:space="preserve">Que, teniendo por presentado este escrito con sus documentos y copias, se sirva admitirlo, tener por formulada DEMANDA DE JUICIO VERBAL contra [aseguradora demandada] y, previos los trámites legales oportunos, dicte Sentencia por la que:</w:t>
+            </w:r>
+          </w:p>
+          <w:p>
+            <w:pPr>
+              <w:spacing w:after="160" w:line="300"/>
+              <w:ind w:firstLine="400"/>
+              <w:jc w:val="both"/>
+            </w:pPr>
+            <w:r>
+              <w:rPr>
+                <w:rFonts w:ascii="Archivo" w:cs="Archivo" w:eastAsia="Archivo" w:hAnsi="Archivo"/>
+                <w:sz w:val="20"/>
+                <w:szCs w:val="20"/>
+              </w:rPr>
+              <w:t xml:space="preserve">1.º Se condene a la demandada a abonar a mi mandante la cantidad de [ ] euros en concepto de indemnización derivada del contrato de seguro referenciado.</w:t>
+            </w:r>
+          </w:p>
+          <w:p>
+            <w:pPr>
+              <w:spacing w:after="160" w:line="300"/>
+              <w:ind w:firstLine="400"/>
+              <w:jc w:val="both"/>
+            </w:pPr>
+            <w:r>
+              <w:rPr>
+                <w:rFonts w:ascii="Archivo" w:cs="Archivo" w:eastAsia="Archivo" w:hAnsi="Archivo"/>
+                <w:sz w:val="20"/>
+                <w:szCs w:val="20"/>
+              </w:rPr>
+              <w:t xml:space="preserve">2.º Se condene a la demandada al pago de los intereses del art. 20 LCS desde la fecha del siniestro hasta su completo pago.</w:t>
+            </w:r>
+          </w:p>
+          <w:p>
+            <w:pPr>
+              <w:spacing w:after="160" w:line="300"/>
+              <w:ind w:firstLine="400"/>
+              <w:jc w:val="both"/>
+            </w:pPr>
+            <w:r>
+              <w:rPr>
+                <w:rFonts w:ascii="Archivo" w:cs="Archivo" w:eastAsia="Archivo" w:hAnsi="Archivo"/>
+                <w:sz w:val="20"/>
+                <w:szCs w:val="20"/>
+              </w:rPr>
+              <w:t xml:space="preserve">3.º Se condene a la demandada al pago de las costas procesales.</w:t>
+            </w:r>
+          </w:p>
+          <w:p>
+            <w:pPr>
+              <w:spacing w:after="160" w:line="300"/>
+              <w:ind w:firstLine="400"/>
+              <w:jc w:val="both"/>
+            </w:pPr>
+            <w:r>
+              <w:rPr>
+                <w:rFonts w:ascii="Archivo" w:cs="Archivo" w:eastAsia="Archivo" w:hAnsi="Archivo"/>
+                <w:sz w:val="20"/>
+                <w:szCs w:val="20"/>
+              </w:rPr>
+              <w:t xml:space="preserve">OTROSÍ DIGO: Que, para el acto de la vista, se propone desde este momento la siguiente prueba: documental (la ya aportada, cuya autenticidad se dará por reconocida en su caso), interrogatorio de la parte demandada y pericial (ratificación del perito autor del Documento n.º 5), solicitando su admisión.</w:t>
+            </w:r>
+          </w:p>
+          <w:p>
+            <w:pPr>
+              <w:spacing w:after="160" w:line="300"/>
+              <w:ind w:firstLine="400"/>
+              <w:jc w:val="both"/>
+            </w:pPr>
+            <w:r>
+              <w:rPr>
+                <w:rFonts w:ascii="Archivo" w:cs="Archivo" w:eastAsia="Archivo" w:hAnsi="Archivo"/>
+                <w:sz w:val="20"/>
+                <w:szCs w:val="20"/>
+              </w:rPr>
+              <w:t xml:space="preserve">SUPLICO AL JUZGADO que tenga por hecha la anterior manifestación a los efectos oportunos.</w:t>
+            </w:r>
+          </w:p>
+          <w:p>
+            <w:pPr>
+              <w:spacing w:after="200"/>
+            </w:pPr>
+          </w:p>
+          <w:p>
+            <w:pPr>
+              <w:spacing w:after="160" w:line="300"/>
+              <w:jc w:val="both"/>
+            </w:pPr>
+            <w:r>
+              <w:rPr>
+                <w:rFonts w:ascii="Archivo" w:cs="Archivo" w:eastAsia="Archivo" w:hAnsi="Archivo"/>
+                <w:sz w:val="20"/>
+                <w:szCs w:val="20"/>
+              </w:rPr>
+              <w:t xml:space="preserve">En [lugar], a [fecha].</w:t>
+            </w:r>
+          </w:p>
+        </w:tc>
+      </w:tr>
+    </w:tbl>
+    <w:p>
+      <w:pPr>
+        <w:pStyle w:val="Heading2"/>
+        <w:spacing w:after="160" w:before="400"/>
+      </w:pPr>
+      <w:r>
+        <w:rPr>
+          <w:rFonts w:ascii="Fraunces" w:cs="Fraunces" w:eastAsia="Fraunces" w:hAnsi="Fraunces"/>
+          <w:b/>
+          <w:bCs/>
+          <w:color w:val="0A2540"/>
+          <w:sz w:val="24"/>
+          <w:szCs w:val="24"/>
+        </w:rPr>
+        <w:t xml:space="preserve">Modelo 5. Demanda reclamando intereses de demora del art. 20 LCS por mora del asegurador</w:t>
+      </w:r>
+    </w:p>
+    <w:p>
+      <w:pPr>
+        <w:spacing w:after="180" w:line="300"/>
+        <w:jc w:val="both"/>
+      </w:pPr>
+      <w:r>
+        <w:rPr>
+          <w:rFonts w:ascii="Archivo" w:cs="Archivo" w:eastAsia="Archivo" w:hAnsi="Archivo"/>
+          <w:i/>
+          <w:iCs/>
+          <w:sz w:val="21"/>
+          <w:szCs w:val="21"/>
+        </w:rPr>
+        <w:t xml:space="preserve">Modelo de fundamentación jurídica específica para los supuestos en que la aseguradora ha abonado la indemnización principal fuera de plazo o solo tras la interposición de la demanda, y se reclama exclusivamente —o de forma destacada— la condena a los intereses moratorios del art. 20 LCS. Se integra en el esquema de demanda del Modelo 4, sustituyendo el fundamento de derecho V y el suplico.</w:t>
+      </w:r>
+    </w:p>
+    <w:p>
+      <w:pPr>
+        <w:spacing w:after="120"/>
+      </w:pPr>
+    </w:p>
+    <w:tbl>
+      <w:tblPr>
+        <w:tblW w:type="pct" w:w="100%"/>
+        <w:tblBorders>
+          <w:top w:val="single" w:color="CBD5E1" w:sz="4"/>
+          <w:left w:val="single" w:color="CBD5E1" w:sz="4"/>
+          <w:bottom w:val="single" w:color="CBD5E1" w:sz="4"/>
+          <w:right w:val="single" w:color="CBD5E1" w:sz="4"/>
+          <w:insideH w:val="single" w:color="auto" w:sz="4"/>
+          <w:insideV w:val="single" w:color="auto" w:sz="4"/>
+        </w:tblBorders>
+      </w:tblPr>
+      <w:tblGrid>
+        <w:gridCol w:w="100"/>
+      </w:tblGrid>
+      <w:tr>
+        <w:tc>
+          <w:tcPr>
+            <w:tcMar>
+              <w:top w:type="dxa" w:w="260"/>
+              <w:left w:type="dxa" w:w="320"/>
+              <w:bottom w:type="dxa" w:w="260"/>
+              <w:right w:type="dxa" w:w="320"/>
+            </w:tcMar>
+          </w:tcPr>
+          <w:p>
+            <w:pPr>
+              <w:spacing w:after="160"/>
+              <w:jc w:val="center"/>
+            </w:pPr>
+            <w:r>
+              <w:rPr>
+                <w:rFonts w:ascii="Archivo" w:cs="Archivo" w:eastAsia="Archivo" w:hAnsi="Archivo"/>
+                <w:b/>
+                <w:bCs/>
+                <w:caps w:val="false"/>
+                <w:sz w:val="21"/>
+                <w:szCs w:val="21"/>
+              </w:rPr>
+              <w:t xml:space="preserve">FUNDAMENTO DE DERECHO ESPECÍFICO SOBRE LA MORA DEL ASEGURADOR</w:t>
+            </w:r>
+          </w:p>
+          <w:p>
+            <w:pPr>
+              <w:spacing w:after="160" w:line="300"/>
+              <w:ind w:firstLine="400"/>
+              <w:jc w:val="both"/>
+            </w:pPr>
+            <w:r>
+              <w:rPr>
+                <w:rFonts w:ascii="Archivo" w:cs="Archivo" w:eastAsia="Archivo" w:hAnsi="Archivo"/>
+                <w:sz w:val="20"/>
+                <w:szCs w:val="20"/>
+              </w:rPr>
+              <w:t xml:space="preserve">V. Intereses del artículo 20 LCS. Conforme al art. 20.3.º LCS, se entenderá que el asegurador incurre en mora cuando no hubiere cumplido su prestación en el plazo de tres meses desde la producción del siniestro, o no hubiere procedido al pago del importe mínimo de lo que pueda deber dentro de los cuarenta días desde la recepción de la declaración del siniestro. En el presente caso, [el siniestro se produjo el (fecha) y la demandada no ha abonado cantidad alguna hasta la fecha / la demandada abonó el importe de (...) euros el (fecha), transcurridos (...) meses desde el siniestro], sin que conste causa justificada de exoneración conforme al art. 20.8.º LCS.</w:t>
+            </w:r>
+          </w:p>
+          <w:p>
+            <w:pPr>
+              <w:spacing w:after="160" w:line="300"/>
+              <w:ind w:firstLine="400"/>
+              <w:jc w:val="both"/>
+            </w:pPr>
+            <w:r>
+              <w:rPr>
+                <w:rFonts w:ascii="Archivo" w:cs="Archivo" w:eastAsia="Archivo" w:hAnsi="Archivo"/>
+                <w:sz w:val="20"/>
+                <w:szCs w:val="20"/>
+              </w:rPr>
+              <w:t xml:space="preserve">El interés de demora, conforme al art. 20.4.º LCS, será el legal del dinero vigente incrementado en el 50 por 100 durante los dos primeros años desde la fecha del siniestro (que será el término inicial del cómputo, art. 20.6.º LCS) y, transcurridos dos años sin haberse satisfecho la indemnización, no podrá ser inferior al 20 por 100 anual, devengándose día a día sin necesidad de reclamación judicial.</w:t>
+            </w:r>
+          </w:p>
+          <w:p>
+            <w:pPr>
+              <w:spacing w:after="160" w:line="300"/>
+              <w:ind w:firstLine="400"/>
+              <w:jc w:val="both"/>
+            </w:pPr>
+            <w:r>
+              <w:rPr>
+                <w:rFonts w:ascii="Archivo" w:cs="Archivo" w:eastAsia="Archivo" w:hAnsi="Archivo"/>
+                <w:sz w:val="20"/>
+                <w:szCs w:val="20"/>
+              </w:rPr>
+              <w:t xml:space="preserve">Procede recordar que, conforme a reiterada doctrina jurisprudencial, la aplicación de estos intereses es prácticamente automática y de imposición de oficio por el órgano judicial (art. 20.4.º LCS), correspondiendo a la aseguradora la carga de acreditar la concurrencia de una causa justificada que excluya la mora, sin que constituya causa justificada per se la mera existencia de un proceso judicial ni la discrepancia sobre la cuantía de la indemnización cuando la obligación de pago del importe mínimo resulta indiscutida.</w:t>
+            </w:r>
+          </w:p>
+          <w:p>
+            <w:pPr>
+              <w:spacing w:after="160"/>
+              <w:jc w:val="center"/>
+            </w:pPr>
+            <w:r>
+              <w:rPr>
+                <w:rFonts w:ascii="Archivo" w:cs="Archivo" w:eastAsia="Archivo" w:hAnsi="Archivo"/>
+                <w:b/>
+                <w:bCs/>
+                <w:caps w:val="false"/>
+                <w:sz w:val="21"/>
+                <w:szCs w:val="21"/>
+              </w:rPr>
+              <w:t xml:space="preserve">SUPLICO (variante)</w:t>
+            </w:r>
+          </w:p>
+          <w:p>
+            <w:pPr>
+              <w:spacing w:after="160" w:line="300"/>
+              <w:ind w:firstLine="400"/>
+              <w:jc w:val="both"/>
+            </w:pPr>
+            <w:r>
+              <w:rPr>
+                <w:rFonts w:ascii="Archivo" w:cs="Archivo" w:eastAsia="Archivo" w:hAnsi="Archivo"/>
+                <w:sz w:val="20"/>
+                <w:szCs w:val="20"/>
+              </w:rPr>
+              <w:t xml:space="preserve">Que se condene a la demandada a abonar a mi mandante, además de la indemnización principal de [ ] euros [o, en su caso, dejando constancia del abono extraprocesal de dicha suma a los solos efectos de la condena en costas], los intereses del art. 20 LCS devengados desde la fecha del siniestro [(fecha)] hasta su completo pago, calculados conforme a las reglas legales expuestas, con expresa condena en costas a la demandada.</w:t>
+            </w:r>
+          </w:p>
+        </w:tc>
+      </w:tr>
+    </w:tbl>
+    <w:p>
+      <w:pPr>
+        <w:pStyle w:val="Heading2"/>
+        <w:spacing w:after="160" w:before="400"/>
+      </w:pPr>
+      <w:r>
+        <w:rPr>
+          <w:rFonts w:ascii="Fraunces" w:cs="Fraunces" w:eastAsia="Fraunces" w:hAnsi="Fraunces"/>
+          <w:b/>
+          <w:bCs/>
+          <w:color w:val="0A2540"/>
+          <w:sz w:val="24"/>
+          <w:szCs w:val="24"/>
+        </w:rPr>
+        <w:t xml:space="preserve">Modelo 6. Reclamación ante la Dirección General de Seguros y Fondos de Pensiones (DGSFP)</w:t>
+      </w:r>
+    </w:p>
+    <w:p>
+      <w:pPr>
+        <w:spacing w:after="180" w:line="300"/>
+        <w:jc w:val="both"/>
+      </w:pPr>
+      <w:r>
+        <w:rPr>
+          <w:rFonts w:ascii="Archivo" w:cs="Archivo" w:eastAsia="Archivo" w:hAnsi="Archivo"/>
+          <w:i/>
+          <w:iCs/>
+          <w:sz w:val="21"/>
+          <w:szCs w:val="21"/>
+        </w:rPr>
+        <w:t xml:space="preserve">Escrito de reclamación en vía administrativa de supervisión, procedente una vez agotada o transcurrido el plazo de resolución de la reclamación ante el Servicio de Atención al Cliente o el Defensor del Asegurado de la entidad (Modelo 2), conforme al régimen de protección del cliente de servicios financieros y a la normativa de ordenación y supervisión de los seguros privados.</w:t>
+      </w:r>
+    </w:p>
+    <w:p>
+      <w:pPr>
+        <w:spacing w:after="120"/>
+      </w:pPr>
+    </w:p>
+    <w:tbl>
+      <w:tblPr>
+        <w:tblW w:type="pct" w:w="100%"/>
+        <w:tblBorders>
+          <w:top w:val="single" w:color="CBD5E1" w:sz="4"/>
+          <w:left w:val="single" w:color="CBD5E1" w:sz="4"/>
+          <w:bottom w:val="single" w:color="CBD5E1" w:sz="4"/>
+          <w:right w:val="single" w:color="CBD5E1" w:sz="4"/>
+          <w:insideH w:val="single" w:color="auto" w:sz="4"/>
+          <w:insideV w:val="single" w:color="auto" w:sz="4"/>
+        </w:tblBorders>
+      </w:tblPr>
+      <w:tblGrid>
+        <w:gridCol w:w="100"/>
+      </w:tblGrid>
+      <w:tr>
+        <w:tc>
+          <w:tcPr>
+            <w:tcMar>
+              <w:top w:type="dxa" w:w="260"/>
+              <w:left w:type="dxa" w:w="320"/>
+              <w:bottom w:type="dxa" w:w="260"/>
+              <w:right w:type="dxa" w:w="320"/>
+            </w:tcMar>
+          </w:tcPr>
+          <w:p>
+            <w:pPr>
+              <w:spacing w:after="160"/>
+              <w:jc w:val="center"/>
+            </w:pPr>
+            <w:r>
+              <w:rPr>
+                <w:rFonts w:ascii="Archivo" w:cs="Archivo" w:eastAsia="Archivo" w:hAnsi="Archivo"/>
+                <w:b/>
+                <w:bCs/>
+                <w:caps w:val="false"/>
+                <w:sz w:val="21"/>
+                <w:szCs w:val="21"/>
+              </w:rPr>
+              <w:t xml:space="preserve">RECLAMACIÓN ANTE LA DIRECCIÓN GENERAL DE SEGUROS Y FONDOS DE PENSIONES</w:t>
+            </w:r>
+          </w:p>
+          <w:p>
+            <w:pPr>
+              <w:spacing w:after="120"/>
+            </w:pPr>
+            <w:r>
+              <w:rPr>
+                <w:rFonts w:ascii="Archivo" w:cs="Archivo" w:eastAsia="Archivo" w:hAnsi="Archivo"/>
+                <w:b/>
+                <w:bCs/>
+                <w:sz w:val="20"/>
+                <w:szCs w:val="20"/>
+              </w:rPr>
+              <w:t xml:space="preserve">Reclamante: </w:t>
+            </w:r>
+            <w:r>
+              <w:rPr>
+                <w:rFonts w:ascii="Archivo" w:cs="Archivo" w:eastAsia="Archivo" w:hAnsi="Archivo"/>
+                <w:color w:val="6B7A8F"/>
+                <w:sz w:val="20"/>
+                <w:szCs w:val="20"/>
+              </w:rPr>
+              <w:t xml:space="preserve">……………………………………………………………………………</w:t>
+            </w:r>
+          </w:p>
+          <w:p>
+            <w:pPr>
+              <w:spacing w:after="120"/>
+            </w:pPr>
+            <w:r>
+              <w:rPr>
+                <w:rFonts w:ascii="Archivo" w:cs="Archivo" w:eastAsia="Archivo" w:hAnsi="Archivo"/>
+                <w:b/>
+                <w:bCs/>
+                <w:sz w:val="20"/>
+                <w:szCs w:val="20"/>
+              </w:rPr>
+              <w:t xml:space="preserve">Entidad aseguradora reclamada: </w:t>
+            </w:r>
+            <w:r>
+              <w:rPr>
+                <w:rFonts w:ascii="Archivo" w:cs="Archivo" w:eastAsia="Archivo" w:hAnsi="Archivo"/>
+                <w:color w:val="6B7A8F"/>
+                <w:sz w:val="20"/>
+                <w:szCs w:val="20"/>
+              </w:rPr>
+              <w:t xml:space="preserve">……………………………………………………………………………</w:t>
+            </w:r>
+          </w:p>
+          <w:p>
+            <w:pPr>
+              <w:spacing w:after="120"/>
+            </w:pPr>
+            <w:r>
+              <w:rPr>
+                <w:rFonts w:ascii="Archivo" w:cs="Archivo" w:eastAsia="Archivo" w:hAnsi="Archivo"/>
+                <w:b/>
+                <w:bCs/>
+                <w:sz w:val="20"/>
+                <w:szCs w:val="20"/>
+              </w:rPr>
+              <w:t xml:space="preserve">Póliza n.º / Siniestro n.º: </w:t>
+            </w:r>
+            <w:r>
+              <w:rPr>
+                <w:rFonts w:ascii="Archivo" w:cs="Archivo" w:eastAsia="Archivo" w:hAnsi="Archivo"/>
+                <w:color w:val="6B7A8F"/>
+                <w:sz w:val="20"/>
+                <w:szCs w:val="20"/>
+              </w:rPr>
+              <w:t xml:space="preserve">……………………………………………………………………………</w:t>
+            </w:r>
+          </w:p>
+          <w:p>
+            <w:pPr>
+              <w:spacing w:after="120"/>
+            </w:pPr>
+          </w:p>
+          <w:p>
+            <w:pPr>
+              <w:spacing w:after="160" w:line="300"/>
+              <w:jc w:val="both"/>
+            </w:pPr>
+            <w:r>
+              <w:rPr>
+                <w:rFonts w:ascii="Archivo" w:cs="Archivo" w:eastAsia="Archivo" w:hAnsi="Archivo"/>
+                <w:sz w:val="20"/>
+                <w:szCs w:val="20"/>
+              </w:rPr>
+              <w:t xml:space="preserve">EXPONE:</w:t>
+            </w:r>
+          </w:p>
+          <w:p>
+            <w:pPr>
+              <w:spacing w:after="160" w:line="300"/>
+              <w:ind w:firstLine="400"/>
+              <w:jc w:val="both"/>
+            </w:pPr>
+            <w:r>
+              <w:rPr>
+                <w:rFonts w:ascii="Archivo" w:cs="Archivo" w:eastAsia="Archivo" w:hAnsi="Archivo"/>
+                <w:sz w:val="20"/>
+                <w:szCs w:val="20"/>
+              </w:rPr>
+              <w:t xml:space="preserve">PRIMERO.- Que con fecha [fecha] presentó reclamación ante el Servicio de Atención al Cliente / Defensor del Asegurado de la entidad [aseguradora], sin haber obtenido respuesta en el plazo legalmente establecido / habiendo recibido respuesta desestimatoria de fecha [fecha] (se acompaña como Documento n.º 1).</w:t>
+            </w:r>
+          </w:p>
+          <w:p>
+            <w:pPr>
+              <w:spacing w:after="160" w:line="300"/>
+              <w:ind w:firstLine="400"/>
+              <w:jc w:val="both"/>
+            </w:pPr>
+            <w:r>
+              <w:rPr>
+                <w:rFonts w:ascii="Archivo" w:cs="Archivo" w:eastAsia="Archivo" w:hAnsi="Archivo"/>
+                <w:sz w:val="20"/>
+                <w:szCs w:val="20"/>
+              </w:rPr>
+              <w:t xml:space="preserve">SEGUNDO.- Que los hechos objeto de la reclamación son los siguientes: [resumen de los hechos: contrato, siniestro, postura de la aseguradora y motivos de disconformidad, con remisión a la documentación aportada].</w:t>
+            </w:r>
+          </w:p>
+          <w:p>
+            <w:pPr>
+              <w:spacing w:after="160" w:line="300"/>
+              <w:ind w:firstLine="400"/>
+              <w:jc w:val="both"/>
+            </w:pPr>
+            <w:r>
+              <w:rPr>
+                <w:rFonts w:ascii="Archivo" w:cs="Archivo" w:eastAsia="Archivo" w:hAnsi="Archivo"/>
+                <w:sz w:val="20"/>
+                <w:szCs w:val="20"/>
+              </w:rPr>
+              <w:t xml:space="preserve">TERCERO.- Que se considera que la actuación de la entidad reclamada resulta contraria a las buenas prácticas y usos financieros y, en particular, [a lo dispuesto en los arts. 1, 3 y 20 de la Ley 50/1980, de Contrato de Seguro / a las condiciones de la póliza suscrita], por los motivos ya expuestos ante el Servicio de Atención al Cliente.</w:t>
+            </w:r>
+          </w:p>
+          <w:p>
+            <w:pPr>
+              <w:spacing w:after="160" w:line="300"/>
+              <w:ind w:firstLine="400"/>
+              <w:jc w:val="both"/>
+            </w:pPr>
+            <w:r>
+              <w:rPr>
+                <w:rFonts w:ascii="Archivo" w:cs="Archivo" w:eastAsia="Archivo" w:hAnsi="Archivo"/>
+                <w:sz w:val="20"/>
+                <w:szCs w:val="20"/>
+              </w:rPr>
+              <w:t xml:space="preserve">SOLICITA que, teniendo por presentado este escrito con la documentación que se acompaña, se admita a trámite la presente reclamación, se dé traslado de la misma a la entidad reclamada y se emita el informe correspondiente sobre el ajuste de su actuación a la normativa de ordenación y supervisión de los seguros privados y a las buenas prácticas del sector, dejando constancia de que el presente escrito no suspende ni sustituye el plazo de prescripción de las acciones civiles que puedan corresponder al reclamante, ni impide el ejercicio de la acción judicial conforme al art. 23 LCS.</w:t>
+            </w:r>
+          </w:p>
+          <w:p>
+            <w:pPr>
+              <w:spacing w:after="200"/>
+            </w:pPr>
+          </w:p>
+          <w:p>
+            <w:pPr>
+              <w:spacing w:after="160" w:line="300"/>
+              <w:jc w:val="both"/>
+            </w:pPr>
+            <w:r>
+              <w:rPr>
+                <w:rFonts w:ascii="Archivo" w:cs="Archivo" w:eastAsia="Archivo" w:hAnsi="Archivo"/>
+                <w:sz w:val="20"/>
+                <w:szCs w:val="20"/>
+              </w:rPr>
+              <w:t xml:space="preserve">En [lugar], a [fecha].</w:t>
+            </w:r>
+          </w:p>
+          <w:p>
+            <w:pPr>
+              <w:spacing w:after="400"/>
+            </w:pPr>
+          </w:p>
+          <w:p>
+            <w:pPr>
+              <w:spacing w:after="0"/>
+              <w:jc w:val="center"/>
+            </w:pPr>
+            <w:r>
+              <w:rPr>
+                <w:rFonts w:ascii="Archivo" w:cs="Archivo" w:eastAsia="Archivo" w:hAnsi="Archivo"/>
+                <w:b w:val="false"/>
+                <w:bCs w:val="false"/>
+                <w:caps w:val="false"/>
+                <w:sz w:val="21"/>
+                <w:szCs w:val="21"/>
+              </w:rPr>
+              <w:t xml:space="preserve">Fdo.: [nombre y apellidos / DNI]</w:t>
+            </w:r>
+          </w:p>
+        </w:tc>
+      </w:tr>
+    </w:tbl>
     <w:sectPr>
       <w:headerReference w:type="default" r:id="rId7"/>
       <w:footerReference w:type="default" r:id="rId8"/>
@@ -2795,6 +5190,132 @@
       </w:r>
       <w:r>
         <w:continuationSeparator/>
+      </w:r>
+    </w:p>
+  </w:footnote>
+  <w:footnote w:id="1">
+    <w:p>
+      <w:r>
+        <w:rPr>
+          <w:rStyle w:val="FootnoteReference"/>
+        </w:rPr>
+        <w:footnoteRef/>
+      </w:r>
+      <w:r>
+        <w:rPr>
+          <w:rFonts w:ascii="Archivo" w:cs="Archivo" w:eastAsia="Archivo" w:hAnsi="Archivo"/>
+          <w:sz w:val="17"/>
+          <w:szCs w:val="17"/>
+        </w:rPr>
+        <w:t xml:space="preserve">SÁNCHEZ CALERO, F. (dir.), Ley de Contrato de Seguro. Comentarios a la Ley 50/1980, de 8 de octubre, y a sus modificaciones, Aranzadi-Thomson Reuters, Cizur Menor, ad art. 1: el precepto acoge la noción causal del contrato de seguro sobre la base del binomio prima-riesgo, superando la discusión doctrinal decimonónica sobre su naturaleza indemnizatoria o de garantía.</w:t>
+      </w:r>
+    </w:p>
+  </w:footnote>
+  <w:footnote w:id="2">
+    <w:p>
+      <w:r>
+        <w:rPr>
+          <w:rStyle w:val="FootnoteReference"/>
+        </w:rPr>
+        <w:footnoteRef/>
+      </w:r>
+      <w:r>
+        <w:rPr>
+          <w:rFonts w:ascii="Archivo" w:cs="Archivo" w:eastAsia="Archivo" w:hAnsi="Archivo"/>
+          <w:sz w:val="17"/>
+          <w:szCs w:val="17"/>
+        </w:rPr>
+        <w:t xml:space="preserve">La figura del seguro «multirriesgo» o «combinado» no constituye un tipo contractual distinto, sino la yuxtaposición, bajo una sola póliza, de varias modalidades de seguro de daños (incendio, robo, agua, etc.) y, en su caso, de responsabilidad civil; cfr. VEIGA COPO, A. B., Tratado del Contrato de Seguro, Civitas-Thomson Reuters, Cizur Menor, últimas ediciones, tomo I, capítulo dedicado a los seguros multirriesgo y combinados.</w:t>
+      </w:r>
+    </w:p>
+  </w:footnote>
+  <w:footnote w:id="3">
+    <w:p>
+      <w:r>
+        <w:rPr>
+          <w:rStyle w:val="FootnoteReference"/>
+        </w:rPr>
+        <w:footnoteRef/>
+      </w:r>
+      <w:r>
+        <w:rPr>
+          <w:rFonts w:ascii="Archivo" w:cs="Archivo" w:eastAsia="Archivo" w:hAnsi="Archivo"/>
+          <w:sz w:val="17"/>
+          <w:szCs w:val="17"/>
+        </w:rPr>
+        <w:t xml:space="preserve">La caracterización del seguro como contrato «de máxima buena fe» procede de la tradición angloamericana (utmost good faith), pero ha sido plenamente asumida por la doctrina española como principio informador transversal de la LCS; vid. TIRADO SUÁREZ, F. J., en Comentarios al Código de Comercio y legislación mercantil especial (dir. R. Uría, A. Menéndez y M. Olivencia), tomo XXIV, vol. 1.º, Edersa/Civitas, epígrafe introductorio sobre los principios informadores del contrato de seguro.</w:t>
+      </w:r>
+    </w:p>
+  </w:footnote>
+  <w:footnote w:id="4">
+    <w:p>
+      <w:r>
+        <w:rPr>
+          <w:rStyle w:val="FootnoteReference"/>
+        </w:rPr>
+        <w:footnoteRef/>
+      </w:r>
+      <w:r>
+        <w:rPr>
+          <w:rFonts w:ascii="Archivo" w:cs="Archivo" w:eastAsia="Archivo" w:hAnsi="Archivo"/>
+          <w:sz w:val="17"/>
+          <w:szCs w:val="17"/>
+        </w:rPr>
+        <w:t xml:space="preserve">La distinción es, con VEIGA COPO, «la más fecunda y a la vez más problemática summa divisio de todo el derecho contractual del seguro español», por la trascendencia práctica de sus consecuencias en materia de oponibilidad; VEIGA COPO, A. B., Condiciones generales y particulares en el contrato de seguro, Civitas-Thomson Reuters, Cizur Menor.</w:t>
+      </w:r>
+    </w:p>
+  </w:footnote>
+  <w:footnote w:id="5">
+    <w:p>
+      <w:r>
+        <w:rPr>
+          <w:rStyle w:val="FootnoteReference"/>
+        </w:rPr>
+        <w:footnoteRef/>
+      </w:r>
+      <w:r>
+        <w:rPr>
+          <w:rFonts w:ascii="Archivo" w:cs="Archivo" w:eastAsia="Archivo" w:hAnsi="Archivo"/>
+          <w:sz w:val="17"/>
+          <w:szCs w:val="17"/>
+        </w:rPr>
+        <w:t xml:space="preserve">Sobre la evolución jurisprudencial de la distinción desde los años noventa, cfr. BATALLER GRAU, J.; BOQUERA MATARREDONA, J.; OLAVARRÍA IGLESIA, J. (coords.), Comentarios a la Ley de Contrato de Seguro, Tirant lo Blanch, Valencia, ad art. 3.</w:t>
+      </w:r>
+    </w:p>
+  </w:footnote>
+  <w:footnote w:id="6">
+    <w:p>
+      <w:r>
+        <w:rPr>
+          <w:rStyle w:val="FootnoteReference"/>
+        </w:rPr>
+        <w:footnoteRef/>
+      </w:r>
+      <w:r>
+        <w:rPr>
+          <w:rFonts w:ascii="Archivo" w:cs="Archivo" w:eastAsia="Archivo" w:hAnsi="Archivo"/>
+          <w:sz w:val="17"/>
+          <w:szCs w:val="17"/>
+        </w:rPr>
+        <w:t xml:space="preserve">En esta línea, un sector doctrinal propone sustituir el criterio formal (ubicación de la cláusula) por un criterio funcional atento a la «expectativa razonable del asegurado» (reasonable expectations doctrine, de raíz anglosajona); vid. la reseña de esta corriente en la Revista Española de Seguros, publicación periódica de la Sección Española de la Asociación Internacional de Derecho de Seguros (SEAIDA).</w:t>
+      </w:r>
+    </w:p>
+  </w:footnote>
+  <w:footnote w:id="7">
+    <w:p>
+      <w:r>
+        <w:rPr>
+          <w:rStyle w:val="FootnoteReference"/>
+        </w:rPr>
+        <w:footnoteRef/>
+      </w:r>
+      <w:r>
+        <w:rPr>
+          <w:rFonts w:ascii="Archivo" w:cs="Archivo" w:eastAsia="Archivo" w:hAnsi="Archivo"/>
+          <w:sz w:val="17"/>
+          <w:szCs w:val="17"/>
+        </w:rPr>
+        <w:t xml:space="preserve">El control de transparencia, de matriz comunitaria (art. 4.2 de la Directiva 93/13/CEE), opera aquí en su vertiente «material» o de comprensibilidad real, no meramente formal o gramatical; sobre su traslación al contrato de seguro, cfr. SÁNCHEZ CALERO, F. (dir.), op. cit., ad art. 3, apartado dedicado al principio de transparencia.</w:t>
       </w:r>
     </w:p>
   </w:footnote>

</xml_diff>

<commit_message>
Completa la Parte II: Capítulos 9-12 (RC, defensa jurídica, especiales, exclusiones)
- Cap. 9: responsabilidad civil del cabeza de familia (arts. 73-76 LCS),
  acción directa e inoponibilidad al perjudicado de la mala fe del
  asegurado (STS de 20/4/2023, ROJ 1544/2023, sobre un seguro de hogar).
- Cap. 10: seguro de defensa jurídica (arts. 76.a-76.g LCS), libre
  elección de abogado y calificación de los límites cuantitativos como
  delimitadores/limitativos/lesivos (STS de 24/2/2021, ROJ 584/2021).
- Cap. 11: sublímites (joyas, electrónica, arte) y seguro de comunidad de
  propietarios (art. 9.1.f LPH), con remisión a la doctrina de
  concurrencia de seguros del capítulo 6.
- Cap. 12: sistemática de exclusiones (legales de orden público vs.
  convencionales) y síntesis metodológica de control de cláusulas que
  cierra la Parte II.

Parte II completa (12 capítulos). Sigue la Parte III.
</commit_message>
<xml_diff>
--- a/libro/Derecho_Seguros_Hogar.docx
+++ b/libro/Derecho_Seguros_Hogar.docx
@@ -13284,6 +13284,4477 @@
           <w:szCs w:val="21"/>
         </w:rPr>
         <w:t xml:space="preserve">VEIGA COPO, A. B., Tratado del Contrato de Seguro, Civitas-Thomson Reuters, Cizur Menor.</w:t>
+      </w:r>
+    </w:p>
+    <w:p>
+      <w:pPr>
+        <w:pStyle w:val="Heading1"/>
+        <w:pageBreakBefore/>
+        <w:spacing w:after="300" w:before="200"/>
+      </w:pPr>
+      <w:r>
+        <w:rPr>
+          <w:rFonts w:ascii="Archivo" w:cs="Archivo" w:eastAsia="Archivo" w:hAnsi="Archivo"/>
+          <w:b/>
+          <w:bCs/>
+          <w:color w:val="1B6DF0"/>
+          <w:sz w:val="22"/>
+          <w:szCs w:val="22"/>
+        </w:rPr>
+        <w:t xml:space="preserve">Capítulo 9. </w:t>
+      </w:r>
+      <w:r>
+        <w:rPr>
+          <w:rFonts w:ascii="Fraunces" w:cs="Fraunces" w:eastAsia="Fraunces" w:hAnsi="Fraunces"/>
+          <w:b/>
+          <w:bCs/>
+          <w:color w:val="0A2540"/>
+          <w:sz w:val="30"/>
+          <w:szCs w:val="30"/>
+        </w:rPr>
+        <w:t xml:space="preserve">Responsabilidad civil de la vida privada y del cabeza de familia</w:t>
+      </w:r>
+    </w:p>
+    <w:tbl>
+      <w:tblPr>
+        <w:tblW w:type="pct" w:w="100%"/>
+        <w:tblBorders>
+          <w:top w:val="single" w:color="CBD5E1" w:sz="4"/>
+          <w:left w:val="single" w:color="1B6DF0" w:sz="24"/>
+          <w:bottom w:val="single" w:color="CBD5E1" w:sz="4"/>
+          <w:right w:val="single" w:color="CBD5E1" w:sz="4"/>
+          <w:insideH w:val="single" w:color="auto" w:sz="4"/>
+          <w:insideV w:val="single" w:color="auto" w:sz="4"/>
+        </w:tblBorders>
+      </w:tblPr>
+      <w:tblGrid>
+        <w:gridCol w:w="100"/>
+      </w:tblGrid>
+      <w:tr>
+        <w:tc>
+          <w:tcPr>
+            <w:shd w:fill="F4F6F9" w:val="clear"/>
+            <w:tcMar>
+              <w:top w:type="dxa" w:w="160"/>
+              <w:left w:type="dxa" w:w="220"/>
+              <w:bottom w:type="dxa" w:w="160"/>
+              <w:right w:type="dxa" w:w="220"/>
+            </w:tcMar>
+          </w:tcPr>
+          <w:p>
+            <w:pPr>
+              <w:spacing w:after="100"/>
+            </w:pPr>
+            <w:r>
+              <w:rPr>
+                <w:rFonts w:ascii="Archivo" w:cs="Archivo" w:eastAsia="Archivo" w:hAnsi="Archivo"/>
+                <w:b/>
+                <w:bCs/>
+                <w:caps/>
+                <w:color w:val="1B6DF0"/>
+                <w:sz w:val="18"/>
+                <w:szCs w:val="18"/>
+              </w:rPr>
+              <w:t xml:space="preserve">Sumario</w:t>
+            </w:r>
+          </w:p>
+          <w:p>
+            <w:pPr>
+              <w:spacing w:after="40" w:line="260"/>
+            </w:pPr>
+            <w:r>
+              <w:rPr>
+                <w:rFonts w:ascii="Archivo" w:cs="Archivo" w:eastAsia="Archivo" w:hAnsi="Archivo"/>
+                <w:sz w:val="18"/>
+                <w:szCs w:val="18"/>
+              </w:rPr>
+              <w:t xml:space="preserve">9.1. El seguro de responsabilidad civil en la póliza de hogar</w:t>
+            </w:r>
+          </w:p>
+          <w:p>
+            <w:pPr>
+              <w:spacing w:after="40" w:line="260"/>
+            </w:pPr>
+            <w:r>
+              <w:rPr>
+                <w:rFonts w:ascii="Archivo" w:cs="Archivo" w:eastAsia="Archivo" w:hAnsi="Archivo"/>
+                <w:sz w:val="18"/>
+                <w:szCs w:val="18"/>
+              </w:rPr>
+              <w:t xml:space="preserve">9.2. La dirección jurídica del siniestro por el asegurador (art. 74 LCS)</w:t>
+            </w:r>
+          </w:p>
+          <w:p>
+            <w:pPr>
+              <w:spacing w:after="40" w:line="260"/>
+            </w:pPr>
+            <w:r>
+              <w:rPr>
+                <w:rFonts w:ascii="Archivo" w:cs="Archivo" w:eastAsia="Archivo" w:hAnsi="Archivo"/>
+                <w:sz w:val="18"/>
+                <w:szCs w:val="18"/>
+              </w:rPr>
+              <w:t xml:space="preserve">9.3. La acción directa del perjudicado (art. 76 LCS)</w:t>
+            </w:r>
+          </w:p>
+          <w:p>
+            <w:pPr>
+              <w:spacing w:after="40" w:line="260"/>
+            </w:pPr>
+            <w:r>
+              <w:rPr>
+                <w:rFonts w:ascii="Archivo" w:cs="Archivo" w:eastAsia="Archivo" w:hAnsi="Archivo"/>
+                <w:sz w:val="18"/>
+                <w:szCs w:val="18"/>
+              </w:rPr>
+              <w:t xml:space="preserve">9.4. La responsabilidad civil por hecho ajeno: hijos, dependientes y mascotas (art. 1903 CC)</w:t>
+            </w:r>
+          </w:p>
+          <w:p>
+            <w:pPr>
+              <w:spacing w:after="40" w:line="260"/>
+            </w:pPr>
+            <w:r>
+              <w:rPr>
+                <w:rFonts w:ascii="Archivo" w:cs="Archivo" w:eastAsia="Archivo" w:hAnsi="Archivo"/>
+                <w:sz w:val="18"/>
+                <w:szCs w:val="18"/>
+              </w:rPr>
+              <w:t xml:space="preserve">9.5. Inoponibilidad del dolo del asegurado al tercero perjudicado</w:t>
+            </w:r>
+          </w:p>
+          <w:p>
+            <w:pPr>
+              <w:spacing w:after="40" w:line="260"/>
+            </w:pPr>
+            <w:r>
+              <w:rPr>
+                <w:rFonts w:ascii="Archivo" w:cs="Archivo" w:eastAsia="Archivo" w:hAnsi="Archivo"/>
+                <w:sz w:val="18"/>
+                <w:szCs w:val="18"/>
+              </w:rPr>
+              <w:t xml:space="preserve">9.6. Ficha para el profesional</w:t>
+            </w:r>
+          </w:p>
+          <w:p>
+            <w:pPr>
+              <w:spacing w:after="40" w:line="260"/>
+            </w:pPr>
+            <w:r>
+              <w:rPr>
+                <w:rFonts w:ascii="Archivo" w:cs="Archivo" w:eastAsia="Archivo" w:hAnsi="Archivo"/>
+                <w:sz w:val="18"/>
+                <w:szCs w:val="18"/>
+              </w:rPr>
+              <w:t xml:space="preserve">9.7. Ficha para el asegurado</w:t>
+            </w:r>
+          </w:p>
+          <w:p>
+            <w:pPr>
+              <w:spacing w:after="40" w:line="260"/>
+            </w:pPr>
+            <w:r>
+              <w:rPr>
+                <w:rFonts w:ascii="Archivo" w:cs="Archivo" w:eastAsia="Archivo" w:hAnsi="Archivo"/>
+                <w:sz w:val="18"/>
+                <w:szCs w:val="18"/>
+              </w:rPr>
+              <w:t xml:space="preserve">9.8. Checklist: gestión de una reclamación de responsabilidad civil del hogar</w:t>
+            </w:r>
+          </w:p>
+        </w:tc>
+      </w:tr>
+    </w:tbl>
+    <w:p>
+      <w:pPr>
+        <w:spacing w:after="160"/>
+      </w:pPr>
+    </w:p>
+    <w:tbl>
+      <w:tblPr>
+        <w:tblW w:type="pct" w:w="100%"/>
+        <w:tblBorders>
+          <w:top w:val="single" w:color="CBD5E1" w:sz="4"/>
+          <w:left w:val="single" w:color="6B7A8F" w:sz="24"/>
+          <w:bottom w:val="single" w:color="CBD5E1" w:sz="4"/>
+          <w:right w:val="single" w:color="CBD5E1" w:sz="4"/>
+          <w:insideH w:val="single" w:color="auto" w:sz="4"/>
+          <w:insideV w:val="single" w:color="auto" w:sz="4"/>
+        </w:tblBorders>
+      </w:tblPr>
+      <w:tblGrid>
+        <w:gridCol w:w="100"/>
+      </w:tblGrid>
+      <w:tr>
+        <w:tc>
+          <w:tcPr>
+            <w:shd w:fill="F4F6F9" w:val="clear"/>
+            <w:tcMar>
+              <w:top w:type="dxa" w:w="160"/>
+              <w:left w:type="dxa" w:w="220"/>
+              <w:bottom w:type="dxa" w:w="160"/>
+              <w:right w:type="dxa" w:w="220"/>
+            </w:tcMar>
+          </w:tcPr>
+          <w:p>
+            <w:pPr>
+              <w:spacing w:after="100"/>
+            </w:pPr>
+            <w:r>
+              <w:rPr>
+                <w:rFonts w:ascii="Archivo" w:cs="Archivo" w:eastAsia="Archivo" w:hAnsi="Archivo"/>
+                <w:b/>
+                <w:bCs/>
+                <w:caps/>
+                <w:color w:val="6B7A8F"/>
+                <w:sz w:val="18"/>
+                <w:szCs w:val="18"/>
+              </w:rPr>
+              <w:t xml:space="preserve">Resumen · Abstract</w:t>
+            </w:r>
+          </w:p>
+          <w:p>
+            <w:pPr>
+              <w:spacing w:after="100"/>
+              <w:jc w:val="both"/>
+            </w:pPr>
+            <w:r>
+              <w:rPr>
+                <w:rFonts w:ascii="Archivo" w:cs="Archivo" w:eastAsia="Archivo" w:hAnsi="Archivo"/>
+                <w:i/>
+                <w:iCs/>
+                <w:sz w:val="18"/>
+                <w:szCs w:val="18"/>
+              </w:rPr>
+              <w:t xml:space="preserve">El capítulo analiza la garantía de responsabilidad civil de la vida privada o del cabeza de familia, presente en la práctica totalidad de las pólizas de hogar, que traslada al asegurado el régimen especial de los arts. 73 a 76 LCS: dirección jurídica del siniestro por el asegurador, acción directa del perjudicado e inoponibilidad a este de las excepciones personales del asegurador frente al asegurado, incluida la propia mala fe de este último, conforme a la reciente doctrina de la Sala Primera aplicada precisamente a un seguro multirriesgo del hogar.</w:t>
+            </w:r>
+          </w:p>
+          <w:p>
+            <w:pPr>
+              <w:spacing w:after="160"/>
+            </w:pPr>
+            <w:r>
+              <w:rPr>
+                <w:rFonts w:ascii="Archivo" w:cs="Archivo" w:eastAsia="Archivo" w:hAnsi="Archivo"/>
+                <w:b/>
+                <w:bCs/>
+                <w:sz w:val="17"/>
+                <w:szCs w:val="17"/>
+              </w:rPr>
+              <w:t xml:space="preserve">Palabras clave: responsabilidad civil, cabeza de familia, art. 73 LCS, art. 76 LCS, acción directa, inoponibilidad, dolo.</w:t>
+            </w:r>
+          </w:p>
+          <w:p>
+            <w:pPr>
+              <w:spacing w:after="100"/>
+              <w:jc w:val="both"/>
+            </w:pPr>
+            <w:r>
+              <w:rPr>
+                <w:rFonts w:ascii="Archivo" w:cs="Archivo" w:eastAsia="Archivo" w:hAnsi="Archivo"/>
+                <w:i/>
+                <w:iCs/>
+                <w:sz w:val="18"/>
+                <w:szCs w:val="18"/>
+              </w:rPr>
+              <w:t xml:space="preserve">This chapter examines the private/family liability cover present in virtually every homeowners' policy, which imports the special regime of Articles 73 to 76 of the Insurance Contract Act: the insurer's conduct of the claim's legal defence, the injured third party's direct action, and the inopposability to that party of the insurer's personal defences against the insured — including the insured's own bad faith — under recent Supreme Court case law applied precisely to a homeowners' multi-risk policy.</w:t>
+            </w:r>
+          </w:p>
+          <w:p>
+            <w:pPr>
+              <w:spacing w:after="0"/>
+            </w:pPr>
+            <w:r>
+              <w:rPr>
+                <w:rFonts w:ascii="Archivo" w:cs="Archivo" w:eastAsia="Archivo" w:hAnsi="Archivo"/>
+                <w:b/>
+                <w:bCs/>
+                <w:sz w:val="17"/>
+                <w:szCs w:val="17"/>
+              </w:rPr>
+              <w:t xml:space="preserve">Keywords: liability insurance, family liability cover, direct action, inopposability of defences, wilful misconduct.</w:t>
+            </w:r>
+          </w:p>
+        </w:tc>
+      </w:tr>
+    </w:tbl>
+    <w:p>
+      <w:pPr>
+        <w:spacing w:after="200"/>
+      </w:pPr>
+    </w:p>
+    <w:p>
+      <w:pPr>
+        <w:pStyle w:val="Heading2"/>
+        <w:spacing w:after="160" w:before="400"/>
+      </w:pPr>
+      <w:r>
+        <w:rPr>
+          <w:rFonts w:ascii="Fraunces" w:cs="Fraunces" w:eastAsia="Fraunces" w:hAnsi="Fraunces"/>
+          <w:b/>
+          <w:bCs/>
+          <w:color w:val="0A2540"/>
+          <w:sz w:val="24"/>
+          <w:szCs w:val="24"/>
+        </w:rPr>
+        <w:t xml:space="preserve">9.1. El seguro de responsabilidad civil en la póliza de hogar</w:t>
+      </w:r>
+    </w:p>
+    <w:p>
+      <w:pPr>
+        <w:spacing w:after="180" w:line="300"/>
+        <w:jc w:val="both"/>
+      </w:pPr>
+      <w:r>
+        <w:rPr>
+          <w:rFonts w:ascii="Archivo" w:cs="Archivo" w:eastAsia="Archivo" w:hAnsi="Archivo"/>
+          <w:sz w:val="21"/>
+          <w:szCs w:val="21"/>
+        </w:rPr>
+        <w:t xml:space="preserve">Prácticamente ninguna póliza de hogar española prescinde de una garantía de responsabilidad civil de la vida privada o del cabeza de familia, que cubre la responsabilidad extracontractual en que puedan incurrir el asegurado y las personas con él convivientes en su vida privada, distinta y adicional a la cobertura de daños propios estudiada en los capítulos anteriores. Esta garantía traslada al contrato el régimen especial que la LCS reserva al seguro de responsabilidad civil en sus arts. 73 a 76</w:t>
+      </w:r>
+      <w:r>
+        <w:rPr>
+          <w:rStyle w:val="FootnoteReference"/>
+        </w:rPr>
+        <w:footnoteReference w:id="20"/>
+      </w:r>
+      <w:r>
+        <w:rPr>
+          <w:rFonts w:ascii="Archivo" w:cs="Archivo" w:eastAsia="Archivo" w:hAnsi="Archivo"/>
+          <w:sz w:val="21"/>
+          <w:szCs w:val="21"/>
+        </w:rPr>
+        <w:t xml:space="preserve">:</w:t>
+      </w:r>
+    </w:p>
+    <w:tbl>
+      <w:tblPr>
+        <w:tblW w:type="pct" w:w="100%"/>
+        <w:tblBorders>
+          <w:top w:val="single" w:color="CBD5E1" w:sz="4"/>
+          <w:left w:val="single" w:color="1B6DF0" w:sz="24"/>
+          <w:bottom w:val="single" w:color="CBD5E1" w:sz="4"/>
+          <w:right w:val="single" w:color="CBD5E1" w:sz="4"/>
+          <w:insideH w:val="single" w:color="auto" w:sz="4"/>
+          <w:insideV w:val="single" w:color="auto" w:sz="4"/>
+        </w:tblBorders>
+      </w:tblPr>
+      <w:tblGrid>
+        <w:gridCol w:w="100"/>
+      </w:tblGrid>
+      <w:tr>
+        <w:tc>
+          <w:tcPr>
+            <w:shd w:fill="F4F6F9" w:val="clear"/>
+            <w:tcMar>
+              <w:top w:type="dxa" w:w="160"/>
+              <w:left w:type="dxa" w:w="220"/>
+              <w:bottom w:type="dxa" w:w="160"/>
+              <w:right w:type="dxa" w:w="220"/>
+            </w:tcMar>
+          </w:tcPr>
+          <w:p>
+            <w:pPr>
+              <w:spacing w:after="100"/>
+            </w:pPr>
+            <w:r>
+              <w:rPr>
+                <w:rFonts w:ascii="Archivo" w:cs="Archivo" w:eastAsia="Archivo" w:hAnsi="Archivo"/>
+                <w:b/>
+                <w:bCs/>
+                <w:caps/>
+                <w:color w:val="1B6DF0"/>
+                <w:sz w:val="18"/>
+                <w:szCs w:val="18"/>
+              </w:rPr>
+              <w:t xml:space="preserve">Texto legal · Art. 73 LCS</w:t>
+            </w:r>
+          </w:p>
+          <w:p>
+            <w:pPr>
+              <w:spacing w:after="0" w:line="280"/>
+              <w:jc w:val="both"/>
+            </w:pPr>
+            <w:r>
+              <w:rPr>
+                <w:rFonts w:ascii="IBM Plex Mono" w:cs="IBM Plex Mono" w:eastAsia="IBM Plex Mono" w:hAnsi="IBM Plex Mono"/>
+                <w:i/>
+                <w:iCs/>
+                <w:color w:val="0A2540"/>
+                <w:sz w:val="18"/>
+                <w:szCs w:val="18"/>
+              </w:rPr>
+              <w:t xml:space="preserve">Por el seguro de responsabilidad civil el asegurador se obliga, dentro de los límites establecidos en la Ley y en el contrato, a cubrir el riesgo del nacimiento a cargo del asegurado de la obligación de indemnizar a un tercero los daños y perjuicios causados por un hecho previsto en el contrato de cuyas consecuencias sea civilmente responsable el asegurado, conforme a derecho.</w:t>
+            </w:r>
+          </w:p>
+        </w:tc>
+      </w:tr>
+    </w:tbl>
+    <w:p>
+      <w:pPr>
+        <w:spacing w:after="180" w:line="300"/>
+        <w:jc w:val="both"/>
+      </w:pPr>
+      <w:r>
+        <w:rPr>
+          <w:rFonts w:ascii="Archivo" w:cs="Archivo" w:eastAsia="Archivo" w:hAnsi="Archivo"/>
+          <w:sz w:val="21"/>
+          <w:szCs w:val="21"/>
+        </w:rPr>
+        <w:t xml:space="preserve">La cláusula de definición de «asegurados» a efectos de esta garantía es, en la práctica del hogar, de importancia capital: suele extenderse, más allá del tomador, al cónyuge o pareja, a los hijos y demás familiares convivientes, e incluso, en ocasiones, al personal doméstico al servicio del hogar, configurando lo que la práctica del sector denomina «responsabilidad civil del cabeza de familia», precisamente porque cubre la responsabilidad de todo el núcleo de convivencia y no solo la del tomador individual.</w:t>
+      </w:r>
+    </w:p>
+    <w:p>
+      <w:pPr>
+        <w:pStyle w:val="Heading2"/>
+        <w:spacing w:after="160" w:before="400"/>
+      </w:pPr>
+      <w:r>
+        <w:rPr>
+          <w:rFonts w:ascii="Fraunces" w:cs="Fraunces" w:eastAsia="Fraunces" w:hAnsi="Fraunces"/>
+          <w:b/>
+          <w:bCs/>
+          <w:color w:val="0A2540"/>
+          <w:sz w:val="24"/>
+          <w:szCs w:val="24"/>
+        </w:rPr>
+        <w:t xml:space="preserve">9.2. La dirección jurídica del siniestro por el asegurador</w:t>
+      </w:r>
+    </w:p>
+    <w:p>
+      <w:pPr>
+        <w:spacing w:after="180" w:line="300"/>
+        <w:jc w:val="both"/>
+      </w:pPr>
+      <w:r>
+        <w:rPr>
+          <w:rFonts w:ascii="Archivo" w:cs="Archivo" w:eastAsia="Archivo" w:hAnsi="Archivo"/>
+          <w:sz w:val="21"/>
+          <w:szCs w:val="21"/>
+        </w:rPr>
+        <w:t xml:space="preserve">Producida una reclamación de responsabilidad civil, el artículo 74 LCS atribuye al asegurador, salvo pacto en contrario, la dirección jurídica de la defensa frente al perjudicado:</w:t>
+      </w:r>
+    </w:p>
+    <w:tbl>
+      <w:tblPr>
+        <w:tblW w:type="pct" w:w="100%"/>
+        <w:tblBorders>
+          <w:top w:val="single" w:color="CBD5E1" w:sz="4"/>
+          <w:left w:val="single" w:color="1B6DF0" w:sz="24"/>
+          <w:bottom w:val="single" w:color="CBD5E1" w:sz="4"/>
+          <w:right w:val="single" w:color="CBD5E1" w:sz="4"/>
+          <w:insideH w:val="single" w:color="auto" w:sz="4"/>
+          <w:insideV w:val="single" w:color="auto" w:sz="4"/>
+        </w:tblBorders>
+      </w:tblPr>
+      <w:tblGrid>
+        <w:gridCol w:w="100"/>
+      </w:tblGrid>
+      <w:tr>
+        <w:tc>
+          <w:tcPr>
+            <w:shd w:fill="F4F6F9" w:val="clear"/>
+            <w:tcMar>
+              <w:top w:type="dxa" w:w="160"/>
+              <w:left w:type="dxa" w:w="220"/>
+              <w:bottom w:type="dxa" w:w="160"/>
+              <w:right w:type="dxa" w:w="220"/>
+            </w:tcMar>
+          </w:tcPr>
+          <w:p>
+            <w:pPr>
+              <w:spacing w:after="100"/>
+            </w:pPr>
+            <w:r>
+              <w:rPr>
+                <w:rFonts w:ascii="Archivo" w:cs="Archivo" w:eastAsia="Archivo" w:hAnsi="Archivo"/>
+                <w:b/>
+                <w:bCs/>
+                <w:caps/>
+                <w:color w:val="1B6DF0"/>
+                <w:sz w:val="18"/>
+                <w:szCs w:val="18"/>
+              </w:rPr>
+              <w:t xml:space="preserve">Texto legal · Art. 74 LCS</w:t>
+            </w:r>
+          </w:p>
+          <w:p>
+            <w:pPr>
+              <w:spacing w:after="0" w:line="280"/>
+              <w:jc w:val="both"/>
+            </w:pPr>
+            <w:r>
+              <w:rPr>
+                <w:rFonts w:ascii="IBM Plex Mono" w:cs="IBM Plex Mono" w:eastAsia="IBM Plex Mono" w:hAnsi="IBM Plex Mono"/>
+                <w:i/>
+                <w:iCs/>
+                <w:color w:val="0A2540"/>
+                <w:sz w:val="18"/>
+                <w:szCs w:val="18"/>
+              </w:rPr>
+              <w:t xml:space="preserve">Salvo pacto en contrario, el asegurador asumirá la dirección jurídica frente a la reclamación del perjudicado, y serán de su cuenta los gastos de defensa que se ocasionen. El asegurado deberá prestar la colaboración necesaria en orden a la dirección jurídica asumida por el asegurador. No obstante lo dispuesto en el párrafo anterior, cuando quien reclame esté también asegurado con el mismo asegurador o exista algún otro posible conflicto de intereses, éste comunicará inmediatamente al asegurado la existencia de esas circunstancias [...]. El asegurado podrá optar entre el mantenimiento de la dirección jurídica por el asegurador o confiar su propia defensa a otra persona. En este último caso, el asegurador quedará obligado a abonar los gastos de tal dirección jurídica hasta el límite pactado en la póliza.</w:t>
+            </w:r>
+          </w:p>
+        </w:tc>
+      </w:tr>
+    </w:tbl>
+    <w:p>
+      <w:pPr>
+        <w:spacing w:after="180" w:line="300"/>
+        <w:jc w:val="both"/>
+      </w:pPr>
+      <w:r>
+        <w:rPr>
+          <w:rFonts w:ascii="Archivo" w:cs="Archivo" w:eastAsia="Archivo" w:hAnsi="Archivo"/>
+          <w:sz w:val="21"/>
+          <w:szCs w:val="21"/>
+        </w:rPr>
+        <w:t xml:space="preserve">La regla de conflicto de intereses del párrafo segundo tiene particular relevancia en el ámbito doméstico: si el perjudicado por el siniestro (por ejemplo, un vecino dañado por una filtración de agua imputable al asegurado) está asegurado con la misma compañía, el asegurador debe comunicarlo de inmediato al asegurado, que puede entonces optar por una defensa independiente, con cargo a la aseguradora hasta el límite pactado en póliza.</w:t>
+      </w:r>
+    </w:p>
+    <w:p>
+      <w:pPr>
+        <w:pStyle w:val="Heading2"/>
+        <w:spacing w:after="160" w:before="400"/>
+      </w:pPr>
+      <w:r>
+        <w:rPr>
+          <w:rFonts w:ascii="Fraunces" w:cs="Fraunces" w:eastAsia="Fraunces" w:hAnsi="Fraunces"/>
+          <w:b/>
+          <w:bCs/>
+          <w:color w:val="0A2540"/>
+          <w:sz w:val="24"/>
+          <w:szCs w:val="24"/>
+        </w:rPr>
+        <w:t xml:space="preserve">9.3. La acción directa del perjudicado</w:t>
+      </w:r>
+    </w:p>
+    <w:p>
+      <w:pPr>
+        <w:spacing w:after="180" w:line="300"/>
+        <w:jc w:val="both"/>
+      </w:pPr>
+      <w:r>
+        <w:rPr>
+          <w:rFonts w:ascii="Archivo" w:cs="Archivo" w:eastAsia="Archivo" w:hAnsi="Archivo"/>
+          <w:sz w:val="21"/>
+          <w:szCs w:val="21"/>
+        </w:rPr>
+        <w:t xml:space="preserve">El precepto más relevante en la práctica litigiosa de esta cobertura es, sin duda, el artículo 76 LCS, que reconoce al tercero perjudicado —no asegurado, ni tomador, ni beneficiario en sentido técnico— una acción directa contra el asegurador, dotada de un régimen de oponibilidad de excepciones singularmente restrictivo</w:t>
+      </w:r>
+      <w:r>
+        <w:rPr>
+          <w:rStyle w:val="FootnoteReference"/>
+        </w:rPr>
+        <w:footnoteReference w:id="21"/>
+      </w:r>
+      <w:r>
+        <w:rPr>
+          <w:rFonts w:ascii="Archivo" w:cs="Archivo" w:eastAsia="Archivo" w:hAnsi="Archivo"/>
+          <w:sz w:val="21"/>
+          <w:szCs w:val="21"/>
+        </w:rPr>
+        <w:t xml:space="preserve">:</w:t>
+      </w:r>
+    </w:p>
+    <w:tbl>
+      <w:tblPr>
+        <w:tblW w:type="pct" w:w="100%"/>
+        <w:tblBorders>
+          <w:top w:val="single" w:color="CBD5E1" w:sz="4"/>
+          <w:left w:val="single" w:color="1B6DF0" w:sz="24"/>
+          <w:bottom w:val="single" w:color="CBD5E1" w:sz="4"/>
+          <w:right w:val="single" w:color="CBD5E1" w:sz="4"/>
+          <w:insideH w:val="single" w:color="auto" w:sz="4"/>
+          <w:insideV w:val="single" w:color="auto" w:sz="4"/>
+        </w:tblBorders>
+      </w:tblPr>
+      <w:tblGrid>
+        <w:gridCol w:w="100"/>
+      </w:tblGrid>
+      <w:tr>
+        <w:tc>
+          <w:tcPr>
+            <w:shd w:fill="F4F6F9" w:val="clear"/>
+            <w:tcMar>
+              <w:top w:type="dxa" w:w="160"/>
+              <w:left w:type="dxa" w:w="220"/>
+              <w:bottom w:type="dxa" w:w="160"/>
+              <w:right w:type="dxa" w:w="220"/>
+            </w:tcMar>
+          </w:tcPr>
+          <w:p>
+            <w:pPr>
+              <w:spacing w:after="100"/>
+            </w:pPr>
+            <w:r>
+              <w:rPr>
+                <w:rFonts w:ascii="Archivo" w:cs="Archivo" w:eastAsia="Archivo" w:hAnsi="Archivo"/>
+                <w:b/>
+                <w:bCs/>
+                <w:caps/>
+                <w:color w:val="1B6DF0"/>
+                <w:sz w:val="18"/>
+                <w:szCs w:val="18"/>
+              </w:rPr>
+              <w:t xml:space="preserve">Texto legal · Art. 76 LCS</w:t>
+            </w:r>
+          </w:p>
+          <w:p>
+            <w:pPr>
+              <w:spacing w:after="0" w:line="280"/>
+              <w:jc w:val="both"/>
+            </w:pPr>
+            <w:r>
+              <w:rPr>
+                <w:rFonts w:ascii="IBM Plex Mono" w:cs="IBM Plex Mono" w:eastAsia="IBM Plex Mono" w:hAnsi="IBM Plex Mono"/>
+                <w:i/>
+                <w:iCs/>
+                <w:color w:val="0A2540"/>
+                <w:sz w:val="18"/>
+                <w:szCs w:val="18"/>
+              </w:rPr>
+              <w:t xml:space="preserve">El perjudicado o sus herederos tendrán acción directa contra el asegurador para exigirle el cumplimiento de la obligación de indemnizar, sin perjuicio del derecho del asegurador a repetir contra el asegurado, en el caso de que sea debido a conducta dolosa de éste, el daño o perjuicio causado a tercero. La acción directa es inmune a las excepciones que puedan corresponder al asegurador contra el asegurado. El asegurador puede, no obstante, oponer la culpa exclusiva del perjudicado y las excepciones personales que tenga contra éste.</w:t>
+            </w:r>
+          </w:p>
+        </w:tc>
+      </w:tr>
+    </w:tbl>
+    <w:p>
+      <w:pPr>
+        <w:spacing w:after="180" w:line="300"/>
+        <w:jc w:val="both"/>
+      </w:pPr>
+      <w:r>
+        <w:rPr>
+          <w:rFonts w:ascii="Archivo" w:cs="Archivo" w:eastAsia="Archivo" w:hAnsi="Archivo"/>
+          <w:sz w:val="21"/>
+          <w:szCs w:val="21"/>
+        </w:rPr>
+        <w:t xml:space="preserve">La «inmunidad» de la acción directa frente a las excepciones que el asegurador tendría frente a su propio asegurado —por ejemplo, el impago de la prima, una reserva o inexactitud en la declaración del riesgo, o la propia mala fe del asegurado en la causación del daño— constituye el rasgo más distintivo de esta acción y la principal fuente de litigiosidad sobre su alcance, según se desarrolla en el epígrafe siguiente.</w:t>
+      </w:r>
+    </w:p>
+    <w:p>
+      <w:pPr>
+        <w:pStyle w:val="Heading2"/>
+        <w:spacing w:after="160" w:before="400"/>
+      </w:pPr>
+      <w:r>
+        <w:rPr>
+          <w:rFonts w:ascii="Fraunces" w:cs="Fraunces" w:eastAsia="Fraunces" w:hAnsi="Fraunces"/>
+          <w:b/>
+          <w:bCs/>
+          <w:color w:val="0A2540"/>
+          <w:sz w:val="24"/>
+          <w:szCs w:val="24"/>
+        </w:rPr>
+        <w:t xml:space="preserve">9.4. La responsabilidad civil por hecho ajeno: hijos, dependientes y mascotas</w:t>
+      </w:r>
+    </w:p>
+    <w:p>
+      <w:pPr>
+        <w:spacing w:after="180" w:line="300"/>
+        <w:jc w:val="both"/>
+      </w:pPr>
+      <w:r>
+        <w:rPr>
+          <w:rFonts w:ascii="Archivo" w:cs="Archivo" w:eastAsia="Archivo" w:hAnsi="Archivo"/>
+          <w:sz w:val="21"/>
+          <w:szCs w:val="21"/>
+        </w:rPr>
+        <w:t xml:space="preserve">La garantía de responsabilidad civil del hogar opera con frecuencia en conexión con los supuestos de responsabilidad por hecho ajeno del artículo 1903 CC, particularmente relevante en el contexto familiar:</w:t>
+      </w:r>
+    </w:p>
+    <w:tbl>
+      <w:tblPr>
+        <w:tblW w:type="pct" w:w="100%"/>
+        <w:tblBorders>
+          <w:top w:val="single" w:color="CBD5E1" w:sz="4"/>
+          <w:left w:val="single" w:color="1B6DF0" w:sz="24"/>
+          <w:bottom w:val="single" w:color="CBD5E1" w:sz="4"/>
+          <w:right w:val="single" w:color="CBD5E1" w:sz="4"/>
+          <w:insideH w:val="single" w:color="auto" w:sz="4"/>
+          <w:insideV w:val="single" w:color="auto" w:sz="4"/>
+        </w:tblBorders>
+      </w:tblPr>
+      <w:tblGrid>
+        <w:gridCol w:w="100"/>
+      </w:tblGrid>
+      <w:tr>
+        <w:tc>
+          <w:tcPr>
+            <w:shd w:fill="F4F6F9" w:val="clear"/>
+            <w:tcMar>
+              <w:top w:type="dxa" w:w="160"/>
+              <w:left w:type="dxa" w:w="220"/>
+              <w:bottom w:type="dxa" w:w="160"/>
+              <w:right w:type="dxa" w:w="220"/>
+            </w:tcMar>
+          </w:tcPr>
+          <w:p>
+            <w:pPr>
+              <w:spacing w:after="100"/>
+            </w:pPr>
+            <w:r>
+              <w:rPr>
+                <w:rFonts w:ascii="Archivo" w:cs="Archivo" w:eastAsia="Archivo" w:hAnsi="Archivo"/>
+                <w:b/>
+                <w:bCs/>
+                <w:caps/>
+                <w:color w:val="1B6DF0"/>
+                <w:sz w:val="18"/>
+                <w:szCs w:val="18"/>
+              </w:rPr>
+              <w:t xml:space="preserve">Texto legal · Art. 1903 CC (extracto)</w:t>
+            </w:r>
+          </w:p>
+          <w:p>
+            <w:pPr>
+              <w:spacing w:after="0" w:line="280"/>
+              <w:jc w:val="both"/>
+            </w:pPr>
+            <w:r>
+              <w:rPr>
+                <w:rFonts w:ascii="IBM Plex Mono" w:cs="IBM Plex Mono" w:eastAsia="IBM Plex Mono" w:hAnsi="IBM Plex Mono"/>
+                <w:i/>
+                <w:iCs/>
+                <w:color w:val="0A2540"/>
+                <w:sz w:val="18"/>
+                <w:szCs w:val="18"/>
+              </w:rPr>
+              <w:t xml:space="preserve">La obligación que impone el artículo anterior es exigible no sólo por los actos u omisiones propios, sino por los de aquellas personas de quienes se debe responder. Los padres son responsables de los daños causados por los hijos que se encuentren bajo su guarda. [...] La responsabilidad de que trata este artículo cesará cuando las personas en él mencionadas prueben que emplearon toda la diligencia de un buen padre de familia para prevenir el daño.</w:t>
+            </w:r>
+          </w:p>
+        </w:tc>
+      </w:tr>
+    </w:tbl>
+    <w:p>
+      <w:pPr>
+        <w:spacing w:after="180" w:line="300"/>
+        <w:jc w:val="both"/>
+      </w:pPr>
+      <w:r>
+        <w:rPr>
+          <w:rFonts w:ascii="Archivo" w:cs="Archivo" w:eastAsia="Archivo" w:hAnsi="Archivo"/>
+          <w:sz w:val="21"/>
+          <w:szCs w:val="21"/>
+        </w:rPr>
+        <w:t xml:space="preserve">Cuando un hijo menor conviviente causa un daño a un tercero (por ejemplo, un incendio accidental, la rotura de un objeto ajeno o una lesión durante un juego), la responsabilidad civil de los padres ex art. 1903 CC queda, en la práctica, cubierta por la póliza de responsabilidad civil del hogar en la medida en que la cláusula de «asegurados» de la póliza —y no solo la ley civil— extienda la cobertura a los hijos convivientes, extremo que debe verificarse en las condiciones particulares de cada contrato concreto.</w:t>
+      </w:r>
+    </w:p>
+    <w:p>
+      <w:pPr>
+        <w:pStyle w:val="Heading2"/>
+        <w:spacing w:after="160" w:before="400"/>
+      </w:pPr>
+      <w:r>
+        <w:rPr>
+          <w:rFonts w:ascii="Fraunces" w:cs="Fraunces" w:eastAsia="Fraunces" w:hAnsi="Fraunces"/>
+          <w:b/>
+          <w:bCs/>
+          <w:color w:val="0A2540"/>
+          <w:sz w:val="24"/>
+          <w:szCs w:val="24"/>
+        </w:rPr>
+        <w:t xml:space="preserve">9.5. Inoponibilidad del dolo del asegurado al tercero perjudicado</w:t>
+      </w:r>
+    </w:p>
+    <w:p>
+      <w:pPr>
+        <w:spacing w:after="180" w:line="300"/>
+        <w:jc w:val="both"/>
+      </w:pPr>
+      <w:r>
+        <w:rPr>
+          <w:rFonts w:ascii="Archivo" w:cs="Archivo" w:eastAsia="Archivo" w:hAnsi="Archivo"/>
+          <w:sz w:val="21"/>
+          <w:szCs w:val="21"/>
+        </w:rPr>
+        <w:t xml:space="preserve">El supuesto más delicado —y de mayor relevancia doctrinal— es el de la eventual mala fe o dolo del propio asegurado en la causación del daño, que conforme al art. 19 LCS exoneraría al asegurador frente a su asegurado (capítulo 17), pero cuya oponibilidad al tercero perjudicado plantea un problema distinto. La STS, Sala de lo Civil, de 20 de abril de 2023 (ROJ: STS 1544/2023; ECLI:ES:TS:2023:1544; MP: Vela Torres), resuelve precisamente un supuesto de seguro multirriesgo de hogar en el que el hijo del tomador, asegurado por la cláusula de cabeza de familia, provocó un incendio al sustraer gasolina, siendo condenado penalmente por un delito imprudente</w:t>
+      </w:r>
+    </w:p>
+    <w:tbl>
+      <w:tblPr>
+        <w:tblW w:type="pct" w:w="100%"/>
+        <w:tblBorders>
+          <w:top w:val="single" w:color="CBD5E1" w:sz="4"/>
+          <w:left w:val="single" w:color="8A5A00" w:sz="24"/>
+          <w:bottom w:val="single" w:color="CBD5E1" w:sz="4"/>
+          <w:right w:val="single" w:color="CBD5E1" w:sz="4"/>
+          <w:insideH w:val="single" w:color="auto" w:sz="4"/>
+          <w:insideV w:val="single" w:color="auto" w:sz="4"/>
+        </w:tblBorders>
+      </w:tblPr>
+      <w:tblGrid>
+        <w:gridCol w:w="100"/>
+      </w:tblGrid>
+      <w:tr>
+        <w:tc>
+          <w:tcPr>
+            <w:shd w:fill="F4F6F9" w:val="clear"/>
+            <w:tcMar>
+              <w:top w:type="dxa" w:w="160"/>
+              <w:left w:type="dxa" w:w="220"/>
+              <w:bottom w:type="dxa" w:w="160"/>
+              <w:right w:type="dxa" w:w="220"/>
+            </w:tcMar>
+          </w:tcPr>
+          <w:p>
+            <w:pPr>
+              <w:spacing w:after="100"/>
+            </w:pPr>
+            <w:r>
+              <w:rPr>
+                <w:rFonts w:ascii="Archivo" w:cs="Archivo" w:eastAsia="Archivo" w:hAnsi="Archivo"/>
+                <w:b/>
+                <w:bCs/>
+                <w:caps/>
+                <w:color w:val="8A5A00"/>
+                <w:sz w:val="18"/>
+                <w:szCs w:val="18"/>
+              </w:rPr>
+              <w:t xml:space="preserve">Jurisprudencia · STS, Sala de lo Civil, de 20 de abril de 2023 (ROJ: STS 1544/2023; ECLI:ES:TS:2023:1544; MP: Vela Torres)</w:t>
+            </w:r>
+          </w:p>
+          <w:p>
+            <w:pPr>
+              <w:spacing w:after="0" w:line="280"/>
+              <w:jc w:val="both"/>
+            </w:pPr>
+            <w:r>
+              <w:rPr>
+                <w:rFonts w:ascii="Archivo" w:cs="Archivo" w:eastAsia="Archivo" w:hAnsi="Archivo"/>
+                <w:color w:val="0A2540"/>
+                <w:sz w:val="19"/>
+                <w:szCs w:val="19"/>
+              </w:rPr>
+              <w:t xml:space="preserve">«No puede afirmarse que el incendio dependiera de la voluntad del demandado, por más imprudente o temeraria que fuera su conducta [...]; lo que dependió de su voluntad —intención o dolo— fue la sustracción de la gasolina, pero no la producción del incendio posterior. Pero es que, en cualquier caso, al tratarse de un seguro de responsabilidad civil, en el que la acción del perjudicado contra el asegurador es inmune a las excepciones que puedan corresponder al asegurador contra el asegurado (art. 76 LCS), la inasegurabilidad por dolo no sería oponible al tercero perjudicado.»</w:t>
+            </w:r>
+          </w:p>
+        </w:tc>
+      </w:tr>
+    </w:tbl>
+    <w:p>
+      <w:pPr>
+        <w:spacing w:after="180" w:line="300"/>
+        <w:jc w:val="both"/>
+      </w:pPr>
+      <w:r>
+        <w:rPr>
+          <w:rFonts w:ascii="Archivo" w:cs="Archivo" w:eastAsia="Archivo" w:hAnsi="Archivo"/>
+          <w:sz w:val="21"/>
+          <w:szCs w:val="21"/>
+        </w:rPr>
+        <w:t xml:space="preserve">La sentencia fija así una doble ratio de gran utilidad práctica. En primer lugar, distingue con precisión el dolo referido al acto inicial (la sustracción de gasolina, voluntaria) del dolo referido al resultado dañoso (el incendio, no querido ni siquiera aceptado como consecuencia probable), rechazando extender automáticamente la calificación dolosa del primero al segundo. En segundo lugar —y esta es la regla de mayor alcance—, incluso si existiera dolo del asegurado que exonerase al asegurador en su relación interna con este (art. 19 LCS), tal circunstancia sería una excepción personal inoponible frente al tercero perjudicado en virtud del art. 76 LCS, que únicamente permite al asegurador oponer a este la culpa exclusiva del propio perjudicado y las excepciones personales que tenga frente a él, no frente al asegurado.</w:t>
+      </w:r>
+    </w:p>
+    <w:p>
+      <w:pPr>
+        <w:pStyle w:val="Heading2"/>
+        <w:spacing w:after="160" w:before="400"/>
+      </w:pPr>
+      <w:r>
+        <w:rPr>
+          <w:rFonts w:ascii="Fraunces" w:cs="Fraunces" w:eastAsia="Fraunces" w:hAnsi="Fraunces"/>
+          <w:b/>
+          <w:bCs/>
+          <w:color w:val="0A2540"/>
+          <w:sz w:val="24"/>
+          <w:szCs w:val="24"/>
+        </w:rPr>
+        <w:t xml:space="preserve">9.6. Ficha para el profesional</w:t>
+      </w:r>
+    </w:p>
+    <w:tbl>
+      <w:tblPr>
+        <w:tblW w:type="pct" w:w="100%"/>
+        <w:tblBorders>
+          <w:top w:val="single" w:color="CBD5E1" w:sz="4"/>
+          <w:left w:val="single" w:color="1B6DF0" w:sz="24"/>
+          <w:bottom w:val="single" w:color="CBD5E1" w:sz="4"/>
+          <w:right w:val="single" w:color="CBD5E1" w:sz="4"/>
+          <w:insideH w:val="single" w:color="auto" w:sz="4"/>
+          <w:insideV w:val="single" w:color="auto" w:sz="4"/>
+        </w:tblBorders>
+      </w:tblPr>
+      <w:tblGrid>
+        <w:gridCol w:w="100"/>
+      </w:tblGrid>
+      <w:tr>
+        <w:tc>
+          <w:tcPr>
+            <w:shd w:fill="F4F6F9" w:val="clear"/>
+            <w:tcMar>
+              <w:top w:type="dxa" w:w="160"/>
+              <w:left w:type="dxa" w:w="220"/>
+              <w:bottom w:type="dxa" w:w="160"/>
+              <w:right w:type="dxa" w:w="220"/>
+            </w:tcMar>
+          </w:tcPr>
+          <w:p>
+            <w:pPr>
+              <w:spacing w:after="100"/>
+            </w:pPr>
+            <w:r>
+              <w:rPr>
+                <w:rFonts w:ascii="Archivo" w:cs="Archivo" w:eastAsia="Archivo" w:hAnsi="Archivo"/>
+                <w:b/>
+                <w:bCs/>
+                <w:caps/>
+                <w:color w:val="1B6DF0"/>
+                <w:sz w:val="18"/>
+                <w:szCs w:val="18"/>
+              </w:rPr>
+              <w:t xml:space="preserve">Puntos de control en una reclamación de responsabilidad civil del hogar</w:t>
+            </w:r>
+          </w:p>
+          <w:p>
+            <w:pPr>
+              <w:pStyle w:val="ListParagraph"/>
+              <w:numPr>
+                <w:ilvl w:val="0"/>
+                <w:numId w:val="2"/>
+              </w:numPr>
+              <w:spacing w:after="80" w:line="280"/>
+            </w:pPr>
+            <w:r>
+              <w:rPr>
+                <w:rFonts w:ascii="Archivo" w:cs="Archivo" w:eastAsia="Archivo" w:hAnsi="Archivo"/>
+                <w:sz w:val="19"/>
+                <w:szCs w:val="19"/>
+              </w:rPr>
+              <w:t xml:space="preserve">Verificar el ámbito subjetivo de la cláusula de «asegurados» a efectos de responsabilidad civil del cabeza de familia: ¿incluye a hijos, pareja, personal doméstico?</w:t>
+            </w:r>
+          </w:p>
+          <w:p>
+            <w:pPr>
+              <w:pStyle w:val="ListParagraph"/>
+              <w:numPr>
+                <w:ilvl w:val="0"/>
+                <w:numId w:val="2"/>
+              </w:numPr>
+              <w:spacing w:after="80" w:line="280"/>
+            </w:pPr>
+            <w:r>
+              <w:rPr>
+                <w:rFonts w:ascii="Archivo" w:cs="Archivo" w:eastAsia="Archivo" w:hAnsi="Archivo"/>
+                <w:sz w:val="19"/>
+                <w:szCs w:val="19"/>
+              </w:rPr>
+              <w:t xml:space="preserve">Ante un conflicto de intereses (perjudicado también asegurado con la misma compañía), comprobar que el asegurador comunicó la circunstancia y ofreció la opción de dirección jurídica independiente (art. 74 LCS).</w:t>
+            </w:r>
+          </w:p>
+          <w:p>
+            <w:pPr>
+              <w:pStyle w:val="ListParagraph"/>
+              <w:numPr>
+                <w:ilvl w:val="0"/>
+                <w:numId w:val="2"/>
+              </w:numPr>
+              <w:spacing w:after="80" w:line="280"/>
+            </w:pPr>
+            <w:r>
+              <w:rPr>
+                <w:rFonts w:ascii="Archivo" w:cs="Archivo" w:eastAsia="Archivo" w:hAnsi="Archivo"/>
+                <w:sz w:val="19"/>
+                <w:szCs w:val="19"/>
+              </w:rPr>
+              <w:t xml:space="preserve">Si se representa al tercero perjudicado, recordar que la acción directa del art. 76 LCS es inmune a las excepciones personales del asegurador contra el asegurado, incluida —conforme a la STS 1544/2023 (ROJ: STS 1544/2023)— la propia mala fe de este último.</w:t>
+            </w:r>
+          </w:p>
+          <w:p>
+            <w:pPr>
+              <w:pStyle w:val="ListParagraph"/>
+              <w:numPr>
+                <w:ilvl w:val="0"/>
+                <w:numId w:val="2"/>
+              </w:numPr>
+              <w:spacing w:after="80" w:line="280"/>
+            </w:pPr>
+            <w:r>
+              <w:rPr>
+                <w:rFonts w:ascii="Archivo" w:cs="Archivo" w:eastAsia="Archivo" w:hAnsi="Archivo"/>
+                <w:sz w:val="19"/>
+                <w:szCs w:val="19"/>
+              </w:rPr>
+              <w:t xml:space="preserve">Distinguir, en los siniestros con origen en una conducta inicialmente voluntaria del asegurado, el dolo referido al acto del dolo referido al resultado dañoso finalmente producido.</w:t>
+            </w:r>
+          </w:p>
+        </w:tc>
+      </w:tr>
+    </w:tbl>
+    <w:p>
+      <w:pPr>
+        <w:pStyle w:val="Heading2"/>
+        <w:spacing w:after="160" w:before="400"/>
+      </w:pPr>
+      <w:r>
+        <w:rPr>
+          <w:rFonts w:ascii="Fraunces" w:cs="Fraunces" w:eastAsia="Fraunces" w:hAnsi="Fraunces"/>
+          <w:b/>
+          <w:bCs/>
+          <w:color w:val="0A2540"/>
+          <w:sz w:val="24"/>
+          <w:szCs w:val="24"/>
+        </w:rPr>
+        <w:t xml:space="preserve">9.7. Ficha para el asegurado</w:t>
+      </w:r>
+    </w:p>
+    <w:tbl>
+      <w:tblPr>
+        <w:tblW w:type="pct" w:w="100%"/>
+        <w:tblBorders>
+          <w:top w:val="single" w:color="CBD5E1" w:sz="4"/>
+          <w:left w:val="single" w:color="8A5A00" w:sz="24"/>
+          <w:bottom w:val="single" w:color="CBD5E1" w:sz="4"/>
+          <w:right w:val="single" w:color="CBD5E1" w:sz="4"/>
+          <w:insideH w:val="single" w:color="auto" w:sz="4"/>
+          <w:insideV w:val="single" w:color="auto" w:sz="4"/>
+        </w:tblBorders>
+      </w:tblPr>
+      <w:tblGrid>
+        <w:gridCol w:w="100"/>
+      </w:tblGrid>
+      <w:tr>
+        <w:tc>
+          <w:tcPr>
+            <w:shd w:fill="F4F6F9" w:val="clear"/>
+            <w:tcMar>
+              <w:top w:type="dxa" w:w="160"/>
+              <w:left w:type="dxa" w:w="220"/>
+              <w:bottom w:type="dxa" w:w="160"/>
+              <w:right w:type="dxa" w:w="220"/>
+            </w:tcMar>
+          </w:tcPr>
+          <w:p>
+            <w:pPr>
+              <w:spacing w:after="100"/>
+            </w:pPr>
+            <w:r>
+              <w:rPr>
+                <w:rFonts w:ascii="Archivo" w:cs="Archivo" w:eastAsia="Archivo" w:hAnsi="Archivo"/>
+                <w:b/>
+                <w:bCs/>
+                <w:caps/>
+                <w:color w:val="8A5A00"/>
+                <w:sz w:val="18"/>
+                <w:szCs w:val="18"/>
+              </w:rPr>
+              <w:t xml:space="preserve">Qué debe saber sobre la responsabilidad civil de su seguro de hogar</w:t>
+            </w:r>
+          </w:p>
+          <w:p>
+            <w:pPr>
+              <w:pStyle w:val="ListParagraph"/>
+              <w:numPr>
+                <w:ilvl w:val="0"/>
+                <w:numId w:val="2"/>
+              </w:numPr>
+              <w:spacing w:after="80" w:line="280"/>
+            </w:pPr>
+            <w:r>
+              <w:rPr>
+                <w:rFonts w:ascii="Archivo" w:cs="Archivo" w:eastAsia="Archivo" w:hAnsi="Archivo"/>
+                <w:sz w:val="19"/>
+                <w:szCs w:val="19"/>
+              </w:rPr>
+              <w:t xml:space="preserve">Compruebe quién está cubierto como «asegurado» a efectos de responsabilidad civil: no siempre incluye automáticamente a todos los convivientes.</w:t>
+            </w:r>
+          </w:p>
+          <w:p>
+            <w:pPr>
+              <w:pStyle w:val="ListParagraph"/>
+              <w:numPr>
+                <w:ilvl w:val="0"/>
+                <w:numId w:val="2"/>
+              </w:numPr>
+              <w:spacing w:after="80" w:line="280"/>
+            </w:pPr>
+            <w:r>
+              <w:rPr>
+                <w:rFonts w:ascii="Archivo" w:cs="Archivo" w:eastAsia="Archivo" w:hAnsi="Archivo"/>
+                <w:sz w:val="19"/>
+                <w:szCs w:val="19"/>
+              </w:rPr>
+              <w:t xml:space="preserve">Si alguien de su entorno familiar causa un daño a un tercero (un vecino, un invitado), comuníquelo a su aseguradora incluso si tiene dudas sobre su responsabilidad: la aseguradora asumirá, salvo pacto en contrario, la dirección jurídica de su defensa.</w:t>
+            </w:r>
+          </w:p>
+          <w:p>
+            <w:pPr>
+              <w:pStyle w:val="ListParagraph"/>
+              <w:numPr>
+                <w:ilvl w:val="0"/>
+                <w:numId w:val="2"/>
+              </w:numPr>
+              <w:spacing w:after="80" w:line="280"/>
+            </w:pPr>
+            <w:r>
+              <w:rPr>
+                <w:rFonts w:ascii="Archivo" w:cs="Archivo" w:eastAsia="Archivo" w:hAnsi="Archivo"/>
+                <w:sz w:val="19"/>
+                <w:szCs w:val="19"/>
+              </w:rPr>
+              <w:t xml:space="preserve">Si el perjudicado también es cliente de su misma aseguradora, tiene derecho a que se lo comuniquen y a elegir defensa independiente si lo prefiere.</w:t>
+            </w:r>
+          </w:p>
+        </w:tc>
+      </w:tr>
+    </w:tbl>
+    <w:p>
+      <w:pPr>
+        <w:pStyle w:val="Heading2"/>
+        <w:spacing w:after="160" w:before="400"/>
+      </w:pPr>
+      <w:r>
+        <w:rPr>
+          <w:rFonts w:ascii="Fraunces" w:cs="Fraunces" w:eastAsia="Fraunces" w:hAnsi="Fraunces"/>
+          <w:b/>
+          <w:bCs/>
+          <w:color w:val="0A2540"/>
+          <w:sz w:val="24"/>
+          <w:szCs w:val="24"/>
+        </w:rPr>
+        <w:t xml:space="preserve">9.8. Checklist: gestión de una reclamación de responsabilidad civil del hogar</w:t>
+      </w:r>
+    </w:p>
+    <w:p>
+      <w:pPr>
+        <w:pStyle w:val="ListParagraph"/>
+        <w:numPr>
+          <w:ilvl w:val="0"/>
+          <w:numId w:val="2"/>
+        </w:numPr>
+        <w:spacing w:after="100" w:line="290"/>
+      </w:pPr>
+      <w:r>
+        <w:rPr>
+          <w:rFonts w:ascii="Archivo" w:cs="Archivo" w:eastAsia="Archivo" w:hAnsi="Archivo"/>
+          <w:sz w:val="21"/>
+          <w:szCs w:val="21"/>
+        </w:rPr>
+        <w:t xml:space="preserve">1. ¿Quién causó el daño y qué relación tiene con el asegurado (hijo, pareja, personal doméstico, el propio asegurado)?</w:t>
+      </w:r>
+    </w:p>
+    <w:p>
+      <w:pPr>
+        <w:pStyle w:val="ListParagraph"/>
+        <w:numPr>
+          <w:ilvl w:val="0"/>
+          <w:numId w:val="2"/>
+        </w:numPr>
+        <w:spacing w:after="100" w:line="290"/>
+      </w:pPr>
+      <w:r>
+        <w:rPr>
+          <w:rFonts w:ascii="Archivo" w:cs="Archivo" w:eastAsia="Archivo" w:hAnsi="Archivo"/>
+          <w:sz w:val="21"/>
+          <w:szCs w:val="21"/>
+        </w:rPr>
+        <w:t xml:space="preserve">2. ¿La cláusula de «asegurados» de la póliza cubre a esa persona?</w:t>
+      </w:r>
+    </w:p>
+    <w:p>
+      <w:pPr>
+        <w:pStyle w:val="ListParagraph"/>
+        <w:numPr>
+          <w:ilvl w:val="0"/>
+          <w:numId w:val="2"/>
+        </w:numPr>
+        <w:spacing w:after="100" w:line="290"/>
+      </w:pPr>
+      <w:r>
+        <w:rPr>
+          <w:rFonts w:ascii="Archivo" w:cs="Archivo" w:eastAsia="Archivo" w:hAnsi="Archivo"/>
+          <w:sz w:val="21"/>
+          <w:szCs w:val="21"/>
+        </w:rPr>
+        <w:t xml:space="preserve">3. ¿Existe conflicto de intereses (perjudicado asegurado con la misma compañía)?</w:t>
+      </w:r>
+    </w:p>
+    <w:p>
+      <w:pPr>
+        <w:pStyle w:val="ListParagraph"/>
+        <w:numPr>
+          <w:ilvl w:val="0"/>
+          <w:numId w:val="2"/>
+        </w:numPr>
+        <w:spacing w:after="100" w:line="290"/>
+      </w:pPr>
+      <w:r>
+        <w:rPr>
+          <w:rFonts w:ascii="Archivo" w:cs="Archivo" w:eastAsia="Archivo" w:hAnsi="Archivo"/>
+          <w:sz w:val="21"/>
+          <w:szCs w:val="21"/>
+        </w:rPr>
+        <w:t xml:space="preserve">4. ¿Existe resolución penal previa sobre los hechos? ¿Califica la conducta como dolosa o imprudente, y respecto de qué elemento (acto o resultado)?</w:t>
+      </w:r>
+    </w:p>
+    <w:p>
+      <w:pPr>
+        <w:pStyle w:val="ListParagraph"/>
+        <w:numPr>
+          <w:ilvl w:val="0"/>
+          <w:numId w:val="2"/>
+        </w:numPr>
+        <w:spacing w:after="100" w:line="290"/>
+      </w:pPr>
+      <w:r>
+        <w:rPr>
+          <w:rFonts w:ascii="Archivo" w:cs="Archivo" w:eastAsia="Archivo" w:hAnsi="Archivo"/>
+          <w:sz w:val="21"/>
+          <w:szCs w:val="21"/>
+        </w:rPr>
+        <w:t xml:space="preserve">5. ¿Se ha ejercitado o se va a ejercitar la acción directa del art. 76 LCS frente al asegurador?</w:t>
+      </w:r>
+    </w:p>
+    <w:p>
+      <w:pPr>
+        <w:pStyle w:val="ListParagraph"/>
+        <w:numPr>
+          <w:ilvl w:val="0"/>
+          <w:numId w:val="2"/>
+        </w:numPr>
+        <w:spacing w:after="100" w:line="290"/>
+      </w:pPr>
+      <w:r>
+        <w:rPr>
+          <w:rFonts w:ascii="Archivo" w:cs="Archivo" w:eastAsia="Archivo" w:hAnsi="Archivo"/>
+          <w:sz w:val="21"/>
+          <w:szCs w:val="21"/>
+        </w:rPr>
+        <w:t xml:space="preserve">6. ¿Qué límite de indemnización y de gastos de defensa jurídica establece la póliza para esta garantía?</w:t>
+      </w:r>
+    </w:p>
+    <w:p>
+      <w:pPr>
+        <w:pStyle w:val="Heading2"/>
+        <w:spacing w:after="160" w:before="400"/>
+      </w:pPr>
+      <w:r>
+        <w:rPr>
+          <w:rFonts w:ascii="Fraunces" w:cs="Fraunces" w:eastAsia="Fraunces" w:hAnsi="Fraunces"/>
+          <w:b/>
+          <w:bCs/>
+          <w:color w:val="0A2540"/>
+          <w:sz w:val="24"/>
+          <w:szCs w:val="24"/>
+        </w:rPr>
+        <w:t xml:space="preserve">Bibliografía citada</w:t>
+      </w:r>
+    </w:p>
+    <w:p>
+      <w:pPr>
+        <w:spacing w:after="180" w:line="300"/>
+        <w:jc w:val="both"/>
+      </w:pPr>
+      <w:r>
+        <w:rPr>
+          <w:rFonts w:ascii="Archivo" w:cs="Archivo" w:eastAsia="Archivo" w:hAnsi="Archivo"/>
+          <w:sz w:val="21"/>
+          <w:szCs w:val="21"/>
+        </w:rPr>
+        <w:t xml:space="preserve">SÁNCHEZ CALERO, F. (dir.), Ley de Contrato de Seguro. Comentarios a la Ley 50/1980, de 8 de octubre, y a sus modificaciones, Aranzadi-Thomson Reuters, Cizur Menor.</w:t>
+      </w:r>
+    </w:p>
+    <w:p>
+      <w:pPr>
+        <w:spacing w:after="180" w:line="300"/>
+        <w:jc w:val="both"/>
+      </w:pPr>
+      <w:r>
+        <w:rPr>
+          <w:rFonts w:ascii="Archivo" w:cs="Archivo" w:eastAsia="Archivo" w:hAnsi="Archivo"/>
+          <w:sz w:val="21"/>
+          <w:szCs w:val="21"/>
+        </w:rPr>
+        <w:t xml:space="preserve">VEIGA COPO, A. B., Tratado del Contrato de Seguro, Civitas-Thomson Reuters, Cizur Menor.</w:t>
+      </w:r>
+    </w:p>
+    <w:p>
+      <w:pPr>
+        <w:pStyle w:val="Heading1"/>
+        <w:pageBreakBefore/>
+        <w:spacing w:after="300" w:before="200"/>
+      </w:pPr>
+      <w:r>
+        <w:rPr>
+          <w:rFonts w:ascii="Archivo" w:cs="Archivo" w:eastAsia="Archivo" w:hAnsi="Archivo"/>
+          <w:b/>
+          <w:bCs/>
+          <w:color w:val="1B6DF0"/>
+          <w:sz w:val="22"/>
+          <w:szCs w:val="22"/>
+        </w:rPr>
+        <w:t xml:space="preserve">Capítulo 10. </w:t>
+      </w:r>
+      <w:r>
+        <w:rPr>
+          <w:rFonts w:ascii="Fraunces" w:cs="Fraunces" w:eastAsia="Fraunces" w:hAnsi="Fraunces"/>
+          <w:b/>
+          <w:bCs/>
+          <w:color w:val="0A2540"/>
+          <w:sz w:val="30"/>
+          <w:szCs w:val="30"/>
+        </w:rPr>
+        <w:t xml:space="preserve">Defensa jurídica y asistencia en el hogar</w:t>
+      </w:r>
+    </w:p>
+    <w:tbl>
+      <w:tblPr>
+        <w:tblW w:type="pct" w:w="100%"/>
+        <w:tblBorders>
+          <w:top w:val="single" w:color="CBD5E1" w:sz="4"/>
+          <w:left w:val="single" w:color="1B6DF0" w:sz="24"/>
+          <w:bottom w:val="single" w:color="CBD5E1" w:sz="4"/>
+          <w:right w:val="single" w:color="CBD5E1" w:sz="4"/>
+          <w:insideH w:val="single" w:color="auto" w:sz="4"/>
+          <w:insideV w:val="single" w:color="auto" w:sz="4"/>
+        </w:tblBorders>
+      </w:tblPr>
+      <w:tblGrid>
+        <w:gridCol w:w="100"/>
+      </w:tblGrid>
+      <w:tr>
+        <w:tc>
+          <w:tcPr>
+            <w:shd w:fill="F4F6F9" w:val="clear"/>
+            <w:tcMar>
+              <w:top w:type="dxa" w:w="160"/>
+              <w:left w:type="dxa" w:w="220"/>
+              <w:bottom w:type="dxa" w:w="160"/>
+              <w:right w:type="dxa" w:w="220"/>
+            </w:tcMar>
+          </w:tcPr>
+          <w:p>
+            <w:pPr>
+              <w:spacing w:after="100"/>
+            </w:pPr>
+            <w:r>
+              <w:rPr>
+                <w:rFonts w:ascii="Archivo" w:cs="Archivo" w:eastAsia="Archivo" w:hAnsi="Archivo"/>
+                <w:b/>
+                <w:bCs/>
+                <w:caps/>
+                <w:color w:val="1B6DF0"/>
+                <w:sz w:val="18"/>
+                <w:szCs w:val="18"/>
+              </w:rPr>
+              <w:t xml:space="preserve">Sumario</w:t>
+            </w:r>
+          </w:p>
+          <w:p>
+            <w:pPr>
+              <w:spacing w:after="40" w:line="260"/>
+            </w:pPr>
+            <w:r>
+              <w:rPr>
+                <w:rFonts w:ascii="Archivo" w:cs="Archivo" w:eastAsia="Archivo" w:hAnsi="Archivo"/>
+                <w:sz w:val="18"/>
+                <w:szCs w:val="18"/>
+              </w:rPr>
+              <w:t xml:space="preserve">10.1. El seguro de defensa jurídica como garantía autónoma</w:t>
+            </w:r>
+          </w:p>
+          <w:p>
+            <w:pPr>
+              <w:spacing w:after="40" w:line="260"/>
+            </w:pPr>
+            <w:r>
+              <w:rPr>
+                <w:rFonts w:ascii="Archivo" w:cs="Archivo" w:eastAsia="Archivo" w:hAnsi="Archivo"/>
+                <w:sz w:val="18"/>
+                <w:szCs w:val="18"/>
+              </w:rPr>
+              <w:t xml:space="preserve">10.2. El derecho de libre elección de abogado y procurador</w:t>
+            </w:r>
+          </w:p>
+          <w:p>
+            <w:pPr>
+              <w:spacing w:after="40" w:line="260"/>
+            </w:pPr>
+            <w:r>
+              <w:rPr>
+                <w:rFonts w:ascii="Archivo" w:cs="Archivo" w:eastAsia="Archivo" w:hAnsi="Archivo"/>
+                <w:sz w:val="18"/>
+                <w:szCs w:val="18"/>
+              </w:rPr>
+              <w:t xml:space="preserve">10.3. Los límites cuantitativos a la libre elección: delimitadores, limitativos o lesivos</w:t>
+            </w:r>
+          </w:p>
+          <w:p>
+            <w:pPr>
+              <w:spacing w:after="40" w:line="260"/>
+            </w:pPr>
+            <w:r>
+              <w:rPr>
+                <w:rFonts w:ascii="Archivo" w:cs="Archivo" w:eastAsia="Archivo" w:hAnsi="Archivo"/>
+                <w:sz w:val="18"/>
+                <w:szCs w:val="18"/>
+              </w:rPr>
+              <w:t xml:space="preserve">10.4. Conflicto de intereses y defensa independiente en la garantía de responsabilidad civil</w:t>
+            </w:r>
+          </w:p>
+          <w:p>
+            <w:pPr>
+              <w:spacing w:after="40" w:line="260"/>
+            </w:pPr>
+            <w:r>
+              <w:rPr>
+                <w:rFonts w:ascii="Archivo" w:cs="Archivo" w:eastAsia="Archivo" w:hAnsi="Archivo"/>
+                <w:sz w:val="18"/>
+                <w:szCs w:val="18"/>
+              </w:rPr>
+              <w:t xml:space="preserve">10.5. La garantía de asistencia en el hogar</w:t>
+            </w:r>
+          </w:p>
+          <w:p>
+            <w:pPr>
+              <w:spacing w:after="40" w:line="260"/>
+            </w:pPr>
+            <w:r>
+              <w:rPr>
+                <w:rFonts w:ascii="Archivo" w:cs="Archivo" w:eastAsia="Archivo" w:hAnsi="Archivo"/>
+                <w:sz w:val="18"/>
+                <w:szCs w:val="18"/>
+              </w:rPr>
+              <w:t xml:space="preserve">10.6. Ficha para el profesional</w:t>
+            </w:r>
+          </w:p>
+          <w:p>
+            <w:pPr>
+              <w:spacing w:after="40" w:line="260"/>
+            </w:pPr>
+            <w:r>
+              <w:rPr>
+                <w:rFonts w:ascii="Archivo" w:cs="Archivo" w:eastAsia="Archivo" w:hAnsi="Archivo"/>
+                <w:sz w:val="18"/>
+                <w:szCs w:val="18"/>
+              </w:rPr>
+              <w:t xml:space="preserve">10.7. Ficha para el asegurado</w:t>
+            </w:r>
+          </w:p>
+          <w:p>
+            <w:pPr>
+              <w:spacing w:after="40" w:line="260"/>
+            </w:pPr>
+            <w:r>
+              <w:rPr>
+                <w:rFonts w:ascii="Archivo" w:cs="Archivo" w:eastAsia="Archivo" w:hAnsi="Archivo"/>
+                <w:sz w:val="18"/>
+                <w:szCs w:val="18"/>
+              </w:rPr>
+              <w:t xml:space="preserve">10.8. Checklist: activación de la cobertura de defensa jurídica</w:t>
+            </w:r>
+          </w:p>
+        </w:tc>
+      </w:tr>
+    </w:tbl>
+    <w:p>
+      <w:pPr>
+        <w:spacing w:after="160"/>
+      </w:pPr>
+    </w:p>
+    <w:tbl>
+      <w:tblPr>
+        <w:tblW w:type="pct" w:w="100%"/>
+        <w:tblBorders>
+          <w:top w:val="single" w:color="CBD5E1" w:sz="4"/>
+          <w:left w:val="single" w:color="6B7A8F" w:sz="24"/>
+          <w:bottom w:val="single" w:color="CBD5E1" w:sz="4"/>
+          <w:right w:val="single" w:color="CBD5E1" w:sz="4"/>
+          <w:insideH w:val="single" w:color="auto" w:sz="4"/>
+          <w:insideV w:val="single" w:color="auto" w:sz="4"/>
+        </w:tblBorders>
+      </w:tblPr>
+      <w:tblGrid>
+        <w:gridCol w:w="100"/>
+      </w:tblGrid>
+      <w:tr>
+        <w:tc>
+          <w:tcPr>
+            <w:shd w:fill="F4F6F9" w:val="clear"/>
+            <w:tcMar>
+              <w:top w:type="dxa" w:w="160"/>
+              <w:left w:type="dxa" w:w="220"/>
+              <w:bottom w:type="dxa" w:w="160"/>
+              <w:right w:type="dxa" w:w="220"/>
+            </w:tcMar>
+          </w:tcPr>
+          <w:p>
+            <w:pPr>
+              <w:spacing w:after="100"/>
+            </w:pPr>
+            <w:r>
+              <w:rPr>
+                <w:rFonts w:ascii="Archivo" w:cs="Archivo" w:eastAsia="Archivo" w:hAnsi="Archivo"/>
+                <w:b/>
+                <w:bCs/>
+                <w:caps/>
+                <w:color w:val="6B7A8F"/>
+                <w:sz w:val="18"/>
+                <w:szCs w:val="18"/>
+              </w:rPr>
+              <w:t xml:space="preserve">Resumen · Abstract</w:t>
+            </w:r>
+          </w:p>
+          <w:p>
+            <w:pPr>
+              <w:spacing w:after="100"/>
+              <w:jc w:val="both"/>
+            </w:pPr>
+            <w:r>
+              <w:rPr>
+                <w:rFonts w:ascii="Archivo" w:cs="Archivo" w:eastAsia="Archivo" w:hAnsi="Archivo"/>
+                <w:i/>
+                <w:iCs/>
+                <w:sz w:val="18"/>
+                <w:szCs w:val="18"/>
+              </w:rPr>
+              <w:t xml:space="preserve">El capítulo estudia la garantía de defensa jurídica del seguro de hogar, regulada como submodalidad autónoma en los arts. 76.a) a 76.g) LCS, con particular atención al derecho de libre elección de abogado y procurador y a la controvertida calificación —delimitadora, limitativa o lesiva— de las cláusulas que fijan un límite cuantitativo a dicho derecho, resuelta por la jurisprudencia mediante un examen casuístico de la suficiencia real del límite pactado. Se completa con el estudio de la garantía, contractual y heterogénea, de asistencia en el hogar.</w:t>
+            </w:r>
+          </w:p>
+          <w:p>
+            <w:pPr>
+              <w:spacing w:after="160"/>
+            </w:pPr>
+            <w:r>
+              <w:rPr>
+                <w:rFonts w:ascii="Archivo" w:cs="Archivo" w:eastAsia="Archivo" w:hAnsi="Archivo"/>
+                <w:b/>
+                <w:bCs/>
+                <w:sz w:val="17"/>
+                <w:szCs w:val="17"/>
+              </w:rPr>
+              <w:t xml:space="preserve">Palabras clave: seguro de defensa jurídica, libre elección de abogado, art. 76 LCS, cláusula limitativa, asistencia en el hogar.</w:t>
+            </w:r>
+          </w:p>
+          <w:p>
+            <w:pPr>
+              <w:spacing w:after="100"/>
+              <w:jc w:val="both"/>
+            </w:pPr>
+            <w:r>
+              <w:rPr>
+                <w:rFonts w:ascii="Archivo" w:cs="Archivo" w:eastAsia="Archivo" w:hAnsi="Archivo"/>
+                <w:i/>
+                <w:iCs/>
+                <w:sz w:val="18"/>
+                <w:szCs w:val="18"/>
+              </w:rPr>
+              <w:t xml:space="preserve">This chapter examines the legal expenses cover of homeowners' insurance, regulated as an autonomous sub-type under Articles 76.a) to 76.g) of the Insurance Contract Act, focusing on the policyholder's right to freely choose legal counsel and on the contested classification —risk-delimiting, rights-limiting or unfair— of clauses capping that right in quantitative terms, resolved by case law through a case-by-case assessment of whether the agreed cap is genuinely sufficient. It closes with an examination of the contractual, heterogeneous home-assistance cover.</w:t>
+            </w:r>
+          </w:p>
+          <w:p>
+            <w:pPr>
+              <w:spacing w:after="0"/>
+            </w:pPr>
+            <w:r>
+              <w:rPr>
+                <w:rFonts w:ascii="Archivo" w:cs="Archivo" w:eastAsia="Archivo" w:hAnsi="Archivo"/>
+                <w:b/>
+                <w:bCs/>
+                <w:sz w:val="17"/>
+                <w:szCs w:val="17"/>
+              </w:rPr>
+              <w:t xml:space="preserve">Keywords: legal expenses insurance, free choice of lawyer, limiting clause, home assistance cover.</w:t>
+            </w:r>
+          </w:p>
+        </w:tc>
+      </w:tr>
+    </w:tbl>
+    <w:p>
+      <w:pPr>
+        <w:spacing w:after="200"/>
+      </w:pPr>
+    </w:p>
+    <w:p>
+      <w:pPr>
+        <w:pStyle w:val="Heading2"/>
+        <w:spacing w:after="160" w:before="400"/>
+      </w:pPr>
+      <w:r>
+        <w:rPr>
+          <w:rFonts w:ascii="Fraunces" w:cs="Fraunces" w:eastAsia="Fraunces" w:hAnsi="Fraunces"/>
+          <w:b/>
+          <w:bCs/>
+          <w:color w:val="0A2540"/>
+          <w:sz w:val="24"/>
+          <w:szCs w:val="24"/>
+        </w:rPr>
+        <w:t xml:space="preserve">10.1. El seguro de defensa jurídica como garantía autónoma</w:t>
+      </w:r>
+    </w:p>
+    <w:p>
+      <w:pPr>
+        <w:spacing w:after="180" w:line="300"/>
+        <w:jc w:val="both"/>
+      </w:pPr>
+      <w:r>
+        <w:rPr>
+          <w:rFonts w:ascii="Archivo" w:cs="Archivo" w:eastAsia="Archivo" w:hAnsi="Archivo"/>
+          <w:sz w:val="21"/>
+          <w:szCs w:val="21"/>
+        </w:rPr>
+        <w:t xml:space="preserve">La LCS dedica a esta garantía un régimen propio, distinto del general de responsabilidad civil, en los arts. 76.a) a 76.g), incorporados por la Ley 21/1990 en trasposición de la normativa comunitaria sobre seguro de defensa jurídica. Aunque en la práctica del hogar se contrata siempre integrada en la póliza multirriesgo, conserva su autonomía funcional: cubre los gastos derivados de la defensa jurídica del asegurado, no la indemnización de un daño causado a un tercero</w:t>
+      </w:r>
+      <w:r>
+        <w:rPr>
+          <w:rStyle w:val="FootnoteReference"/>
+        </w:rPr>
+        <w:footnoteReference w:id="22"/>
+      </w:r>
+      <w:r>
+        <w:rPr>
+          <w:rFonts w:ascii="Archivo" w:cs="Archivo" w:eastAsia="Archivo" w:hAnsi="Archivo"/>
+          <w:sz w:val="21"/>
+          <w:szCs w:val="21"/>
+        </w:rPr>
+        <w:t xml:space="preserve">.</w:t>
+      </w:r>
+    </w:p>
+    <w:p>
+      <w:pPr>
+        <w:spacing w:after="180" w:line="300"/>
+        <w:jc w:val="both"/>
+      </w:pPr>
+      <w:r>
+        <w:rPr>
+          <w:rFonts w:ascii="Archivo" w:cs="Archivo" w:eastAsia="Archivo" w:hAnsi="Archivo"/>
+          <w:sz w:val="21"/>
+          <w:szCs w:val="21"/>
+        </w:rPr>
+        <w:t xml:space="preserve">El artículo 74 LCS, ya estudiado en el capítulo 9 a propósito de la dirección jurídica del siniestro de responsabilidad civil, contiene una previsión que conecta ambas garantías: cuando el asegurado, ante un conflicto de intereses, opta por confiar su defensa a un profesional distinto del designado por el asegurador, este «quedará obligado a abonar los gastos de tal dirección jurídica hasta el límite pactado en la póliza» (art. 74, párrafo segundo, in fine). La garantía específica de defensa jurídica extiende y generaliza este derecho de libre elección más allá del supuesto concreto de conflicto de intereses.</w:t>
+      </w:r>
+    </w:p>
+    <w:p>
+      <w:pPr>
+        <w:pStyle w:val="Heading2"/>
+        <w:spacing w:after="160" w:before="400"/>
+      </w:pPr>
+      <w:r>
+        <w:rPr>
+          <w:rFonts w:ascii="Fraunces" w:cs="Fraunces" w:eastAsia="Fraunces" w:hAnsi="Fraunces"/>
+          <w:b/>
+          <w:bCs/>
+          <w:color w:val="0A2540"/>
+          <w:sz w:val="24"/>
+          <w:szCs w:val="24"/>
+        </w:rPr>
+        <w:t xml:space="preserve">10.2. El derecho de libre elección de abogado y procurador</w:t>
+      </w:r>
+    </w:p>
+    <w:p>
+      <w:pPr>
+        <w:spacing w:after="180" w:line="300"/>
+        <w:jc w:val="both"/>
+      </w:pPr>
+      <w:r>
+        <w:rPr>
+          <w:rFonts w:ascii="Archivo" w:cs="Archivo" w:eastAsia="Archivo" w:hAnsi="Archivo"/>
+          <w:sz w:val="21"/>
+          <w:szCs w:val="21"/>
+        </w:rPr>
+        <w:t xml:space="preserve">El régimen propio del seguro de defensa jurídica reconoce al asegurado el derecho a elegir libremente los profesionales que le representen y defiendan en cualquier procedimiento, derecho que la STS 584/2021 (ROJ: STS 584/2021) sitúa expresamente en el art. 76.d) LCS</w:t>
+      </w:r>
+      <w:r>
+        <w:rPr>
+          <w:rStyle w:val="FootnoteReference"/>
+        </w:rPr>
+        <w:footnoteReference w:id="23"/>
+      </w:r>
+      <w:r>
+        <w:rPr>
+          <w:rFonts w:ascii="Archivo" w:cs="Archivo" w:eastAsia="Archivo" w:hAnsi="Archivo"/>
+          <w:sz w:val="21"/>
+          <w:szCs w:val="21"/>
+        </w:rPr>
+        <w:t xml:space="preserve">, y que la propia Sala Primera resume con cita de sus propios precedentes:</w:t>
+      </w:r>
+    </w:p>
+    <w:tbl>
+      <w:tblPr>
+        <w:tblW w:type="pct" w:w="100%"/>
+        <w:tblBorders>
+          <w:top w:val="single" w:color="CBD5E1" w:sz="4"/>
+          <w:left w:val="single" w:color="8A5A00" w:sz="24"/>
+          <w:bottom w:val="single" w:color="CBD5E1" w:sz="4"/>
+          <w:right w:val="single" w:color="CBD5E1" w:sz="4"/>
+          <w:insideH w:val="single" w:color="auto" w:sz="4"/>
+          <w:insideV w:val="single" w:color="auto" w:sz="4"/>
+        </w:tblBorders>
+      </w:tblPr>
+      <w:tblGrid>
+        <w:gridCol w:w="100"/>
+      </w:tblGrid>
+      <w:tr>
+        <w:tc>
+          <w:tcPr>
+            <w:shd w:fill="F4F6F9" w:val="clear"/>
+            <w:tcMar>
+              <w:top w:type="dxa" w:w="160"/>
+              <w:left w:type="dxa" w:w="220"/>
+              <w:bottom w:type="dxa" w:w="160"/>
+              <w:right w:type="dxa" w:w="220"/>
+            </w:tcMar>
+          </w:tcPr>
+          <w:p>
+            <w:pPr>
+              <w:spacing w:after="100"/>
+            </w:pPr>
+            <w:r>
+              <w:rPr>
+                <w:rFonts w:ascii="Archivo" w:cs="Archivo" w:eastAsia="Archivo" w:hAnsi="Archivo"/>
+                <w:b/>
+                <w:bCs/>
+                <w:caps/>
+                <w:color w:val="8A5A00"/>
+                <w:sz w:val="18"/>
+                <w:szCs w:val="18"/>
+              </w:rPr>
+              <w:t xml:space="preserve">Jurisprudencia · STS, Sala de lo Civil, de 24 de febrero de 2021 (ROJ: STS 584/2021; ECLI:ES:TS:2021:584; MP: Parra Lucán)</w:t>
+            </w:r>
+          </w:p>
+          <w:p>
+            <w:pPr>
+              <w:spacing w:after="0" w:line="280"/>
+              <w:jc w:val="both"/>
+            </w:pPr>
+            <w:r>
+              <w:rPr>
+                <w:rFonts w:ascii="Archivo" w:cs="Archivo" w:eastAsia="Archivo" w:hAnsi="Archivo"/>
+                <w:color w:val="0A2540"/>
+                <w:sz w:val="19"/>
+                <w:szCs w:val="19"/>
+              </w:rPr>
+              <w:t xml:space="preserve">«En el ámbito del seguro de defensa jurídica, conforme al art. 76.a) LCS, el asegurador queda obligado a hacerse cargo de los gastos de la defensa jurídica libremente elegida ‘dentro de los límites establecidos en la ley y en el contrato’ [...]. La claridad y precisión es exigible a todas las cláusulas del contrato de seguro, tanto si están incluidas en las condiciones generales como en las particulares, y con independencia de que se califiquen de delimitadoras del riesgo o limitativas de los derechos del asegurado.»</w:t>
+            </w:r>
+          </w:p>
+        </w:tc>
+      </w:tr>
+    </w:tbl>
+    <w:p>
+      <w:pPr>
+        <w:pStyle w:val="Heading2"/>
+        <w:spacing w:after="160" w:before="400"/>
+      </w:pPr>
+      <w:r>
+        <w:rPr>
+          <w:rFonts w:ascii="Fraunces" w:cs="Fraunces" w:eastAsia="Fraunces" w:hAnsi="Fraunces"/>
+          <w:b/>
+          <w:bCs/>
+          <w:color w:val="0A2540"/>
+          <w:sz w:val="24"/>
+          <w:szCs w:val="24"/>
+        </w:rPr>
+        <w:t xml:space="preserve">10.3. Los límites cuantitativos a la libre elección: delimitadores, limitativos o lesivos</w:t>
+      </w:r>
+    </w:p>
+    <w:p>
+      <w:pPr>
+        <w:spacing w:after="180" w:line="300"/>
+        <w:jc w:val="both"/>
+      </w:pPr>
+      <w:r>
+        <w:rPr>
+          <w:rFonts w:ascii="Archivo" w:cs="Archivo" w:eastAsia="Archivo" w:hAnsi="Archivo"/>
+          <w:sz w:val="21"/>
+          <w:szCs w:val="21"/>
+        </w:rPr>
+        <w:t xml:space="preserve">La práctica totalidad de las pólizas de hogar fijan un límite económico a la cobertura de defensa jurídica en caso de libre designación de profesionales. La calificación jurídica de estos límites —cuestión sobre la que, según reconoce la propia Sala Primera, «ante el silencio del legislador, corresponde a los tribunales»— ha sido resuelta mediante un criterio funcional que atiende a la suficiencia real del límite pactado en relación con el tipo de procedimiento cubierto:</w:t>
+      </w:r>
+    </w:p>
+    <w:tbl>
+      <w:tblPr>
+        <w:tblW w:type="pct" w:w="100%"/>
+        <w:tblBorders>
+          <w:top w:val="single" w:color="CBD5E1" w:sz="4"/>
+          <w:left w:val="single" w:color="8A5A00" w:sz="24"/>
+          <w:bottom w:val="single" w:color="CBD5E1" w:sz="4"/>
+          <w:right w:val="single" w:color="CBD5E1" w:sz="4"/>
+          <w:insideH w:val="single" w:color="auto" w:sz="4"/>
+          <w:insideV w:val="single" w:color="auto" w:sz="4"/>
+        </w:tblBorders>
+      </w:tblPr>
+      <w:tblGrid>
+        <w:gridCol w:w="100"/>
+      </w:tblGrid>
+      <w:tr>
+        <w:tc>
+          <w:tcPr>
+            <w:shd w:fill="F4F6F9" w:val="clear"/>
+            <w:tcMar>
+              <w:top w:type="dxa" w:w="160"/>
+              <w:left w:type="dxa" w:w="220"/>
+              <w:bottom w:type="dxa" w:w="160"/>
+              <w:right w:type="dxa" w:w="220"/>
+            </w:tcMar>
+          </w:tcPr>
+          <w:p>
+            <w:pPr>
+              <w:spacing w:after="100"/>
+            </w:pPr>
+            <w:r>
+              <w:rPr>
+                <w:rFonts w:ascii="Archivo" w:cs="Archivo" w:eastAsia="Archivo" w:hAnsi="Archivo"/>
+                <w:b/>
+                <w:bCs/>
+                <w:caps/>
+                <w:color w:val="8A5A00"/>
+                <w:sz w:val="18"/>
+                <w:szCs w:val="18"/>
+              </w:rPr>
+              <w:t xml:space="preserve">Jurisprudencia · STS, Sala de lo Civil, de 24 de febrero de 2021 (ROJ: STS 584/2021; ECLI:ES:TS:2021:584; MP: Parra Lucán), con cita de la STS 421/2020, de 4 de julio</w:t>
+            </w:r>
+          </w:p>
+          <w:p>
+            <w:pPr>
+              <w:spacing w:after="0" w:line="280"/>
+              <w:jc w:val="both"/>
+            </w:pPr>
+            <w:r>
+              <w:rPr>
+                <w:rFonts w:ascii="Archivo" w:cs="Archivo" w:eastAsia="Archivo" w:hAnsi="Archivo"/>
+                <w:color w:val="0A2540"/>
+                <w:sz w:val="19"/>
+                <w:szCs w:val="19"/>
+              </w:rPr>
+              <w:t xml:space="preserve">«Aunque en principio la cláusula puede calificarse como delimitadora del riesgo, en atención a las circunstancias del caso será limitativa de los derechos del asegurado, incluso lesiva, si fija unos límites notoriamente insuficientes en relación con la cuantía cubierta por el seguro de responsabilidad civil.»</w:t>
+            </w:r>
+          </w:p>
+        </w:tc>
+      </w:tr>
+    </w:tbl>
+    <w:p>
+      <w:pPr>
+        <w:spacing w:after="180" w:line="300"/>
+        <w:jc w:val="both"/>
+      </w:pPr>
+      <w:r>
+        <w:rPr>
+          <w:rFonts w:ascii="Archivo" w:cs="Archivo" w:eastAsia="Archivo" w:hAnsi="Archivo"/>
+          <w:sz w:val="21"/>
+          <w:szCs w:val="21"/>
+        </w:rPr>
+        <w:t xml:space="preserve">De esta doctrina se extrae una metodología de análisis en tres escalones que el profesional debe aplicar sistemáticamente ante cualquier límite cuantitativo de defensa jurídica: primero, verificar los requisitos formales del art. 3 LCS (destacado y, en su caso, aceptación específica); segundo, comparar el importe del límite con el coste real y previsible de una defensa jurídica adecuada al tipo de procedimiento cubierto (un límite de 600 euros, como el enjuiciado en la propia STS 584/2021, puede resultar manifiestamente insuficiente para un procedimiento ordinario o incluso para un juicio verbal de cierta complejidad); y tercero, si el límite vacía de contenido efectivo el derecho de libre elección reconocido por la ley, concluir su carácter limitativo —o, en los casos más extremos, lesivo y por tanto nulo— con independencia de su ubicación formal en el condicionado.</w:t>
+      </w:r>
+    </w:p>
+    <w:p>
+      <w:pPr>
+        <w:pStyle w:val="Heading2"/>
+        <w:spacing w:after="160" w:before="400"/>
+      </w:pPr>
+      <w:r>
+        <w:rPr>
+          <w:rFonts w:ascii="Fraunces" w:cs="Fraunces" w:eastAsia="Fraunces" w:hAnsi="Fraunces"/>
+          <w:b/>
+          <w:bCs/>
+          <w:color w:val="0A2540"/>
+          <w:sz w:val="24"/>
+          <w:szCs w:val="24"/>
+        </w:rPr>
+        <w:t xml:space="preserve">10.4. Conflicto de intereses y defensa independiente en la garantía de responsabilidad civil</w:t>
+      </w:r>
+    </w:p>
+    <w:p>
+      <w:pPr>
+        <w:spacing w:after="180" w:line="300"/>
+        <w:jc w:val="both"/>
+      </w:pPr>
+      <w:r>
+        <w:rPr>
+          <w:rFonts w:ascii="Archivo" w:cs="Archivo" w:eastAsia="Archivo" w:hAnsi="Archivo"/>
+          <w:sz w:val="21"/>
+          <w:szCs w:val="21"/>
+        </w:rPr>
+        <w:t xml:space="preserve">Como se anticipó en el capítulo 9, cuando la reclamación de responsabilidad civil enfrenta al asegurado con otro cliente de la misma aseguradora, o concurre cualquier otro conflicto de intereses, el asegurado puede optar por una dirección jurídica independiente conforme al art. 74 LCS, sujeta también al límite cuantitativo pactado en póliza y al mismo escrutinio de suficiencia que se acaba de exponer para la garantía específica de defensa jurídica.</w:t>
+      </w:r>
+    </w:p>
+    <w:p>
+      <w:pPr>
+        <w:pStyle w:val="Heading2"/>
+        <w:spacing w:after="160" w:before="400"/>
+      </w:pPr>
+      <w:r>
+        <w:rPr>
+          <w:rFonts w:ascii="Fraunces" w:cs="Fraunces" w:eastAsia="Fraunces" w:hAnsi="Fraunces"/>
+          <w:b/>
+          <w:bCs/>
+          <w:color w:val="0A2540"/>
+          <w:sz w:val="24"/>
+          <w:szCs w:val="24"/>
+        </w:rPr>
+        <w:t xml:space="preserve">10.5. La garantía de asistencia en el hogar</w:t>
+      </w:r>
+    </w:p>
+    <w:p>
+      <w:pPr>
+        <w:spacing w:after="180" w:line="300"/>
+        <w:jc w:val="both"/>
+      </w:pPr>
+      <w:r>
+        <w:rPr>
+          <w:rFonts w:ascii="Archivo" w:cs="Archivo" w:eastAsia="Archivo" w:hAnsi="Archivo"/>
+          <w:sz w:val="21"/>
+          <w:szCs w:val="21"/>
+        </w:rPr>
+        <w:t xml:space="preserve">Junto a la defensa jurídica propiamente dicha, la práctica aseguradora incorpora con frecuencia una garantía de «asistencia en el hogar» de naturaleza puramente contractual y heterogénea —sin correlato en un régimen legal específico de la LCS— que suele comprender servicios de urgencia (cerrajería, fontanería o electricidad de urgencia), envío de profesionales para reparaciones menores, y en ocasiones asistencia informática o telefónica. Por su naturaleza de prestación de servicios más que de indemnización dineraria, su régimen de cláusulas limitativas y su interpretación se rigen íntegramente por el art. 3 LCS y por la metodología general expuesta en el capítulo 4, sin las especialidades del régimen legal propio del seguro de defensa jurídica.</w:t>
+      </w:r>
+    </w:p>
+    <w:p>
+      <w:pPr>
+        <w:pStyle w:val="Heading2"/>
+        <w:spacing w:after="160" w:before="400"/>
+      </w:pPr>
+      <w:r>
+        <w:rPr>
+          <w:rFonts w:ascii="Fraunces" w:cs="Fraunces" w:eastAsia="Fraunces" w:hAnsi="Fraunces"/>
+          <w:b/>
+          <w:bCs/>
+          <w:color w:val="0A2540"/>
+          <w:sz w:val="24"/>
+          <w:szCs w:val="24"/>
+        </w:rPr>
+        <w:t xml:space="preserve">10.6. Ficha para el profesional</w:t>
+      </w:r>
+    </w:p>
+    <w:tbl>
+      <w:tblPr>
+        <w:tblW w:type="pct" w:w="100%"/>
+        <w:tblBorders>
+          <w:top w:val="single" w:color="CBD5E1" w:sz="4"/>
+          <w:left w:val="single" w:color="1B6DF0" w:sz="24"/>
+          <w:bottom w:val="single" w:color="CBD5E1" w:sz="4"/>
+          <w:right w:val="single" w:color="CBD5E1" w:sz="4"/>
+          <w:insideH w:val="single" w:color="auto" w:sz="4"/>
+          <w:insideV w:val="single" w:color="auto" w:sz="4"/>
+        </w:tblBorders>
+      </w:tblPr>
+      <w:tblGrid>
+        <w:gridCol w:w="100"/>
+      </w:tblGrid>
+      <w:tr>
+        <w:tc>
+          <w:tcPr>
+            <w:shd w:fill="F4F6F9" w:val="clear"/>
+            <w:tcMar>
+              <w:top w:type="dxa" w:w="160"/>
+              <w:left w:type="dxa" w:w="220"/>
+              <w:bottom w:type="dxa" w:w="160"/>
+              <w:right w:type="dxa" w:w="220"/>
+            </w:tcMar>
+          </w:tcPr>
+          <w:p>
+            <w:pPr>
+              <w:spacing w:after="100"/>
+            </w:pPr>
+            <w:r>
+              <w:rPr>
+                <w:rFonts w:ascii="Archivo" w:cs="Archivo" w:eastAsia="Archivo" w:hAnsi="Archivo"/>
+                <w:b/>
+                <w:bCs/>
+                <w:caps/>
+                <w:color w:val="1B6DF0"/>
+                <w:sz w:val="18"/>
+                <w:szCs w:val="18"/>
+              </w:rPr>
+              <w:t xml:space="preserve">Puntos de control ante un límite de defensa jurídica insuficiente</w:t>
+            </w:r>
+          </w:p>
+          <w:p>
+            <w:pPr>
+              <w:pStyle w:val="ListParagraph"/>
+              <w:numPr>
+                <w:ilvl w:val="0"/>
+                <w:numId w:val="2"/>
+              </w:numPr>
+              <w:spacing w:after="80" w:line="280"/>
+            </w:pPr>
+            <w:r>
+              <w:rPr>
+                <w:rFonts w:ascii="Archivo" w:cs="Archivo" w:eastAsia="Archivo" w:hAnsi="Archivo"/>
+                <w:sz w:val="19"/>
+                <w:szCs w:val="19"/>
+              </w:rPr>
+              <w:t xml:space="preserve">Comprobar el cumplimiento de los requisitos formales del art. 3 LCS respecto del límite cuantitativo pactado.</w:t>
+            </w:r>
+          </w:p>
+          <w:p>
+            <w:pPr>
+              <w:pStyle w:val="ListParagraph"/>
+              <w:numPr>
+                <w:ilvl w:val="0"/>
+                <w:numId w:val="2"/>
+              </w:numPr>
+              <w:spacing w:after="80" w:line="280"/>
+            </w:pPr>
+            <w:r>
+              <w:rPr>
+                <w:rFonts w:ascii="Archivo" w:cs="Archivo" w:eastAsia="Archivo" w:hAnsi="Archivo"/>
+                <w:sz w:val="19"/>
+                <w:szCs w:val="19"/>
+              </w:rPr>
+              <w:t xml:space="preserve">Cuantificar el coste real y previsible de una defensa jurídica adecuada al procedimiento concreto, comparándolo con el límite pactado, siguiendo la metodología de la STS 584/2021 (ROJ: STS 584/2021).</w:t>
+            </w:r>
+          </w:p>
+          <w:p>
+            <w:pPr>
+              <w:pStyle w:val="ListParagraph"/>
+              <w:numPr>
+                <w:ilvl w:val="0"/>
+                <w:numId w:val="2"/>
+              </w:numPr>
+              <w:spacing w:after="80" w:line="280"/>
+            </w:pPr>
+            <w:r>
+              <w:rPr>
+                <w:rFonts w:ascii="Archivo" w:cs="Archivo" w:eastAsia="Archivo" w:hAnsi="Archivo"/>
+                <w:sz w:val="19"/>
+                <w:szCs w:val="19"/>
+              </w:rPr>
+              <w:t xml:space="preserve">Si el límite resulta notoriamente insuficiente, plantear alternativamente su calificación como cláusula limitativa mal incorporada o como cláusula lesiva nula de pleno derecho.</w:t>
+            </w:r>
+          </w:p>
+          <w:p>
+            <w:pPr>
+              <w:pStyle w:val="ListParagraph"/>
+              <w:numPr>
+                <w:ilvl w:val="0"/>
+                <w:numId w:val="2"/>
+              </w:numPr>
+              <w:spacing w:after="80" w:line="280"/>
+            </w:pPr>
+            <w:r>
+              <w:rPr>
+                <w:rFonts w:ascii="Archivo" w:cs="Archivo" w:eastAsia="Archivo" w:hAnsi="Archivo"/>
+                <w:sz w:val="19"/>
+                <w:szCs w:val="19"/>
+              </w:rPr>
+              <w:t xml:space="preserve">En los seguros de responsabilidad civil con dirección jurídica del asegurador, verificar si concurre conflicto de intereses que habilite la defensa independiente del art. 74 LCS.</w:t>
+            </w:r>
+          </w:p>
+        </w:tc>
+      </w:tr>
+    </w:tbl>
+    <w:p>
+      <w:pPr>
+        <w:pStyle w:val="Heading2"/>
+        <w:spacing w:after="160" w:before="400"/>
+      </w:pPr>
+      <w:r>
+        <w:rPr>
+          <w:rFonts w:ascii="Fraunces" w:cs="Fraunces" w:eastAsia="Fraunces" w:hAnsi="Fraunces"/>
+          <w:b/>
+          <w:bCs/>
+          <w:color w:val="0A2540"/>
+          <w:sz w:val="24"/>
+          <w:szCs w:val="24"/>
+        </w:rPr>
+        <w:t xml:space="preserve">10.7. Ficha para el asegurado</w:t>
+      </w:r>
+    </w:p>
+    <w:tbl>
+      <w:tblPr>
+        <w:tblW w:type="pct" w:w="100%"/>
+        <w:tblBorders>
+          <w:top w:val="single" w:color="CBD5E1" w:sz="4"/>
+          <w:left w:val="single" w:color="8A5A00" w:sz="24"/>
+          <w:bottom w:val="single" w:color="CBD5E1" w:sz="4"/>
+          <w:right w:val="single" w:color="CBD5E1" w:sz="4"/>
+          <w:insideH w:val="single" w:color="auto" w:sz="4"/>
+          <w:insideV w:val="single" w:color="auto" w:sz="4"/>
+        </w:tblBorders>
+      </w:tblPr>
+      <w:tblGrid>
+        <w:gridCol w:w="100"/>
+      </w:tblGrid>
+      <w:tr>
+        <w:tc>
+          <w:tcPr>
+            <w:shd w:fill="F4F6F9" w:val="clear"/>
+            <w:tcMar>
+              <w:top w:type="dxa" w:w="160"/>
+              <w:left w:type="dxa" w:w="220"/>
+              <w:bottom w:type="dxa" w:w="160"/>
+              <w:right w:type="dxa" w:w="220"/>
+            </w:tcMar>
+          </w:tcPr>
+          <w:p>
+            <w:pPr>
+              <w:spacing w:after="100"/>
+            </w:pPr>
+            <w:r>
+              <w:rPr>
+                <w:rFonts w:ascii="Archivo" w:cs="Archivo" w:eastAsia="Archivo" w:hAnsi="Archivo"/>
+                <w:b/>
+                <w:bCs/>
+                <w:caps/>
+                <w:color w:val="8A5A00"/>
+                <w:sz w:val="18"/>
+                <w:szCs w:val="18"/>
+              </w:rPr>
+              <w:t xml:space="preserve">Qué debe saber sobre la defensa jurídica de su seguro de hogar</w:t>
+            </w:r>
+          </w:p>
+          <w:p>
+            <w:pPr>
+              <w:pStyle w:val="ListParagraph"/>
+              <w:numPr>
+                <w:ilvl w:val="0"/>
+                <w:numId w:val="2"/>
+              </w:numPr>
+              <w:spacing w:after="80" w:line="280"/>
+            </w:pPr>
+            <w:r>
+              <w:rPr>
+                <w:rFonts w:ascii="Archivo" w:cs="Archivo" w:eastAsia="Archivo" w:hAnsi="Archivo"/>
+                <w:sz w:val="19"/>
+                <w:szCs w:val="19"/>
+              </w:rPr>
+              <w:t xml:space="preserve">Tiene derecho a elegir a su propio abogado y procurador en caso de litigio cubierto por esta garantía, no solo a los designados por la aseguradora.</w:t>
+            </w:r>
+          </w:p>
+          <w:p>
+            <w:pPr>
+              <w:pStyle w:val="ListParagraph"/>
+              <w:numPr>
+                <w:ilvl w:val="0"/>
+                <w:numId w:val="2"/>
+              </w:numPr>
+              <w:spacing w:after="80" w:line="280"/>
+            </w:pPr>
+            <w:r>
+              <w:rPr>
+                <w:rFonts w:ascii="Archivo" w:cs="Archivo" w:eastAsia="Archivo" w:hAnsi="Archivo"/>
+                <w:sz w:val="19"/>
+                <w:szCs w:val="19"/>
+              </w:rPr>
+              <w:t xml:space="preserve">Revise el límite económico de esta cobertura en sus condiciones particulares: si es muy reducido en relación con el tipo de procedimiento previsible, puede no cubrir realmente los honorarios de un profesional independiente.</w:t>
+            </w:r>
+          </w:p>
+          <w:p>
+            <w:pPr>
+              <w:pStyle w:val="ListParagraph"/>
+              <w:numPr>
+                <w:ilvl w:val="0"/>
+                <w:numId w:val="2"/>
+              </w:numPr>
+              <w:spacing w:after="80" w:line="280"/>
+            </w:pPr>
+            <w:r>
+              <w:rPr>
+                <w:rFonts w:ascii="Archivo" w:cs="Archivo" w:eastAsia="Archivo" w:hAnsi="Archivo"/>
+                <w:sz w:val="19"/>
+                <w:szCs w:val="19"/>
+              </w:rPr>
+              <w:t xml:space="preserve">Si su aseguradora le abona solo una parte de los honorarios de su abogado alegando el límite de la póliza, consulte si ese límite podría ser insuficiente y, por tanto, impugnable.</w:t>
+            </w:r>
+          </w:p>
+        </w:tc>
+      </w:tr>
+    </w:tbl>
+    <w:p>
+      <w:pPr>
+        <w:pStyle w:val="Heading2"/>
+        <w:spacing w:after="160" w:before="400"/>
+      </w:pPr>
+      <w:r>
+        <w:rPr>
+          <w:rFonts w:ascii="Fraunces" w:cs="Fraunces" w:eastAsia="Fraunces" w:hAnsi="Fraunces"/>
+          <w:b/>
+          <w:bCs/>
+          <w:color w:val="0A2540"/>
+          <w:sz w:val="24"/>
+          <w:szCs w:val="24"/>
+        </w:rPr>
+        <w:t xml:space="preserve">10.8. Checklist: activación de la cobertura de defensa jurídica</w:t>
+      </w:r>
+    </w:p>
+    <w:p>
+      <w:pPr>
+        <w:pStyle w:val="ListParagraph"/>
+        <w:numPr>
+          <w:ilvl w:val="0"/>
+          <w:numId w:val="2"/>
+        </w:numPr>
+        <w:spacing w:after="100" w:line="290"/>
+      </w:pPr>
+      <w:r>
+        <w:rPr>
+          <w:rFonts w:ascii="Archivo" w:cs="Archivo" w:eastAsia="Archivo" w:hAnsi="Archivo"/>
+          <w:sz w:val="21"/>
+          <w:szCs w:val="21"/>
+        </w:rPr>
+        <w:t xml:space="preserve">1. ¿El conflicto está cubierto por la garantía de defensa jurídica de la póliza (materia, cuantía, momento de origen)?</w:t>
+      </w:r>
+    </w:p>
+    <w:p>
+      <w:pPr>
+        <w:pStyle w:val="ListParagraph"/>
+        <w:numPr>
+          <w:ilvl w:val="0"/>
+          <w:numId w:val="2"/>
+        </w:numPr>
+        <w:spacing w:after="100" w:line="290"/>
+      </w:pPr>
+      <w:r>
+        <w:rPr>
+          <w:rFonts w:ascii="Archivo" w:cs="Archivo" w:eastAsia="Archivo" w:hAnsi="Archivo"/>
+          <w:sz w:val="21"/>
+          <w:szCs w:val="21"/>
+        </w:rPr>
+        <w:t xml:space="preserve">2. ¿Se ha ejercitado o comunicado el derecho de libre elección de abogado y procurador?</w:t>
+      </w:r>
+    </w:p>
+    <w:p>
+      <w:pPr>
+        <w:pStyle w:val="ListParagraph"/>
+        <w:numPr>
+          <w:ilvl w:val="0"/>
+          <w:numId w:val="2"/>
+        </w:numPr>
+        <w:spacing w:after="100" w:line="290"/>
+      </w:pPr>
+      <w:r>
+        <w:rPr>
+          <w:rFonts w:ascii="Archivo" w:cs="Archivo" w:eastAsia="Archivo" w:hAnsi="Archivo"/>
+          <w:sz w:val="21"/>
+          <w:szCs w:val="21"/>
+        </w:rPr>
+        <w:t xml:space="preserve">3. ¿Cuál es el límite económico pactado, y resulta razonablemente suficiente para el tipo de procedimiento?</w:t>
+      </w:r>
+    </w:p>
+    <w:p>
+      <w:pPr>
+        <w:pStyle w:val="ListParagraph"/>
+        <w:numPr>
+          <w:ilvl w:val="0"/>
+          <w:numId w:val="2"/>
+        </w:numPr>
+        <w:spacing w:after="100" w:line="290"/>
+      </w:pPr>
+      <w:r>
+        <w:rPr>
+          <w:rFonts w:ascii="Archivo" w:cs="Archivo" w:eastAsia="Archivo" w:hAnsi="Archivo"/>
+          <w:sz w:val="21"/>
+          <w:szCs w:val="21"/>
+        </w:rPr>
+        <w:t xml:space="preserve">4. ¿Existe conflicto de intereses con la propia aseguradora u otro asegurado de la misma compañía?</w:t>
+      </w:r>
+    </w:p>
+    <w:p>
+      <w:pPr>
+        <w:pStyle w:val="ListParagraph"/>
+        <w:numPr>
+          <w:ilvl w:val="0"/>
+          <w:numId w:val="2"/>
+        </w:numPr>
+        <w:spacing w:after="100" w:line="290"/>
+      </w:pPr>
+      <w:r>
+        <w:rPr>
+          <w:rFonts w:ascii="Archivo" w:cs="Archivo" w:eastAsia="Archivo" w:hAnsi="Archivo"/>
+          <w:sz w:val="21"/>
+          <w:szCs w:val="21"/>
+        </w:rPr>
+        <w:t xml:space="preserve">5. ¿Se ha reclamado, en su caso, la diferencia entre lo abonado por la aseguradora y el coste real de la defensa?</w:t>
+      </w:r>
+    </w:p>
+    <w:p>
+      <w:pPr>
+        <w:pStyle w:val="Heading2"/>
+        <w:spacing w:after="160" w:before="400"/>
+      </w:pPr>
+      <w:r>
+        <w:rPr>
+          <w:rFonts w:ascii="Fraunces" w:cs="Fraunces" w:eastAsia="Fraunces" w:hAnsi="Fraunces"/>
+          <w:b/>
+          <w:bCs/>
+          <w:color w:val="0A2540"/>
+          <w:sz w:val="24"/>
+          <w:szCs w:val="24"/>
+        </w:rPr>
+        <w:t xml:space="preserve">Bibliografía citada</w:t>
+      </w:r>
+    </w:p>
+    <w:p>
+      <w:pPr>
+        <w:spacing w:after="180" w:line="300"/>
+        <w:jc w:val="both"/>
+      </w:pPr>
+      <w:r>
+        <w:rPr>
+          <w:rFonts w:ascii="Archivo" w:cs="Archivo" w:eastAsia="Archivo" w:hAnsi="Archivo"/>
+          <w:sz w:val="21"/>
+          <w:szCs w:val="21"/>
+        </w:rPr>
+        <w:t xml:space="preserve">BATALLER GRAU, J.; BOQUERA MATARREDONA, J.; OLAVARRÍA IGLESIA, J. (coords.), Comentarios a la Ley de Contrato de Seguro, Tirant lo Blanch, Valencia.</w:t>
+      </w:r>
+    </w:p>
+    <w:p>
+      <w:pPr>
+        <w:spacing w:after="180" w:line="300"/>
+        <w:jc w:val="both"/>
+      </w:pPr>
+      <w:r>
+        <w:rPr>
+          <w:rFonts w:ascii="Archivo" w:cs="Archivo" w:eastAsia="Archivo" w:hAnsi="Archivo"/>
+          <w:sz w:val="21"/>
+          <w:szCs w:val="21"/>
+        </w:rPr>
+        <w:t xml:space="preserve">VEIGA COPO, A. B., Tratado del Contrato de Seguro, Civitas-Thomson Reuters, Cizur Menor.</w:t>
+      </w:r>
+    </w:p>
+    <w:p>
+      <w:pPr>
+        <w:pStyle w:val="Heading1"/>
+        <w:pageBreakBefore/>
+        <w:spacing w:after="300" w:before="200"/>
+      </w:pPr>
+      <w:r>
+        <w:rPr>
+          <w:rFonts w:ascii="Archivo" w:cs="Archivo" w:eastAsia="Archivo" w:hAnsi="Archivo"/>
+          <w:b/>
+          <w:bCs/>
+          <w:color w:val="1B6DF0"/>
+          <w:sz w:val="22"/>
+          <w:szCs w:val="22"/>
+        </w:rPr>
+        <w:t xml:space="preserve">Capítulo 11. </w:t>
+      </w:r>
+      <w:r>
+        <w:rPr>
+          <w:rFonts w:ascii="Fraunces" w:cs="Fraunces" w:eastAsia="Fraunces" w:hAnsi="Fraunces"/>
+          <w:b/>
+          <w:bCs/>
+          <w:color w:val="0A2540"/>
+          <w:sz w:val="30"/>
+          <w:szCs w:val="30"/>
+        </w:rPr>
+        <w:t xml:space="preserve">Coberturas especiales: joyas, objetos de valor, equipos electrónicos y comunidades de propietarios</w:t>
+      </w:r>
+    </w:p>
+    <w:tbl>
+      <w:tblPr>
+        <w:tblW w:type="pct" w:w="100%"/>
+        <w:tblBorders>
+          <w:top w:val="single" w:color="CBD5E1" w:sz="4"/>
+          <w:left w:val="single" w:color="1B6DF0" w:sz="24"/>
+          <w:bottom w:val="single" w:color="CBD5E1" w:sz="4"/>
+          <w:right w:val="single" w:color="CBD5E1" w:sz="4"/>
+          <w:insideH w:val="single" w:color="auto" w:sz="4"/>
+          <w:insideV w:val="single" w:color="auto" w:sz="4"/>
+        </w:tblBorders>
+      </w:tblPr>
+      <w:tblGrid>
+        <w:gridCol w:w="100"/>
+      </w:tblGrid>
+      <w:tr>
+        <w:tc>
+          <w:tcPr>
+            <w:shd w:fill="F4F6F9" w:val="clear"/>
+            <w:tcMar>
+              <w:top w:type="dxa" w:w="160"/>
+              <w:left w:type="dxa" w:w="220"/>
+              <w:bottom w:type="dxa" w:w="160"/>
+              <w:right w:type="dxa" w:w="220"/>
+            </w:tcMar>
+          </w:tcPr>
+          <w:p>
+            <w:pPr>
+              <w:spacing w:after="100"/>
+            </w:pPr>
+            <w:r>
+              <w:rPr>
+                <w:rFonts w:ascii="Archivo" w:cs="Archivo" w:eastAsia="Archivo" w:hAnsi="Archivo"/>
+                <w:b/>
+                <w:bCs/>
+                <w:caps/>
+                <w:color w:val="1B6DF0"/>
+                <w:sz w:val="18"/>
+                <w:szCs w:val="18"/>
+              </w:rPr>
+              <w:t xml:space="preserve">Sumario</w:t>
+            </w:r>
+          </w:p>
+          <w:p>
+            <w:pPr>
+              <w:spacing w:after="40" w:line="260"/>
+            </w:pPr>
+            <w:r>
+              <w:rPr>
+                <w:rFonts w:ascii="Archivo" w:cs="Archivo" w:eastAsia="Archivo" w:hAnsi="Archivo"/>
+                <w:sz w:val="18"/>
+                <w:szCs w:val="18"/>
+              </w:rPr>
+              <w:t xml:space="preserve">11.1. El régimen de sublímites en el seguro de hogar</w:t>
+            </w:r>
+          </w:p>
+          <w:p>
+            <w:pPr>
+              <w:spacing w:after="40" w:line="260"/>
+            </w:pPr>
+            <w:r>
+              <w:rPr>
+                <w:rFonts w:ascii="Archivo" w:cs="Archivo" w:eastAsia="Archivo" w:hAnsi="Archivo"/>
+                <w:sz w:val="18"/>
+                <w:szCs w:val="18"/>
+              </w:rPr>
+              <w:t xml:space="preserve">11.2. Joyas y objetos de valor</w:t>
+            </w:r>
+          </w:p>
+          <w:p>
+            <w:pPr>
+              <w:spacing w:after="40" w:line="260"/>
+            </w:pPr>
+            <w:r>
+              <w:rPr>
+                <w:rFonts w:ascii="Archivo" w:cs="Archivo" w:eastAsia="Archivo" w:hAnsi="Archivo"/>
+                <w:sz w:val="18"/>
+                <w:szCs w:val="18"/>
+              </w:rPr>
+              <w:t xml:space="preserve">11.3. Equipos electrónicos, informáticos y de telefonía</w:t>
+            </w:r>
+          </w:p>
+          <w:p>
+            <w:pPr>
+              <w:spacing w:after="40" w:line="260"/>
+            </w:pPr>
+            <w:r>
+              <w:rPr>
+                <w:rFonts w:ascii="Archivo" w:cs="Archivo" w:eastAsia="Archivo" w:hAnsi="Archivo"/>
+                <w:sz w:val="18"/>
+                <w:szCs w:val="18"/>
+              </w:rPr>
+              <w:t xml:space="preserve">11.4. Obras de arte y colecciones</w:t>
+            </w:r>
+          </w:p>
+          <w:p>
+            <w:pPr>
+              <w:spacing w:after="40" w:line="260"/>
+            </w:pPr>
+            <w:r>
+              <w:rPr>
+                <w:rFonts w:ascii="Archivo" w:cs="Archivo" w:eastAsia="Archivo" w:hAnsi="Archivo"/>
+                <w:sz w:val="18"/>
+                <w:szCs w:val="18"/>
+              </w:rPr>
+              <w:t xml:space="preserve">11.5. El seguro de la comunidad de propietarios y su interacción con la póliza individual</w:t>
+            </w:r>
+          </w:p>
+          <w:p>
+            <w:pPr>
+              <w:spacing w:after="40" w:line="260"/>
+            </w:pPr>
+            <w:r>
+              <w:rPr>
+                <w:rFonts w:ascii="Archivo" w:cs="Archivo" w:eastAsia="Archivo" w:hAnsi="Archivo"/>
+                <w:sz w:val="18"/>
+                <w:szCs w:val="18"/>
+              </w:rPr>
+              <w:t xml:space="preserve">11.6. Ficha para el profesional</w:t>
+            </w:r>
+          </w:p>
+          <w:p>
+            <w:pPr>
+              <w:spacing w:after="40" w:line="260"/>
+            </w:pPr>
+            <w:r>
+              <w:rPr>
+                <w:rFonts w:ascii="Archivo" w:cs="Archivo" w:eastAsia="Archivo" w:hAnsi="Archivo"/>
+                <w:sz w:val="18"/>
+                <w:szCs w:val="18"/>
+              </w:rPr>
+              <w:t xml:space="preserve">11.7. Ficha para el asegurado</w:t>
+            </w:r>
+          </w:p>
+          <w:p>
+            <w:pPr>
+              <w:spacing w:after="40" w:line="260"/>
+            </w:pPr>
+            <w:r>
+              <w:rPr>
+                <w:rFonts w:ascii="Archivo" w:cs="Archivo" w:eastAsia="Archivo" w:hAnsi="Archivo"/>
+                <w:sz w:val="18"/>
+                <w:szCs w:val="18"/>
+              </w:rPr>
+              <w:t xml:space="preserve">11.8. Checklist: revisión de sublímites y coberturas especiales</w:t>
+            </w:r>
+          </w:p>
+        </w:tc>
+      </w:tr>
+    </w:tbl>
+    <w:p>
+      <w:pPr>
+        <w:spacing w:after="160"/>
+      </w:pPr>
+    </w:p>
+    <w:tbl>
+      <w:tblPr>
+        <w:tblW w:type="pct" w:w="100%"/>
+        <w:tblBorders>
+          <w:top w:val="single" w:color="CBD5E1" w:sz="4"/>
+          <w:left w:val="single" w:color="6B7A8F" w:sz="24"/>
+          <w:bottom w:val="single" w:color="CBD5E1" w:sz="4"/>
+          <w:right w:val="single" w:color="CBD5E1" w:sz="4"/>
+          <w:insideH w:val="single" w:color="auto" w:sz="4"/>
+          <w:insideV w:val="single" w:color="auto" w:sz="4"/>
+        </w:tblBorders>
+      </w:tblPr>
+      <w:tblGrid>
+        <w:gridCol w:w="100"/>
+      </w:tblGrid>
+      <w:tr>
+        <w:tc>
+          <w:tcPr>
+            <w:shd w:fill="F4F6F9" w:val="clear"/>
+            <w:tcMar>
+              <w:top w:type="dxa" w:w="160"/>
+              <w:left w:type="dxa" w:w="220"/>
+              <w:bottom w:type="dxa" w:w="160"/>
+              <w:right w:type="dxa" w:w="220"/>
+            </w:tcMar>
+          </w:tcPr>
+          <w:p>
+            <w:pPr>
+              <w:spacing w:after="100"/>
+            </w:pPr>
+            <w:r>
+              <w:rPr>
+                <w:rFonts w:ascii="Archivo" w:cs="Archivo" w:eastAsia="Archivo" w:hAnsi="Archivo"/>
+                <w:b/>
+                <w:bCs/>
+                <w:caps/>
+                <w:color w:val="6B7A8F"/>
+                <w:sz w:val="18"/>
+                <w:szCs w:val="18"/>
+              </w:rPr>
+              <w:t xml:space="preserve">Resumen · Abstract</w:t>
+            </w:r>
+          </w:p>
+          <w:p>
+            <w:pPr>
+              <w:spacing w:after="100"/>
+              <w:jc w:val="both"/>
+            </w:pPr>
+            <w:r>
+              <w:rPr>
+                <w:rFonts w:ascii="Archivo" w:cs="Archivo" w:eastAsia="Archivo" w:hAnsi="Archivo"/>
+                <w:i/>
+                <w:iCs/>
+                <w:sz w:val="18"/>
+                <w:szCs w:val="18"/>
+              </w:rPr>
+              <w:t xml:space="preserve">El capítulo sistematiza las coberturas especiales o adicionales del seguro de hogar —joyas, dinero en efectivo, equipos electrónicos, obras de arte— estructuradas técnicamente como sublímites dentro de la suma asegurada general del contenido, y su calificación como cláusulas delimitadoras o limitativas conforme a la doctrina ya expuesta en los capítulos 1 y 4. Se completa con el estudio de la interacción entre el seguro individual del propietario y el seguro de la comunidad de propietarios en régimen de propiedad horizontal.</w:t>
+            </w:r>
+          </w:p>
+          <w:p>
+            <w:pPr>
+              <w:spacing w:after="160"/>
+            </w:pPr>
+            <w:r>
+              <w:rPr>
+                <w:rFonts w:ascii="Archivo" w:cs="Archivo" w:eastAsia="Archivo" w:hAnsi="Archivo"/>
+                <w:b/>
+                <w:bCs/>
+                <w:sz w:val="17"/>
+                <w:szCs w:val="17"/>
+              </w:rPr>
+              <w:t xml:space="preserve">Palabras clave: sublímites, joyas, objetos de valor, equipos electrónicos, comunidad de propietarios, seguro de comunidad.</w:t>
+            </w:r>
+          </w:p>
+          <w:p>
+            <w:pPr>
+              <w:spacing w:after="100"/>
+              <w:jc w:val="both"/>
+            </w:pPr>
+            <w:r>
+              <w:rPr>
+                <w:rFonts w:ascii="Archivo" w:cs="Archivo" w:eastAsia="Archivo" w:hAnsi="Archivo"/>
+                <w:i/>
+                <w:iCs/>
+                <w:sz w:val="18"/>
+                <w:szCs w:val="18"/>
+              </w:rPr>
+              <w:t xml:space="preserve">This chapter systematises the special or additional covers of homeowners' insurance —jewellery, cash, electronic equipment, artwork— structured technically as sub-limits within the overall contents sum insured, and their classification as risk-delimiting or rights-limiting clauses under the doctrine already set out in Chapters 1 and 4. It closes with an examination of the interaction between an individual owner's policy and the homeowners' association's own insurance under the condominium regime.</w:t>
+            </w:r>
+          </w:p>
+          <w:p>
+            <w:pPr>
+              <w:spacing w:after="0"/>
+            </w:pPr>
+            <w:r>
+              <w:rPr>
+                <w:rFonts w:ascii="Archivo" w:cs="Archivo" w:eastAsia="Archivo" w:hAnsi="Archivo"/>
+                <w:b/>
+                <w:bCs/>
+                <w:sz w:val="17"/>
+                <w:szCs w:val="17"/>
+              </w:rPr>
+              <w:t xml:space="preserve">Keywords: sub-limits, jewellery, valuables, electronic equipment, condominium insurance.</w:t>
+            </w:r>
+          </w:p>
+        </w:tc>
+      </w:tr>
+    </w:tbl>
+    <w:p>
+      <w:pPr>
+        <w:spacing w:after="200"/>
+      </w:pPr>
+    </w:p>
+    <w:p>
+      <w:pPr>
+        <w:pStyle w:val="Heading2"/>
+        <w:spacing w:after="160" w:before="400"/>
+      </w:pPr>
+      <w:r>
+        <w:rPr>
+          <w:rFonts w:ascii="Fraunces" w:cs="Fraunces" w:eastAsia="Fraunces" w:hAnsi="Fraunces"/>
+          <w:b/>
+          <w:bCs/>
+          <w:color w:val="0A2540"/>
+          <w:sz w:val="24"/>
+          <w:szCs w:val="24"/>
+        </w:rPr>
+        <w:t xml:space="preserve">11.1. El régimen de sublímites en el seguro de hogar</w:t>
+      </w:r>
+    </w:p>
+    <w:p>
+      <w:pPr>
+        <w:spacing w:after="180" w:line="300"/>
+        <w:jc w:val="both"/>
+      </w:pPr>
+      <w:r>
+        <w:rPr>
+          <w:rFonts w:ascii="Archivo" w:cs="Archivo" w:eastAsia="Archivo" w:hAnsi="Archivo"/>
+          <w:sz w:val="21"/>
+          <w:szCs w:val="21"/>
+        </w:rPr>
+        <w:t xml:space="preserve">Como se anticipó en el capítulo 1, la práctica aseguradora somete determinadas categorías de bienes del contenido a sublímites cuantitativos específicos, inferiores a la suma asegurada general del contenido. Técnicamente, un sublímite es una cláusula delimitadora del objeto de la cobertura —concreta hasta qué importe responde la aseguradora respecto de una determinada categoría de bienes—, pero su calificación puede mudar a limitativa, e incluso lesiva, cuando se aparta de forma sorpresiva de las expectativas razonables del asegurado sobre el alcance de su cobertura general</w:t>
+      </w:r>
+      <w:r>
+        <w:rPr>
+          <w:rStyle w:val="FootnoteReference"/>
+        </w:rPr>
+        <w:footnoteReference w:id="24"/>
+      </w:r>
+      <w:r>
+        <w:rPr>
+          <w:rFonts w:ascii="Archivo" w:cs="Archivo" w:eastAsia="Archivo" w:hAnsi="Archivo"/>
+          <w:sz w:val="21"/>
+          <w:szCs w:val="21"/>
+        </w:rPr>
+        <w:t xml:space="preserve">, conforme a la metodología de análisis fijada en el capítulo 4.</w:t>
+      </w:r>
+    </w:p>
+    <w:p>
+      <w:pPr>
+        <w:pStyle w:val="Heading2"/>
+        <w:spacing w:after="160" w:before="400"/>
+      </w:pPr>
+      <w:r>
+        <w:rPr>
+          <w:rFonts w:ascii="Fraunces" w:cs="Fraunces" w:eastAsia="Fraunces" w:hAnsi="Fraunces"/>
+          <w:b/>
+          <w:bCs/>
+          <w:color w:val="0A2540"/>
+          <w:sz w:val="24"/>
+          <w:szCs w:val="24"/>
+        </w:rPr>
+        <w:t xml:space="preserve">11.2. Joyas y objetos de valor</w:t>
+      </w:r>
+    </w:p>
+    <w:p>
+      <w:pPr>
+        <w:spacing w:after="180" w:line="300"/>
+        <w:jc w:val="both"/>
+      </w:pPr>
+      <w:r>
+        <w:rPr>
+          <w:rFonts w:ascii="Archivo" w:cs="Archivo" w:eastAsia="Archivo" w:hAnsi="Archivo"/>
+          <w:sz w:val="21"/>
+          <w:szCs w:val="21"/>
+        </w:rPr>
+        <w:t xml:space="preserve">El artículo 46 LCS, estudiado en el capítulo 5, excluye de la cobertura estándar de incendio, «salvo pacto expreso en contrario», los valores mobiliarios, billetes de banco, piedras y metales preciosos y objetos artísticos. La práctica aseguradora traduce esta reserva legal en un sublímite específico para joyas y objetos de valor, normalmente fijado como un porcentaje reducido de la suma asegurada general del contenido, que conviene verificar expresamente en las condiciones particulares. Además del límite cuantitativo, es habitual que estas garantías exijan la acreditación reforzada de la preexistencia (facturas, tasaciones, fotografías) y, en ocasiones, la custodia en caja fuerte como condición de cobertura para determinados umbrales de valor —cláusula cuyo carácter limitativo, si no está debidamente destacada y aceptada conforme al art. 3 LCS, puede ser cuestionado con los mismos argumentos ya expuestos en el capítulo 4.</w:t>
+      </w:r>
+    </w:p>
+    <w:p>
+      <w:pPr>
+        <w:pStyle w:val="Heading2"/>
+        <w:spacing w:after="160" w:before="400"/>
+      </w:pPr>
+      <w:r>
+        <w:rPr>
+          <w:rFonts w:ascii="Fraunces" w:cs="Fraunces" w:eastAsia="Fraunces" w:hAnsi="Fraunces"/>
+          <w:b/>
+          <w:bCs/>
+          <w:color w:val="0A2540"/>
+          <w:sz w:val="24"/>
+          <w:szCs w:val="24"/>
+        </w:rPr>
+        <w:t xml:space="preserve">11.3. Equipos electrónicos, informáticos y de telefonía</w:t>
+      </w:r>
+    </w:p>
+    <w:p>
+      <w:pPr>
+        <w:spacing w:after="180" w:line="300"/>
+        <w:jc w:val="both"/>
+      </w:pPr>
+      <w:r>
+        <w:rPr>
+          <w:rFonts w:ascii="Archivo" w:cs="Archivo" w:eastAsia="Archivo" w:hAnsi="Archivo"/>
+          <w:sz w:val="21"/>
+          <w:szCs w:val="21"/>
+        </w:rPr>
+        <w:t xml:space="preserve">La cobertura de equipos electrónicos plantea una problemática específica derivada de su rápida obsolescencia y depreciación: la distinción, ya analizada en el capítulo 1 a propósito de la STS 2233/2020 (ROJ: STS 2233/2020) sobre prendas de vestir, entre valoración por «valor real» y por «valor de reposición» adquiere aquí especial relevancia económica, dada la disparidad frecuente entre ambos criterios en bienes tecnológicos. El profesional debe verificar con particular atención qué criterio de valoración aplica la póliza a esta categoría de bienes, por ser habitualmente la fuente de mayor discrepancia económica entre la expectativa del asegurado y la oferta de la aseguradora.</w:t>
+      </w:r>
+    </w:p>
+    <w:p>
+      <w:pPr>
+        <w:pStyle w:val="Heading2"/>
+        <w:spacing w:after="160" w:before="400"/>
+      </w:pPr>
+      <w:r>
+        <w:rPr>
+          <w:rFonts w:ascii="Fraunces" w:cs="Fraunces" w:eastAsia="Fraunces" w:hAnsi="Fraunces"/>
+          <w:b/>
+          <w:bCs/>
+          <w:color w:val="0A2540"/>
+          <w:sz w:val="24"/>
+          <w:szCs w:val="24"/>
+        </w:rPr>
+        <w:t xml:space="preserve">11.4. Obras de arte y colecciones</w:t>
+      </w:r>
+    </w:p>
+    <w:p>
+      <w:pPr>
+        <w:spacing w:after="180" w:line="300"/>
+        <w:jc w:val="both"/>
+      </w:pPr>
+      <w:r>
+        <w:rPr>
+          <w:rFonts w:ascii="Archivo" w:cs="Archivo" w:eastAsia="Archivo" w:hAnsi="Archivo"/>
+          <w:sz w:val="21"/>
+          <w:szCs w:val="21"/>
+        </w:rPr>
+        <w:t xml:space="preserve">Las pólizas de hogar de gama alta incorporan, en ocasiones mediante condiciones especiales específicas, coberturas para obras de arte, antigüedades o colecciones, sujetas normalmente a la aportación de una tasación pericial previa a la contratación (declaración de valor) que, a diferencia del régimen general, puede vincular contractualmente a las partes sobre el valor del bien a efectos de la indemnización, atemperando en la práctica la aplicación de la regla proporcional del infraseguro estudiada en el capítulo 15 respecto de estos bienes concretos, siempre que la declaración de valor haya sido expresamente aceptada por la aseguradora.</w:t>
+      </w:r>
+    </w:p>
+    <w:p>
+      <w:pPr>
+        <w:pStyle w:val="Heading2"/>
+        <w:spacing w:after="160" w:before="400"/>
+      </w:pPr>
+      <w:r>
+        <w:rPr>
+          <w:rFonts w:ascii="Fraunces" w:cs="Fraunces" w:eastAsia="Fraunces" w:hAnsi="Fraunces"/>
+          <w:b/>
+          <w:bCs/>
+          <w:color w:val="0A2540"/>
+          <w:sz w:val="24"/>
+          <w:szCs w:val="24"/>
+        </w:rPr>
+        <w:t xml:space="preserve">11.5. El seguro de la comunidad de propietarios y su interacción con la póliza individual</w:t>
+      </w:r>
+    </w:p>
+    <w:p>
+      <w:pPr>
+        <w:spacing w:after="180" w:line="300"/>
+        <w:jc w:val="both"/>
+      </w:pPr>
+      <w:r>
+        <w:rPr>
+          <w:rFonts w:ascii="Archivo" w:cs="Archivo" w:eastAsia="Archivo" w:hAnsi="Archivo"/>
+          <w:sz w:val="21"/>
+          <w:szCs w:val="21"/>
+        </w:rPr>
+        <w:t xml:space="preserve">La Ley de Propiedad Horizontal no impone con carácter general la obligación de asegurar el edificio, pero sí prevé expresamente la posibilidad de que la comunidad, con cargo al fondo de reserva obligatorio, suscriba un contrato de seguro que cubra los daños causados en la finca</w:t>
+      </w:r>
+      <w:r>
+        <w:rPr>
+          <w:rStyle w:val="FootnoteReference"/>
+        </w:rPr>
+        <w:footnoteReference w:id="25"/>
+      </w:r>
+      <w:r>
+        <w:rPr>
+          <w:rFonts w:ascii="Archivo" w:cs="Archivo" w:eastAsia="Archivo" w:hAnsi="Archivo"/>
+          <w:sz w:val="21"/>
+          <w:szCs w:val="21"/>
+        </w:rPr>
+        <w:t xml:space="preserve">:</w:t>
+      </w:r>
+    </w:p>
+    <w:tbl>
+      <w:tblPr>
+        <w:tblW w:type="pct" w:w="100%"/>
+        <w:tblBorders>
+          <w:top w:val="single" w:color="CBD5E1" w:sz="4"/>
+          <w:left w:val="single" w:color="1B6DF0" w:sz="24"/>
+          <w:bottom w:val="single" w:color="CBD5E1" w:sz="4"/>
+          <w:right w:val="single" w:color="CBD5E1" w:sz="4"/>
+          <w:insideH w:val="single" w:color="auto" w:sz="4"/>
+          <w:insideV w:val="single" w:color="auto" w:sz="4"/>
+        </w:tblBorders>
+      </w:tblPr>
+      <w:tblGrid>
+        <w:gridCol w:w="100"/>
+      </w:tblGrid>
+      <w:tr>
+        <w:tc>
+          <w:tcPr>
+            <w:shd w:fill="F4F6F9" w:val="clear"/>
+            <w:tcMar>
+              <w:top w:type="dxa" w:w="160"/>
+              <w:left w:type="dxa" w:w="220"/>
+              <w:bottom w:type="dxa" w:w="160"/>
+              <w:right w:type="dxa" w:w="220"/>
+            </w:tcMar>
+          </w:tcPr>
+          <w:p>
+            <w:pPr>
+              <w:spacing w:after="100"/>
+            </w:pPr>
+            <w:r>
+              <w:rPr>
+                <w:rFonts w:ascii="Archivo" w:cs="Archivo" w:eastAsia="Archivo" w:hAnsi="Archivo"/>
+                <w:b/>
+                <w:bCs/>
+                <w:caps/>
+                <w:color w:val="1B6DF0"/>
+                <w:sz w:val="18"/>
+                <w:szCs w:val="18"/>
+              </w:rPr>
+              <w:t xml:space="preserve">Texto legal · Art. 9.1.f) LPH (extracto)</w:t>
+            </w:r>
+          </w:p>
+          <w:p>
+            <w:pPr>
+              <w:spacing w:after="0" w:line="280"/>
+              <w:jc w:val="both"/>
+            </w:pPr>
+            <w:r>
+              <w:rPr>
+                <w:rFonts w:ascii="IBM Plex Mono" w:cs="IBM Plex Mono" w:eastAsia="IBM Plex Mono" w:hAnsi="IBM Plex Mono"/>
+                <w:i/>
+                <w:iCs/>
+                <w:color w:val="0A2540"/>
+                <w:sz w:val="18"/>
+                <w:szCs w:val="18"/>
+              </w:rPr>
+              <w:t xml:space="preserve">Con cargo al fondo de reserva la comunidad podrá suscribir un contrato de seguro que cubra los daños causados en la finca o bien concluir un contrato de mantenimiento permanente del inmueble y sus instalaciones generales.</w:t>
+            </w:r>
+          </w:p>
+        </w:tc>
+      </w:tr>
+    </w:tbl>
+    <w:p>
+      <w:pPr>
+        <w:spacing w:after="180" w:line="300"/>
+        <w:jc w:val="both"/>
+      </w:pPr>
+      <w:r>
+        <w:rPr>
+          <w:rFonts w:ascii="Archivo" w:cs="Archivo" w:eastAsia="Archivo" w:hAnsi="Archivo"/>
+          <w:sz w:val="21"/>
+          <w:szCs w:val="21"/>
+        </w:rPr>
+        <w:t xml:space="preserve">Cuando existe seguro de comunidad, su interacción con la póliza individual de cada propietario debe analizarse, como se expuso en el capítulo 6 a propósito de la STS 1227/2025 (ROJ: STS 1227/2025), verificando la identidad de riesgo e interés asegurado en cada caso concreto: la propia sentencia distingue expresamente los supuestos de «coberturas concurrentes de elementos privativos de inmuebles en propiedad horizontal» —en los que resulta más fácil apreciar dicha identidad y, por tanto, aplicar la contribución proporcional del art. 32 LCS— de otros supuestos, como el arrendamiento, en los que el interés asegurado por cada póliza puede ser sustancialmente distinto.</w:t>
+      </w:r>
+    </w:p>
+    <w:p>
+      <w:pPr>
+        <w:pStyle w:val="Heading2"/>
+        <w:spacing w:after="160" w:before="400"/>
+      </w:pPr>
+      <w:r>
+        <w:rPr>
+          <w:rFonts w:ascii="Fraunces" w:cs="Fraunces" w:eastAsia="Fraunces" w:hAnsi="Fraunces"/>
+          <w:b/>
+          <w:bCs/>
+          <w:color w:val="0A2540"/>
+          <w:sz w:val="24"/>
+          <w:szCs w:val="24"/>
+        </w:rPr>
+        <w:t xml:space="preserve">11.6. Ficha para el profesional</w:t>
+      </w:r>
+    </w:p>
+    <w:tbl>
+      <w:tblPr>
+        <w:tblW w:type="pct" w:w="100%"/>
+        <w:tblBorders>
+          <w:top w:val="single" w:color="CBD5E1" w:sz="4"/>
+          <w:left w:val="single" w:color="1B6DF0" w:sz="24"/>
+          <w:bottom w:val="single" w:color="CBD5E1" w:sz="4"/>
+          <w:right w:val="single" w:color="CBD5E1" w:sz="4"/>
+          <w:insideH w:val="single" w:color="auto" w:sz="4"/>
+          <w:insideV w:val="single" w:color="auto" w:sz="4"/>
+        </w:tblBorders>
+      </w:tblPr>
+      <w:tblGrid>
+        <w:gridCol w:w="100"/>
+      </w:tblGrid>
+      <w:tr>
+        <w:tc>
+          <w:tcPr>
+            <w:shd w:fill="F4F6F9" w:val="clear"/>
+            <w:tcMar>
+              <w:top w:type="dxa" w:w="160"/>
+              <w:left w:type="dxa" w:w="220"/>
+              <w:bottom w:type="dxa" w:w="160"/>
+              <w:right w:type="dxa" w:w="220"/>
+            </w:tcMar>
+          </w:tcPr>
+          <w:p>
+            <w:pPr>
+              <w:spacing w:after="100"/>
+            </w:pPr>
+            <w:r>
+              <w:rPr>
+                <w:rFonts w:ascii="Archivo" w:cs="Archivo" w:eastAsia="Archivo" w:hAnsi="Archivo"/>
+                <w:b/>
+                <w:bCs/>
+                <w:caps/>
+                <w:color w:val="1B6DF0"/>
+                <w:sz w:val="18"/>
+                <w:szCs w:val="18"/>
+              </w:rPr>
+              <w:t xml:space="preserve">Puntos de control sobre coberturas especiales</w:t>
+            </w:r>
+          </w:p>
+          <w:p>
+            <w:pPr>
+              <w:pStyle w:val="ListParagraph"/>
+              <w:numPr>
+                <w:ilvl w:val="0"/>
+                <w:numId w:val="2"/>
+              </w:numPr>
+              <w:spacing w:after="80" w:line="280"/>
+            </w:pPr>
+            <w:r>
+              <w:rPr>
+                <w:rFonts w:ascii="Archivo" w:cs="Archivo" w:eastAsia="Archivo" w:hAnsi="Archivo"/>
+                <w:sz w:val="19"/>
+                <w:szCs w:val="19"/>
+              </w:rPr>
+              <w:t xml:space="preserve">Verificar la existencia y cuantía de cada sublímite (joyas, dinero, equipos electrónicos, obras de arte) frente a la suma asegurada general del contenido.</w:t>
+            </w:r>
+          </w:p>
+          <w:p>
+            <w:pPr>
+              <w:pStyle w:val="ListParagraph"/>
+              <w:numPr>
+                <w:ilvl w:val="0"/>
+                <w:numId w:val="2"/>
+              </w:numPr>
+              <w:spacing w:after="80" w:line="280"/>
+            </w:pPr>
+            <w:r>
+              <w:rPr>
+                <w:rFonts w:ascii="Archivo" w:cs="Archivo" w:eastAsia="Archivo" w:hAnsi="Archivo"/>
+                <w:sz w:val="19"/>
+                <w:szCs w:val="19"/>
+              </w:rPr>
+              <w:t xml:space="preserve">Aplicar la metodología del capítulo 4 (incorporación, calificación, requisitos formales, interpretación) a cada sublímite controvertido, con particular atención a su carácter sorpresivo.</w:t>
+            </w:r>
+          </w:p>
+          <w:p>
+            <w:pPr>
+              <w:pStyle w:val="ListParagraph"/>
+              <w:numPr>
+                <w:ilvl w:val="0"/>
+                <w:numId w:val="2"/>
+              </w:numPr>
+              <w:spacing w:after="80" w:line="280"/>
+            </w:pPr>
+            <w:r>
+              <w:rPr>
+                <w:rFonts w:ascii="Archivo" w:cs="Archivo" w:eastAsia="Archivo" w:hAnsi="Archivo"/>
+                <w:sz w:val="19"/>
+                <w:szCs w:val="19"/>
+              </w:rPr>
+              <w:t xml:space="preserve">En equipos electrónicos, verificar expresamente el criterio de valoración pactado (valor real o de reposición), invocando en su caso la doctrina de la STS 2233/2020 (ROJ: STS 2233/2020).</w:t>
+            </w:r>
+          </w:p>
+          <w:p>
+            <w:pPr>
+              <w:pStyle w:val="ListParagraph"/>
+              <w:numPr>
+                <w:ilvl w:val="0"/>
+                <w:numId w:val="2"/>
+              </w:numPr>
+              <w:spacing w:after="80" w:line="280"/>
+            </w:pPr>
+            <w:r>
+              <w:rPr>
+                <w:rFonts w:ascii="Archivo" w:cs="Archivo" w:eastAsia="Archivo" w:hAnsi="Archivo"/>
+                <w:sz w:val="19"/>
+                <w:szCs w:val="19"/>
+              </w:rPr>
+              <w:t xml:space="preserve">Ante un siniestro que afecte a elementos comunes y privativos simultáneamente, verificar la existencia de seguro de comunidad y la identidad de riesgo e interés con la póliza individual, conforme a la STS 1227/2025 (ROJ: STS 1227/2025).</w:t>
+            </w:r>
+          </w:p>
+        </w:tc>
+      </w:tr>
+    </w:tbl>
+    <w:p>
+      <w:pPr>
+        <w:pStyle w:val="Heading2"/>
+        <w:spacing w:after="160" w:before="400"/>
+      </w:pPr>
+      <w:r>
+        <w:rPr>
+          <w:rFonts w:ascii="Fraunces" w:cs="Fraunces" w:eastAsia="Fraunces" w:hAnsi="Fraunces"/>
+          <w:b/>
+          <w:bCs/>
+          <w:color w:val="0A2540"/>
+          <w:sz w:val="24"/>
+          <w:szCs w:val="24"/>
+        </w:rPr>
+        <w:t xml:space="preserve">11.7. Ficha para el asegurado</w:t>
+      </w:r>
+    </w:p>
+    <w:tbl>
+      <w:tblPr>
+        <w:tblW w:type="pct" w:w="100%"/>
+        <w:tblBorders>
+          <w:top w:val="single" w:color="CBD5E1" w:sz="4"/>
+          <w:left w:val="single" w:color="8A5A00" w:sz="24"/>
+          <w:bottom w:val="single" w:color="CBD5E1" w:sz="4"/>
+          <w:right w:val="single" w:color="CBD5E1" w:sz="4"/>
+          <w:insideH w:val="single" w:color="auto" w:sz="4"/>
+          <w:insideV w:val="single" w:color="auto" w:sz="4"/>
+        </w:tblBorders>
+      </w:tblPr>
+      <w:tblGrid>
+        <w:gridCol w:w="100"/>
+      </w:tblGrid>
+      <w:tr>
+        <w:tc>
+          <w:tcPr>
+            <w:shd w:fill="F4F6F9" w:val="clear"/>
+            <w:tcMar>
+              <w:top w:type="dxa" w:w="160"/>
+              <w:left w:type="dxa" w:w="220"/>
+              <w:bottom w:type="dxa" w:w="160"/>
+              <w:right w:type="dxa" w:w="220"/>
+            </w:tcMar>
+          </w:tcPr>
+          <w:p>
+            <w:pPr>
+              <w:spacing w:after="100"/>
+            </w:pPr>
+            <w:r>
+              <w:rPr>
+                <w:rFonts w:ascii="Archivo" w:cs="Archivo" w:eastAsia="Archivo" w:hAnsi="Archivo"/>
+                <w:b/>
+                <w:bCs/>
+                <w:caps/>
+                <w:color w:val="8A5A00"/>
+                <w:sz w:val="18"/>
+                <w:szCs w:val="18"/>
+              </w:rPr>
+              <w:t xml:space="preserve">Qué debe revisar sobre sus bienes de especial valor</w:t>
+            </w:r>
+          </w:p>
+          <w:p>
+            <w:pPr>
+              <w:pStyle w:val="ListParagraph"/>
+              <w:numPr>
+                <w:ilvl w:val="0"/>
+                <w:numId w:val="2"/>
+              </w:numPr>
+              <w:spacing w:after="80" w:line="280"/>
+            </w:pPr>
+            <w:r>
+              <w:rPr>
+                <w:rFonts w:ascii="Archivo" w:cs="Archivo" w:eastAsia="Archivo" w:hAnsi="Archivo"/>
+                <w:sz w:val="19"/>
+                <w:szCs w:val="19"/>
+              </w:rPr>
+              <w:t xml:space="preserve">Si posee joyas, dinero en efectivo u objetos de valor por encima del sublímite estándar de su póliza, valore contratar una ampliación específica de esta garantía.</w:t>
+            </w:r>
+          </w:p>
+          <w:p>
+            <w:pPr>
+              <w:pStyle w:val="ListParagraph"/>
+              <w:numPr>
+                <w:ilvl w:val="0"/>
+                <w:numId w:val="2"/>
+              </w:numPr>
+              <w:spacing w:after="80" w:line="280"/>
+            </w:pPr>
+            <w:r>
+              <w:rPr>
+                <w:rFonts w:ascii="Archivo" w:cs="Archivo" w:eastAsia="Archivo" w:hAnsi="Archivo"/>
+                <w:sz w:val="19"/>
+                <w:szCs w:val="19"/>
+              </w:rPr>
+              <w:t xml:space="preserve">Conserve facturas, tasaciones y fotografías de sus bienes de mayor valor: son la prueba más eficaz en caso de siniestro.</w:t>
+            </w:r>
+          </w:p>
+          <w:p>
+            <w:pPr>
+              <w:pStyle w:val="ListParagraph"/>
+              <w:numPr>
+                <w:ilvl w:val="0"/>
+                <w:numId w:val="2"/>
+              </w:numPr>
+              <w:spacing w:after="80" w:line="280"/>
+            </w:pPr>
+            <w:r>
+              <w:rPr>
+                <w:rFonts w:ascii="Archivo" w:cs="Archivo" w:eastAsia="Archivo" w:hAnsi="Archivo"/>
+                <w:sz w:val="19"/>
+                <w:szCs w:val="19"/>
+              </w:rPr>
+              <w:t xml:space="preserve">Pregunte a su aseguradora si su comunidad de propietarios tiene contratado un seguro propio y qué cubre exactamente, para evitar solapamientos o lagunas de cobertura.</w:t>
+            </w:r>
+          </w:p>
+        </w:tc>
+      </w:tr>
+    </w:tbl>
+    <w:p>
+      <w:pPr>
+        <w:pStyle w:val="Heading2"/>
+        <w:spacing w:after="160" w:before="400"/>
+      </w:pPr>
+      <w:r>
+        <w:rPr>
+          <w:rFonts w:ascii="Fraunces" w:cs="Fraunces" w:eastAsia="Fraunces" w:hAnsi="Fraunces"/>
+          <w:b/>
+          <w:bCs/>
+          <w:color w:val="0A2540"/>
+          <w:sz w:val="24"/>
+          <w:szCs w:val="24"/>
+        </w:rPr>
+        <w:t xml:space="preserve">11.8. Checklist: revisión de sublímites y coberturas especiales</w:t>
+      </w:r>
+    </w:p>
+    <w:p>
+      <w:pPr>
+        <w:pStyle w:val="ListParagraph"/>
+        <w:numPr>
+          <w:ilvl w:val="0"/>
+          <w:numId w:val="2"/>
+        </w:numPr>
+        <w:spacing w:after="100" w:line="290"/>
+      </w:pPr>
+      <w:r>
+        <w:rPr>
+          <w:rFonts w:ascii="Archivo" w:cs="Archivo" w:eastAsia="Archivo" w:hAnsi="Archivo"/>
+          <w:sz w:val="21"/>
+          <w:szCs w:val="21"/>
+        </w:rPr>
+        <w:t xml:space="preserve">1. ¿Qué sublímite tiene pactado para joyas y objetos de valor, y es suficiente para los bienes que realmente posee?</w:t>
+      </w:r>
+    </w:p>
+    <w:p>
+      <w:pPr>
+        <w:pStyle w:val="ListParagraph"/>
+        <w:numPr>
+          <w:ilvl w:val="0"/>
+          <w:numId w:val="2"/>
+        </w:numPr>
+        <w:spacing w:after="100" w:line="290"/>
+      </w:pPr>
+      <w:r>
+        <w:rPr>
+          <w:rFonts w:ascii="Archivo" w:cs="Archivo" w:eastAsia="Archivo" w:hAnsi="Archivo"/>
+          <w:sz w:val="21"/>
+          <w:szCs w:val="21"/>
+        </w:rPr>
+        <w:t xml:space="preserve">2. ¿Qué sublímite tiene para dinero en efectivo dentro y fuera de la vivienda?</w:t>
+      </w:r>
+    </w:p>
+    <w:p>
+      <w:pPr>
+        <w:pStyle w:val="ListParagraph"/>
+        <w:numPr>
+          <w:ilvl w:val="0"/>
+          <w:numId w:val="2"/>
+        </w:numPr>
+        <w:spacing w:after="100" w:line="290"/>
+      </w:pPr>
+      <w:r>
+        <w:rPr>
+          <w:rFonts w:ascii="Archivo" w:cs="Archivo" w:eastAsia="Archivo" w:hAnsi="Archivo"/>
+          <w:sz w:val="21"/>
+          <w:szCs w:val="21"/>
+        </w:rPr>
+        <w:t xml:space="preserve">3. ¿Qué criterio de valoración aplica a los equipos electrónicos (valor real o de reposición)?</w:t>
+      </w:r>
+    </w:p>
+    <w:p>
+      <w:pPr>
+        <w:pStyle w:val="ListParagraph"/>
+        <w:numPr>
+          <w:ilvl w:val="0"/>
+          <w:numId w:val="2"/>
+        </w:numPr>
+        <w:spacing w:after="100" w:line="290"/>
+      </w:pPr>
+      <w:r>
+        <w:rPr>
+          <w:rFonts w:ascii="Archivo" w:cs="Archivo" w:eastAsia="Archivo" w:hAnsi="Archivo"/>
+          <w:sz w:val="21"/>
+          <w:szCs w:val="21"/>
+        </w:rPr>
+        <w:t xml:space="preserve">4. ¿Existe cobertura específica para obras de arte o colecciones, con declaración de valor aceptada por la aseguradora?</w:t>
+      </w:r>
+    </w:p>
+    <w:p>
+      <w:pPr>
+        <w:pStyle w:val="ListParagraph"/>
+        <w:numPr>
+          <w:ilvl w:val="0"/>
+          <w:numId w:val="2"/>
+        </w:numPr>
+        <w:spacing w:after="100" w:line="290"/>
+      </w:pPr>
+      <w:r>
+        <w:rPr>
+          <w:rFonts w:ascii="Archivo" w:cs="Archivo" w:eastAsia="Archivo" w:hAnsi="Archivo"/>
+          <w:sz w:val="21"/>
+          <w:szCs w:val="21"/>
+        </w:rPr>
+        <w:t xml:space="preserve">5. ¿Existe seguro de la comunidad de propietarios? ¿Qué elementos cubre?</w:t>
+      </w:r>
+    </w:p>
+    <w:p>
+      <w:pPr>
+        <w:pStyle w:val="ListParagraph"/>
+        <w:numPr>
+          <w:ilvl w:val="0"/>
+          <w:numId w:val="2"/>
+        </w:numPr>
+        <w:spacing w:after="100" w:line="290"/>
+      </w:pPr>
+      <w:r>
+        <w:rPr>
+          <w:rFonts w:ascii="Archivo" w:cs="Archivo" w:eastAsia="Archivo" w:hAnsi="Archivo"/>
+          <w:sz w:val="21"/>
+          <w:szCs w:val="21"/>
+        </w:rPr>
+        <w:t xml:space="preserve">6. ¿Podría existir concurrencia entre la póliza individual y la de la comunidad respecto de algún elemento?</w:t>
+      </w:r>
+    </w:p>
+    <w:p>
+      <w:pPr>
+        <w:pStyle w:val="Heading2"/>
+        <w:spacing w:after="160" w:before="400"/>
+      </w:pPr>
+      <w:r>
+        <w:rPr>
+          <w:rFonts w:ascii="Fraunces" w:cs="Fraunces" w:eastAsia="Fraunces" w:hAnsi="Fraunces"/>
+          <w:b/>
+          <w:bCs/>
+          <w:color w:val="0A2540"/>
+          <w:sz w:val="24"/>
+          <w:szCs w:val="24"/>
+        </w:rPr>
+        <w:t xml:space="preserve">Bibliografía citada</w:t>
+      </w:r>
+    </w:p>
+    <w:p>
+      <w:pPr>
+        <w:spacing w:after="180" w:line="300"/>
+        <w:jc w:val="both"/>
+      </w:pPr>
+      <w:r>
+        <w:rPr>
+          <w:rFonts w:ascii="Archivo" w:cs="Archivo" w:eastAsia="Archivo" w:hAnsi="Archivo"/>
+          <w:sz w:val="21"/>
+          <w:szCs w:val="21"/>
+        </w:rPr>
+        <w:t xml:space="preserve">BATALLER GRAU, J.; BOQUERA MATARREDONA, J.; OLAVARRÍA IGLESIA, J. (coords.), Comentarios a la Ley de Contrato de Seguro, Tirant lo Blanch, Valencia.</w:t>
+      </w:r>
+    </w:p>
+    <w:p>
+      <w:pPr>
+        <w:spacing w:after="180" w:line="300"/>
+        <w:jc w:val="both"/>
+      </w:pPr>
+      <w:r>
+        <w:rPr>
+          <w:rFonts w:ascii="Archivo" w:cs="Archivo" w:eastAsia="Archivo" w:hAnsi="Archivo"/>
+          <w:sz w:val="21"/>
+          <w:szCs w:val="21"/>
+        </w:rPr>
+        <w:t xml:space="preserve">VEIGA COPO, A. B., Condiciones generales y particulares en el contrato de seguro, Civitas-Thomson Reuters, Cizur Menor.</w:t>
+      </w:r>
+    </w:p>
+    <w:p>
+      <w:pPr>
+        <w:pStyle w:val="Heading1"/>
+        <w:pageBreakBefore/>
+        <w:spacing w:after="300" w:before="200"/>
+      </w:pPr>
+      <w:r>
+        <w:rPr>
+          <w:rFonts w:ascii="Archivo" w:cs="Archivo" w:eastAsia="Archivo" w:hAnsi="Archivo"/>
+          <w:b/>
+          <w:bCs/>
+          <w:color w:val="1B6DF0"/>
+          <w:sz w:val="22"/>
+          <w:szCs w:val="22"/>
+        </w:rPr>
+        <w:t xml:space="preserve">Capítulo 12. </w:t>
+      </w:r>
+      <w:r>
+        <w:rPr>
+          <w:rFonts w:ascii="Fraunces" w:cs="Fraunces" w:eastAsia="Fraunces" w:hAnsi="Fraunces"/>
+          <w:b/>
+          <w:bCs/>
+          <w:color w:val="0A2540"/>
+          <w:sz w:val="30"/>
+          <w:szCs w:val="30"/>
+        </w:rPr>
+        <w:t xml:space="preserve">Exclusiones generales y particulares</w:t>
+      </w:r>
+    </w:p>
+    <w:tbl>
+      <w:tblPr>
+        <w:tblW w:type="pct" w:w="100%"/>
+        <w:tblBorders>
+          <w:top w:val="single" w:color="CBD5E1" w:sz="4"/>
+          <w:left w:val="single" w:color="1B6DF0" w:sz="24"/>
+          <w:bottom w:val="single" w:color="CBD5E1" w:sz="4"/>
+          <w:right w:val="single" w:color="CBD5E1" w:sz="4"/>
+          <w:insideH w:val="single" w:color="auto" w:sz="4"/>
+          <w:insideV w:val="single" w:color="auto" w:sz="4"/>
+        </w:tblBorders>
+      </w:tblPr>
+      <w:tblGrid>
+        <w:gridCol w:w="100"/>
+      </w:tblGrid>
+      <w:tr>
+        <w:tc>
+          <w:tcPr>
+            <w:shd w:fill="F4F6F9" w:val="clear"/>
+            <w:tcMar>
+              <w:top w:type="dxa" w:w="160"/>
+              <w:left w:type="dxa" w:w="220"/>
+              <w:bottom w:type="dxa" w:w="160"/>
+              <w:right w:type="dxa" w:w="220"/>
+            </w:tcMar>
+          </w:tcPr>
+          <w:p>
+            <w:pPr>
+              <w:spacing w:after="100"/>
+            </w:pPr>
+            <w:r>
+              <w:rPr>
+                <w:rFonts w:ascii="Archivo" w:cs="Archivo" w:eastAsia="Archivo" w:hAnsi="Archivo"/>
+                <w:b/>
+                <w:bCs/>
+                <w:caps/>
+                <w:color w:val="1B6DF0"/>
+                <w:sz w:val="18"/>
+                <w:szCs w:val="18"/>
+              </w:rPr>
+              <w:t xml:space="preserve">Sumario</w:t>
+            </w:r>
+          </w:p>
+          <w:p>
+            <w:pPr>
+              <w:spacing w:after="40" w:line="260"/>
+            </w:pPr>
+            <w:r>
+              <w:rPr>
+                <w:rFonts w:ascii="Archivo" w:cs="Archivo" w:eastAsia="Archivo" w:hAnsi="Archivo"/>
+                <w:sz w:val="18"/>
+                <w:szCs w:val="18"/>
+              </w:rPr>
+              <w:t xml:space="preserve">12.1. Sistemática de las exclusiones en el seguro de hogar</w:t>
+            </w:r>
+          </w:p>
+          <w:p>
+            <w:pPr>
+              <w:spacing w:after="40" w:line="260"/>
+            </w:pPr>
+            <w:r>
+              <w:rPr>
+                <w:rFonts w:ascii="Archivo" w:cs="Archivo" w:eastAsia="Archivo" w:hAnsi="Archivo"/>
+                <w:sz w:val="18"/>
+                <w:szCs w:val="18"/>
+              </w:rPr>
+              <w:t xml:space="preserve">12.2. Exclusiones legales de orden público: dolo y mala fe (art. 19 LCS)</w:t>
+            </w:r>
+          </w:p>
+          <w:p>
+            <w:pPr>
+              <w:spacing w:after="40" w:line="260"/>
+            </w:pPr>
+            <w:r>
+              <w:rPr>
+                <w:rFonts w:ascii="Archivo" w:cs="Archivo" w:eastAsia="Archivo" w:hAnsi="Archivo"/>
+                <w:sz w:val="18"/>
+                <w:szCs w:val="18"/>
+              </w:rPr>
+              <w:t xml:space="preserve">12.3. Exclusiones típicas de riesgos catastróficos y bélicos</w:t>
+            </w:r>
+          </w:p>
+          <w:p>
+            <w:pPr>
+              <w:spacing w:after="40" w:line="260"/>
+            </w:pPr>
+            <w:r>
+              <w:rPr>
+                <w:rFonts w:ascii="Archivo" w:cs="Archivo" w:eastAsia="Archivo" w:hAnsi="Archivo"/>
+                <w:sz w:val="18"/>
+                <w:szCs w:val="18"/>
+              </w:rPr>
+              <w:t xml:space="preserve">12.4. Exclusiones por vicio propio, desgaste y falta de mantenimiento</w:t>
+            </w:r>
+          </w:p>
+          <w:p>
+            <w:pPr>
+              <w:spacing w:after="40" w:line="260"/>
+            </w:pPr>
+            <w:r>
+              <w:rPr>
+                <w:rFonts w:ascii="Archivo" w:cs="Archivo" w:eastAsia="Archivo" w:hAnsi="Archivo"/>
+                <w:sz w:val="18"/>
+                <w:szCs w:val="18"/>
+              </w:rPr>
+              <w:t xml:space="preserve">12.5. Exclusiones por desocupación prolongada de la vivienda</w:t>
+            </w:r>
+          </w:p>
+          <w:p>
+            <w:pPr>
+              <w:spacing w:after="40" w:line="260"/>
+            </w:pPr>
+            <w:r>
+              <w:rPr>
+                <w:rFonts w:ascii="Archivo" w:cs="Archivo" w:eastAsia="Archivo" w:hAnsi="Archivo"/>
+                <w:sz w:val="18"/>
+                <w:szCs w:val="18"/>
+              </w:rPr>
+              <w:t xml:space="preserve">12.6. El control de las exclusiones conforme al art. 3 LCS: síntesis metodológica</w:t>
+            </w:r>
+          </w:p>
+          <w:p>
+            <w:pPr>
+              <w:spacing w:after="40" w:line="260"/>
+            </w:pPr>
+            <w:r>
+              <w:rPr>
+                <w:rFonts w:ascii="Archivo" w:cs="Archivo" w:eastAsia="Archivo" w:hAnsi="Archivo"/>
+                <w:sz w:val="18"/>
+                <w:szCs w:val="18"/>
+              </w:rPr>
+              <w:t xml:space="preserve">12.7. Ficha para el profesional</w:t>
+            </w:r>
+          </w:p>
+          <w:p>
+            <w:pPr>
+              <w:spacing w:after="40" w:line="260"/>
+            </w:pPr>
+            <w:r>
+              <w:rPr>
+                <w:rFonts w:ascii="Archivo" w:cs="Archivo" w:eastAsia="Archivo" w:hAnsi="Archivo"/>
+                <w:sz w:val="18"/>
+                <w:szCs w:val="18"/>
+              </w:rPr>
+              <w:t xml:space="preserve">12.8. Ficha para el asegurado</w:t>
+            </w:r>
+          </w:p>
+          <w:p>
+            <w:pPr>
+              <w:spacing w:after="40" w:line="260"/>
+            </w:pPr>
+            <w:r>
+              <w:rPr>
+                <w:rFonts w:ascii="Archivo" w:cs="Archivo" w:eastAsia="Archivo" w:hAnsi="Archivo"/>
+                <w:sz w:val="18"/>
+                <w:szCs w:val="18"/>
+              </w:rPr>
+              <w:t xml:space="preserve">12.9. Checklist: análisis de una exclusión invocada por la aseguradora</w:t>
+            </w:r>
+          </w:p>
+        </w:tc>
+      </w:tr>
+    </w:tbl>
+    <w:p>
+      <w:pPr>
+        <w:spacing w:after="160"/>
+      </w:pPr>
+    </w:p>
+    <w:tbl>
+      <w:tblPr>
+        <w:tblW w:type="pct" w:w="100%"/>
+        <w:tblBorders>
+          <w:top w:val="single" w:color="CBD5E1" w:sz="4"/>
+          <w:left w:val="single" w:color="6B7A8F" w:sz="24"/>
+          <w:bottom w:val="single" w:color="CBD5E1" w:sz="4"/>
+          <w:right w:val="single" w:color="CBD5E1" w:sz="4"/>
+          <w:insideH w:val="single" w:color="auto" w:sz="4"/>
+          <w:insideV w:val="single" w:color="auto" w:sz="4"/>
+        </w:tblBorders>
+      </w:tblPr>
+      <w:tblGrid>
+        <w:gridCol w:w="100"/>
+      </w:tblGrid>
+      <w:tr>
+        <w:tc>
+          <w:tcPr>
+            <w:shd w:fill="F4F6F9" w:val="clear"/>
+            <w:tcMar>
+              <w:top w:type="dxa" w:w="160"/>
+              <w:left w:type="dxa" w:w="220"/>
+              <w:bottom w:type="dxa" w:w="160"/>
+              <w:right w:type="dxa" w:w="220"/>
+            </w:tcMar>
+          </w:tcPr>
+          <w:p>
+            <w:pPr>
+              <w:spacing w:after="100"/>
+            </w:pPr>
+            <w:r>
+              <w:rPr>
+                <w:rFonts w:ascii="Archivo" w:cs="Archivo" w:eastAsia="Archivo" w:hAnsi="Archivo"/>
+                <w:b/>
+                <w:bCs/>
+                <w:caps/>
+                <w:color w:val="6B7A8F"/>
+                <w:sz w:val="18"/>
+                <w:szCs w:val="18"/>
+              </w:rPr>
+              <w:t xml:space="preserve">Resumen · Abstract</w:t>
+            </w:r>
+          </w:p>
+          <w:p>
+            <w:pPr>
+              <w:spacing w:after="100"/>
+              <w:jc w:val="both"/>
+            </w:pPr>
+            <w:r>
+              <w:rPr>
+                <w:rFonts w:ascii="Archivo" w:cs="Archivo" w:eastAsia="Archivo" w:hAnsi="Archivo"/>
+                <w:i/>
+                <w:iCs/>
+                <w:sz w:val="18"/>
+                <w:szCs w:val="18"/>
+              </w:rPr>
+              <w:t xml:space="preserve">El capítulo cierra la Parte II sistematizando el régimen de exclusiones del seguro de hogar, distinguiendo las exclusiones legales de orden público —inderogables por pacto— de las exclusiones convencionales, sujetas al régimen general de control del art. 3 LCS ya desarrollado en los capítulos 1 y 4. Se examinan las categorías de exclusión más frecuentes en la práctica: dolo y mala fe, riesgos catastróficos y bélicos, vicio propio y falta de mantenimiento, y desocupación prolongada de la vivienda.</w:t>
+            </w:r>
+          </w:p>
+          <w:p>
+            <w:pPr>
+              <w:spacing w:after="160"/>
+            </w:pPr>
+            <w:r>
+              <w:rPr>
+                <w:rFonts w:ascii="Archivo" w:cs="Archivo" w:eastAsia="Archivo" w:hAnsi="Archivo"/>
+                <w:b/>
+                <w:bCs/>
+                <w:sz w:val="17"/>
+                <w:szCs w:val="17"/>
+              </w:rPr>
+              <w:t xml:space="preserve">Palabras clave: exclusiones, art. 19 LCS, orden público, vicio propio, desocupación de la vivienda.</w:t>
+            </w:r>
+          </w:p>
+          <w:p>
+            <w:pPr>
+              <w:spacing w:after="100"/>
+              <w:jc w:val="both"/>
+            </w:pPr>
+            <w:r>
+              <w:rPr>
+                <w:rFonts w:ascii="Archivo" w:cs="Archivo" w:eastAsia="Archivo" w:hAnsi="Archivo"/>
+                <w:i/>
+                <w:iCs/>
+                <w:sz w:val="18"/>
+                <w:szCs w:val="18"/>
+              </w:rPr>
+              <w:t xml:space="preserve">This closing chapter of Part II systematises the exclusions applicable to homeowners' insurance, distinguishing mandatory statutory exclusions from contractual exclusions subject to the general control regime of Article 3 already developed in Chapters 1 and 4. It examines the most frequent exclusion categories in practice: wilful misconduct and bad faith, catastrophic and war risks, inherent defect and lack of maintenance, and prolonged vacancy of the dwelling.</w:t>
+            </w:r>
+          </w:p>
+          <w:p>
+            <w:pPr>
+              <w:spacing w:after="0"/>
+            </w:pPr>
+            <w:r>
+              <w:rPr>
+                <w:rFonts w:ascii="Archivo" w:cs="Archivo" w:eastAsia="Archivo" w:hAnsi="Archivo"/>
+                <w:b/>
+                <w:bCs/>
+                <w:sz w:val="17"/>
+                <w:szCs w:val="17"/>
+              </w:rPr>
+              <w:t xml:space="preserve">Keywords: policy exclusions, public order, inherent vice, prolonged vacancy.</w:t>
+            </w:r>
+          </w:p>
+        </w:tc>
+      </w:tr>
+    </w:tbl>
+    <w:p>
+      <w:pPr>
+        <w:spacing w:after="200"/>
+      </w:pPr>
+    </w:p>
+    <w:p>
+      <w:pPr>
+        <w:pStyle w:val="Heading2"/>
+        <w:spacing w:after="160" w:before="400"/>
+      </w:pPr>
+      <w:r>
+        <w:rPr>
+          <w:rFonts w:ascii="Fraunces" w:cs="Fraunces" w:eastAsia="Fraunces" w:hAnsi="Fraunces"/>
+          <w:b/>
+          <w:bCs/>
+          <w:color w:val="0A2540"/>
+          <w:sz w:val="24"/>
+          <w:szCs w:val="24"/>
+        </w:rPr>
+        <w:t xml:space="preserve">12.1. Sistemática de las exclusiones en el seguro de hogar</w:t>
+      </w:r>
+    </w:p>
+    <w:p>
+      <w:pPr>
+        <w:spacing w:after="180" w:line="300"/>
+        <w:jc w:val="both"/>
+      </w:pPr>
+      <w:r>
+        <w:rPr>
+          <w:rFonts w:ascii="Archivo" w:cs="Archivo" w:eastAsia="Archivo" w:hAnsi="Archivo"/>
+          <w:sz w:val="21"/>
+          <w:szCs w:val="21"/>
+        </w:rPr>
+        <w:t xml:space="preserve">Toda póliza de hogar combina dos tipos de exclusiones de naturaleza jurídica muy distinta, cuya confusión es fuente frecuente de error en la práctica profesional</w:t>
+      </w:r>
+      <w:r>
+        <w:rPr>
+          <w:rStyle w:val="FootnoteReference"/>
+        </w:rPr>
+        <w:footnoteReference w:id="26"/>
+      </w:r>
+      <w:r>
+        <w:rPr>
+          <w:rFonts w:ascii="Archivo" w:cs="Archivo" w:eastAsia="Archivo" w:hAnsi="Archivo"/>
+          <w:sz w:val="21"/>
+          <w:szCs w:val="21"/>
+        </w:rPr>
+        <w:t xml:space="preserve">:</w:t>
+      </w:r>
+    </w:p>
+    <w:p>
+      <w:pPr>
+        <w:pStyle w:val="ListParagraph"/>
+        <w:numPr>
+          <w:ilvl w:val="0"/>
+          <w:numId w:val="2"/>
+        </w:numPr>
+        <w:spacing w:after="100" w:line="290"/>
+      </w:pPr>
+      <w:r>
+        <w:rPr>
+          <w:rFonts w:ascii="Archivo" w:cs="Archivo" w:eastAsia="Archivo" w:hAnsi="Archivo"/>
+          <w:b/>
+          <w:bCs/>
+          <w:sz w:val="21"/>
+          <w:szCs w:val="21"/>
+        </w:rPr>
+        <w:t xml:space="preserve">Exclusiones legales de orden público: </w:t>
+      </w:r>
+      <w:r>
+        <w:rPr>
+          <w:rFonts w:ascii="Archivo" w:cs="Archivo" w:eastAsia="Archivo" w:hAnsi="Archivo"/>
+          <w:sz w:val="21"/>
+          <w:szCs w:val="21"/>
+        </w:rPr>
+        <w:t xml:space="preserve">derivan directamente de la LCS (arts. 19 y 48, entre otros) y no pueden ser alteradas por pacto en perjuicio del asegurado; su fundamento no es contractual sino de orden público asegurador.</w:t>
+      </w:r>
+    </w:p>
+    <w:p>
+      <w:pPr>
+        <w:pStyle w:val="ListParagraph"/>
+        <w:numPr>
+          <w:ilvl w:val="0"/>
+          <w:numId w:val="2"/>
+        </w:numPr>
+        <w:spacing w:after="100" w:line="290"/>
+      </w:pPr>
+      <w:r>
+        <w:rPr>
+          <w:rFonts w:ascii="Archivo" w:cs="Archivo" w:eastAsia="Archivo" w:hAnsi="Archivo"/>
+          <w:b/>
+          <w:bCs/>
+          <w:sz w:val="21"/>
+          <w:szCs w:val="21"/>
+        </w:rPr>
+        <w:t xml:space="preserve">Exclusiones convencionales: </w:t>
+      </w:r>
+      <w:r>
+        <w:rPr>
+          <w:rFonts w:ascii="Archivo" w:cs="Archivo" w:eastAsia="Archivo" w:hAnsi="Archivo"/>
+          <w:sz w:val="21"/>
+          <w:szCs w:val="21"/>
+        </w:rPr>
+        <w:t xml:space="preserve">son fruto de la libertad de pactos de las partes dentro de los límites de la LCS, y quedan sometidas íntegramente al régimen de control de incorporación, calificación e interpretación estudiado en los capítulos 1 y 4 (arts. 3 LCS, 5 y 7 LCGC, 1288 CC).</w:t>
+      </w:r>
+    </w:p>
+    <w:p>
+      <w:pPr>
+        <w:pStyle w:val="Heading2"/>
+        <w:spacing w:after="160" w:before="400"/>
+      </w:pPr>
+      <w:r>
+        <w:rPr>
+          <w:rFonts w:ascii="Fraunces" w:cs="Fraunces" w:eastAsia="Fraunces" w:hAnsi="Fraunces"/>
+          <w:b/>
+          <w:bCs/>
+          <w:color w:val="0A2540"/>
+          <w:sz w:val="24"/>
+          <w:szCs w:val="24"/>
+        </w:rPr>
+        <w:t xml:space="preserve">12.2. Exclusiones legales de orden público: dolo y mala fe</w:t>
+      </w:r>
+    </w:p>
+    <w:p>
+      <w:pPr>
+        <w:spacing w:after="180" w:line="300"/>
+        <w:jc w:val="both"/>
+      </w:pPr>
+      <w:r>
+        <w:rPr>
+          <w:rFonts w:ascii="Archivo" w:cs="Archivo" w:eastAsia="Archivo" w:hAnsi="Archivo"/>
+          <w:sz w:val="21"/>
+          <w:szCs w:val="21"/>
+        </w:rPr>
+        <w:t xml:space="preserve">La exclusión legal por excelencia en el seguro de daños es la del artículo 19 LCS, ya estudiada en su proyección general en el capítulo 1 y que se desarrolla con detalle en el capítulo 17 de esta obra:</w:t>
+      </w:r>
+    </w:p>
+    <w:tbl>
+      <w:tblPr>
+        <w:tblW w:type="pct" w:w="100%"/>
+        <w:tblBorders>
+          <w:top w:val="single" w:color="CBD5E1" w:sz="4"/>
+          <w:left w:val="single" w:color="1B6DF0" w:sz="24"/>
+          <w:bottom w:val="single" w:color="CBD5E1" w:sz="4"/>
+          <w:right w:val="single" w:color="CBD5E1" w:sz="4"/>
+          <w:insideH w:val="single" w:color="auto" w:sz="4"/>
+          <w:insideV w:val="single" w:color="auto" w:sz="4"/>
+        </w:tblBorders>
+      </w:tblPr>
+      <w:tblGrid>
+        <w:gridCol w:w="100"/>
+      </w:tblGrid>
+      <w:tr>
+        <w:tc>
+          <w:tcPr>
+            <w:shd w:fill="F4F6F9" w:val="clear"/>
+            <w:tcMar>
+              <w:top w:type="dxa" w:w="160"/>
+              <w:left w:type="dxa" w:w="220"/>
+              <w:bottom w:type="dxa" w:w="160"/>
+              <w:right w:type="dxa" w:w="220"/>
+            </w:tcMar>
+          </w:tcPr>
+          <w:p>
+            <w:pPr>
+              <w:spacing w:after="100"/>
+            </w:pPr>
+            <w:r>
+              <w:rPr>
+                <w:rFonts w:ascii="Archivo" w:cs="Archivo" w:eastAsia="Archivo" w:hAnsi="Archivo"/>
+                <w:b/>
+                <w:bCs/>
+                <w:caps/>
+                <w:color w:val="1B6DF0"/>
+                <w:sz w:val="18"/>
+                <w:szCs w:val="18"/>
+              </w:rPr>
+              <w:t xml:space="preserve">Texto legal · Art. 19 LCS</w:t>
+            </w:r>
+          </w:p>
+          <w:p>
+            <w:pPr>
+              <w:spacing w:after="0" w:line="280"/>
+              <w:jc w:val="both"/>
+            </w:pPr>
+            <w:r>
+              <w:rPr>
+                <w:rFonts w:ascii="IBM Plex Mono" w:cs="IBM Plex Mono" w:eastAsia="IBM Plex Mono" w:hAnsi="IBM Plex Mono"/>
+                <w:i/>
+                <w:iCs/>
+                <w:color w:val="0A2540"/>
+                <w:sz w:val="18"/>
+                <w:szCs w:val="18"/>
+              </w:rPr>
+              <w:t xml:space="preserve">El asegurador estará obligado al pago de la prestación, salvo en el supuesto de que el siniestro haya sido causado por mala fe del asegurado.</w:t>
+            </w:r>
+          </w:p>
+        </w:tc>
+      </w:tr>
+    </w:tbl>
+    <w:p>
+      <w:pPr>
+        <w:spacing w:after="180" w:line="300"/>
+        <w:jc w:val="both"/>
+      </w:pPr>
+      <w:r>
+        <w:rPr>
+          <w:rFonts w:ascii="Archivo" w:cs="Archivo" w:eastAsia="Archivo" w:hAnsi="Archivo"/>
+          <w:sz w:val="21"/>
+          <w:szCs w:val="21"/>
+        </w:rPr>
+        <w:t xml:space="preserve">Esta exclusión, a diferencia de las convencionales, no necesita figurar destacada en la póliza para desplegar sus efectos: opera ope legis como límite estructural de la propia institución aseguradora, pues un seguro que cubriera el siniestro provocado de mala fe por el propio asegurado dejaría de cumplir su función de traslación de un riesgo incierto y ajeno a la voluntad del asegurado.</w:t>
+      </w:r>
+    </w:p>
+    <w:p>
+      <w:pPr>
+        <w:pStyle w:val="Heading2"/>
+        <w:spacing w:after="160" w:before="400"/>
+      </w:pPr>
+      <w:r>
+        <w:rPr>
+          <w:rFonts w:ascii="Fraunces" w:cs="Fraunces" w:eastAsia="Fraunces" w:hAnsi="Fraunces"/>
+          <w:b/>
+          <w:bCs/>
+          <w:color w:val="0A2540"/>
+          <w:sz w:val="24"/>
+          <w:szCs w:val="24"/>
+        </w:rPr>
+        <w:t xml:space="preserve">12.3. Exclusiones típicas de riesgos catastróficos y bélicos</w:t>
+      </w:r>
+    </w:p>
+    <w:p>
+      <w:pPr>
+        <w:spacing w:after="180" w:line="300"/>
+        <w:jc w:val="both"/>
+      </w:pPr>
+      <w:r>
+        <w:rPr>
+          <w:rFonts w:ascii="Archivo" w:cs="Archivo" w:eastAsia="Archivo" w:hAnsi="Archivo"/>
+          <w:sz w:val="21"/>
+          <w:szCs w:val="21"/>
+        </w:rPr>
+        <w:t xml:space="preserve">Las condiciones generales de las pólizas de hogar excluyen de forma prácticamente universal los daños derivados de conflictos armados, energía nuclear y, como se estudió en el capítulo 8, los acontecimientos calificados como «extraordinarios» conforme al RDL 7/2004, cuya cobertura corresponde al Consorcio de Compensación de Seguros y no a la aseguradora privada. Estas exclusiones, aunque formuladas contractualmente, responden a una lógica de distribución legal de riesgos entre el mercado privado y el sistema público de compensación, por lo que su control de incorporación e interpretación, sin dejar de aplicarse, opera con menor intensidad que respecto de exclusiones puramente convencionales sin ese correlato en la distribución legal de riesgos.</w:t>
+      </w:r>
+    </w:p>
+    <w:p>
+      <w:pPr>
+        <w:pStyle w:val="Heading2"/>
+        <w:spacing w:after="160" w:before="400"/>
+      </w:pPr>
+      <w:r>
+        <w:rPr>
+          <w:rFonts w:ascii="Fraunces" w:cs="Fraunces" w:eastAsia="Fraunces" w:hAnsi="Fraunces"/>
+          <w:b/>
+          <w:bCs/>
+          <w:color w:val="0A2540"/>
+          <w:sz w:val="24"/>
+          <w:szCs w:val="24"/>
+        </w:rPr>
+        <w:t xml:space="preserve">12.4. Exclusiones por vicio propio, desgaste y falta de mantenimiento</w:t>
+      </w:r>
+    </w:p>
+    <w:p>
+      <w:pPr>
+        <w:spacing w:after="180" w:line="300"/>
+        <w:jc w:val="both"/>
+      </w:pPr>
+      <w:r>
+        <w:rPr>
+          <w:rFonts w:ascii="Archivo" w:cs="Archivo" w:eastAsia="Archivo" w:hAnsi="Archivo"/>
+          <w:sz w:val="21"/>
+          <w:szCs w:val="21"/>
+        </w:rPr>
+        <w:t xml:space="preserve">Como se estudió con detalle en el capítulo 6 a propósito de los daños por agua, la exclusión del vicio propio, el desgaste natural y la falta de mantenimiento es una de las más invocadas —y más litigiosas— en la práctica del seguro de hogar, por la dificultad de distinguir, en el plano técnico, entre el evento súbito y accidental (cubierto) y el proceso de deterioro progresivo (excluido). La metodología de análisis expuesta en el capítulo 6 —prueba pericial sobre la causa técnica del daño, carga de la prueba de la aseguradora que invoca la exclusión, y proyección de la regla contra proferentem ante la duda razonable— es plenamente aplicable a esta categoría de exclusión con independencia de la garantía concreta afectada (agua, incendio, estructura).</w:t>
+      </w:r>
+    </w:p>
+    <w:p>
+      <w:pPr>
+        <w:pStyle w:val="Heading2"/>
+        <w:spacing w:after="160" w:before="400"/>
+      </w:pPr>
+      <w:r>
+        <w:rPr>
+          <w:rFonts w:ascii="Fraunces" w:cs="Fraunces" w:eastAsia="Fraunces" w:hAnsi="Fraunces"/>
+          <w:b/>
+          <w:bCs/>
+          <w:color w:val="0A2540"/>
+          <w:sz w:val="24"/>
+          <w:szCs w:val="24"/>
+        </w:rPr>
+        <w:t xml:space="preserve">12.5. Exclusiones por desocupación prolongada de la vivienda</w:t>
+      </w:r>
+    </w:p>
+    <w:p>
+      <w:pPr>
+        <w:spacing w:after="180" w:line="300"/>
+        <w:jc w:val="both"/>
+      </w:pPr>
+      <w:r>
+        <w:rPr>
+          <w:rFonts w:ascii="Archivo" w:cs="Archivo" w:eastAsia="Archivo" w:hAnsi="Archivo"/>
+          <w:sz w:val="21"/>
+          <w:szCs w:val="21"/>
+        </w:rPr>
+        <w:t xml:space="preserve">Es habitual que las condiciones generales excluyan, o limiten severamente, la cobertura de determinados riesgos (típicamente, robo y daños por agua) cuando la vivienda ha permanecido desocupada durante un período prolongado —normalmente entre treinta y noventa días consecutivos, según póliza—, por el incremento objetivo de riesgo que la desocupación comporta</w:t>
+      </w:r>
+      <w:r>
+        <w:rPr>
+          <w:rStyle w:val="FootnoteReference"/>
+        </w:rPr>
+        <w:footnoteReference w:id="27"/>
+      </w:r>
+      <w:r>
+        <w:rPr>
+          <w:rFonts w:ascii="Archivo" w:cs="Archivo" w:eastAsia="Archivo" w:hAnsi="Archivo"/>
+          <w:sz w:val="21"/>
+          <w:szCs w:val="21"/>
+        </w:rPr>
+        <w:t xml:space="preserve">. Esta exclusión, formulada en términos objetivos de días de desocupación, se califica generalmente como delimitadora del riesgo si está formulada con claridad en las condiciones particulares, pero puede recalificarse como limitativa —y exigir, por tanto, el cumplimiento de los requisitos del art. 3 LCS— cuando su aplicación se extiende de forma sorpresiva a supuestos de desocupación ordinaria y previsible (vacaciones, segunda residencia de uso esporádico) no anunciados con claridad al contratar.</w:t>
+      </w:r>
+    </w:p>
+    <w:p>
+      <w:pPr>
+        <w:pStyle w:val="Heading2"/>
+        <w:spacing w:after="160" w:before="400"/>
+      </w:pPr>
+      <w:r>
+        <w:rPr>
+          <w:rFonts w:ascii="Fraunces" w:cs="Fraunces" w:eastAsia="Fraunces" w:hAnsi="Fraunces"/>
+          <w:b/>
+          <w:bCs/>
+          <w:color w:val="0A2540"/>
+          <w:sz w:val="24"/>
+          <w:szCs w:val="24"/>
+        </w:rPr>
+        <w:t xml:space="preserve">12.6. El control de las exclusiones conforme al art. 3 LCS: síntesis metodológica</w:t>
+      </w:r>
+    </w:p>
+    <w:p>
+      <w:pPr>
+        <w:spacing w:after="180" w:line="300"/>
+        <w:jc w:val="both"/>
+      </w:pPr>
+      <w:r>
+        <w:rPr>
+          <w:rFonts w:ascii="Archivo" w:cs="Archivo" w:eastAsia="Archivo" w:hAnsi="Archivo"/>
+          <w:sz w:val="21"/>
+          <w:szCs w:val="21"/>
+        </w:rPr>
+        <w:t xml:space="preserve">Cierra este capítulo, y con él la Parte II de la obra, una síntesis de la metodología de análisis de cualquier exclusión invocada por una aseguradora, que recoge y unifica los criterios desarrollados a lo largo de los capítulos 1, 4, 6 y 12:</w:t>
+      </w:r>
+    </w:p>
+    <w:p>
+      <w:pPr>
+        <w:pStyle w:val="ListParagraph"/>
+        <w:numPr>
+          <w:ilvl w:val="0"/>
+          <w:numId w:val="2"/>
+        </w:numPr>
+        <w:spacing w:after="100" w:line="290"/>
+      </w:pPr>
+      <w:r>
+        <w:rPr>
+          <w:rFonts w:ascii="Archivo" w:cs="Archivo" w:eastAsia="Archivo" w:hAnsi="Archivo"/>
+          <w:sz w:val="21"/>
+          <w:szCs w:val="21"/>
+        </w:rPr>
+        <w:t xml:space="preserve">1. Calificar la naturaleza de la exclusión: legal de orden público (inderogable) o convencional (sujeta al art. 3 LCS).</w:t>
+      </w:r>
+    </w:p>
+    <w:p>
+      <w:pPr>
+        <w:pStyle w:val="ListParagraph"/>
+        <w:numPr>
+          <w:ilvl w:val="0"/>
+          <w:numId w:val="2"/>
+        </w:numPr>
+        <w:spacing w:after="100" w:line="290"/>
+      </w:pPr>
+      <w:r>
+        <w:rPr>
+          <w:rFonts w:ascii="Archivo" w:cs="Archivo" w:eastAsia="Archivo" w:hAnsi="Archivo"/>
+          <w:sz w:val="21"/>
+          <w:szCs w:val="21"/>
+        </w:rPr>
+        <w:t xml:space="preserve">2. Si es convencional, verificar su incorporación efectiva al contrato (arts. 5 y 7 LCGC, capítulo 4).</w:t>
+      </w:r>
+    </w:p>
+    <w:p>
+      <w:pPr>
+        <w:pStyle w:val="ListParagraph"/>
+        <w:numPr>
+          <w:ilvl w:val="0"/>
+          <w:numId w:val="2"/>
+        </w:numPr>
+        <w:spacing w:after="100" w:line="290"/>
+      </w:pPr>
+      <w:r>
+        <w:rPr>
+          <w:rFonts w:ascii="Archivo" w:cs="Archivo" w:eastAsia="Archivo" w:hAnsi="Archivo"/>
+          <w:sz w:val="21"/>
+          <w:szCs w:val="21"/>
+        </w:rPr>
+        <w:t xml:space="preserve">3. Calificarla como delimitadora o limitativa conforme al test de la cláusula sorpresiva (capítulo 1).</w:t>
+      </w:r>
+    </w:p>
+    <w:p>
+      <w:pPr>
+        <w:pStyle w:val="ListParagraph"/>
+        <w:numPr>
+          <w:ilvl w:val="0"/>
+          <w:numId w:val="2"/>
+        </w:numPr>
+        <w:spacing w:after="100" w:line="290"/>
+      </w:pPr>
+      <w:r>
+        <w:rPr>
+          <w:rFonts w:ascii="Archivo" w:cs="Archivo" w:eastAsia="Archivo" w:hAnsi="Archivo"/>
+          <w:sz w:val="21"/>
+          <w:szCs w:val="21"/>
+        </w:rPr>
+        <w:t xml:space="preserve">4. Si es limitativa, verificar el cumplimiento de los requisitos formales del art. 3 LCS (destacado y aceptación específica).</w:t>
+      </w:r>
+    </w:p>
+    <w:p>
+      <w:pPr>
+        <w:pStyle w:val="ListParagraph"/>
+        <w:numPr>
+          <w:ilvl w:val="0"/>
+          <w:numId w:val="2"/>
+        </w:numPr>
+        <w:spacing w:after="100" w:line="290"/>
+      </w:pPr>
+      <w:r>
+        <w:rPr>
+          <w:rFonts w:ascii="Archivo" w:cs="Archivo" w:eastAsia="Archivo" w:hAnsi="Archivo"/>
+          <w:sz w:val="21"/>
+          <w:szCs w:val="21"/>
+        </w:rPr>
+        <w:t xml:space="preserve">5. Ante la persistencia de duda razonable sobre su alcance, proyectar la regla contra proferentem del art. 1288 CC (capítulo 4).</w:t>
+      </w:r>
+    </w:p>
+    <w:p>
+      <w:pPr>
+        <w:pStyle w:val="ListParagraph"/>
+        <w:numPr>
+          <w:ilvl w:val="0"/>
+          <w:numId w:val="2"/>
+        </w:numPr>
+        <w:spacing w:after="100" w:line="290"/>
+      </w:pPr>
+      <w:r>
+        <w:rPr>
+          <w:rFonts w:ascii="Archivo" w:cs="Archivo" w:eastAsia="Archivo" w:hAnsi="Archivo"/>
+          <w:sz w:val="21"/>
+          <w:szCs w:val="21"/>
+        </w:rPr>
+        <w:t xml:space="preserve">6. Si el tomador es consumidor, verificar adicionalmente su conformidad con el TRLGDCU y la LCGC (capítulo 21).</w:t>
+      </w:r>
+    </w:p>
+    <w:p>
+      <w:pPr>
+        <w:pStyle w:val="Heading2"/>
+        <w:spacing w:after="160" w:before="400"/>
+      </w:pPr>
+      <w:r>
+        <w:rPr>
+          <w:rFonts w:ascii="Fraunces" w:cs="Fraunces" w:eastAsia="Fraunces" w:hAnsi="Fraunces"/>
+          <w:b/>
+          <w:bCs/>
+          <w:color w:val="0A2540"/>
+          <w:sz w:val="24"/>
+          <w:szCs w:val="24"/>
+        </w:rPr>
+        <w:t xml:space="preserve">12.7. Ficha para el profesional</w:t>
+      </w:r>
+    </w:p>
+    <w:tbl>
+      <w:tblPr>
+        <w:tblW w:type="pct" w:w="100%"/>
+        <w:tblBorders>
+          <w:top w:val="single" w:color="CBD5E1" w:sz="4"/>
+          <w:left w:val="single" w:color="1B6DF0" w:sz="24"/>
+          <w:bottom w:val="single" w:color="CBD5E1" w:sz="4"/>
+          <w:right w:val="single" w:color="CBD5E1" w:sz="4"/>
+          <w:insideH w:val="single" w:color="auto" w:sz="4"/>
+          <w:insideV w:val="single" w:color="auto" w:sz="4"/>
+        </w:tblBorders>
+      </w:tblPr>
+      <w:tblGrid>
+        <w:gridCol w:w="100"/>
+      </w:tblGrid>
+      <w:tr>
+        <w:tc>
+          <w:tcPr>
+            <w:shd w:fill="F4F6F9" w:val="clear"/>
+            <w:tcMar>
+              <w:top w:type="dxa" w:w="160"/>
+              <w:left w:type="dxa" w:w="220"/>
+              <w:bottom w:type="dxa" w:w="160"/>
+              <w:right w:type="dxa" w:w="220"/>
+            </w:tcMar>
+          </w:tcPr>
+          <w:p>
+            <w:pPr>
+              <w:spacing w:after="100"/>
+            </w:pPr>
+            <w:r>
+              <w:rPr>
+                <w:rFonts w:ascii="Archivo" w:cs="Archivo" w:eastAsia="Archivo" w:hAnsi="Archivo"/>
+                <w:b/>
+                <w:bCs/>
+                <w:caps/>
+                <w:color w:val="1B6DF0"/>
+                <w:sz w:val="18"/>
+                <w:szCs w:val="18"/>
+              </w:rPr>
+              <w:t xml:space="preserve">Puntos de control ante cualquier exclusión invocada</w:t>
+            </w:r>
+          </w:p>
+          <w:p>
+            <w:pPr>
+              <w:pStyle w:val="ListParagraph"/>
+              <w:numPr>
+                <w:ilvl w:val="0"/>
+                <w:numId w:val="2"/>
+              </w:numPr>
+              <w:spacing w:after="80" w:line="280"/>
+            </w:pPr>
+            <w:r>
+              <w:rPr>
+                <w:rFonts w:ascii="Archivo" w:cs="Archivo" w:eastAsia="Archivo" w:hAnsi="Archivo"/>
+                <w:sz w:val="19"/>
+                <w:szCs w:val="19"/>
+              </w:rPr>
+              <w:t xml:space="preserve">Aplicar sistemáticamente la síntesis metodológica del epígrafe 12.6 antes de aceptar o impugnar una exclusión invocada por la aseguradora.</w:t>
+            </w:r>
+          </w:p>
+          <w:p>
+            <w:pPr>
+              <w:pStyle w:val="ListParagraph"/>
+              <w:numPr>
+                <w:ilvl w:val="0"/>
+                <w:numId w:val="2"/>
+              </w:numPr>
+              <w:spacing w:after="80" w:line="280"/>
+            </w:pPr>
+            <w:r>
+              <w:rPr>
+                <w:rFonts w:ascii="Archivo" w:cs="Archivo" w:eastAsia="Archivo" w:hAnsi="Archivo"/>
+                <w:sz w:val="19"/>
+                <w:szCs w:val="19"/>
+              </w:rPr>
+              <w:t xml:space="preserve">Distinguir siempre las exclusiones legales de orden público (dolo, mala fe) de las convencionales, porque su régimen de control es radicalmente distinto.</w:t>
+            </w:r>
+          </w:p>
+          <w:p>
+            <w:pPr>
+              <w:pStyle w:val="ListParagraph"/>
+              <w:numPr>
+                <w:ilvl w:val="0"/>
+                <w:numId w:val="2"/>
+              </w:numPr>
+              <w:spacing w:after="80" w:line="280"/>
+            </w:pPr>
+            <w:r>
+              <w:rPr>
+                <w:rFonts w:ascii="Archivo" w:cs="Archivo" w:eastAsia="Archivo" w:hAnsi="Archivo"/>
+                <w:sz w:val="19"/>
+                <w:szCs w:val="19"/>
+              </w:rPr>
+              <w:t xml:space="preserve">En exclusiones por vicio propio o desgaste, exigir prueba pericial cumplida de la causa técnica del daño, sin admitir afirmaciones genéricas de la aseguradora.</w:t>
+            </w:r>
+          </w:p>
+          <w:p>
+            <w:pPr>
+              <w:pStyle w:val="ListParagraph"/>
+              <w:numPr>
+                <w:ilvl w:val="0"/>
+                <w:numId w:val="2"/>
+              </w:numPr>
+              <w:spacing w:after="80" w:line="280"/>
+            </w:pPr>
+            <w:r>
+              <w:rPr>
+                <w:rFonts w:ascii="Archivo" w:cs="Archivo" w:eastAsia="Archivo" w:hAnsi="Archivo"/>
+                <w:sz w:val="19"/>
+                <w:szCs w:val="19"/>
+              </w:rPr>
+              <w:t xml:space="preserve">En exclusiones por desocupación, verificar si el período aplicado a la vivienda concreta constituye realmente un supuesto excepcional o una desocupación ordinaria y previsible.</w:t>
+            </w:r>
+          </w:p>
+        </w:tc>
+      </w:tr>
+    </w:tbl>
+    <w:p>
+      <w:pPr>
+        <w:pStyle w:val="Heading2"/>
+        <w:spacing w:after="160" w:before="400"/>
+      </w:pPr>
+      <w:r>
+        <w:rPr>
+          <w:rFonts w:ascii="Fraunces" w:cs="Fraunces" w:eastAsia="Fraunces" w:hAnsi="Fraunces"/>
+          <w:b/>
+          <w:bCs/>
+          <w:color w:val="0A2540"/>
+          <w:sz w:val="24"/>
+          <w:szCs w:val="24"/>
+        </w:rPr>
+        <w:t xml:space="preserve">12.8. Ficha para el asegurado</w:t>
+      </w:r>
+    </w:p>
+    <w:tbl>
+      <w:tblPr>
+        <w:tblW w:type="pct" w:w="100%"/>
+        <w:tblBorders>
+          <w:top w:val="single" w:color="CBD5E1" w:sz="4"/>
+          <w:left w:val="single" w:color="8A5A00" w:sz="24"/>
+          <w:bottom w:val="single" w:color="CBD5E1" w:sz="4"/>
+          <w:right w:val="single" w:color="CBD5E1" w:sz="4"/>
+          <w:insideH w:val="single" w:color="auto" w:sz="4"/>
+          <w:insideV w:val="single" w:color="auto" w:sz="4"/>
+        </w:tblBorders>
+      </w:tblPr>
+      <w:tblGrid>
+        <w:gridCol w:w="100"/>
+      </w:tblGrid>
+      <w:tr>
+        <w:tc>
+          <w:tcPr>
+            <w:shd w:fill="F4F6F9" w:val="clear"/>
+            <w:tcMar>
+              <w:top w:type="dxa" w:w="160"/>
+              <w:left w:type="dxa" w:w="220"/>
+              <w:bottom w:type="dxa" w:w="160"/>
+              <w:right w:type="dxa" w:w="220"/>
+            </w:tcMar>
+          </w:tcPr>
+          <w:p>
+            <w:pPr>
+              <w:spacing w:after="100"/>
+            </w:pPr>
+            <w:r>
+              <w:rPr>
+                <w:rFonts w:ascii="Archivo" w:cs="Archivo" w:eastAsia="Archivo" w:hAnsi="Archivo"/>
+                <w:b/>
+                <w:bCs/>
+                <w:caps/>
+                <w:color w:val="8A5A00"/>
+                <w:sz w:val="18"/>
+                <w:szCs w:val="18"/>
+              </w:rPr>
+              <w:t xml:space="preserve">Qué debe comprobar sobre las exclusiones de su póliza</w:t>
+            </w:r>
+          </w:p>
+          <w:p>
+            <w:pPr>
+              <w:pStyle w:val="ListParagraph"/>
+              <w:numPr>
+                <w:ilvl w:val="0"/>
+                <w:numId w:val="2"/>
+              </w:numPr>
+              <w:spacing w:after="80" w:line="280"/>
+            </w:pPr>
+            <w:r>
+              <w:rPr>
+                <w:rFonts w:ascii="Archivo" w:cs="Archivo" w:eastAsia="Archivo" w:hAnsi="Archivo"/>
+                <w:sz w:val="19"/>
+                <w:szCs w:val="19"/>
+              </w:rPr>
+              <w:t xml:space="preserve">Lea con atención el apartado de exclusiones de sus condiciones generales, no solo el de coberturas: le indicará qué situaciones quedan fuera de su protección.</w:t>
+            </w:r>
+          </w:p>
+          <w:p>
+            <w:pPr>
+              <w:pStyle w:val="ListParagraph"/>
+              <w:numPr>
+                <w:ilvl w:val="0"/>
+                <w:numId w:val="2"/>
+              </w:numPr>
+              <w:spacing w:after="80" w:line="280"/>
+            </w:pPr>
+            <w:r>
+              <w:rPr>
+                <w:rFonts w:ascii="Archivo" w:cs="Archivo" w:eastAsia="Archivo" w:hAnsi="Archivo"/>
+                <w:sz w:val="19"/>
+                <w:szCs w:val="19"/>
+              </w:rPr>
+              <w:t xml:space="preserve">Si va a dejar su vivienda desocupada por un período prolongado (obras, viaje largo, cambio de residencia), consulte a su aseguradora si esto afecta a su cobertura y, si es preciso, comunique la circunstancia.</w:t>
+            </w:r>
+          </w:p>
+          <w:p>
+            <w:pPr>
+              <w:pStyle w:val="ListParagraph"/>
+              <w:numPr>
+                <w:ilvl w:val="0"/>
+                <w:numId w:val="2"/>
+              </w:numPr>
+              <w:spacing w:after="80" w:line="280"/>
+            </w:pPr>
+            <w:r>
+              <w:rPr>
+                <w:rFonts w:ascii="Archivo" w:cs="Archivo" w:eastAsia="Archivo" w:hAnsi="Archivo"/>
+                <w:sz w:val="19"/>
+                <w:szCs w:val="19"/>
+              </w:rPr>
+              <w:t xml:space="preserve">Si le deniegan un siniestro invocando una exclusión, pida que se la citen literalmente y le expliquen por qué se aplica a su caso concreto.</w:t>
+            </w:r>
+          </w:p>
+        </w:tc>
+      </w:tr>
+    </w:tbl>
+    <w:p>
+      <w:pPr>
+        <w:pStyle w:val="Heading2"/>
+        <w:spacing w:after="160" w:before="400"/>
+      </w:pPr>
+      <w:r>
+        <w:rPr>
+          <w:rFonts w:ascii="Fraunces" w:cs="Fraunces" w:eastAsia="Fraunces" w:hAnsi="Fraunces"/>
+          <w:b/>
+          <w:bCs/>
+          <w:color w:val="0A2540"/>
+          <w:sz w:val="24"/>
+          <w:szCs w:val="24"/>
+        </w:rPr>
+        <w:t xml:space="preserve">12.9. Checklist: análisis de una exclusión invocada por la aseguradora</w:t>
+      </w:r>
+    </w:p>
+    <w:p>
+      <w:pPr>
+        <w:pStyle w:val="ListParagraph"/>
+        <w:numPr>
+          <w:ilvl w:val="0"/>
+          <w:numId w:val="2"/>
+        </w:numPr>
+        <w:spacing w:after="100" w:line="290"/>
+      </w:pPr>
+      <w:r>
+        <w:rPr>
+          <w:rFonts w:ascii="Archivo" w:cs="Archivo" w:eastAsia="Archivo" w:hAnsi="Archivo"/>
+          <w:sz w:val="21"/>
+          <w:szCs w:val="21"/>
+        </w:rPr>
+        <w:t xml:space="preserve">1. ¿Es una exclusión legal de orden público o una exclusión convencional?</w:t>
+      </w:r>
+    </w:p>
+    <w:p>
+      <w:pPr>
+        <w:pStyle w:val="ListParagraph"/>
+        <w:numPr>
+          <w:ilvl w:val="0"/>
+          <w:numId w:val="2"/>
+        </w:numPr>
+        <w:spacing w:after="100" w:line="290"/>
+      </w:pPr>
+      <w:r>
+        <w:rPr>
+          <w:rFonts w:ascii="Archivo" w:cs="Archivo" w:eastAsia="Archivo" w:hAnsi="Archivo"/>
+          <w:sz w:val="21"/>
+          <w:szCs w:val="21"/>
+        </w:rPr>
+        <w:t xml:space="preserve">2. ¿Está la cláusula efectivamente incorporada al contrato (entrega y accesibilidad real)?</w:t>
+      </w:r>
+    </w:p>
+    <w:p>
+      <w:pPr>
+        <w:pStyle w:val="ListParagraph"/>
+        <w:numPr>
+          <w:ilvl w:val="0"/>
+          <w:numId w:val="2"/>
+        </w:numPr>
+        <w:spacing w:after="100" w:line="290"/>
+      </w:pPr>
+      <w:r>
+        <w:rPr>
+          <w:rFonts w:ascii="Archivo" w:cs="Archivo" w:eastAsia="Archivo" w:hAnsi="Archivo"/>
+          <w:sz w:val="21"/>
+          <w:szCs w:val="21"/>
+        </w:rPr>
+        <w:t xml:space="preserve">3. ¿Es delimitadora o limitativa conforme al test de la cláusula sorpresiva?</w:t>
+      </w:r>
+    </w:p>
+    <w:p>
+      <w:pPr>
+        <w:pStyle w:val="ListParagraph"/>
+        <w:numPr>
+          <w:ilvl w:val="0"/>
+          <w:numId w:val="2"/>
+        </w:numPr>
+        <w:spacing w:after="100" w:line="290"/>
+      </w:pPr>
+      <w:r>
+        <w:rPr>
+          <w:rFonts w:ascii="Archivo" w:cs="Archivo" w:eastAsia="Archivo" w:hAnsi="Archivo"/>
+          <w:sz w:val="21"/>
+          <w:szCs w:val="21"/>
+        </w:rPr>
+        <w:t xml:space="preserve">4. Si es limitativa, ¿cumple los requisitos formales del art. 3 LCS?</w:t>
+      </w:r>
+    </w:p>
+    <w:p>
+      <w:pPr>
+        <w:pStyle w:val="ListParagraph"/>
+        <w:numPr>
+          <w:ilvl w:val="0"/>
+          <w:numId w:val="2"/>
+        </w:numPr>
+        <w:spacing w:after="100" w:line="290"/>
+      </w:pPr>
+      <w:r>
+        <w:rPr>
+          <w:rFonts w:ascii="Archivo" w:cs="Archivo" w:eastAsia="Archivo" w:hAnsi="Archivo"/>
+          <w:sz w:val="21"/>
+          <w:szCs w:val="21"/>
+        </w:rPr>
+        <w:t xml:space="preserve">5. ¿Existe duda razonable sobre su alcance que deba resolverse a favor del asegurado (art. 1288 CC)?</w:t>
+      </w:r>
+    </w:p>
+    <w:p>
+      <w:pPr>
+        <w:pStyle w:val="ListParagraph"/>
+        <w:numPr>
+          <w:ilvl w:val="0"/>
+          <w:numId w:val="2"/>
+        </w:numPr>
+        <w:spacing w:after="100" w:line="290"/>
+      </w:pPr>
+      <w:r>
+        <w:rPr>
+          <w:rFonts w:ascii="Archivo" w:cs="Archivo" w:eastAsia="Archivo" w:hAnsi="Archivo"/>
+          <w:sz w:val="21"/>
+          <w:szCs w:val="21"/>
+        </w:rPr>
+        <w:t xml:space="preserve">6. ¿Aporta la aseguradora prueba pericial suficiente de los hechos en que basa la exclusión?</w:t>
+      </w:r>
+    </w:p>
+    <w:p>
+      <w:pPr>
+        <w:pStyle w:val="Heading2"/>
+        <w:spacing w:after="160" w:before="400"/>
+      </w:pPr>
+      <w:r>
+        <w:rPr>
+          <w:rFonts w:ascii="Fraunces" w:cs="Fraunces" w:eastAsia="Fraunces" w:hAnsi="Fraunces"/>
+          <w:b/>
+          <w:bCs/>
+          <w:color w:val="0A2540"/>
+          <w:sz w:val="24"/>
+          <w:szCs w:val="24"/>
+        </w:rPr>
+        <w:t xml:space="preserve">Bibliografía citada</w:t>
+      </w:r>
+    </w:p>
+    <w:p>
+      <w:pPr>
+        <w:spacing w:after="180" w:line="300"/>
+        <w:jc w:val="both"/>
+      </w:pPr>
+      <w:r>
+        <w:rPr>
+          <w:rFonts w:ascii="Archivo" w:cs="Archivo" w:eastAsia="Archivo" w:hAnsi="Archivo"/>
+          <w:sz w:val="21"/>
+          <w:szCs w:val="21"/>
+        </w:rPr>
+        <w:t xml:space="preserve">SÁNCHEZ CALERO, F. (dir.), Ley de Contrato de Seguro. Comentarios a la Ley 50/1980, de 8 de octubre, y a sus modificaciones, Aranzadi-Thomson Reuters, Cizur Menor.</w:t>
       </w:r>
     </w:p>
     <w:sectPr>
@@ -13734,6 +18205,150 @@
           <w:szCs w:val="17"/>
         </w:rPr>
         <w:t xml:space="preserve">El sistema dual español —aseguramiento privado de riesgos ordinarios y cobertura pública complementaria de riesgos catastróficos mediante recargo obligatorio— es una de las señas de identidad del ordenamiento asegurador español, sin equivalente exacto en otros ordenamientos de nuestro entorno; sobre su fundamento y funcionamiento, vid. VEIGA COPO, A. B., Tratado del Contrato de Seguro, op. cit., tomo dedicado al Consorcio de Compensación de Seguros.</w:t>
+      </w:r>
+    </w:p>
+  </w:footnote>
+  <w:footnote w:id="20">
+    <w:p>
+      <w:r>
+        <w:rPr>
+          <w:rStyle w:val="FootnoteReference"/>
+        </w:rPr>
+        <w:footnoteRef/>
+      </w:r>
+      <w:r>
+        <w:rPr>
+          <w:rFonts w:ascii="Archivo" w:cs="Archivo" w:eastAsia="Archivo" w:hAnsi="Archivo"/>
+          <w:sz w:val="17"/>
+          <w:szCs w:val="17"/>
+        </w:rPr>
+        <w:t xml:space="preserve">La inserción de una garantía de responsabilidad civil dentro de una póliza multirriesgo no altera su naturaleza jurídica: sigue rigiéndose por el régimen especial de los arts. 73 y siguientes LCS, y no por el régimen general del seguro de daños propios; cfr. SÁNCHEZ CALERO, F. (dir.), op. cit., ad art. 73.</w:t>
+      </w:r>
+    </w:p>
+  </w:footnote>
+  <w:footnote w:id="21">
+    <w:p>
+      <w:r>
+        <w:rPr>
+          <w:rStyle w:val="FootnoteReference"/>
+        </w:rPr>
+        <w:footnoteRef/>
+      </w:r>
+      <w:r>
+        <w:rPr>
+          <w:rFonts w:ascii="Archivo" w:cs="Archivo" w:eastAsia="Archivo" w:hAnsi="Archivo"/>
+          <w:sz w:val="17"/>
+          <w:szCs w:val="17"/>
+        </w:rPr>
+        <w:t xml:space="preserve">La acción directa del art. 76 LCS es una de las manifestaciones más características del carácter tuitivo del seguro de responsabilidad civil hacia el tercero perjudicado, ajeno por completo a la relación contractual entre tomador y asegurador; sobre su naturaleza jurídica (¿acción propia iure proprio o subrogación legal?), cfr. VEIGA COPO, A. B., Tratado del Contrato de Seguro, op. cit., tomo dedicado al seguro de responsabilidad civil.</w:t>
+      </w:r>
+    </w:p>
+  </w:footnote>
+  <w:footnote w:id="22">
+    <w:p>
+      <w:r>
+        <w:rPr>
+          <w:rStyle w:val="FootnoteReference"/>
+        </w:rPr>
+        <w:footnoteRef/>
+      </w:r>
+      <w:r>
+        <w:rPr>
+          <w:rFonts w:ascii="Archivo" w:cs="Archivo" w:eastAsia="Archivo" w:hAnsi="Archivo"/>
+          <w:sz w:val="17"/>
+          <w:szCs w:val="17"/>
+        </w:rPr>
+        <w:t xml:space="preserve">La autonomía del seguro de defensa jurídica frente al de responsabilidad civil, pese a su frecuente coexistencia en una misma póliza y a su origen normativo común en la transposición de la Directiva 87/344/CEE, es un rasgo estructural destacado unánimemente por la doctrina; cfr. BATALLER GRAU, J. et al., op. cit., ad arts. 76.a) a 76.g).</w:t>
+      </w:r>
+    </w:p>
+  </w:footnote>
+  <w:footnote w:id="23">
+    <w:p>
+      <w:r>
+        <w:rPr>
+          <w:rStyle w:val="FootnoteReference"/>
+        </w:rPr>
+        <w:footnoteRef/>
+      </w:r>
+      <w:r>
+        <w:rPr>
+          <w:rFonts w:ascii="Archivo" w:cs="Archivo" w:eastAsia="Archivo" w:hAnsi="Archivo"/>
+          <w:sz w:val="17"/>
+          <w:szCs w:val="17"/>
+        </w:rPr>
+        <w:t xml:space="preserve">El derecho de libre elección de abogado y procurador constituye, según ha destacado la doctrina, el núcleo mismo de la protección que el legislador comunitario quiso otorgar al asegurado de defensa jurídica frente al riesgo de que el asegurador, al controlar la elección del profesional, subordinase la calidad de la defensa a sus propios intereses económicos como pagador; cfr. VEIGA COPO, A. B., Tratado del Contrato de Seguro, op. cit., tomo dedicado al seguro de defensa jurídica.</w:t>
+      </w:r>
+    </w:p>
+  </w:footnote>
+  <w:footnote w:id="24">
+    <w:p>
+      <w:r>
+        <w:rPr>
+          <w:rStyle w:val="FootnoteReference"/>
+        </w:rPr>
+        <w:footnoteRef/>
+      </w:r>
+      <w:r>
+        <w:rPr>
+          <w:rFonts w:ascii="Archivo" w:cs="Archivo" w:eastAsia="Archivo" w:hAnsi="Archivo"/>
+          <w:sz w:val="17"/>
+          <w:szCs w:val="17"/>
+        </w:rPr>
+        <w:t xml:space="preserve">La frontera entre el sublímite como mera concreción cuantitativa del riesgo (delimitador) y el sublímite como vaciamiento encubierto de la cobertura general (limitativo o lesivo) es una de las cuestiones más debatidas en la doctrina reciente sobre el art. 3 LCS aplicado a coberturas especiales; cfr. VEIGA COPO, A. B., Condiciones generales y particulares en el contrato de seguro, op. cit.</w:t>
+      </w:r>
+    </w:p>
+  </w:footnote>
+  <w:footnote w:id="25">
+    <w:p>
+      <w:r>
+        <w:rPr>
+          <w:rStyle w:val="FootnoteReference"/>
+        </w:rPr>
+        <w:footnoteRef/>
+      </w:r>
+      <w:r>
+        <w:rPr>
+          <w:rFonts w:ascii="Archivo" w:cs="Archivo" w:eastAsia="Archivo" w:hAnsi="Archivo"/>
+          <w:sz w:val="17"/>
+          <w:szCs w:val="17"/>
+        </w:rPr>
+        <w:t xml:space="preserve">La ausencia de una obligación legal general de aseguramiento de la comunidad contrasta con la extendidísima práctica de suscribirlo, impulsada tanto por la prudencia de las juntas de propietarios como, en ocasiones, por su previsión expresa en los estatutos de la comunidad; cfr. BATALLER GRAU, J. et al., op. cit., epígrafe sobre seguros en la propiedad horizontal.</w:t>
+      </w:r>
+    </w:p>
+  </w:footnote>
+  <w:footnote w:id="26">
+    <w:p>
+      <w:r>
+        <w:rPr>
+          <w:rStyle w:val="FootnoteReference"/>
+        </w:rPr>
+        <w:footnoteRef/>
+      </w:r>
+      <w:r>
+        <w:rPr>
+          <w:rFonts w:ascii="Archivo" w:cs="Archivo" w:eastAsia="Archivo" w:hAnsi="Archivo"/>
+          <w:sz w:val="17"/>
+          <w:szCs w:val="17"/>
+        </w:rPr>
+        <w:t xml:space="preserve">La distinción entre exclusiones legales imperativas y exclusiones convencionales sujetas al art. 3 LCS, aunque conceptualmente sencilla, exige un ejercicio constante de calificación en la práctica, dado que muchas condiciones generales reproducen o parafrasean exclusiones legales sin indicar su origen normativo; cfr. SÁNCHEZ CALERO, F. (dir.), op. cit., epígrafe introductorio al régimen de exclusiones del seguro de daños.</w:t>
+      </w:r>
+    </w:p>
+  </w:footnote>
+  <w:footnote w:id="27">
+    <w:p>
+      <w:r>
+        <w:rPr>
+          <w:rStyle w:val="FootnoteReference"/>
+        </w:rPr>
+        <w:footnoteRef/>
+      </w:r>
+      <w:r>
+        <w:rPr>
+          <w:rFonts w:ascii="Archivo" w:cs="Archivo" w:eastAsia="Archivo" w:hAnsi="Archivo"/>
+          <w:sz w:val="17"/>
+          <w:szCs w:val="17"/>
+        </w:rPr>
+        <w:t xml:space="preserve">La exclusión por desocupación prolongada guarda una relación funcional con el deber de comunicación de la agravación del riesgo del art. 11 LCS estudiado en el capítulo 3, en la medida en que un cambio duradero en el patrón de ocupación de la vivienda puede constituir, en sí mismo, una circunstancia agravante sujeta a dicho deber si fue objeto de pregunta en el cuestionario inicial; cfr. capítulo 3, epígrafe 3.3.1.</w:t>
       </w:r>
     </w:p>
   </w:footnote>

</xml_diff>